<commit_message>
[T05 2026-10-20] docs: Redezeit neu verteilt
- Kilian übernimmt Datenmodell (100 s) und Vorgehen/PM (90 s) ganz; Texte um ein SD4-Beispiel und das Entscheidungslog ergänzt
- David (Auftragsreise 55 s) und Adrian (Lösung 50 s) gekürzt, gesamt weiter 18:10
- TODO D: Folie 14 einblenden, Notizen in der PPTX übernehmen, Hinweis zu Jakobs ausgeblendeten Folien

Co-Authored-By: Claude Opus 5.5 <noreply@anthropic.com>
Claude-Session: https://claude.ai/code/session_01H2bGsFaySUqsEjJ1PXuxUw
</commit_message>
<xml_diff>
--- a/4_praesentation/Sprechtext_Abschlusspraesentation.docx
+++ b/4_praesentation/Sprechtext_Abschlusspraesentation.docx
@@ -24,7 +24,7 @@
         <w:t xml:space="preserve">Redezeit je Person: </w:t>
       </w:r>
       <w:r>
-        <w:t>Nina 2:50, David 3:40, Adrian 3:30, Maximilian 3:20, Kilian 2:30, Jakob 2:20 · gesamt 18:10.</w:t>
+        <w:t>Nina 2:50, David 3:20, Adrian 3:10, Maximilian 3:20, Kilian 3:10, Jakob 2:20 · gesamt 18:10.</w:t>
       </w:r>
     </w:p>
     <w:p>
@@ -125,7 +125,7 @@
         <w:rPr>
           <w:i/>
         </w:rPr>
-        <w:t xml:space="preserve">  (70 s)</w:t>
+        <w:t xml:space="preserve">  (50 s)</w:t>
       </w:r>
     </w:p>
     <w:p>
@@ -136,7 +136,7 @@
         <w:t xml:space="preserve">Adrian: </w:t>
       </w:r>
       <w:r>
-        <w:t>RepairFlow ist unsere Antwort darauf. Wichtig für die Einordnung: Wir sind nicht die Werkstatt, wir sind das Software-Startup. FixWerk ist unser Pilotkunde, an dessen Abläufen wir die Plattform entworfen haben. Diese Perspektive haben wir nach der Rückfrage des Dozenten bei der Konzeptvorstellung bewusst festgelegt. RepairFlow ist eine Cloud-Plattform, die den ganzen Reparatur-Lebenszyklus abdeckt, von der ersten Anfrage bis zur Abholung und Reklamation. Sie besteht aus vier Modulen: dem Kundenportal mit App, dem Auftrags- und Werkstattmodul, dem Dispositionsmodul für Ersatzteile und der Abrechnung. Zielkunden sind unabhängige Werkstätten und kleine Ketten mit zwei bis zehn Filialen. Außerhalb der Plattform bleiben die physische Reparatur, die Systeme der Lieferanten und die Buchhaltung; dorthin gibt es Schnittstellen, mehr nicht.</w:t>
+        <w:t>RepairFlow ist unsere Antwort darauf. Wichtig für die Einordnung: Wir sind nicht die Werkstatt, wir sind das Software-Startup. FixWerk ist unser Pilotkunde, an dessen Abläufen wir die Plattform entworfen haben. RepairFlow ist eine Cloud-Plattform, die den ganzen Reparatur-Lebenszyklus abdeckt, von der ersten Anfrage bis zur Abholung und Reklamation. Sie besteht aus vier Modulen: dem Kundenportal mit App, dem Auftrags- und Werkstattmodul, dem Dispositionsmodul für Ersatzteile und der Abrechnung. Die physische Reparatur, die Lieferantensysteme und die Buchhaltung bleiben außerhalb.</w:t>
       </w:r>
     </w:p>
     <w:p>
@@ -181,7 +181,7 @@
         <w:rPr>
           <w:i/>
         </w:rPr>
-        <w:t xml:space="preserve">  (75 s)</w:t>
+        <w:t xml:space="preserve">  (55 s)</w:t>
       </w:r>
     </w:p>
     <w:p>
@@ -192,7 +192,7 @@
         <w:t xml:space="preserve">David: </w:t>
       </w:r>
       <w:r>
-        <w:t>So sieht eine Reparatur mit RepairFlow aus. Der Kunde schickt per App ein Foto oder Video und bekommt innerhalb einer Minute Vorschlag, vorläufigen Kostenvoranschlag und Terminvorschlag. Bestätigt er, sind die Teile schon vorreserviert. In der Filiale wird das Gerät registriert und der Auftrag angelegt. Der Techniker prüft den Vorschlag, stellt die Diagnose und erstellt den Kostenvoranschlag, den der Kunde wieder in der App freigibt. Dann disponiert RepairFlow die Teile über alle Filialen und bestellt Fehlteile beim Lieferanten. Nach der Reparatur folgt die Endkontrolle, der Kunde wird benachrichtigt, holt ab und zahlt. Jeder dieser Schritte ist ein Status des Reparaturauftrags: angenommen, in Diagnose, KVA offen, freigegeben, Teile bestellt, in Reparatur, fertig, abgeholt. Dieser Zustandsautomat ist der rote Faden durch alle unsere Modelle. Und falls doch etwas nicht passt: Die Reklamation startet einen eigenen Prozess, im Gewährleistungsfall kostenfrei.</w:t>
+        <w:t>Der Kunde schickt per App ein Foto oder Video und bekommt innerhalb einer Minute Vorschlag, vorläufigen Kostenvoranschlag und Terminvorschlag. In der Filiale wird das Gerät registriert und der Auftrag angelegt. Der Techniker prüft den Vorschlag, stellt die Diagnose und erstellt den Kostenvoranschlag, den der Kunde in der App freigibt. Dann disponiert RepairFlow die Teile über alle Filialen und bestellt Fehlteile beim Lieferanten. Nach der Reparatur folgt die Endkontrolle, der Kunde wird benachrichtigt, holt ab und zahlt. Jeder dieser Schritte ist ein Status des Reparaturauftrags: angenommen, in Diagnose, KVA offen, freigegeben, Teile bestellt, in Reparatur, fertig, abgeholt. Dieser Zustandsautomat ist der rote Faden durch alle unsere Modelle.</w:t>
       </w:r>
     </w:p>
     <w:p>
@@ -349,7 +349,7 @@
         <w:rPr>
           <w:i/>
         </w:rPr>
-        <w:t xml:space="preserve">  (80 s)</w:t>
+        <w:t xml:space="preserve">  (100 s)</w:t>
       </w:r>
     </w:p>
     <w:p>
@@ -360,7 +360,7 @@
         <w:t xml:space="preserve">Kilian: </w:t>
       </w:r>
       <w:r>
-        <w:t>Das Klassendiagramm ist ein einziges, vollständiges Modell mit 27 Klassen. Fünf Entscheidungen prägen es. Erstens: Der Reparaturauftrag ist die Aggregatwurzel. Befund und Reparaturschritte existieren nur mit ihrem Auftrag und sind deshalb Kompositionen, Kostenvoranschlag und Gerät sind nur zugeordnet, weil der Vorab-KVA schon vor dem Auftrag entsteht. Zweitens: Der Lagerbestand ist eine eigene Klasse zwischen Ersatzteil und Filiale. Nur so lässt sich die Verfügbarkeit über alle Filialen prüfen. Drittens: Die Reservierung ist eine eigene Klasse mit Lebenszyklus, vorreserviert, reserviert, entnommen, storniert. Viertens: Der Werkstattbetrieb ist der Mandant, und die Mitarbeiter sind nach Typ spezialisiert, Servicemitarbeiter, Techniker, Disponent und Werkstattleiter, passend zu den Lanes in BPMN und zu den Rollen im Use-Case-Diagramm. Fünftens: Voranmeldung, Medienanhang und KI-Diagnosevorschlag tragen die Sofortdiagnose. Die sechs Sequenzdiagramme verwenden ausschließlich Operationen dieser Klassen; jede Botschaft an ein Objekt ist eine Operation des Klassendiagramms.</w:t>
+        <w:t>Das Klassendiagramm ist ein einziges, vollständiges Modell mit 27 Klassen. Fünf Entscheidungen prägen es. Erstens: Der Reparaturauftrag ist die Aggregatwurzel. Befund und Reparaturschritte existieren nur mit ihrem Auftrag und sind deshalb Kompositionen, Kostenvoranschlag und Gerät sind nur zugeordnet, weil der Vorab-KVA schon vor dem Auftrag entsteht. Zweitens: Der Lagerbestand ist eine eigene Klasse zwischen Ersatzteil und Filiale. Nur so lässt sich die Verfügbarkeit über alle Filialen prüfen. Drittens: Die Reservierung ist eine eigene Klasse mit Lebenszyklus, vorreserviert, reserviert, entnommen, storniert. Viertens: Der Werkstattbetrieb ist der Mandant, und die Mitarbeiter sind nach Typ spezialisiert, Servicemitarbeiter, Techniker, Disponent und Werkstattleiter, passend zu den Lanes in BPMN und zu den Rollen im Use-Case-Diagramm. Fünftens: Voranmeldung, Medienanhang und KI-Diagnosevorschlag tragen die Sofortdiagnose. Die sechs Sequenzdiagramme verwenden ausschließlich Operationen dieser Klassen; jede Botschaft an ein Objekt ist eine Operation des Klassendiagramms. Ein Beispiel ist SD4, die Fertigmeldung: Besteht der Auftrag auch nach der zweiten Nacharbeit die Endkontrolle nicht, ruft der Endkontrolleur wechsleStatus mit dem Wert ABGELEHNT auf, also genau die Operation, die der Reparaturauftrag im Klassendiagramm anbietet. Gezeichnet ist alles in Visual Paradigm, die Sequenzdiagramme hängen als Unterdiagramme an ihren Use Cases.</w:t>
       </w:r>
     </w:p>
     <w:p>
@@ -377,7 +377,7 @@
         <w:rPr>
           <w:i/>
         </w:rPr>
-        <w:t xml:space="preserve">  (70 s)</w:t>
+        <w:t xml:space="preserve">  (90 s)</w:t>
       </w:r>
     </w:p>
     <w:p>
@@ -388,7 +388,7 @@
         <w:t xml:space="preserve">Kilian: </w:t>
       </w:r>
       <w:r>
-        <w:t>Gearbeitet haben wir in Sprints, die sich am Takt der vier Gruppentermine orientiert haben, mit Review, Retrospektive und Planning je Termin. Nina hat die Projektleitung, David die Stellvertretung und die Sicherungen, Adrian ist Product Owner, ich Scrum Master, Maximilian verantwortet BPMN, Jakob die Qualität. Alles Schriftliche liegt in einem GitHub-Repository; jede Änderung geht über einen eigenen Branch, einen Pull Request und ein Review durch eine zweite Person, bisher 27 gemergte Pull Requests. Das Trello-Board hat eine Liste je Termin und eine Karte je Person und Aufgabe. Jedes Diagramm wurde im Zweierteam geprüft. Die Meilensteine: Am 02.09. standen alle Diagramme im Entwurf, am 05.10. die Korrekturen aus zwei Gesamtprüfungen, am 15.10. haben wir die Rollenstruktur umgesetzt, am 22.10. war die Generalprobe. Die Abgabe folgt am 13.11.</w:t>
+        <w:t>Gearbeitet haben wir in Sprints, die sich am Takt der vier Gruppentermine orientiert haben, mit Review, Retrospektive und Planning je Termin. Nina hat die Projektleitung, David die Stellvertretung und die Sicherungen, Adrian ist Product Owner, ich Scrum Master, Maximilian verantwortet BPMN, Jakob die Qualität. Alles Schriftliche liegt in einem GitHub-Repository; jede Änderung geht über einen eigenen Branch, einen Pull Request und ein Review durch eine zweite Person, inzwischen über 35 gemergte Pull Requests. Das Trello-Board hat eine Liste je Termin und eine Karte je Person und Aufgabe. Jedes Diagramm wurde im Zweierteam geprüft. Als Scrum Master war mir wichtig, dass Entscheidungen nicht im Gruppenchat verloren gehen: Alles, was mehrere betrifft, steht im Entscheidungslog, inzwischen 30 Einträge mit Begründung und Datum. Das hat uns bei jeder Korrektur geholfen, weil wir nachvollziehen konnten, warum ein Modell so aussieht. Die Meilensteine: Am 02.09. standen alle Diagramme im Entwurf, am 05.10. die Korrekturen aus zwei Gesamtprüfungen, am 15.10. haben wir die Rollenstruktur umgesetzt, am 22.10. war die Generalprobe. Die Abgabe folgt am 13.11.</w:t>
       </w:r>
     </w:p>
     <w:p>

</xml_diff>

<commit_message>
[T05 2026-10-20] docs: Folie 8 Live-Demo der Kunden-App
- neue Folie 8 mit drei Screenshots aus dem Mockup und Hinweisen, was die Demo zeigt; Folien 9 bis 19 neu nummeriert, Agenda und Anhang angepasst
- Sprechtext: Folie 8 (Adrian, 60 s) ergänzt, Nummern angeglichen, Redezeit gesamt 19:10
- TODO, Team-Datei und Mockup-README auf die neue Folienfolge

Co-Authored-By: Claude Fable 5.1 <noreply@anthropic.com>
Claude-Session: https://claude.ai/code/session_01H2bGsFaySUqsEjJ1PXuxUw
</commit_message>
<xml_diff>
--- a/4_praesentation/Sprechtext_Abschlusspraesentation.docx
+++ b/4_praesentation/Sprechtext_Abschlusspraesentation.docx
@@ -8,7 +8,7 @@
           <w:b/>
           <w:sz w:val="28"/>
         </w:rPr>
-        <w:t>Sprechtext Abschlusspräsentation RepairFlow (ca. 18 Minuten)</w:t>
+        <w:t>Sprechtext Abschlusspräsentation RepairFlow (ca. 19 Minuten)</w:t>
       </w:r>
     </w:p>
     <w:p>
@@ -24,7 +24,7 @@
         <w:t xml:space="preserve">Redezeit je Person: </w:t>
       </w:r>
       <w:r>
-        <w:t>Nina 2:50, David 3:20, Adrian 3:10, Maximilian 3:20, Kilian 3:10, Jakob 2:20 · gesamt 18:10.</w:t>
+        <w:t>Nina 2:50, David 3:20, Adrian 4:10, Maximilian 3:20, Kilian 3:10, Jakob 2:20 · gesamt 19:10.</w:t>
       </w:r>
     </w:p>
     <w:p>
@@ -80,7 +80,7 @@
         <w:t xml:space="preserve">Nina: </w:t>
       </w:r>
       <w:r>
-        <w:t xml:space="preserve">Unsere Präsentation hat zwei Hälften. In der ersten erzählen wir RepairFlow so, wie wir es einer Werkstatt vorstellen würden: Problem, Lösung, Nutzen, die Reparatur aus Kundensicht und unser Alleinstellungsmerkmal, die KI-Sofortdiagnose. In der zweiten Hälfte zeigen wir, was dahintersteckt: zehn Geschäftsprozesse, Rollen und Use Cases, das Datenmodell, unser Vorgehen und die Qualitätssicherung. Die Diagramme selbst finden Sie in der Projektdokumentation und im Abgabepaket; hier konzentrieren wir uns auf die Ergebnisse. Fragen gern am Ende.</w:t>
+        <w:t xml:space="preserve">Unsere Präsentation hat zwei Hälften. In der ersten erzählen wir RepairFlow so, wie wir es einer Werkstatt vorstellen würden: Problem, Lösung, Nutzen, die Reparatur aus Kundensicht und unser Alleinstellungsmerkmal, die KI-Sofortdiagnose, mit einer kurzen Demo der Kunden-App. In der zweiten Hälfte zeigen wir, was dahintersteckt: zehn Geschäftsprozesse, Rollen und Use Cases, das Datenmodell, unser Vorgehen und die Qualitätssicherung. Die Diagramme selbst finden Sie in der Projektdokumentation und im Abgabepaket; hier konzentrieren wir uns auf die Ergebnisse. Fragen gern am Ende.</w:t>
       </w:r>
     </w:p>
     <w:p>
@@ -231,7 +231,35 @@
         <w:rPr>
           <w:b/>
         </w:rPr>
-        <w:t>Folie 8 – Was wir gebaut haben: Ergebnisse in Zahlen</w:t>
+        <w:t>Folie 8 – Live-Demo: die Kunden-App</w:t>
+      </w:r>
+      <w:r>
+        <w:rPr>
+          <w:i/>
+        </w:rPr>
+        <w:t xml:space="preserve">  (60 s)</w:t>
+      </w:r>
+    </w:p>
+    <w:p>
+      <w:r>
+        <w:rPr>
+          <w:b/>
+        </w:rPr>
+        <w:t xml:space="preserve">Adrian: </w:t>
+      </w:r>
+      <w:r>
+        <w:t xml:space="preserve">Wie sich das für den Kunden anfühlt, zeige ich Ihnen kurz in der App. Der Kunde wählt sein Gerät, beschreibt das Problem und lädt ein Foto hoch; im Modell ist das die Voranmeldung mit dem Medienanhang. Der KI-Dienst antwortet mit Ursache, benötigten Teilen und einer Konfidenz, das ist der KIDiagnosevorschlag. RepairFlow rechnet daraus das Angebot, deutlich als vorläufig markiert, und schlägt Filiale und Termin vor. Bestätigt der Kunde, sind die Teile vorreserviert und die Voranmeldung steht. Der eigentliche Reparaturauftrag entsteht erst, wenn das Gerät in der Filiale abgegeben wird. Zum Schluss sieht der Kunde den Status seines Auftrags entlang derselben Zustände, die David in der Auftragsreise gezeigt hat. Die KI-Antwort ist in der Demo simuliert; Ablauf und Begriffe sind genau die aus unseren Modellen.</w:t>
+      </w:r>
+    </w:p>
+    <w:p>
+      <w:pPr>
+        <w:spacing w:before="200"/>
+      </w:pPr>
+      <w:r>
+        <w:rPr>
+          <w:b/>
+        </w:rPr>
+        <w:t>Folie 9 – Was wir gebaut haben: Ergebnisse in Zahlen</w:t>
       </w:r>
       <w:r>
         <w:rPr>
@@ -259,7 +287,7 @@
         <w:rPr>
           <w:b/>
         </w:rPr>
-        <w:t>Folie 9 – Zehn Prozesse, 61 Prozent automatisiert</w:t>
+        <w:t>Folie 10 – Zehn Prozesse, 61 Prozent automatisiert</w:t>
       </w:r>
       <w:r>
         <w:rPr>
@@ -287,7 +315,7 @@
         <w:rPr>
           <w:b/>
         </w:rPr>
-        <w:t>Folie 10 – Drei Prozess-Highlights</w:t>
+        <w:t>Folie 11 – Drei Prozess-Highlights</w:t>
       </w:r>
       <w:r>
         <w:rPr>
@@ -315,7 +343,7 @@
         <w:rPr>
           <w:b/>
         </w:rPr>
-        <w:t>Folie 11 – Wer macht was im System: Rollen und Use Cases</w:t>
+        <w:t>Folie 12 – Wer macht was im System: Rollen und Use Cases</w:t>
       </w:r>
       <w:r>
         <w:rPr>
@@ -343,7 +371,7 @@
         <w:rPr>
           <w:b/>
         </w:rPr>
-        <w:t>Folie 12 – Das Datenmodell: fünf Entwurfsentscheidungen</w:t>
+        <w:t>Folie 13 – Das Datenmodell: fünf Entwurfsentscheidungen</w:t>
       </w:r>
       <w:r>
         <w:rPr>
@@ -357,7 +385,6 @@
         <w:rPr>
           <w:b/>
         </w:rPr>
-        <w:lastRenderedPageBreak/>
         <w:t xml:space="preserve">Kilian: </w:t>
       </w:r>
       <w:r>
@@ -372,7 +399,7 @@
         <w:rPr>
           <w:b/>
         </w:rPr>
-        <w:t>Folie 13 – Vorgehen und Projektmanagement</w:t>
+        <w:t>Folie 14 – Vorgehen und Projektmanagement</w:t>
       </w:r>
       <w:r>
         <w:rPr>
@@ -400,7 +427,7 @@
         <w:rPr>
           <w:b/>
         </w:rPr>
-        <w:t>Folie 14 – Qualität: Konventionen, Linter, Konsistenz</w:t>
+        <w:t>Folie 15 – Qualität: Konventionen, Linter, Konsistenz</w:t>
       </w:r>
       <w:r>
         <w:rPr>
@@ -428,8 +455,7 @@
         <w:rPr>
           <w:b/>
         </w:rPr>
-        <w:lastRenderedPageBreak/>
-        <w:t>Folie 15 – Herausforderungen und Lernerfahrungen</w:t>
+        <w:t>Folie 16 – Herausforderungen und Lernerfahrungen</w:t>
       </w:r>
       <w:r>
         <w:rPr>
@@ -457,7 +483,7 @@
         <w:rPr>
           <w:b/>
         </w:rPr>
-        <w:t>Folie 16 – Geschäftsmodell und Ausblick</w:t>
+        <w:t>Folie 17 – Geschäftsmodell und Ausblick</w:t>
       </w:r>
       <w:r>
         <w:rPr>
@@ -485,7 +511,7 @@
         <w:rPr>
           <w:b/>
         </w:rPr>
-        <w:t>Folie 17 – Fazit und Danke</w:t>
+        <w:t>Folie 18 – Fazit und Danke</w:t>
       </w:r>
       <w:r>
         <w:rPr>
@@ -513,7 +539,7 @@
         <w:rPr>
           <w:b/>
         </w:rPr>
-        <w:t>Folie 18 – Anhang: Beiträge der Vortragenden</w:t>
+        <w:t>Folie 19 – Anhang: Beiträge der Vortragenden</w:t>
       </w:r>
     </w:p>
     <w:p>

</xml_diff>

<commit_message>
[T05 2026-10-22] docs: Diagramme, Doku und Praesentation an UI-Umbau angepasst
- Klassendiagramm und sechs Sequenzdiagramme neu exportiert (Oberflaechenklassen, Objektsuche)
- Doku: Abbildungen 5-7 ersetzt, Tippfehler in 5.4, 5.5 und 7.1
- Praesentation: Zahlen 29 Klassen / 40 Assoziationen, Folie 13 Mandant und Oberflaechen, Anhang
- Sprechtexte nach Aufteilung der Agenda, Notizen und Word-Datei gleich
</commit_message>
<xml_diff>
--- a/4_praesentation/Sprechtext_Abschlusspraesentation.docx
+++ b/4_praesentation/Sprechtext_Abschlusspraesentation.docx
@@ -24,7 +24,7 @@
         <w:t xml:space="preserve">Redezeit je Person: </w:t>
       </w:r>
       <w:r>
-        <w:t>Nina 2:50, David 3:20, Adrian 4:10, Maximilian 3:20, Kilian 3:10, Jakob 2:20 · gesamt 19:10.</w:t>
+        <w:t>Nina 3:45, David 3:15, Kilian 3:55, Maximilian 3:40, Adrian 1:50, Jakob 2:10 · gesamt 18:35.</w:t>
       </w:r>
     </w:p>
     <w:p>
@@ -52,7 +52,7 @@
         <w:t xml:space="preserve">Nina: </w:t>
       </w:r>
       <w:r>
-        <w:t xml:space="preserve">Guten Morgen zusammen. Wir sind Gruppe 1 und stellen Ihnen RepairFlow vor: eine Plattform, mit der Reparaturwerkstätten ihre Aufträge, Ersatzteile und Kunden an einer Stelle steuern. Den Anfang macht David mit dem Problem, das wir lösen wollen. Danach zeigt Adrian die Lösung, Maximilian, Kilian und Jakob fassen zusammen, was wir dafür modelliert haben, und ich schließe mit Geschäftsmodell und Ausblick.</w:t>
+        <w:t>Guten Morgen zusammen. Wir sind Gruppe 1 und stellen Ihnen RepairFlow vor: eine Plattform, mit der Reparaturwerkstätten ihre Aufträge, Ersatzteile und Kunden an einer Stelle steuern. David beginnt mit dem Problem und unserer Lösung, Kilian und Maximilian zeigen, wie ein Auftrag durch RepairFlow läuft. Danach stellen Adrian, Kilian und Jakob vor, was wir dafür modelliert haben, und ich schließe mit Vorgehen, Geschäftsmodell und Ausblick.</w:t>
       </w:r>
     </w:p>
     <w:p>
@@ -80,7 +80,7 @@
         <w:t xml:space="preserve">Nina: </w:t>
       </w:r>
       <w:r>
-        <w:t xml:space="preserve">Unsere Präsentation hat zwei Hälften. In der ersten erzählen wir RepairFlow so, wie wir es einer Werkstatt vorstellen würden: Problem, Lösung, Nutzen, die Reparatur aus Kundensicht und unser Alleinstellungsmerkmal, die KI-Sofortdiagnose, mit einer kurzen Demo der Kunden-App. In der zweiten Hälfte zeigen wir, was dahintersteckt: zehn Geschäftsprozesse, Rollen und Use Cases, das Datenmodell, unser Vorgehen und die Qualitätssicherung. Die Diagramme selbst finden Sie in der Projektdokumentation und im Abgabepaket; hier konzentrieren wir uns auf die Ergebnisse. Fragen gern am Ende.</w:t>
+        <w:t>Unsere Präsentation hat zwei Hälften. In der ersten erzählen wir RepairFlow so, wie wir es einer Werkstatt vorstellen würden: Problem, Lösung, Nutzen, die Reparatur aus Kundensicht mit drei Prozess-Highlights und unser Alleinstellungsmerkmal, die KI-Sofortdiagnose, mit einer kurzen Demo der Kunden-App. In der zweiten Hälfte zeigen wir, was dahintersteckt: zehn Geschäftsprozesse, Rollen und Use Cases, das Datenmodell, die Qualitätssicherung und unser Vorgehen. Die Diagramme selbst finden Sie in der Projektdokumentation und im Abgabepaket; hier konzentrieren wir uns auf die Ergebnisse. Fragen gern am Ende.</w:t>
       </w:r>
     </w:p>
     <w:p>
@@ -108,7 +108,7 @@
         <w:t xml:space="preserve">David: </w:t>
       </w:r>
       <w:r>
-        <w:t xml:space="preserve">Stellen Sie sich eine Werkstattkette mit vier Filialen vor, die Fahrräder, E-Bikes und Elektronik repariert. In unserem Szenario heißt sie FixWerk. Der Alltag dort läuft über Papierzettel, Excel-Listen und Telefon. Das führt zu vier Problemen. Erstens: Der Kunde gibt sein Gerät ab und hört dann nichts mehr. Ob der Kostenvoranschlag freizugeben ist oder das Gerät fertig ist, erfährt er, wenn er anruft. Zweitens: Niemand weiß ohne Nachfrage, wo ein Auftrag gerade steht, weil Zettel und Listen auseinanderlaufen. Drittens: Jede Filiale bestellt Ersatzteile für sich, obwohl das Teil oft in der Nachbarfiliale liegt. Viertens: Termine werden nach Gefühl zugesagt, weil die Auslastung der Techniker nicht sichtbar ist. Die vier Punkte sind Annahmen unseres Szenarios, aber jeder, der schon einmal ein Gerät zur Reparatur gebracht hat, kennt mindestens eines davon.</w:t>
+        <w:t>Stellen Sie sich eine Werkstattkette mit vier Filialen vor, die Fahrräder, E-Bikes und Elektronik repariert. In unserem Szenario heißt sie FixWerk. Der Alltag dort läuft über Papierzettel, Excel-Listen und Telefon. Das führt zu vier Problemen. Erstens: Der Kunde gibt sein Gerät ab und hört dann nichts mehr. Ob der Kostenvoranschlag freizugeben ist oder das Gerät fertig ist, erfährt er, wenn er anruft. Zweitens: Niemand weiß ohne Nachfrage, wo ein Auftrag gerade steht, weil Zettel und Listen auseinanderlaufen. Drittens: Jede Filiale bestellt Ersatzteile für sich, obwohl das Teil oft in der Nachbarfiliale liegt. Viertens: Termine werden nach Gefühl zugesagt, weil die Auslastung der Techniker nicht sichtbar ist. Die vier Punkte sind Annahmen unseres Szenarios, aber jeder, der schon einmal ein Gerät zur Reparatur gebracht hat, kennt mindestens eines davon.</w:t>
       </w:r>
     </w:p>
     <w:p>
@@ -125,7 +125,7 @@
         <w:rPr>
           <w:i/>
         </w:rPr>
-        <w:t xml:space="preserve">  (50 s)</w:t>
+        <w:t xml:space="preserve">  (65 s)</w:t>
       </w:r>
     </w:p>
     <w:p>
@@ -133,10 +133,10 @@
         <w:rPr>
           <w:b/>
         </w:rPr>
-        <w:t xml:space="preserve">Adrian: </w:t>
+        <w:t xml:space="preserve">David: </w:t>
       </w:r>
       <w:r>
-        <w:t xml:space="preserve">RepairFlow ist unsere Antwort darauf. Wichtig für die Einordnung: Wir sind nicht die Werkstatt, wir sind das Software-Startup. FixWerk ist unser Pilotkunde, an dessen Abläufen wir die Plattform entworfen haben. RepairFlow ist eine Cloud-Plattform, die den ganzen Reparatur-Lebenszyklus abdeckt, von der ersten Anfrage bis zur Abholung und Reklamation. Sie besteht aus vier Modulen: dem Kundenportal mit App, dem Auftrags- und Werkstattmodul, dem Dispositionsmodul für Ersatzteile und der Abrechnung. Die physische Reparatur, die Lieferantensysteme und die Buchhaltung bleiben außerhalb.</w:t>
+        <w:t>RepairFlow ist unsere Antwort darauf. Wichtig für die Einordnung: Wir sind nicht die Werkstatt, wir sind das Software-Startup. FixWerk ist unser Pilotkunde, an dessen Abläufen wir die Plattform entworfen haben. RepairFlow ist eine Cloud-Plattform, die den ganzen Reparatur-Lebenszyklus abdeckt, von der ersten Anfrage bis zur Abholung und Reklamation. Sie besteht aus vier Modulen: dem Kundenportal mit App, dem Auftrags- und Werkstattmodul, dem Dispositionsmodul für Ersatzteile und der Abrechnung. Zielkunden sind unabhängige Werkstätten und kleine Ketten mit zwei bis zehn Filialen. Die physische Reparatur, die Lieferantensysteme und die Buchhaltung bleiben außerhalb; dorthin gibt es nur Schnittstellen.</w:t>
       </w:r>
     </w:p>
     <w:p>
@@ -153,7 +153,7 @@
         <w:rPr>
           <w:i/>
         </w:rPr>
-        <w:t xml:space="preserve">  (60 s)</w:t>
+        <w:t xml:space="preserve">  (55 s)</w:t>
       </w:r>
     </w:p>
     <w:p>
@@ -161,10 +161,10 @@
         <w:rPr>
           <w:b/>
         </w:rPr>
-        <w:t xml:space="preserve">Adrian: </w:t>
+        <w:t xml:space="preserve">David: </w:t>
       </w:r>
       <w:r>
-        <w:t xml:space="preserve">Was hat die Werkstatt davon? Drei Dinge. Erstens: eine Plattform für alle drei Gerätearten, mit einer Kundenbasis und einem gemeinsamen Ersatzteillager. Zweitens: filialübergreifende Disposition. RepairFlow kennt die Bestände aller Standorte, reserviert dort, wo das Teil liegt, und bestellt nur, was nirgends vorhanden ist. Das spart Lieferzeit und Doppelbestellungen. Drittens: der Kunde bekommt Klarheit, bevor er die Werkstatt betritt. Mit einem Foto aus der App erhält er einen Diagnosevorschlag, einen vorläufigen Kostenvoranschlag und einen Termin. Für die Werkstatt heißt das weniger Telefon, weniger Standzeit im Lager und eine Auslastung, die sie wirklich sieht.</w:t>
+        <w:t>Was hat die Werkstatt davon? Drei Dinge. Erstens: eine Plattform für alle drei Gerätearten, mit einer Kundenbasis und einem gemeinsamen Ersatzteillager. Zweitens: filialübergreifende Disposition. RepairFlow kennt die Bestände aller Standorte, reserviert dort, wo das Teil liegt, und bestellt nur, was nirgends vorhanden ist. Drittens: Der Kunde bekommt Klarheit, bevor er die Werkstatt betritt, mit Diagnosevorschlag, vorläufigem Kostenvoranschlag und Termin. Für die Werkstatt heißt das weniger Telefon, weniger Standzeit im Lager und eine Auslastung, die sie wirklich sieht. Wie das für einen einzelnen Auftrag aussieht, zeigt Kilian.</w:t>
       </w:r>
     </w:p>
     <w:p>
@@ -181,7 +181,7 @@
         <w:rPr>
           <w:i/>
         </w:rPr>
-        <w:t xml:space="preserve">  (55 s)</w:t>
+        <w:t xml:space="preserve">  (65 s)</w:t>
       </w:r>
     </w:p>
     <w:p>
@@ -189,10 +189,10 @@
         <w:rPr>
           <w:b/>
         </w:rPr>
-        <w:t xml:space="preserve">David: </w:t>
+        <w:t xml:space="preserve">Kilian: </w:t>
       </w:r>
       <w:r>
-        <w:t xml:space="preserve">Der Kunde schickt per App ein Foto oder Video und bekommt innerhalb einer Minute Vorschlag, vorläufigen Kostenvoranschlag und Terminvorschlag. In der Filiale wird das Gerät registriert und der Auftrag angelegt. Der Techniker prüft den Vorschlag, stellt die Diagnose und erstellt den Kostenvoranschlag, den der Kunde in der App freigibt. Dann disponiert RepairFlow die Teile über alle Filialen und bestellt Fehlteile beim Lieferanten. Nach der Reparatur folgt die Endkontrolle, der Kunde wird benachrichtigt, holt ab und zahlt. Jeder dieser Schritte ist ein Status des Reparaturauftrags: angenommen, in Diagnose, KVA offen, freigegeben, Teile bestellt, in Reparatur, fertig, abgeholt. Dieser Zustandsautomat ist der rote Faden durch alle unsere Modelle.</w:t>
+        <w:t>So sieht eine Reparatur mit RepairFlow aus. Der Kunde schickt per App ein Foto oder Video und bekommt innerhalb einer Minute Vorschlag, vorläufigen Kostenvoranschlag und Terminvorschlag. In der Filiale wird das Gerät registriert und der Auftrag angelegt. Der Techniker prüft den Vorschlag, stellt die Diagnose und erstellt den Kostenvoranschlag, den der Kunde in der App freigibt. Dann disponiert RepairFlow die Teile über alle Filialen und bestellt Fehlteile beim Lieferanten. Nach der Reparatur folgt die Endkontrolle, der Kunde wird benachrichtigt, holt ab und zahlt. Jeder dieser Schritte ist ein Status des Reparaturauftrags: angenommen, in Diagnose, KVA offen, freigegeben, Teile bestellt, in Reparatur, fertig, abgeholt. Dieser Zustandsautomat ist der rote Faden durch alle unsere Modelle. Welche Abläufe dahinterstecken, zeigt Maximilian an drei Beispielen.</w:t>
       </w:r>
     </w:p>
     <w:p>
@@ -203,7 +203,7 @@
         <w:rPr>
           <w:b/>
         </w:rPr>
-        <w:t>Folie 7 – KI-Sofortdiagnose: KVA in 60 Sekunden</w:t>
+        <w:t>Folie 7 – Drei Prozess-Highlights</w:t>
       </w:r>
       <w:r>
         <w:rPr>
@@ -217,10 +217,10 @@
         <w:rPr>
           <w:b/>
         </w:rPr>
-        <w:t xml:space="preserve">Adrian: </w:t>
+        <w:t xml:space="preserve">Maximilian: </w:t>
       </w:r>
       <w:r>
-        <w:t xml:space="preserve">Unser Alleinstellungsmerkmal ist die KI-Sofortdiagnose, die Sie gerade in der Auftragsreise gesehen haben. Fünf Schritte: Der Kunde nimmt Foto, Video oder Ton auf. Ein KI-Dienst erkennt Gerätetyp, wahrscheinliche Ursache und benötigte Teile. RepairFlow rechnet daraus einen vorläufigen Kostenvoranschlag, prüft die Verfügbarkeit in allen Filialen und reserviert vor. Zum Schluss schlägt es Filiale und Termin vor, und der Kunde bestätigt. Uns war wichtig, das glaubwürdig zu halten. Heute machbar ist die Erkennung sichtbarer Schäden per Bildanalyse, etwa ein gebrochenes Display oder eine gerissene Kette, dazu ein Vorab-KVA aus Teilepreisen und Aufwandsrichtwerten. Vision sind Geräuschanalyse bei E-Bike-Motoren und eine Aufwandsschätzung aus Video. Deshalb bleibt der Vorschlag immer vorläufig: Der Techniker bestätigt oder korrigiert ihn, und erst dann wird daraus ein verbindlicher Kostenvoranschlag. Die Medien werden nur mit Einwilligung verarbeitet und nach Abschluss gelöscht.</w:t>
+        <w:t>Hinter jedem dieser Schritte steht ein Geschäftsprozess. Drei Stellen zeigen, was die Prozesse leisten. Erstens der Kostenvoranschlag in Prozess 04: Nach dem Versand wartet ein ereignisbasiertes Gateway auf Freigabe, Ablehnung oder den Ablauf von drei Tagen. Bei Fristablauf erinnert RepairFlow den Kunden, höchstens zweimal. Nach dem dritten Fristablauf ohne Antwort gilt der KVA als abgelehnt und das Gerät geht mit Diagnosepauschale zur Abholung. Kein Auftrag bleibt liegen. Zweitens die Disposition in Prozess 05: Für jedes benötigte Teil läuft parallel eine Prüfung, erst im eigenen Lager, dann in den anderen Filialen. Was lokal liegt, wird reserviert, was anderswo liegt, umgelagert, und nur Fehlteile werden bestellt. Drittens die Reklamation in Prozess 09: Der Techniker prüft den Mangel, RepairFlow entscheidet nach Regel über Gewährleistung, und im Gewährleistungsfall entsteht ein kostenfreier Nacharbeitsauftrag, der wieder durch die normale Auftragsreise läuft. Wie sich das für den Kunden anfühlt, zeige ich Ihnen jetzt in der App.</w:t>
       </w:r>
     </w:p>
     <w:p>
@@ -237,7 +237,7 @@
         <w:rPr>
           <w:i/>
         </w:rPr>
-        <w:t xml:space="preserve">  (60 s)</w:t>
+        <w:t xml:space="preserve">  (70 s)</w:t>
       </w:r>
     </w:p>
     <w:p>
@@ -245,10 +245,10 @@
         <w:rPr>
           <w:b/>
         </w:rPr>
-        <w:t xml:space="preserve">Adrian: </w:t>
+        <w:t xml:space="preserve">Maximilian: </w:t>
       </w:r>
       <w:r>
-        <w:t xml:space="preserve">Wie sich das für den Kunden anfühlt, zeige ich Ihnen kurz in der App. Der Kunde wählt sein Gerät, beschreibt das Problem und lädt ein Foto hoch; im Modell ist das die Voranmeldung mit dem Medienanhang. Der KI-Dienst antwortet mit Ursache, benötigten Teilen und einer Konfidenz, das ist der KIDiagnosevorschlag. RepairFlow rechnet daraus das Angebot, deutlich als vorläufig markiert, und schlägt Filiale und Termin vor. Bestätigt der Kunde, sind die Teile vorreserviert und die Voranmeldung steht. Der eigentliche Reparaturauftrag entsteht erst, wenn das Gerät in der Filiale abgegeben wird. Zum Schluss sieht der Kunde den Status seines Auftrags entlang derselben Zustände, die David in der Auftragsreise gezeigt hat. Die KI-Antwort ist in der Demo simuliert; Ablauf und Begriffe sind genau die aus unseren Modellen.</w:t>
+        <w:t>Wir starten mit der Sofortdiagnose aus Kundensicht. Der Kunde wählt sein Gerät, beschreibt das Problem und lädt ein Foto hoch; im Modell ist das die Voranmeldung mit dem Medienanhang. Der KI-Dienst antwortet mit Ursache, benötigten Teilen und einer Konfidenz, das ist der KIDiagnosevorschlag. RepairFlow rechnet daraus das Angebot, deutlich als vorläufig markiert, und schlägt Filiale und Termin vor. Bestätigt der Kunde, sind die Teile vorreserviert und die Voranmeldung steht. Der eigentliche Reparaturauftrag entsteht erst, wenn das Gerät in der Filiale abgegeben wird. Zum Schluss sieht der Kunde den Status seines Auftrags entlang derselben Zustände, die Kilian in der Auftragsreise gezeigt hat. Die KI-Antwort ist in der Demo simuliert; Ablauf und Begriffe sind genau die aus unseren Modellen.</w:t>
       </w:r>
     </w:p>
     <w:p>
@@ -259,35 +259,7 @@
         <w:rPr>
           <w:b/>
         </w:rPr>
-        <w:t>Folie 9 – Was wir gebaut haben: Ergebnisse in Zahlen</w:t>
-      </w:r>
-      <w:r>
-        <w:rPr>
-          <w:i/>
-        </w:rPr>
-        <w:t xml:space="preserve">  (50 s)</w:t>
-      </w:r>
-    </w:p>
-    <w:p>
-      <w:r>
-        <w:rPr>
-          <w:b/>
-        </w:rPr>
-        <w:t xml:space="preserve">Maximilian: </w:t>
-      </w:r>
-      <w:r>
-        <w:t xml:space="preserve">Damit zur zweiten Hälfte: Was steckt hinter dieser Geschichte? Wir haben drei Modelle erstellt, die zusammenpassen. Zehn BPMN-Kollaborationsdiagramme mit 133 Aktivitäten im Werkstatt-Pool, dazu die Abläufe des Kunden mit 26 weiteren Aktivitäten. Ein Use-Case-Diagramm mit 19 Use Cases und 17 Akteuren. Ein vollständiges Klassendiagramm mit 27 Klassen und 36 Assoziationen. Sechs Sequenzdiagramme, gefordert waren fünf. Alle Modelle liegen im Camunda Modeler und in Visual Paradigm und werden mit der Dokumentation abgegeben. Ich beginne mit den Geschäftsprozessen.</w:t>
-      </w:r>
-    </w:p>
-    <w:p>
-      <w:pPr>
-        <w:spacing w:before="200"/>
-      </w:pPr>
-      <w:r>
-        <w:rPr>
-          <w:b/>
-        </w:rPr>
-        <w:t>Folie 10 – Zehn Prozesse, 61 Prozent automatisiert</w:t>
+        <w:t>Folie 9 – KI-Sofortdiagnose: KVA in 60 Sekunden</w:t>
       </w:r>
       <w:r>
         <w:rPr>
@@ -304,7 +276,7 @@
         <w:t xml:space="preserve">Maximilian: </w:t>
       </w:r>
       <w:r>
-        <w:t xml:space="preserve">Die zehn Prozesse decken den gesamten Lebenszyklus ab. Prozesse 01 bis 08 sind die durchgehende Auftragsreise: Sofortdiagnose, Annahme, Diagnose, Kostenvoranschlag, Ersatzteilreservierung, Bestellung, Reparatur und Abholung. 09 und 10 sind die Folgeprozesse Reklamation und Retoure. Jedes Diagramm ist eine Kollaboration: Der Werkstattbetrieb ist der ausführbare Pool mit den Lanes Service, Techniker, Werkstattleitung und Disposition, der Kunde hat seinen eigenen Ablauf, der Lieferant bleibt eine Black Box. Die wichtigste Zahl: 61 Prozent der Aktivitäten führt RepairFlow ohne manuelle Arbeit aus, also Statuswechsel, Benachrichtigungen, Verfügbarkeitsprüfungen, Berechnungen und Regeln. Was Handwerk ist, bleibt Handwerk: Diagnose, Reparatur und Endkontrolle sind Aktivitäten des Technikers mit Unterstützung durch das System.</w:t>
+        <w:t>Was Sie gerade in der App gesehen haben, ist unser Alleinstellungsmerkmal, die KI-Sofortdiagnose. Fünf Schritte: Der Kunde nimmt Foto, Video oder Ton auf. Ein KI-Dienst erkennt Gerätetyp, wahrscheinliche Ursache und benötigte Teile. RepairFlow rechnet daraus einen vorläufigen Kostenvoranschlag, prüft die Verfügbarkeit in allen Filialen und reserviert vor. Zum Schluss schlägt es Filiale und Termin vor, und der Kunde bestätigt. Heute machbar ist die Erkennung sichtbarer Schäden per Bildanalyse, etwa ein gebrochenes Display oder eine gerissene Kette, dazu ein Vorab-KVA aus Teilepreisen und Aufwandsrichtwerten. Vision sind Geräuschanalyse bei E-Bike-Motoren und eine Aufwandsschätzung aus Video. Deshalb bleibt der Vorschlag immer vorläufig: Der Techniker bestätigt oder korrigiert ihn. Die Medien werden nur mit Einwilligung verarbeitet und nach Abschluss gelöscht. Was hinter all dem steckt, zeigt Adrian.</w:t>
       </w:r>
     </w:p>
     <w:p>
@@ -315,13 +287,13 @@
         <w:rPr>
           <w:b/>
         </w:rPr>
-        <w:t>Folie 11 – Drei Prozess-Highlights</w:t>
+        <w:t>Folie 10 – Was wir gebaut haben: Ergebnisse in Zahlen</w:t>
       </w:r>
       <w:r>
         <w:rPr>
           <w:i/>
         </w:rPr>
-        <w:t xml:space="preserve">  (80 s)</w:t>
+        <w:t xml:space="preserve">  (50 s)</w:t>
       </w:r>
     </w:p>
     <w:p>
@@ -329,10 +301,38 @@
         <w:rPr>
           <w:b/>
         </w:rPr>
-        <w:t xml:space="preserve">Maximilian: </w:t>
+        <w:t xml:space="preserve">Adrian: </w:t>
       </w:r>
       <w:r>
-        <w:t xml:space="preserve">Drei Stellen zeigen, was die Prozesse leisten. Erstens der Kostenvoranschlag in Prozess 04: Nach dem Versand wartet ein ereignisbasiertes Gateway auf Freigabe, Ablehnung oder den Ablauf von drei Tagen. Bei Fristablauf erinnert RepairFlow den Kunden, höchstens zweimal. Nach dem dritten Fristablauf ohne Antwort gilt der KVA als abgelehnt und das Gerät geht mit Diagnosepauschale zur Abholung. Kein Auftrag bleibt liegen. Zweitens die Disposition in Prozess 05: Für jedes benötigte Teil läuft parallel eine Prüfung, erst im eigenen Lager, dann in den anderen Filialen. Was lokal liegt, wird reserviert, was anderswo liegt, umgelagert, und nur Fehlteile werden bestellt. Drittens die Reklamation in Prozess 09: Der Techniker prüft den Mangel, RepairFlow entscheidet nach Regel über Gewährleistung, und im Gewährleistungsfall entsteht ein kostenfreier Nacharbeitsauftrag, der wieder durch die normale Auftragsreise läuft. So bleibt das Modell schlank, weil die Reklamation keine eigene Reparaturlogik braucht.</w:t>
+        <w:t>Damit zur zweiten Hälfte: Was steckt hinter dieser Geschichte? Wir haben drei Modelle erstellt, die zusammenpassen. Zehn BPMN-Kollaborationsdiagramme mit 133 Aktivitäten im Werkstatt-Pool, dazu die Abläufe des Kunden. Ein Use-Case-Diagramm mit 19 Use Cases und 17 Rollen und Akteuren. Ein vollständiges Klassendiagramm mit 29 Klassen und 40 Assoziationen. Sechs Sequenzdiagramme, gefordert waren fünf, dazu ein Zustandsdiagramm für den Reparaturauftrag. Alle Modelle liegen im Camunda Modeler und in Visual Paradigm und werden mit der Dokumentation abgegeben.</w:t>
+      </w:r>
+    </w:p>
+    <w:p>
+      <w:pPr>
+        <w:spacing w:before="200"/>
+      </w:pPr>
+      <w:r>
+        <w:rPr>
+          <w:b/>
+        </w:rPr>
+        <w:t>Folie 11 – Zehn Prozesse, 61 Prozent automatisiert</w:t>
+      </w:r>
+      <w:r>
+        <w:rPr>
+          <w:i/>
+        </w:rPr>
+        <w:t xml:space="preserve">  (60 s)</w:t>
+      </w:r>
+    </w:p>
+    <w:p>
+      <w:r>
+        <w:rPr>
+          <w:b/>
+        </w:rPr>
+        <w:t xml:space="preserve">Adrian: </w:t>
+      </w:r>
+      <w:r>
+        <w:t>Die zehn Prozesse decken den gesamten Lebenszyklus ab. Prozesse 01 bis 08 sind die durchgehende Auftragsreise, 09 und 10 die Folgeprozesse Reklamation und Retoure; drei Highlights daraus hat Maximilian schon gezeigt. Jedes Diagramm ist eine Kollaboration: Der Werkstattbetrieb ist der ausführbare Pool mit den Lanes Service, Techniker, Werkstattleitung und Disposition, der Kunde hat seinen eigenen Ablauf, der Lieferant bleibt eine Black Box. Die wichtigste Zahl: 61 Prozent der Aktivitäten führt RepairFlow ohne manuelle Arbeit aus, also Statuswechsel, Benachrichtigungen, Prüfungen, Berechnungen und Regeln. Was Handwerk ist, bleibt Handwerk: Diagnose, Reparatur und Endkontrolle macht der Techniker mit Unterstützung durch das System. Wer im System welche Aufgaben hat, zeigt Kilian.</w:t>
       </w:r>
     </w:p>
     <w:p>
@@ -357,10 +357,10 @@
         <w:rPr>
           <w:b/>
         </w:rPr>
-        <w:t xml:space="preserve">David: </w:t>
+        <w:t xml:space="preserve">Kilian: </w:t>
       </w:r>
       <w:r>
-        <w:t xml:space="preserve">Das Use-Case-Diagramm beschreibt, was RepairFlow für seine Benutzer leistet. 19 Use Cases in vier Bereichen: das Kundenportal mit Sofortdiagnose, Voranmeldung und KVA-Freigabe; Auftrag und Werkstatt von der Annahme bis zur Reklamation; die Ersatzteil-Disposition von der Reservierung bis zur Retoure; und die Administration des Werkstattbetriebs. Eine Besonderheit geht auf das Coaching zurück: Jeder Use Case hat genau eine Rolle. Statt eines Technikers mit fünf Verbindungen gibt es jetzt Diagnoseprüfer, Diagnostiker, Kalkulator, Reparateur und Endkontrolleur. Welche Person welche Rolle ausfüllt, regelt die Werkstatt selbst; im Datenmodell sind die Rollen den Mitarbeitertypen zugeordnet. Das Diagramm ist dadurch sofort lesbar, und die Rollen tauchen in den Sequenzdiagrammen wieder auf. Dazu kommen der Kunde und der KI-Diagnosedienst als externes System. Der Lieferant ist bewusst kein Akteur: Er hat keinen Zugang zu RepairFlow und bleibt eine Black Box, mit der nur Nachrichten ausgetauscht werden.</w:t>
+        <w:t>Das Use-Case-Diagramm beschreibt, was RepairFlow für seine Benutzer leistet. 19 Use Cases in vier Bereichen: das Kundenportal mit Sofortdiagnose, Voranmeldung und KVA-Freigabe; Auftrag und Werkstatt von der Annahme bis zur Reklamation; die Ersatzteil-Disposition von der Reservierung bis zur Retoure; und die Administration des Werkstattbetriebs. Eine Besonderheit geht auf das Coaching zurück: Jeder Use Case hat genau eine Rolle. Statt eines Technikers mit fünf Verbindungen gibt es Diagnoseprüfer, Diagnostiker, Kalkulator, Reparateur und Endkontrolleur. Welche Person welche Rolle ausfüllt, regelt die Werkstatt selbst; im Datenmodell sind die Rollen den Mitarbeitertypen zugeordnet. Dazu kommen der Kunde und der KI-Diagnosedienst als externes System. Der Lieferant ist bewusst kein Akteur: Er hat keinen Zugang zu RepairFlow und bleibt eine Black Box.</w:t>
       </w:r>
     </w:p>
     <w:p>
@@ -388,7 +388,7 @@
         <w:t xml:space="preserve">Kilian: </w:t>
       </w:r>
       <w:r>
-        <w:t xml:space="preserve">Das Klassendiagramm ist ein einziges, vollständiges Modell mit 27 Klassen. Fünf Entscheidungen prägen es. Erstens: Der Reparaturauftrag ist die Aggregatwurzel. Befund und Reparaturschritte existieren nur mit ihrem Auftrag und sind deshalb Kompositionen, Kostenvoranschlag und Gerät sind nur zugeordnet, weil der Vorab-KVA schon vor dem Auftrag entsteht. Zweitens: Der Lagerbestand ist eine eigene Klasse zwischen Ersatzteil und Filiale. Nur so lässt sich die Verfügbarkeit über alle Filialen prüfen. Drittens: Die Reservierung ist eine eigene Klasse mit Lebenszyklus, vorreserviert, reserviert, entnommen, storniert. Viertens: Der Werkstattbetrieb ist der Mandant, und die Mitarbeiter sind nach Typ spezialisiert, Servicemitarbeiter, Techniker, Disponent und Werkstattleiter, passend zu den Lanes in BPMN und zu den Rollen im Use-Case-Diagramm. Fünftens: Voranmeldung, Medienanhang und KI-Diagnosevorschlag tragen die Sofortdiagnose. Die sechs Sequenzdiagramme verwenden ausschließlich Operationen dieser Klassen; jede Botschaft an ein Objekt ist eine Operation des Klassendiagramms. Ein Beispiel ist SD4, die Fertigmeldung: Besteht der Auftrag auch nach der zweiten Nacharbeit die Endkontrolle nicht, ruft der Endkontrolleur wechsleStatus mit dem Wert ABGELEHNT auf, also genau die Operation, die der Reparaturauftrag im Klassendiagramm anbietet. Gezeichnet ist alles in Visual Paradigm, die Sequenzdiagramme hängen als Unterdiagramme an ihren Use Cases.</w:t>
+        <w:t>Das Klassendiagramm ist ein einziges, vollständiges Modell mit 29 Klassen. Fünf Entscheidungen prägen es. Erstens: Der Reparaturauftrag ist die Aggregatwurzel. Befund und Reparaturschritte sind Kompositionen, Kostenvoranschlag und Gerät nur zugeordnet, weil der Vorab-KVA schon vor dem Auftrag entsteht. Zweitens: Der Lagerbestand ist eine eigene Klasse zwischen Ersatzteil und Filiale; nur so lässt sich die Verfügbarkeit über alle Filialen prüfen. Drittens: Die Reservierung ist eine eigene Klasse mit Lebenszyklus. Viertens: Der Werkstattbetrieb ist Mandant und Sammelstelle. Er kennt alle Aufträge, Bestellungen und Reklamationen und findet sie über ihre Nummer. Die Mitarbeiter sind nach Typ spezialisiert, passend zu Lanes und Rollen, und arbeiten wie der Kunde nie direkt mit den Fachobjekten, sondern über zwei Oberflächenklassen, die Werkstattoberfläche und die KundenApp. Fünftens: Voranmeldung, Medienanhang und KI-Diagnosevorschlag tragen die Sofortdiagnose. Ein Beispiel aus den Sequenzdiagrammen ist SD4, die Fertigmeldung: Der Endkontrolleur gibt die Auftragsnummer ein, die Werkstattoberfläche sucht den Auftrag und arbeitet mit diesem Objekt; nach jeder Nacharbeit sucht sie ihn neu. Besteht er auch nach der zweiten Nacharbeit die Endkontrolle nicht, ruft sie wechsleStatus mit dem Wert ABGELEHNT auf, genau die Operation, die der Reparaturauftrag im Klassendiagramm anbietet.</w:t>
       </w:r>
     </w:p>
     <w:p>
@@ -399,13 +399,13 @@
         <w:rPr>
           <w:b/>
         </w:rPr>
-        <w:t>Folie 14 – Vorgehen und Projektmanagement</w:t>
+        <w:t>Folie 14 – Qualität: Konventionen, Linter, Konsistenz</w:t>
       </w:r>
       <w:r>
         <w:rPr>
           <w:i/>
         </w:rPr>
-        <w:t xml:space="preserve">  (90 s)</w:t>
+        <w:t xml:space="preserve">  (65 s)</w:t>
       </w:r>
     </w:p>
     <w:p>
@@ -413,10 +413,10 @@
         <w:rPr>
           <w:b/>
         </w:rPr>
-        <w:t xml:space="preserve">Kilian: </w:t>
+        <w:t xml:space="preserve">Jakob: </w:t>
       </w:r>
       <w:r>
-        <w:t xml:space="preserve">Gearbeitet haben wir in Sprints, die sich am Takt der vier Gruppentermine orientiert haben, mit Review, Retrospektive und Planning je Termin. Nina hat die Projektleitung, David die Stellvertretung und die Sicherungen, Adrian ist Product Owner, ich Scrum Master, Maximilian verantwortet BPMN, Jakob die Qualität. Alles Schriftliche liegt in einem GitHub-Repository; jede Änderung geht über einen eigenen Branch, einen Pull Request und ein Review durch eine zweite Person. Das Trello-Board hat eine Liste je Termin und eine Karte je Person und Aufgabe. Jedes Diagramm ist denselben Weg gegangen: Entwurf im Zweierteam, gegenseitiges Review, Abstimmung im Gruppentermin und erst dann die Umsetzung über einen Pull Request. Als Scrum Master war mir wichtig, dass Entscheidungen nicht im Gruppenchat verloren gehen: Alles, was mehrere betrifft, steht im Entscheidungslog mit Begründung und Datum. Das hat uns bei jeder Korrektur geholfen, weil wir nachvollziehen konnten, warum ein Modell sich über mehrere Veränderungen entwickelt hat. So sind aus den ersten Entwürfen Schritt für Schritt die Modelle geworden, die Sie heute sehen.</w:t>
+        <w:t>Drei Modelle, die sich auf dieselben Dinge beziehen, laufen schnell auseinander. Dagegen hatten wir drei Mittel. Erstens Konventionen: Datenobjekte in BPMN tragen die Klassennamen, Aktivitäten heißen Verb plus Objekt, jede Rolle ist genau einer Lane und einer Klasse zugeordnet, die Statuswerte sind in allen Modellen identisch, und in jedem Sequenzdiagramm geht der Weg vom Akteur über die Oberfläche zum Objekt. Zweitens Werkzeuge: Die BPMN-Dateien sind für Camunda 8 angereichert, mit Task-Definitionen, Timern und Bedingungen; der Camunda-Linter und bpmnlint melden null Befunde. Drittens Prüfrunden: Jedes Diagramm wurde im Zweierteam geprüft, und jede Änderung wird gegen unsere QA-Checkliste geprüft, bevor sie gemergt wird. Ein Beispiel: Als wir die Nacharbeit in Prozess 07 auf zwei Durchläufe begrenzt haben, musste das Sequenzdiagramm SD4 nachziehen. Genau solche Stellen findet die Checkliste.</w:t>
       </w:r>
     </w:p>
     <w:p>
@@ -427,13 +427,13 @@
         <w:rPr>
           <w:b/>
         </w:rPr>
-        <w:t>Folie 15 – Qualität: Konventionen, Linter, Konsistenz</w:t>
+        <w:t>Folie 15 – Herausforderungen und Lernerfahrungen</w:t>
       </w:r>
       <w:r>
         <w:rPr>
           <w:i/>
         </w:rPr>
-        <w:t xml:space="preserve">  (70 s)</w:t>
+        <w:t xml:space="preserve">  (65 s)</w:t>
       </w:r>
     </w:p>
     <w:p>
@@ -444,7 +444,7 @@
         <w:t xml:space="preserve">Jakob: </w:t>
       </w:r>
       <w:r>
-        <w:t xml:space="preserve">Drei Modelle, die sich auf dieselben Dinge beziehen, laufen schnell auseinander. Dagegen hatten wir drei Mittel. Erstens Konventionen: Datenobjekte in BPMN tragen die Klassennamen, Aktivitäten heißen Verb plus Objekt, jede Rolle ist genau einer Lane und einer Klasse zugeordnet, und die Statuswerte sind in allen Modellen identisch. Zweitens Werkzeuge: Die BPMN-Dateien sind für Camunda 8 angereichert, mit Task-Definitionen, Timern und Bedingungen. Der Camunda-Linter und bpmnlint melden null Befunde. Drittens Reviews: Jedes Diagramm wurde im Zweierteam geprüft und in den Gruppenterminen gemeinsam abgestimmt. Jede Änderung wird gegen unsere QA-Checkliste geprüft, bevor sie gemergt wird. Ein Beispiel: Als wir die Nacharbeit in Prozess 07 auf zwei Durchläufe begrenzt haben, musste das Sequenzdiagramm SD4 nachziehen. Genau solche Stellen findet die Checkliste.</w:t>
+        <w:t>Vier Dinge haben uns am meisten beschäftigt. Die Perspektive: Werkstatt oder Softwareanbieter? Die Rückfrage des Dozenten hat uns zur klaren Entscheidung gezwungen, und danach mussten Texte und Klassenmodell nachziehen. Das Vokabular: Datenobjekte, Klassen, Lebenslinien und Statuswerte müssen wortgleich sein, sonst zerfällt die Analyse in drei Einzelmodelle. Die Werkzeuge: Der Camunda Modeler meldet für Camunda 8 fehlende technische Details als Fehler, und wir haben die Diagramme so lange angereichert, bis nichts mehr rot war. Und die Vision: Die KI-Sofortdiagnose soll beeindrucken, aber glaubwürdig bleiben. Gelernt haben wir, dass Konsistenz keine Prüfung am Ende ist, sondern eine Regel bei jeder Änderung, und dass klare Hinweise von außen, etwa zum Use-Case-Diagramm und zu den Oberflächen in den Sequenzdiagrammen, ein Modell deutlich besser machen. Wie wir zusammengearbeitet haben, zeigt Nina.</w:t>
       </w:r>
     </w:p>
     <w:p>
@@ -455,13 +455,13 @@
         <w:rPr>
           <w:b/>
         </w:rPr>
-        <w:t>Folie 16 – Herausforderungen und Lernerfahrungen</w:t>
+        <w:t>Folie 16 – Vorgehen und Projektmanagement</w:t>
       </w:r>
       <w:r>
         <w:rPr>
           <w:i/>
         </w:rPr>
-        <w:t xml:space="preserve">  (70 s)</w:t>
+        <w:t xml:space="preserve">  (65 s)</w:t>
       </w:r>
     </w:p>
     <w:p>
@@ -469,10 +469,10 @@
         <w:rPr>
           <w:b/>
         </w:rPr>
-        <w:t xml:space="preserve">Jakob: </w:t>
+        <w:t xml:space="preserve">Nina: </w:t>
       </w:r>
       <w:r>
-        <w:t xml:space="preserve">Vier Dinge haben uns am meisten beschäftigt. Die Perspektive: Werkstatt oder Softwareanbieter? Die Rückfrage des Dozenten hat uns zur klaren Entscheidung gezwungen, und danach mussten Texte und Klassenmodell nachziehen. Das Vokabular: Datenobjekte, Klassen, Lebenslinien und Statuswerte müssen wortgleich sein, sonst zerfällt die Analyse in drei Einzelmodelle. Die Werkzeuge: Der Camunda Modeler meldet für Camunda 8 fehlende technische Details als Fehler, und wir haben die Diagramme so lange angereichert, bis nichts mehr rot war. Und die Vision: Die KI-Sofortdiagnose soll beeindrucken, aber glaubwürdig bleiben, deshalb die Trennung in heute machbar und Vision. Gelernt haben wir, dass Konsistenz keine Prüfung am Ende ist, sondern eine Regel bei jeder Änderung. Und dass ein klarer Hinweis von außen, wie der zum Use-Case-Diagramm, ein Modell deutlich besser machen kann.</w:t>
+        <w:t>Gearbeitet haben wir in Sprints im Takt der vier Gruppentermine, mit Review, Retrospektive und Planning je Termin. Ich habe die Projektleitung, David die Stellvertretung und die Sicherungen, Adrian ist Product Owner, Kilian Scrum Master, Maximilian verantwortet BPMN, Jakob die Qualität. Alles Schriftliche liegt in einem GitHub-Repository; jede Änderung geht über einen eigenen Branch, einen Pull Request und ein Review durch eine zweite Person. Das Trello-Board hat eine Liste je Termin und eine Karte je Person und Aufgabe. Jedes Diagramm ist denselben Weg gegangen: Entwurf im Zweierteam, gegenseitiges Review, Abstimmung im Gruppentermin und erst dann die Umsetzung über einen Pull Request. Entscheidungen, die mehrere betreffen, stehen mit Begründung und Datum im Entscheidungslog; so konnten wir bei jeder Korrektur nachvollziehen, warum ein Modell so aussieht.</w:t>
       </w:r>
     </w:p>
     <w:p>
@@ -489,7 +489,7 @@
         <w:rPr>
           <w:i/>
         </w:rPr>
-        <w:t xml:space="preserve">  (70 s)</w:t>
+        <w:t xml:space="preserve">  (60 s)</w:t>
       </w:r>
     </w:p>
     <w:p>
@@ -500,7 +500,7 @@
         <w:t xml:space="preserve">Nina: </w:t>
       </w:r>
       <w:r>
-        <w:t xml:space="preserve">Zum Schluss der Blick nach vorn. RepairFlow wird als Abo je Filiale angeboten, in zwei Stufen: Basis mit Auftrags- und Kundenverwaltung, Pro mit filialübergreifender Disposition und KI-Sofortdiagnose. Zielkunden sind unabhängige Werkstätten und kleine Ketten mit zwei bis zehn Filialen im deutschsprachigen Raum. Das sind Betriebe, die heute genau die vier Probleme vom Anfang haben und für die ein großes Werkstattsystem zu schwer ist. Der Ausblick geht in drei Richtungen: Predictive Disposition, also eine Bedarfsprognose je Filiale und Saison, damit Teile vor der Nachfrage im Lager liegen. Ein Techniker-Copilot, der Reparaturschritte aus der Historie vorschlägt. Und eine digitale Geräteakte, in der jedes Gerät seine Reparaturgeschichte behält. Nichts davon ist modelliert, aber alles baut auf dem Datenmodell auf, das wir heute vorgestellt haben.</w:t>
+        <w:t>Zum Schluss der Blick nach vorn. RepairFlow wird als Abo je Filiale angeboten, in zwei Stufen: Basis mit Auftrags- und Kundenverwaltung, Pro mit filialübergreifender Disposition und KI-Sofortdiagnose. Zielkunden sind unabhängige Werkstätten und kleine Ketten mit zwei bis zehn Filialen im deutschsprachigen Raum, also genau die Betriebe mit den vier Problemen vom Anfang. Der Ausblick geht in drei Richtungen: Predictive Disposition, also eine Bedarfsprognose je Filiale und Saison. Ein Techniker-Copilot, der Reparaturschritte aus der Historie vorschlägt. Und eine digitale Geräteakte, in der jedes Gerät seine Reparaturgeschichte behält. Nichts davon ist modelliert, aber alles baut auf dem Datenmodell auf, das wir heute vorgestellt haben.</w:t>
       </w:r>
     </w:p>
     <w:p>
@@ -528,7 +528,7 @@
         <w:t xml:space="preserve">Nina: </w:t>
       </w:r>
       <w:r>
-        <w:t xml:space="preserve">RepairFlow löst den Medienbruch aus Papier, Excel und Telefon und macht den Reparaturauftrag zum zentralen Zustandsautomaten. Der fachliche Mehrwert liegt in der filialübergreifenden Disposition und in der KI-Sofortdiagnose, die dem Kunden Klarheit gibt, bevor er die Werkstatt betritt. Vielen Dank für Ihre Aufmerksamkeit. Wir freuen uns auf Ihre Fragen.</w:t>
+        <w:t>RepairFlow löst den Medienbruch aus Papier, Excel und Telefon und macht den Reparaturauftrag zum zentralen Zustandsautomaten. Der fachliche Mehrwert liegt in der filialübergreifenden Disposition und in der KI-Sofortdiagnose, die dem Kunden Klarheit gibt, bevor er die Werkstatt betritt. Vielen Dank für Ihre Aufmerksamkeit. Wir freuen uns auf Ihre Fragen.</w:t>
       </w:r>
     </w:p>
     <w:p>
@@ -540,6 +540,11 @@
           <w:b/>
         </w:rPr>
         <w:t>Folie 19 – Anhang: Beiträge der Vortragenden</w:t>
+      </w:r>
+      <w:r>
+        <w:rPr>
+          <w:i/>
+        </w:rPr>
       </w:r>
     </w:p>
     <w:p>

</xml_diff>

<commit_message>
docs: Praesentation und Sprechtext an Doku und Diagramme angeglichen (Vorreservierung nach Bestaetigung, Freigabe Nacharbeit, Status abgelehnt, Agenda, Coaching-Hinweise)
</commit_message>
<xml_diff>
--- a/4_praesentation/Sprechtext_Abschlusspraesentation.docx
+++ b/4_praesentation/Sprechtext_Abschlusspraesentation.docx
@@ -24,7 +24,7 @@
         <w:t xml:space="preserve">Redezeit je Person: </w:t>
       </w:r>
       <w:r>
-        <w:t>Nina 3:45, David 3:15, Kilian 3:55, Maximilian 3:40, Adrian 1:50, Jakob 2:10 · gesamt 18:35.</w:t>
+        <w:t>Nina 3:45, David 3:15, Kilian 4:00, Maximilian 3:40, Adrian 1:50, Jakob 2:10 · gesamt 18:40.</w:t>
       </w:r>
     </w:p>
     <w:p>
@@ -181,7 +181,7 @@
         <w:rPr>
           <w:i/>
         </w:rPr>
-        <w:t xml:space="preserve">  (65 s)</w:t>
+        <w:t xml:space="preserve">  (70 s)</w:t>
       </w:r>
     </w:p>
     <w:p>
@@ -192,7 +192,7 @@
         <w:t xml:space="preserve">Kilian: </w:t>
       </w:r>
       <w:r>
-        <w:t>So sieht eine Reparatur mit RepairFlow aus. Der Kunde schickt per App ein Foto oder Video und bekommt innerhalb einer Minute Vorschlag, vorläufigen Kostenvoranschlag und Terminvorschlag. In der Filiale wird das Gerät registriert und der Auftrag angelegt. Der Techniker prüft den Vorschlag, stellt die Diagnose und erstellt den Kostenvoranschlag, den der Kunde in der App freigibt. Dann disponiert RepairFlow die Teile über alle Filialen und bestellt Fehlteile beim Lieferanten. Nach der Reparatur folgt die Endkontrolle, der Kunde wird benachrichtigt, holt ab und zahlt. Jeder dieser Schritte ist ein Status des Reparaturauftrags: angenommen, in Diagnose, KVA offen, freigegeben, Teile bestellt, in Reparatur, fertig, abgeholt. Dieser Zustandsautomat ist der rote Faden durch alle unsere Modelle. Welche Abläufe dahinterstecken, zeigt Maximilian an drei Beispielen.</w:t>
+        <w:t>So sieht eine Reparatur mit RepairFlow aus. Der Kunde schickt per App ein Foto oder Video und bekommt innerhalb einer Minute Vorschlag, vorläufigen Kostenvoranschlag und Terminvorschlag. In der Filiale wird das Gerät registriert und der Auftrag angelegt. Der Techniker prüft den Vorschlag, stellt die Diagnose und erstellt den Kostenvoranschlag, den der Kunde in der App freigibt. Dann disponiert RepairFlow die Teile über alle Filialen und bestellt Fehlteile beim Lieferanten. Nach der Reparatur folgt die Endkontrolle, der Kunde wird benachrichtigt, holt ab und zahlt. Jeder dieser Schritte ist ein Status des Reparaturauftrags: angenommen, in Diagnose, KVA offen, freigegeben, Teile bestellt, in Reparatur, fertig, abgeholt, und abgelehnt, wenn der Kunde den KVA ablehnt oder die Reparatur scheitert. Dieser Zustandsautomat ist der rote Faden durch alle unsere Modelle. Welche Abläufe dahinterstecken, zeigt Maximilian an drei Beispielen.</w:t>
       </w:r>
     </w:p>
     <w:p>
@@ -220,7 +220,7 @@
         <w:t xml:space="preserve">Maximilian: </w:t>
       </w:r>
       <w:r>
-        <w:t>Hinter jedem dieser Schritte steht ein Geschäftsprozess. Drei Stellen zeigen, was die Prozesse leisten. Erstens der Kostenvoranschlag in Prozess 04: Nach dem Versand wartet ein ereignisbasiertes Gateway auf Freigabe, Ablehnung oder den Ablauf von drei Tagen. Bei Fristablauf erinnert RepairFlow den Kunden, höchstens zweimal. Nach dem dritten Fristablauf ohne Antwort gilt der KVA als abgelehnt und das Gerät geht mit Diagnosepauschale zur Abholung. Kein Auftrag bleibt liegen. Zweitens die Disposition in Prozess 05: Für jedes benötigte Teil läuft parallel eine Prüfung, erst im eigenen Lager, dann in den anderen Filialen. Was lokal liegt, wird reserviert, was anderswo liegt, umgelagert, und nur Fehlteile werden bestellt. Drittens die Reklamation in Prozess 09: Der Techniker prüft den Mangel, RepairFlow entscheidet nach Regel über Gewährleistung, und im Gewährleistungsfall entsteht ein kostenfreier Nacharbeitsauftrag, der wieder durch die normale Auftragsreise läuft. Wie sich das für den Kunden anfühlt, zeige ich Ihnen jetzt in der App.</w:t>
+        <w:t>Hinter jedem dieser Schritte steht ein Geschäftsprozess. Drei Stellen zeigen, was die Prozesse leisten. Erstens der Kostenvoranschlag in Prozess 04: Nach dem Versand wartet ein ereignisbasiertes Gateway auf Freigabe, Ablehnung oder den Ablauf von drei Tagen. Bei Fristablauf erinnert RepairFlow den Kunden, höchstens zweimal. Nach dem dritten Fristablauf ohne Antwort gilt der KVA als abgelehnt und das Gerät geht mit Diagnosepauschale zur Abholung. Kein Auftrag bleibt liegen. Zweitens die Disposition in Prozess 05: Für jedes benötigte Teil läuft parallel eine Prüfung, erst im eigenen Lager, dann in den anderen Filialen. Was lokal liegt, wird reserviert, was anderswo liegt, umgelagert, und nur Fehlteile werden bestellt. Drittens die Reklamation in Prozess 09: Der Techniker prüft den Mangel, RepairFlow entscheidet nach Regel über Gewährleistung, und im Gewährleistungsfall gibt die Werkstattleitung einen kostenfreien Nacharbeitsauftrag frei, der wieder durch die normale Auftragsreise läuft. Wie sich das für den Kunden anfühlt, zeige ich Ihnen jetzt in der App.</w:t>
       </w:r>
     </w:p>
     <w:p>
@@ -276,7 +276,7 @@
         <w:t xml:space="preserve">Maximilian: </w:t>
       </w:r>
       <w:r>
-        <w:t>Was Sie gerade in der App gesehen haben, ist unser Alleinstellungsmerkmal, die KI-Sofortdiagnose. Fünf Schritte: Der Kunde nimmt Foto, Video oder Ton auf. Ein KI-Dienst erkennt Gerätetyp, wahrscheinliche Ursache und benötigte Teile. RepairFlow rechnet daraus einen vorläufigen Kostenvoranschlag, prüft die Verfügbarkeit in allen Filialen und reserviert vor. Zum Schluss schlägt es Filiale und Termin vor, und der Kunde bestätigt. Heute machbar ist die Erkennung sichtbarer Schäden per Bildanalyse, etwa ein gebrochenes Display oder eine gerissene Kette, dazu ein Vorab-KVA aus Teilepreisen und Aufwandsrichtwerten. Vision sind Geräuschanalyse bei E-Bike-Motoren und eine Aufwandsschätzung aus Video. Deshalb bleibt der Vorschlag immer vorläufig: Der Techniker bestätigt oder korrigiert ihn. Die Medien werden nur mit Einwilligung verarbeitet und nach Abschluss gelöscht. Was hinter all dem steckt, zeigt Adrian.</w:t>
+        <w:t>Was Sie gerade in der App gesehen haben, ist unser Alleinstellungsmerkmal, die KI-Sofortdiagnose. Fünf Schritte: Der Kunde nimmt Foto, Video oder Ton auf. Ein KI-Dienst erkennt Gerätetyp, wahrscheinliche Ursache und benötigte Teile. RepairFlow rechnet daraus einen vorläufigen Kostenvoranschlag, prüft die Verfügbarkeit in allen Filialen und schlägt Filiale und Termin vor. Bestätigt der Kunde den Termin, werden die Teile vorreserviert. Heute machbar ist die Erkennung sichtbarer Schäden per Bildanalyse, etwa ein gebrochenes Display oder eine gerissene Kette, dazu ein Vorab-KVA aus Teilepreisen und Aufwandsrichtwerten. Vision sind Geräuschanalyse bei E-Bike-Motoren und eine Aufwandsschätzung aus Video. Deshalb bleibt der Vorschlag immer vorläufig: Der Techniker bestätigt oder korrigiert ihn. Die Medien werden nur mit Einwilligung verarbeitet und nach Abschluss gelöscht. Was hinter all dem steckt, zeigt Adrian.</w:t>
       </w:r>
     </w:p>
     <w:p>

</xml_diff>

<commit_message>
docs: Sprechtexte nach Abschnitten verteilt, Folie 9 an Adrian, Folie 19 angepasst
</commit_message>
<xml_diff>
--- a/4_praesentation/Sprechtext_Abschlusspraesentation.docx
+++ b/4_praesentation/Sprechtext_Abschlusspraesentation.docx
@@ -24,7 +24,7 @@
         <w:t xml:space="preserve">Redezeit je Person: </w:t>
       </w:r>
       <w:r>
-        <w:t>Nina 3:45, David 3:15, Kilian 4:00, Maximilian 3:40, Adrian 1:50, Jakob 2:10 · gesamt 18:40.</w:t>
+        <w:t>David 3:30, Kilian 3:45, Maximilian 3:40, Adrian 3:00, Jakob 2:10, Nina 2:35 · gesamt 18:40.</w:t>
       </w:r>
     </w:p>
     <w:p>
@@ -49,10 +49,10 @@
         <w:rPr>
           <w:b/>
         </w:rPr>
-        <w:t xml:space="preserve">Nina: </w:t>
+        <w:t xml:space="preserve">David: </w:t>
       </w:r>
       <w:r>
-        <w:t>Guten Morgen zusammen. Wir sind Gruppe 1 und stellen Ihnen RepairFlow vor: eine Plattform, mit der Reparaturwerkstätten ihre Aufträge, Ersatzteile und Kunden an einer Stelle steuern. David beginnt mit dem Problem und unserer Lösung, Kilian und Maximilian zeigen, wie ein Auftrag durch RepairFlow läuft. Danach stellen Adrian, Kilian und Jakob vor, was wir dafür modelliert haben, und ich schließe mit Vorgehen, Geschäftsmodell und Ausblick.</w:t>
+        <w:t>Guten Morgen zusammen. Wir sind Gruppe 1 und stellen Ihnen RepairFlow vor: eine Plattform, mit der Reparaturwerkstätten ihre Aufträge, Ersatzteile und Kunden an einer Stelle steuern. Ich beginne mit dem Problem und unserer Lösung, Kilian zeigt den Nutzen und Maximilian, wie ein Auftrag durch RepairFlow läuft. Danach stellen Adrian, Kilian und Jakob vor, was wir dafür modelliert haben, und Nina schließt mit Vorgehen, Geschäftsmodell und Ausblick.</w:t>
       </w:r>
     </w:p>
     <w:p>
@@ -77,7 +77,7 @@
         <w:rPr>
           <w:b/>
         </w:rPr>
-        <w:t xml:space="preserve">Nina: </w:t>
+        <w:t xml:space="preserve">David: </w:t>
       </w:r>
       <w:r>
         <w:t>Unsere Präsentation hat zwei Hälften. In der ersten erzählen wir RepairFlow so, wie wir es einer Werkstatt vorstellen würden: Problem, Lösung, Nutzen, die Reparatur aus Kundensicht mit drei Prozess-Highlights und unser Alleinstellungsmerkmal, die KI-Sofortdiagnose, mit einer kurzen Demo der Kunden-App. In der zweiten Hälfte zeigen wir, was dahintersteckt: zehn Geschäftsprozesse, Rollen und Use Cases, das Datenmodell, die Qualitätssicherung und unser Vorgehen. Die Diagramme selbst finden Sie in der Projektdokumentation und im Abgabepaket; hier konzentrieren wir uns auf die Ergebnisse. Fragen gern am Ende.</w:t>
@@ -136,7 +136,7 @@
         <w:t xml:space="preserve">David: </w:t>
       </w:r>
       <w:r>
-        <w:t>RepairFlow ist unsere Antwort darauf. Wichtig für die Einordnung: Wir sind nicht die Werkstatt, wir sind das Software-Startup. FixWerk ist unser Pilotkunde, an dessen Abläufen wir die Plattform entworfen haben. RepairFlow ist eine Cloud-Plattform, die den ganzen Reparatur-Lebenszyklus abdeckt, von der ersten Anfrage bis zur Abholung und Reklamation. Sie besteht aus vier Modulen: dem Kundenportal mit App, dem Auftrags- und Werkstattmodul, dem Dispositionsmodul für Ersatzteile und der Abrechnung. Zielkunden sind unabhängige Werkstätten und kleine Ketten mit zwei bis zehn Filialen. Die physische Reparatur, die Lieferantensysteme und die Buchhaltung bleiben außerhalb; dorthin gibt es nur Schnittstellen.</w:t>
+        <w:t>RepairFlow ist unsere Antwort darauf. Wichtig für die Einordnung: Wir sind nicht die Werkstatt, wir sind das Software-Startup. FixWerk ist unser Pilotkunde, an dessen Abläufen wir die Plattform entworfen haben. RepairFlow ist eine Cloud-Plattform, die den ganzen Reparatur-Lebenszyklus abdeckt, von der ersten Anfrage bis zur Abholung und Reklamation. Sie besteht aus vier Modulen: dem Kundenportal mit App, dem Auftrags- und Werkstattmodul, dem Dispositionsmodul für Ersatzteile und der Abrechnung. Zielkunden sind unabhängige Werkstätten und kleine Ketten mit zwei bis zehn Filialen. Die physische Reparatur, die Lieferantensysteme und die Buchhaltung bleiben außerhalb; dorthin gibt es nur Schnittstellen. Was die Werkstatt davon hat, zeigt Kilian.</w:t>
       </w:r>
     </w:p>
     <w:p>
@@ -161,10 +161,10 @@
         <w:rPr>
           <w:b/>
         </w:rPr>
-        <w:t xml:space="preserve">David: </w:t>
+        <w:t xml:space="preserve">Kilian: </w:t>
       </w:r>
       <w:r>
-        <w:t>Was hat die Werkstatt davon? Drei Dinge. Erstens: eine Plattform für alle drei Gerätearten, mit einer Kundenbasis und einem gemeinsamen Ersatzteillager. Zweitens: filialübergreifende Disposition. RepairFlow kennt die Bestände aller Standorte, reserviert dort, wo das Teil liegt, und bestellt nur, was nirgends vorhanden ist. Drittens: Der Kunde bekommt Klarheit, bevor er die Werkstatt betritt, mit Diagnosevorschlag, vorläufigem Kostenvoranschlag und Termin. Für die Werkstatt heißt das weniger Telefon, weniger Standzeit im Lager und eine Auslastung, die sie wirklich sieht. Wie das für einen einzelnen Auftrag aussieht, zeigt Kilian.</w:t>
+        <w:t>Was hat die Werkstatt davon? Auf der Folie stehen drei Punkte. Der erste ist eine Plattform für Fahrräder, E-Bikes und Elektronik, mit einer gemeinsamen Kundenbasis und einem gemeinsamen Ersatzteillager. Dazu kommt die filialübergreifende Disposition: RepairFlow kennt die Bestände aller Standorte, reserviert das Teil dort, wo es liegt, und bestellt nur, was nirgends vorhanden ist. Und der Kunde weiß schon vor dem Besuch, woran er ist, weil er Diagnosevorschlag, vorläufigen Kostenvoranschlag und Termin vorab bekommt. Für die Werkstatt bedeutet das weniger Telefonate, kürzere Standzeiten im Lager und eine Auslastung, die sie tatsächlich sieht. Wie das bei einem einzelnen Auftrag abläuft, zeigt Maximilian.</w:t>
       </w:r>
     </w:p>
     <w:p>
@@ -189,10 +189,10 @@
         <w:rPr>
           <w:b/>
         </w:rPr>
-        <w:t xml:space="preserve">Kilian: </w:t>
+        <w:t xml:space="preserve">Maximilian: </w:t>
       </w:r>
       <w:r>
-        <w:t>So sieht eine Reparatur mit RepairFlow aus. Der Kunde schickt per App ein Foto oder Video und bekommt innerhalb einer Minute Vorschlag, vorläufigen Kostenvoranschlag und Terminvorschlag. In der Filiale wird das Gerät registriert und der Auftrag angelegt. Der Techniker prüft den Vorschlag, stellt die Diagnose und erstellt den Kostenvoranschlag, den der Kunde in der App freigibt. Dann disponiert RepairFlow die Teile über alle Filialen und bestellt Fehlteile beim Lieferanten. Nach der Reparatur folgt die Endkontrolle, der Kunde wird benachrichtigt, holt ab und zahlt. Jeder dieser Schritte ist ein Status des Reparaturauftrags: angenommen, in Diagnose, KVA offen, freigegeben, Teile bestellt, in Reparatur, fertig, abgeholt, und abgelehnt, wenn der Kunde den KVA ablehnt oder die Reparatur scheitert. Dieser Zustandsautomat ist der rote Faden durch alle unsere Modelle. Welche Abläufe dahinterstecken, zeigt Maximilian an drei Beispielen.</w:t>
+        <w:t>So sieht eine Reparatur mit RepairFlow aus. Der Kunde schickt per App ein Foto oder Video und bekommt innerhalb einer Minute Vorschlag, vorläufigen Kostenvoranschlag und Terminvorschlag. In der Filiale wird das Gerät registriert und der Auftrag angelegt. Der Techniker prüft den Vorschlag, stellt die Diagnose und erstellt den Kostenvoranschlag, den der Kunde in der App freigibt. Dann disponiert RepairFlow die Teile über alle Filialen und bestellt Fehlteile beim Lieferanten. Nach der Reparatur folgt die Endkontrolle, der Kunde wird benachrichtigt, holt ab und zahlt. Jeder dieser Schritte ist ein Status des Reparaturauftrags: angenommen, in Diagnose, KVA offen, freigegeben, Teile bestellt, in Reparatur, fertig, abgeholt, und abgelehnt, wenn der Kunde den KVA ablehnt oder die Reparatur scheitert. Dieser Zustandsautomat ist der rote Faden durch alle unsere Modelle. Welche Abläufe dahinterstecken, zeige ich Ihnen an drei Beispielen.</w:t>
       </w:r>
     </w:p>
     <w:p>
@@ -248,7 +248,7 @@
         <w:t xml:space="preserve">Maximilian: </w:t>
       </w:r>
       <w:r>
-        <w:t>Wir starten mit der Sofortdiagnose aus Kundensicht. Der Kunde wählt sein Gerät, beschreibt das Problem und lädt ein Foto hoch; im Modell ist das die Voranmeldung mit dem Medienanhang. Der KI-Dienst antwortet mit Ursache, benötigten Teilen und einer Konfidenz, das ist der KIDiagnosevorschlag. RepairFlow rechnet daraus das Angebot, deutlich als vorläufig markiert, und schlägt Filiale und Termin vor. Bestätigt der Kunde, sind die Teile vorreserviert und die Voranmeldung steht. Der eigentliche Reparaturauftrag entsteht erst, wenn das Gerät in der Filiale abgegeben wird. Zum Schluss sieht der Kunde den Status seines Auftrags entlang derselben Zustände, die Kilian in der Auftragsreise gezeigt hat. Die KI-Antwort ist in der Demo simuliert; Ablauf und Begriffe sind genau die aus unseren Modellen.</w:t>
+        <w:t>Wir starten mit der Sofortdiagnose aus Kundensicht. Der Kunde wählt sein Gerät, beschreibt das Problem und lädt ein Foto hoch; im Modell ist das die Voranmeldung mit dem Medienanhang. Der KI-Dienst antwortet mit Ursache, benötigten Teilen und einer Konfidenz, das ist der KIDiagnosevorschlag. RepairFlow rechnet daraus das Angebot, deutlich als vorläufig markiert, und schlägt Filiale und Termin vor. Bestätigt der Kunde, sind die Teile vorreserviert und die Voranmeldung steht. Der eigentliche Reparaturauftrag entsteht erst, wenn das Gerät in der Filiale abgegeben wird. Zum Schluss sieht der Kunde den Status seines Auftrags entlang derselben Zustände, die ich vorhin in der Auftragsreise gezeigt habe. Die KI-Antwort ist in der Demo simuliert; Ablauf und Begriffe sind genau die aus unseren Modellen. Was hinter der Sofortdiagnose steckt, erklärt Adrian.</w:t>
       </w:r>
     </w:p>
     <w:p>
@@ -273,10 +273,10 @@
         <w:rPr>
           <w:b/>
         </w:rPr>
-        <w:t xml:space="preserve">Maximilian: </w:t>
+        <w:t xml:space="preserve">Adrian: </w:t>
       </w:r>
       <w:r>
-        <w:t>Was Sie gerade in der App gesehen haben, ist unser Alleinstellungsmerkmal, die KI-Sofortdiagnose. Fünf Schritte: Der Kunde nimmt Foto, Video oder Ton auf. Ein KI-Dienst erkennt Gerätetyp, wahrscheinliche Ursache und benötigte Teile. RepairFlow rechnet daraus einen vorläufigen Kostenvoranschlag, prüft die Verfügbarkeit in allen Filialen und schlägt Filiale und Termin vor. Bestätigt der Kunde den Termin, werden die Teile vorreserviert. Heute machbar ist die Erkennung sichtbarer Schäden per Bildanalyse, etwa ein gebrochenes Display oder eine gerissene Kette, dazu ein Vorab-KVA aus Teilepreisen und Aufwandsrichtwerten. Vision sind Geräuschanalyse bei E-Bike-Motoren und eine Aufwandsschätzung aus Video. Deshalb bleibt der Vorschlag immer vorläufig: Der Techniker bestätigt oder korrigiert ihn. Die Medien werden nur mit Einwilligung verarbeitet und nach Abschluss gelöscht. Was hinter all dem steckt, zeigt Adrian.</w:t>
+        <w:t>Was Sie gerade in der App gesehen haben, ist unser Alleinstellungsmerkmal, die KI-Sofortdiagnose. Fünf Schritte: Der Kunde nimmt Foto, Video oder Ton auf. Ein KI-Dienst erkennt Gerätetyp, wahrscheinliche Ursache und benötigte Teile. RepairFlow rechnet daraus einen vorläufigen Kostenvoranschlag, prüft die Verfügbarkeit in allen Filialen und schlägt Filiale und Termin vor. Bestätigt der Kunde den Termin, werden die Teile vorreserviert. Heute machbar ist die Erkennung sichtbarer Schäden per Bildanalyse, etwa ein gebrochenes Display oder eine gerissene Kette, dazu ein Vorab-KVA aus Teilepreisen und Aufwandsrichtwerten. Vision sind Geräuschanalyse bei E-Bike-Motoren und eine Aufwandsschätzung aus Video. Deshalb bleibt der Vorschlag immer vorläufig: Der Techniker bestätigt oder korrigiert ihn. Die Medien werden nur mit Einwilligung verarbeitet und nach Abschluss gelöscht.</w:t>
       </w:r>
     </w:p>
     <w:p>
@@ -360,7 +360,7 @@
         <w:t xml:space="preserve">Kilian: </w:t>
       </w:r>
       <w:r>
-        <w:t>Das Use-Case-Diagramm beschreibt, was RepairFlow für seine Benutzer leistet. 19 Use Cases in vier Bereichen: das Kundenportal mit Sofortdiagnose, Voranmeldung und KVA-Freigabe; Auftrag und Werkstatt von der Annahme bis zur Reklamation; die Ersatzteil-Disposition von der Reservierung bis zur Retoure; und die Administration des Werkstattbetriebs. Eine Besonderheit geht auf das Coaching zurück: Jeder Use Case hat genau eine Rolle. Statt eines Technikers mit fünf Verbindungen gibt es Diagnoseprüfer, Diagnostiker, Kalkulator, Reparateur und Endkontrolleur. Welche Person welche Rolle ausfüllt, regelt die Werkstatt selbst; im Datenmodell sind die Rollen den Mitarbeitertypen zugeordnet. Dazu kommen der Kunde und der KI-Diagnosedienst als externes System. Der Lieferant ist bewusst kein Akteur: Er hat keinen Zugang zu RepairFlow und bleibt eine Black Box.</w:t>
+        <w:t>Das Use-Case-Diagramm zeigt, was RepairFlow für seine Benutzer leistet. Es hat 19 Use Cases in vier Bereichen: das Kundenportal mit Sofortdiagnose, Voranmeldung und KVA-Freigabe, dann Auftrag und Werkstatt von der Annahme bis zur Reklamation, die Ersatzteil-Disposition von der Reservierung bis zur Retoure und schließlich die Verwaltung des Werkstattbetriebs. Nach dem Coaching haben wir das Diagramm so umgebaut, dass jeder Use Case genau eine Rolle hat. Früher hing der Techniker an fünf Use Cases, heute gibt es dafür Diagnoseprüfer, Diagnostiker, Kalkulator, Reparateur und Endkontrolleur. Welche Person welche Rolle übernimmt, legt die Werkstatt selbst fest; im Datenmodell gehört jede Rolle zu einem Mitarbeitertyp. Außerdem gibt es den Kunden und den KI-Diagnosedienst als externes System. Den Lieferanten haben wir nicht als Akteur aufgenommen, weil er keinen Zugang zu RepairFlow hat. Er bleibt eine Black Box.</w:t>
       </w:r>
     </w:p>
     <w:p>
@@ -388,7 +388,7 @@
         <w:t xml:space="preserve">Kilian: </w:t>
       </w:r>
       <w:r>
-        <w:t>Das Klassendiagramm ist ein einziges, vollständiges Modell mit 29 Klassen. Fünf Entscheidungen prägen es. Erstens: Der Reparaturauftrag ist die Aggregatwurzel. Befund und Reparaturschritte sind Kompositionen, Kostenvoranschlag und Gerät nur zugeordnet, weil der Vorab-KVA schon vor dem Auftrag entsteht. Zweitens: Der Lagerbestand ist eine eigene Klasse zwischen Ersatzteil und Filiale; nur so lässt sich die Verfügbarkeit über alle Filialen prüfen. Drittens: Die Reservierung ist eine eigene Klasse mit Lebenszyklus. Viertens: Der Werkstattbetrieb ist Mandant und Sammelstelle. Er kennt alle Aufträge, Bestellungen und Reklamationen und findet sie über ihre Nummer. Die Mitarbeiter sind nach Typ spezialisiert, passend zu Lanes und Rollen, und arbeiten wie der Kunde nie direkt mit den Fachobjekten, sondern über zwei Oberflächenklassen, die Werkstattoberfläche und die KundenApp. Fünftens: Voranmeldung, Medienanhang und KI-Diagnosevorschlag tragen die Sofortdiagnose. Ein Beispiel aus den Sequenzdiagrammen ist SD4, die Fertigmeldung: Der Endkontrolleur gibt die Auftragsnummer ein, die Werkstattoberfläche sucht den Auftrag und arbeitet mit diesem Objekt; nach jeder Nacharbeit sucht sie ihn neu. Besteht er auch nach der zweiten Nacharbeit die Endkontrolle nicht, ruft sie wechsleStatus mit dem Wert ABGELEHNT auf, genau die Operation, die der Reparaturauftrag im Klassendiagramm anbietet.</w:t>
+        <w:t>Das Klassendiagramm ist ein einziges Modell mit 29 Klassen. Fünf Entscheidungen prägen es. Erstens ist der Reparaturauftrag die Aggregatwurzel: Befund und Reparaturschritte sind Kompositionen, Kostenvoranschlag und Gerät sind nur zugeordnet, weil der vorläufige KVA schon vor dem Auftrag entsteht. Zweitens ist der Lagerbestand eine eigene Klasse zwischen Ersatzteil und Filiale. Nur so können wir die Verfügbarkeit über alle Filialen prüfen. Drittens hat die Reservierung als eigene Klasse einen Lebenszyklus, von vorreserviert bis entnommen oder storniert. Viertens ist der Werkstattbetrieb Mandant und Sammelstelle. Er kennt alle Aufträge, Bestellungen und Reklamationen und findet sie über ihre Nummer. Die Mitarbeiter sind nach Typ spezialisiert, passend zu Lanes und Rollen. Die Rollen aus dem Use-Case-Diagramm arbeiten, genau wie der Kunde, nur über die beiden Oberflächenklassen Werkstattoberfläche und KundenApp mit den Fachobjekten. Fünftens bilden Voranmeldung, Medienanhang und KI-Diagnosevorschlag die Sofortdiagnose ab. Wie das in den Sequenzdiagrammen aussieht, zeigt SD4, die Fertigmeldung. Der Endkontrolleur gibt die Auftragsnummer ein, die Werkstattoberfläche sucht den Auftrag und arbeitet dann mit diesem Objekt. Nach jeder Nacharbeit sucht sie ihn neu. Fällt er auch nach der zweiten Nacharbeit durch die Endkontrolle, ruft die Oberfläche wechsleStatus mit dem Wert ABGELEHNT auf. Diese Operation bietet der Reparaturauftrag im Klassendiagramm an.</w:t>
       </w:r>
     </w:p>
     <w:p>

</xml_diff>

<commit_message>
docs: Sprechtexte und Folien vereinfacht + mockup
</commit_message>
<xml_diff>
--- a/4_praesentation/Sprechtext_Abschlusspraesentation.docx
+++ b/4_praesentation/Sprechtext_Abschlusspraesentation.docx
@@ -52,7 +52,12 @@
         <w:t xml:space="preserve">David: </w:t>
       </w:r>
       <w:r>
-        <w:t>Guten Morgen zusammen. Wir sind Gruppe 1 und stellen Ihnen RepairFlow vor: eine Plattform, mit der Reparaturwerkstätten ihre Aufträge, Ersatzteile und Kunden an einer Stelle steuern. Ich beginne mit dem Problem und unserer Lösung, Kilian zeigt den Nutzen und Maximilian, wie ein Auftrag durch RepairFlow läuft. Danach stellen Adrian, Kilian und Jakob vor, was wir dafür modelliert haben, und Nina schließt mit Vorgehen, Geschäftsmodell und Ausblick.</w:t>
+        <w:t>Guten Morgen. Wir sind Gruppe 1 und stellen Ihnen RepairFlow vor. Mit dieser Plattform verwalten Reparaturwerkstätten ihre Aufträge, Ersatzteile und Kunden an einer Stelle.</w:t>
+      </w:r>
+    </w:p>
+    <w:p>
+      <w:r>
+        <w:t>Ich erkläre zuerst das Problem und unsere Lösung. Kilian zeigt den Nutzen, Maximilian den Weg eines Auftrags durch RepairFlow. Danach zeigen Adrian, Kilian und Jakob, was wir modelliert haben. Nina schließt mit unserem Vorgehen, dem Geschäftsmodell und dem Ausblick.</w:t>
       </w:r>
     </w:p>
     <w:p>
@@ -80,7 +85,17 @@
         <w:t xml:space="preserve">David: </w:t>
       </w:r>
       <w:r>
-        <w:t>Unsere Präsentation hat zwei Hälften. In der ersten erzählen wir RepairFlow so, wie wir es einer Werkstatt vorstellen würden: Problem, Lösung, Nutzen, die Reparatur aus Kundensicht mit drei Prozess-Highlights und unser Alleinstellungsmerkmal, die KI-Sofortdiagnose, mit einer kurzen Demo der Kunden-App. In der zweiten Hälfte zeigen wir, was dahintersteckt: zehn Geschäftsprozesse, Rollen und Use Cases, das Datenmodell, die Qualitätssicherung und unser Vorgehen. Die Diagramme selbst finden Sie in der Projektdokumentation und im Abgabepaket; hier konzentrieren wir uns auf die Ergebnisse. Fragen gern am Ende.</w:t>
+        <w:t>Unsere Präsentation hat zwei Teile.</w:t>
+      </w:r>
+    </w:p>
+    <w:p>
+      <w:r>
+        <w:t>Im ersten Teil stellen wir RepairFlow so vor, wie wir es einer Werkstatt zeigen würden. Es geht um das Problem, unsere Lösung, den Nutzen, den Weg eines Auftrags und um die KI-Sofortdiagnose mit einer kurzen Demo der App.</w:t>
+      </w:r>
+    </w:p>
+    <w:p>
+      <w:r>
+        <w:t>Im zweiten Teil zeigen wir, was dahintersteckt: die Geschäftsprozesse, die Rollen, das Datenmodell, unsere Qualitätssicherung und wie wir als Team gearbeitet haben. Die Diagramme selbst finden Sie in der Dokumentation. Fragen gerne am Ende.</w:t>
       </w:r>
     </w:p>
     <w:p>
@@ -97,7 +112,7 @@
         <w:rPr>
           <w:i/>
         </w:rPr>
-        <w:t xml:space="preserve">  (75 s)</w:t>
+        <w:t xml:space="preserve">  (70 s)</w:t>
       </w:r>
     </w:p>
     <w:p>
@@ -108,7 +123,32 @@
         <w:t xml:space="preserve">David: </w:t>
       </w:r>
       <w:r>
-        <w:t>Stellen Sie sich eine Werkstattkette mit vier Filialen vor, die Fahrräder, E-Bikes und Elektronik repariert. In unserem Szenario heißt sie FixWerk. Der Alltag dort läuft über Papierzettel, Excel-Listen und Telefon. Das führt zu vier Problemen. Erstens: Der Kunde gibt sein Gerät ab und hört dann nichts mehr. Ob der Kostenvoranschlag freizugeben ist oder das Gerät fertig ist, erfährt er, wenn er anruft. Zweitens: Niemand weiß ohne Nachfrage, wo ein Auftrag gerade steht, weil Zettel und Listen auseinanderlaufen. Drittens: Jede Filiale bestellt Ersatzteile für sich, obwohl das Teil oft in der Nachbarfiliale liegt. Viertens: Termine werden nach Gefühl zugesagt, weil die Auslastung der Techniker nicht sichtbar ist. Die vier Punkte sind Annahmen unseres Szenarios, aber jeder, der schon einmal ein Gerät zur Reparatur gebracht hat, kennt mindestens eines davon.</w:t>
+        <w:t>Stellen Sie sich eine Werkstattkette mit vier Filialen vor. Sie repariert Fahrräder, E-Bikes und Elektronik. In unserem Szenario heißt sie FixWerk. Dort läuft fast alles über Papierzettel, Excel-Listen und das Telefon. Daraus entstehen vier Probleme.</w:t>
+      </w:r>
+    </w:p>
+    <w:p>
+      <w:r>
+        <w:t>Erstens hört der Kunde nach der Abgabe nichts mehr. Ob der Kostenvoranschlag da ist oder das Gerät fertig ist, erfährt er nur, wenn er anruft.</w:t>
+      </w:r>
+    </w:p>
+    <w:p>
+      <w:r>
+        <w:t>Zweitens weiß niemand ohne Nachfragen, wo ein Auftrag gerade steht. Die Zettel und die Listen passen oft nicht zusammen.</w:t>
+      </w:r>
+    </w:p>
+    <w:p>
+      <w:r>
+        <w:t>Drittens bestellt jede Filiale ihre Ersatzteile selbst, obwohl das Teil oft in der Nachbarfiliale liegt.</w:t>
+      </w:r>
+    </w:p>
+    <w:p>
+      <w:r>
+        <w:t>Viertens werden Termine nach Gefühl zugesagt, weil niemand sieht, wie ausgelastet die Techniker sind.</w:t>
+      </w:r>
+    </w:p>
+    <w:p>
+      <w:r>
+        <w:t>Diese vier Punkte sind Annahmen aus unserem Szenario. Wer schon einmal ein Gerät zur Reparatur gebracht hat, kennt aber sicher mindestens einen davon.</w:t>
       </w:r>
     </w:p>
     <w:p>
@@ -119,6 +159,7 @@
         <w:rPr>
           <w:b/>
         </w:rPr>
+        <w:lastRenderedPageBreak/>
         <w:t>Folie 4 – RepairFlow: die Lösung</w:t>
       </w:r>
       <w:r>
@@ -136,7 +177,17 @@
         <w:t xml:space="preserve">David: </w:t>
       </w:r>
       <w:r>
-        <w:t>RepairFlow ist unsere Antwort darauf. Wichtig für die Einordnung: Wir sind nicht die Werkstatt, wir sind das Software-Startup. FixWerk ist unser Pilotkunde, an dessen Abläufen wir die Plattform entworfen haben. RepairFlow ist eine Cloud-Plattform, die den ganzen Reparatur-Lebenszyklus abdeckt, von der ersten Anfrage bis zur Abholung und Reklamation. Sie besteht aus vier Modulen: dem Kundenportal mit App, dem Auftrags- und Werkstattmodul, dem Dispositionsmodul für Ersatzteile und der Abrechnung. Zielkunden sind unabhängige Werkstätten und kleine Ketten mit zwei bis zehn Filialen. Die physische Reparatur, die Lieferantensysteme und die Buchhaltung bleiben außerhalb; dorthin gibt es nur Schnittstellen. Was die Werkstatt davon hat, zeigt Kilian.</w:t>
+        <w:t>Unsere Antwort darauf ist RepairFlow. Wichtig dabei: Wir sind nicht die Werkstatt. Wir sind ein Software-Startup. FixWerk ist unser Pilotkunde, also der erste Kunde, an dessen Abläufen wir die Plattform entworfen haben.</w:t>
+      </w:r>
+    </w:p>
+    <w:p>
+      <w:r>
+        <w:t>RepairFlow läuft in der Cloud und begleitet die ganze Reparatur, von der ersten Anfrage bis zur Abholung und einer möglichen Reklamation. Die Plattform hat vier Bereiche: das Kundenportal mit der App, den Bereich für Aufträge und Werkstatt, die Ersatzteil-Disposition und die Abrechnung.</w:t>
+      </w:r>
+    </w:p>
+    <w:p>
+      <w:r>
+        <w:t>Unsere Zielkunden sind unabhängige Werkstätten und kleine Ketten mit zwei bis zehn Filialen. Die Reparatur selbst, die Systeme der Lieferanten und die Buchhaltung gehören nicht zu RepairFlow. Dorthin gibt es nur Schnittstellen. Was die Werkstatt davon hat, zeigt Kilian.</w:t>
       </w:r>
     </w:p>
     <w:p>
@@ -153,7 +204,7 @@
         <w:rPr>
           <w:i/>
         </w:rPr>
-        <w:t xml:space="preserve">  (55 s)</w:t>
+        <w:t xml:space="preserve">  (60 s)</w:t>
       </w:r>
     </w:p>
     <w:p>
@@ -164,7 +215,27 @@
         <w:t xml:space="preserve">Kilian: </w:t>
       </w:r>
       <w:r>
-        <w:t>Was hat die Werkstatt davon? Auf der Folie stehen drei Punkte. Der erste ist eine Plattform für Fahrräder, E-Bikes und Elektronik, mit einer gemeinsamen Kundenbasis und einem gemeinsamen Ersatzteillager. Dazu kommt die filialübergreifende Disposition: RepairFlow kennt die Bestände aller Standorte, reserviert das Teil dort, wo es liegt, und bestellt nur, was nirgends vorhanden ist. Und der Kunde weiß schon vor dem Besuch, woran er ist, weil er Diagnosevorschlag, vorläufigen Kostenvoranschlag und Termin vorab bekommt. Für die Werkstatt bedeutet das weniger Telefonate, kürzere Standzeiten im Lager und eine Auslastung, die sie tatsächlich sieht. Wie das bei einem einzelnen Auftrag abläuft, zeigt Maximilian.</w:t>
+        <w:t>Was hat eine Werkstatt von RepairFlow? Auf der Folie sehen Sie drei Punkte.</w:t>
+      </w:r>
+    </w:p>
+    <w:p>
+      <w:r>
+        <w:t>Erstens eine Plattform für alles. Fahrräder, E-Bikes und Elektronik laufen über dasselbe System. Es gibt eine Kundenliste, ein Ersatzteillager und für jeden Auftrag einen Status, den alle sehen.</w:t>
+      </w:r>
+    </w:p>
+    <w:p>
+      <w:r>
+        <w:t>Zweitens arbeiten die Filialen zusammen. RepairFlow sieht die Lager aller Standorte. Liegt ein Teil in der Nachbarfiliale, wird es dort reserviert oder herübergeschickt. Bestellt wird nur, was nirgends da ist.</w:t>
+      </w:r>
+    </w:p>
+    <w:p>
+      <w:r>
+        <w:t>Drittens weiß der Kunde vorher Bescheid. Er schickt ein Foto über die App und bekommt einen Diagnosevorschlag, einen ersten Kostenvoranschlag und einen Termin, noch bevor er in die Werkstatt kommt.</w:t>
+      </w:r>
+    </w:p>
+    <w:p>
+      <w:r>
+        <w:t>Die Werkstatt muss dadurch weniger telefonieren, Teile liegen kürzer im Lager, und sie sieht, wie ausgelastet ihre Techniker sind. Wie ein einzelner Auftrag abläuft, zeigt Maximilian.</w:t>
       </w:r>
     </w:p>
     <w:p>
@@ -192,7 +263,10 @@
         <w:t xml:space="preserve">Maximilian: </w:t>
       </w:r>
       <w:r>
-        <w:t>So sieht eine Reparatur mit RepairFlow aus. Der Kunde schickt per App ein Foto oder Video und bekommt innerhalb einer Minute Vorschlag, vorläufigen Kostenvoranschlag und Terminvorschlag. In der Filiale wird das Gerät registriert und der Auftrag angelegt. Der Techniker prüft den Vorschlag, stellt die Diagnose und erstellt den Kostenvoranschlag, den der Kunde in der App freigibt. Dann disponiert RepairFlow die Teile über alle Filialen und bestellt Fehlteile beim Lieferanten. Nach der Reparatur folgt die Endkontrolle, der Kunde wird benachrichtigt, holt ab und zahlt. Jeder dieser Schritte ist ein Status des Reparaturauftrags: angenommen, in Diagnose, KVA offen, freigegeben, Teile bestellt, in Reparatur, fertig, abgeholt, und abgelehnt, wenn der Kunde den KVA ablehnt oder die Reparatur scheitert. Dieser Zustandsautomat ist der rote Faden durch alle unsere Modelle. Welche Abläufe dahinterstecken, zeige ich Ihnen an drei Beispielen.</w:t>
+        <w:t>So sieht eine Reparatur mit RepairFlow aus. Der Kunde schickt per App ein Foto oder Video und bekommt innerhalb einer Minute Vorschlag, vorläufigen Kostenvoranschlag und Terminvorschlag. In der Filiale wird das Gerät registriert und der Auftrag angelegt. Der Techniker prüft den Vorschlag, stellt die Diagnose und erstellt den Kostenvoranschlag, den der Kunde in der App freigibt. Dann disponiert RepairFlow die Teile über alle Filialen und bestellt Fehlteile beim Lieferanten. Nach der Reparatur folgt die Endko</w:t>
+      </w:r>
+      <w:r>
+        <w:t>ntrolle, der Kunde wird benachrichtigt, holt ab und zahlt. Jeder dieser Schritte ist ein Status des Reparaturauftrags: angenommen, in Diagnose, KVA offen, freigegeben, Teile bestellt, in Reparatur, fertig, abgeholt, und abgelehnt, wenn der Kunde den KVA ablehnt oder die Reparatur scheitert. Dieser Zustandsautomat ist der rote Faden durch alle unsere Modelle. Welche Abläufe dahinterstecken, zeige ich Ihnen an drei Beispielen.</w:t>
       </w:r>
     </w:p>
     <w:p>
@@ -217,11 +291,26 @@
         <w:rPr>
           <w:b/>
         </w:rPr>
+        <w:lastRenderedPageBreak/>
         <w:t xml:space="preserve">Maximilian: </w:t>
       </w:r>
       <w:r>
-        <w:t>Hinter jedem dieser Schritte steht ein Geschäftsprozess. Drei Stellen zeigen, was die Prozesse leisten. Erstens der Kostenvoranschlag in Prozess 04: Nach dem Versand wartet ein ereignisbasiertes Gateway auf Freigabe, Ablehnung oder den Ablauf von drei Tagen. Bei Fristablauf erinnert RepairFlow den Kunden, höchstens zweimal. Nach dem dritten Fristablauf ohne Antwort gilt der KVA als abgelehnt und das Gerät geht mit Diagnosepauschale zur Abholung. Kein Auftrag bleibt liegen. Zweitens die Disposition in Prozess 05: Für jedes benötigte Teil läuft parallel eine Prüfung, erst im eigenen Lager, dann in den anderen Filialen. Was lokal liegt, wird reserviert, was anderswo liegt, umgelagert, und nur Fehlteile werden bestellt. Drittens die Reklamation in Prozess 09: Der Techniker prüft den Mangel, RepairFlow entscheidet nach Regel über Gewährleistung, und im Gewährleistungsfall gibt die Werkstattleitung einen kostenfreien Nacharbeitsauftrag frei, der wieder durch die normale Auftragsreise läuft. Wie sich das für den Kunden anfühlt, zeige ich Ihnen jetzt in der App.</w:t>
+        <w:t>Hinter jedem dieser Schritte steht ein Geschäftsprozess. Drei Stellen zeigen, was die Prozesse leisten. Erstens der Kostenvoranschlag in Prozess 04: Nach dem Versand wartet ein ereignisbasiertes Gateway auf Freigabe, Ablehnung oder den Ablauf von drei Tagen. Bei Fristablauf erinnert RepairFlow den Kunden, höchstens zweimal. Nach dem dritten Fristablauf ohne Antwort gilt der KVA als abgelehnt und das Gerät geht mit Diagnosepauschale zur Abholung. Kein Auftrag bleibt liegen. Zweitens die Disposition in Prozes</w:t>
       </w:r>
+      <w:r>
+        <w:t>s 05: Für jedes benötigte Teil läuft parallel eine Prüfung, erst im eigenen Lager, dann in den anderen Filialen. Was lokal liegt, wird reserviert, was anderswo liegt, umgelagert, und nur Fehlteile werden bestellt. Drittens die Reklamation in Prozess 09: Der Techniker prüft den Mangel, RepairFlow entscheidet nach Regel über Gewährleistung, und im Gewährleistungsfall gibt die Werkstattleitung einen kostenfreien Nacharbeitsauftrag frei, der wieder durch die normale Auftragsreise läuft. Wie sich das für den Kun</w:t>
+      </w:r>
+      <w:r>
+        <w:t>den anfühlt, zeige ich Ihnen jetzt in der App.</w:t>
+      </w:r>
+    </w:p>
+    <w:p>
+      <w:pPr>
+        <w:spacing w:before="200"/>
+        <w:rPr>
+          <w:b/>
+        </w:rPr>
+      </w:pPr>
     </w:p>
     <w:p>
       <w:pPr>
@@ -248,7 +337,10 @@
         <w:t xml:space="preserve">Maximilian: </w:t>
       </w:r>
       <w:r>
-        <w:t>Wir starten mit der Sofortdiagnose aus Kundensicht. Der Kunde wählt sein Gerät, beschreibt das Problem und lädt ein Foto hoch; im Modell ist das die Voranmeldung mit dem Medienanhang. Der KI-Dienst antwortet mit Ursache, benötigten Teilen und einer Konfidenz, das ist der KIDiagnosevorschlag. RepairFlow rechnet daraus das Angebot, deutlich als vorläufig markiert, und schlägt Filiale und Termin vor. Bestätigt der Kunde, sind die Teile vorreserviert und die Voranmeldung steht. Der eigentliche Reparaturauftrag entsteht erst, wenn das Gerät in der Filiale abgegeben wird. Zum Schluss sieht der Kunde den Status seines Auftrags entlang derselben Zustände, die ich vorhin in der Auftragsreise gezeigt habe. Die KI-Antwort ist in der Demo simuliert; Ablauf und Begriffe sind genau die aus unseren Modellen. Was hinter der Sofortdiagnose steckt, erklärt Adrian.</w:t>
+        <w:t xml:space="preserve">Wir starten mit der Sofortdiagnose aus Kundensicht. Der Kunde wählt sein Gerät, beschreibt das Problem und lädt ein Foto hoch; im Modell ist das die Voranmeldung mit dem Medienanhang. Der KI-Dienst antwortet mit Ursache, benötigten Teilen und einer Konfidenz, das ist der KIDiagnosevorschlag. RepairFlow rechnet daraus das Angebot, deutlich als vorläufig markiert, und schlägt Filiale und Termin vor. Bestätigt der Kunde, sind die Teile vorreserviert und die Voranmeldung steht. Der eigentliche Reparaturauftrag </w:t>
+      </w:r>
+      <w:r>
+        <w:t>entsteht erst, wenn das Gerät in der Filiale abgegeben wird. Zum Schluss sieht der Kunde den Status seines Auftrags entlang derselben Zustände, die ich vorhin in der Auftragsreise gezeigt habe. Die KI-Antwort ist in der Demo simuliert; Ablauf und Begriffe sind genau die aus unseren Modellen. Was hinter der Sofortdiagnose steckt, erklärt Adrian.</w:t>
       </w:r>
     </w:p>
     <w:p>
@@ -276,7 +368,10 @@
         <w:t xml:space="preserve">Adrian: </w:t>
       </w:r>
       <w:r>
-        <w:t>Was Sie gerade in der App gesehen haben, ist unser Alleinstellungsmerkmal, die KI-Sofortdiagnose. Fünf Schritte: Der Kunde nimmt Foto, Video oder Ton auf. Ein KI-Dienst erkennt Gerätetyp, wahrscheinliche Ursache und benötigte Teile. RepairFlow rechnet daraus einen vorläufigen Kostenvoranschlag, prüft die Verfügbarkeit in allen Filialen und schlägt Filiale und Termin vor. Bestätigt der Kunde den Termin, werden die Teile vorreserviert. Heute machbar ist die Erkennung sichtbarer Schäden per Bildanalyse, etwa ein gebrochenes Display oder eine gerissene Kette, dazu ein Vorab-KVA aus Teilepreisen und Aufwandsrichtwerten. Vision sind Geräuschanalyse bei E-Bike-Motoren und eine Aufwandsschätzung aus Video. Deshalb bleibt der Vorschlag immer vorläufig: Der Techniker bestätigt oder korrigiert ihn. Die Medien werden nur mit Einwilligung verarbeitet und nach Abschluss gelöscht.</w:t>
+        <w:t>Was Sie gerade in der App gesehen haben, ist unser Alleinstellungsmerkmal, die KI-Sofortdiagnose. Fünf Schritte: Der Kunde nimmt Foto, Video oder Ton auf. Ein KI-Dienst erkennt Gerätetyp, wahrscheinliche Ursache und benötigte Teile. RepairFlow rechnet daraus einen vorläufigen Kostenvoranschlag, prüft die Verfügbarkeit in allen Filialen und schlägt Filiale und Termin vor. Bestätigt der Kunde den Termin, werden die Teile vorreserviert. Heute machbar ist die Erkennung sichtbarer Schäden per Bildanalyse, etwa e</w:t>
+      </w:r>
+      <w:r>
+        <w:t>in gebrochenes Display oder eine gerissene Kette, dazu ein Vorab-KVA aus Teilepreisen und Aufwandsrichtwerten. Vision sind Geräuschanalyse bei E-Bike-Motoren und eine Aufwandsschätzung aus Video. Deshalb bleibt der Vorschlag immer vorläufig: Der Techniker bestätigt oder korrigiert ihn. Die Medien werden nur mit Einwilligung verarbeitet und nach Abschluss gelöscht.</w:t>
       </w:r>
     </w:p>
     <w:p>
@@ -304,7 +399,11 @@
         <w:t xml:space="preserve">Adrian: </w:t>
       </w:r>
       <w:r>
-        <w:t>Damit zur zweiten Hälfte: Was steckt hinter dieser Geschichte? Wir haben drei Modelle erstellt, die zusammenpassen. Zehn BPMN-Kollaborationsdiagramme mit 136 Aktivitäten im Werkstatt-Pool, dazu die Abläufe des Kunden. Ein Use-Case-Diagramm mit 19 Use Cases und 17 Rollen und Akteuren. Ein vollständiges Klassendiagramm mit 29 Klassen und 40 Assoziationen. Sechs Sequenzdiagramme, gefordert waren fünf. Alle Modelle liegen im Camunda Modeler und in Visual Paradigm und werden mit der Dokumentation abgegeben.</w:t>
+        <w:t xml:space="preserve">Damit zur zweiten Hälfte: Was steckt hinter dieser Geschichte? Wir haben drei Modelle erstellt, die zusammenpassen. Zehn BPMN-Kollaborationsdiagramme mit 136 Aktivitäten im Werkstatt-Pool, dazu die Abläufe des Kunden. Ein Use-Case-Diagramm mit 19 Use Cases und 17 Rollen und Akteuren. Ein vollständiges Klassendiagramm mit 29 Klassen und 40 Assoziationen. Sechs Sequenzdiagramme, </w:t>
+      </w:r>
+      <w:r>
+        <w:lastRenderedPageBreak/>
+        <w:t>gefordert waren fünf. Alle Modelle liegen im Camunda Modeler und in Visual Paradigm und werden mit der Dokumentation abgegeben.</w:t>
       </w:r>
     </w:p>
     <w:p>
@@ -332,7 +431,10 @@
         <w:t xml:space="preserve">Adrian: </w:t>
       </w:r>
       <w:r>
-        <w:t>Die zehn Prozesse decken den gesamten Lebenszyklus ab. Prozesse 01 bis 08 sind die durchgehende Auftragsreise, 09 und 10 die Folgeprozesse Reklamation und Retoure; drei Highlights daraus hat Maximilian schon gezeigt. Jedes Diagramm ist eine Kollaboration: Der Werkstattbetrieb ist der ausführbare Pool mit den Lanes Service, Techniker, Werkstattleitung und Disposition, der Kunde hat seinen eigenen Ablauf, der Lieferant bleibt eine Black Box. Die wichtigste Zahl: 62 Prozent der Aktivitäten führt RepairFlow ohne manuelle Arbeit aus, also Statuswechsel, Benachrichtigungen, Prüfungen, Berechnungen und Regeln. Was Handwerk ist, bleibt Handwerk: Diagnose, Reparatur und Endkontrolle macht der Techniker mit Unterstützung durch das System. Wer im System welche Aufgaben hat, zeigt Kilian.</w:t>
+        <w:t>Die zehn Prozesse decken den gesamten Lebenszyklus ab. Prozesse 01 bis 08 sind die durchgehende Auftragsreise, 09 und 10 die Folgeprozesse Reklamation und Retoure; drei Highlights daraus hat Maximilian schon gezeigt. Jedes Diagramm ist eine Kollaboration: Der Werkstattbetrieb ist der ausführbare Pool mit den Lanes Service, Techniker, Werkstattleitung und Disposition, der Kunde hat seinen eigenen Ablauf, der Lieferant bleibt eine Black Box. Die wichtigste Zahl: 62 Prozent der Aktivitäten führt RepairFlow ohn</w:t>
+      </w:r>
+      <w:r>
+        <w:t>e manuelle Arbeit aus, also Statuswechsel, Benachrichtigungen, Prüfungen, Berechnungen und Regeln. Was Handwerk ist, bleibt Handwerk: Diagnose, Reparatur und Endkontrolle macht der Techniker mit Unterstützung durch das System. Wer im System welche Aufgaben hat, zeigt Kilian.</w:t>
       </w:r>
     </w:p>
     <w:p>
@@ -343,13 +445,13 @@
         <w:rPr>
           <w:b/>
         </w:rPr>
-        <w:t>Folie 12 – Wer macht was im System: Rollen und Use Cases</w:t>
+        <w:t>Folie 12 – Wer macht was im System?</w:t>
       </w:r>
       <w:r>
         <w:rPr>
           <w:i/>
         </w:rPr>
-        <w:t xml:space="preserve">  (70 s)</w:t>
+        <w:t xml:space="preserve">  (75 s)</w:t>
       </w:r>
     </w:p>
     <w:p>
@@ -360,7 +462,22 @@
         <w:t xml:space="preserve">Kilian: </w:t>
       </w:r>
       <w:r>
-        <w:t>Das Use-Case-Diagramm zeigt, was RepairFlow für seine Benutzer leistet. Es hat 19 Use Cases in vier Bereichen: das Kundenportal mit Sofortdiagnose, Voranmeldung und KVA-Freigabe, dann Auftrag und Werkstatt von der Annahme bis zur Reklamation, die Ersatzteil-Disposition von der Reservierung bis zur Retoure und schließlich die Verwaltung des Werkstattbetriebs. Nach dem Coaching haben wir das Diagramm so umgebaut, dass jeder Use Case genau eine Rolle hat. Früher hing der Techniker an fünf Use Cases, heute gibt es dafür Diagnoseprüfer, Diagnostiker, Kalkulator, Reparateur und Endkontrolleur. Welche Person welche Rolle übernimmt, legt die Werkstatt selbst fest; im Datenmodell gehört jede Rolle zu einem Mitarbeitertyp. Außerdem gibt es den Kunden und den KI-Diagnosedienst als externes System. Den Lieferanten haben wir nicht als Akteur aufgenommen, weil er keinen Zugang zu RepairFlow hat. Er bleibt eine Black Box.</w:t>
+        <w:t>Jetzt geht es darum, wer im System was macht. Dafür haben wir Use Cases beschrieben. Ein Use Case ist eine Aufgabe, die jemand mit RepairFlow erledigt, zum Beispiel einen Kostenvoranschlag freigeben.</w:t>
+      </w:r>
+    </w:p>
+    <w:p>
+      <w:r>
+        <w:t>Wir haben 19 Use Cases in vier Bereichen. Im Kundenportal arbeitet der Kunde. Er fordert die Sofortdiagnose an, bestätigt seinen Termin und gibt den Kostenvoranschlag frei oder lehnt ihn ab. Die Diagnose selbst liefert ein externer KI-Dienst. Im Bereich Auftrag und Werkstatt geht es von der Annahme des Geräts bis zur Reklamation. Bei der Ersatzteil-Disposition werden Teile reserviert, bestellt, eingebucht und bei Mängeln zurückgeschickt. Und ein Administrator verwaltet den Betrieb mit seinen Filialen.</w:t>
+      </w:r>
+    </w:p>
+    <w:p>
+      <w:r>
+        <w:t>Nach dem Coaching haben wir eine Regel eingeführt: Jeder Use Case hat genau eine Rolle. Früher stand bei fünf Aufgaben einfach „Techniker“. Heute gibt es dafür eigene Rollen, zum Beispiel den Diagnostiker, den Kalkulator und den Endkontrolleur. Welcher Mitarbeiter welche Rolle übernimmt, legt die Werkstatt selbst fest.</w:t>
+      </w:r>
+    </w:p>
+    <w:p>
+      <w:r>
+        <w:t>Den Lieferanten haben wir nicht aufgenommen. Er arbeitet nicht mit RepairFlow und bleibt für uns eine Black Box.</w:t>
       </w:r>
     </w:p>
     <w:p>
@@ -371,13 +488,13 @@
         <w:rPr>
           <w:b/>
         </w:rPr>
-        <w:t>Folie 13 – Das Datenmodell: fünf Entwurfsentscheidungen</w:t>
+        <w:t>Folie 13 – Das Datenmodell: fünf Entscheidungen</w:t>
       </w:r>
       <w:r>
         <w:rPr>
           <w:i/>
         </w:rPr>
-        <w:t xml:space="preserve">  (100 s)</w:t>
+        <w:t xml:space="preserve">  (85 s)</w:t>
       </w:r>
     </w:p>
     <w:p>
@@ -388,7 +505,38 @@
         <w:t xml:space="preserve">Kilian: </w:t>
       </w:r>
       <w:r>
-        <w:t>Das Klassendiagramm ist ein einziges Modell mit 29 Klassen. Fünf Entscheidungen prägen es. Erstens ist der Reparaturauftrag die Aggregatwurzel: Befund und Reparaturschritte sind Kompositionen, Kostenvoranschlag und Gerät sind nur zugeordnet, weil der vorläufige KVA schon vor dem Auftrag entsteht. Zweitens ist der Lagerbestand eine eigene Klasse zwischen Ersatzteil und Filiale. Nur so können wir die Verfügbarkeit über alle Filialen prüfen. Drittens hat die Reservierung als eigene Klasse einen Lebenszyklus, von vorreserviert bis entnommen oder storniert. Viertens ist der Werkstattbetrieb Mandant und Sammelstelle. Er kennt alle Aufträge, Bestellungen und Reklamationen und findet sie über ihre Nummer. Die Mitarbeiter sind nach Typ spezialisiert, passend zu Lanes und Rollen. Die Rollen aus dem Use-Case-Diagramm arbeiten, genau wie der Kunde, nur über die beiden Oberflächenklassen Werkstattoberfläche und KundenApp mit den Fachobjekten. Fünftens bilden Voranmeldung, Medienanhang und KI-Diagnosevorschlag die Sofortdiagnose ab. Wie das in den Sequenzdiagrammen aussieht, zeigt SD4, die Fertigmeldung. Der Endkontrolleur gibt die Auftragsnummer ein, die Werkstattoberfläche sucht den Auftrag und arbeitet dann mit diesem Objekt. Nach jeder Nacharbeit sucht sie ihn neu. Fällt er auch nach der zweiten Nacharbeit durch die Endkontrolle, ruft die Oberfläche wechsleStatus mit dem Wert ABGELEHNT auf. Diese Operation bietet der Reparaturauftrag im Klassendiagramm an.</w:t>
+        <w:t>Zum Schluss meines Teils das Datenmodell. Es beschreibt, welche Daten RepairFlow speichert und wie sie zusammenhängen. Insgesamt sind es 29 Klassen. Fünf Entscheidungen erkläre ich kurz.</w:t>
+      </w:r>
+    </w:p>
+    <w:p>
+      <w:r>
+        <w:t>Erstens steht der Reparaturauftrag im Mittelpunkt. Befund und Reparaturschritte gehören fest zum Auftrag. Kostenvoranschlag und Gerät sind nur mit ihm verknüpft, weil der erste Kostenvoranschlag schon entsteht, bevor es einen Auftrag gibt.</w:t>
+      </w:r>
+    </w:p>
+    <w:p>
+      <w:r>
+        <w:lastRenderedPageBreak/>
+        <w:t>Zweitens ist der Lagerbestand eine eigene Klasse. Er sagt, wie viel von einem Teil in welcher Filiale liegt. Nur so kann RepairFlow alle Filialen durchsuchen.</w:t>
+      </w:r>
+    </w:p>
+    <w:p>
+      <w:r>
+        <w:t>Drittens ist auch die Reservierung eine eigene Klasse, weil sie sich verändert. Erst ist ein Teil vorreserviert, dann reserviert und am Ende entnommen oder storniert.</w:t>
+      </w:r>
+    </w:p>
+    <w:p>
+      <w:r>
+        <w:t>Viertens ist der Werkstattbetrieb die Zentrale. Er kennt alle Aufträge, Bestellungen und Reklamationen. Die Mitarbeiter haben vier Typen, die zu den Rollen von eben passen. Kunden und Mitarbeiter kommen nur über zwei Oberflächen an die Daten, die KundenApp und die Werkstattoberfläche.</w:t>
+      </w:r>
+    </w:p>
+    <w:p>
+      <w:r>
+        <w:t>Fünftens hat die Sofortdiagnose drei eigene Klassen: die Voranmeldung, den Medienanhang mit Foto oder Video und den Vorschlag der KI.</w:t>
+      </w:r>
+    </w:p>
+    <w:p>
+      <w:r>
+        <w:t>Wie wir dafür gesorgt haben, dass alle Modelle zusammenpassen, zeigt Jakob.</w:t>
       </w:r>
     </w:p>
     <w:p>
@@ -399,7 +547,7 @@
         <w:rPr>
           <w:b/>
         </w:rPr>
-        <w:t>Folie 14 – Qualität: Konventionen, Linter, Konsistenz</w:t>
+        <w:t>Folie 14 – Qualität: Regeln, Werkzeuge, Reviews</w:t>
       </w:r>
       <w:r>
         <w:rPr>
@@ -416,7 +564,27 @@
         <w:t xml:space="preserve">Jakob: </w:t>
       </w:r>
       <w:r>
-        <w:t>Drei Modelle, die sich auf dieselben Dinge beziehen, laufen schnell auseinander. Dagegen hatten wir drei Mittel. Erstens Konventionen: Datenobjekte in BPMN tragen die Klassennamen, Aktivitäten heißen Verb plus Objekt, jede Rolle ist genau einer Lane und einer Klasse zugeordnet, die Statuswerte sind in allen Modellen identisch, und in jedem Sequenzdiagramm geht der Weg vom Akteur über die Oberfläche zum Objekt. Zweitens Werkzeuge: Die BPMN-Dateien sind für Camunda 8 angereichert, mit Task-Definitionen, Timern und Bedingungen; der Camunda-Linter und bpmnlint melden null Befunde. Drittens Reviews: Jedes Diagramm wurde im Zweierteam geprüft und in den Gruppenterminen abgestimmt, und jede Änderung wird gegen unsere QA-Checkliste geprüft, bevor sie gemergt wird. Ein Beispiel: Als wir die Nacharbeit in Prozess 07 auf zwei Durchläufe begrenzt haben, musste das Sequenzdiagramm SD4 nachziehen. Genau solche Stellen findet die Checkliste.</w:t>
+        <w:t>Wir haben drei Modelle gebaut, die über dieselben Dinge sprechen. Da passiert es schnell, dass sie auseinanderlaufen. Dagegen haben wir drei Dinge getan.</w:t>
+      </w:r>
+    </w:p>
+    <w:p>
+      <w:r>
+        <w:t>Erstens feste Regeln. Eine Sache heißt in allen Modellen gleich. Ein Datenobjekt im Prozess trägt also denselben Namen wie die Klasse. Jede Rolle gehört zu genau einer Lane und einer Klasse, und die Statuswerte sind überall dieselben.</w:t>
+      </w:r>
+    </w:p>
+    <w:p>
+      <w:r>
+        <w:t>Zweitens Werkzeuge. Wir haben die Prozessdiagramme für Camunda 8 mit technischen Angaben ergänzt, zum Beispiel mit Timern und Bedingungen. Zwei Prüfprogramme melden danach keinen einzigen Fehler.</w:t>
+      </w:r>
+    </w:p>
+    <w:p>
+      <w:r>
+        <w:t>Drittens Reviews. Jedes Diagramm hat eine zweite Person geprüft, und jede Änderung prüfen wir gegen eine Checkliste.</w:t>
+      </w:r>
+    </w:p>
+    <w:p>
+      <w:r>
+        <w:t>Ein Beispiel: Als wir die Nacharbeit auf höchstens zwei Durchläufe begrenzt haben, mussten auch die anderen Modelle angepasst werden. Genau solche Stellen findet die Checkliste.</w:t>
       </w:r>
     </w:p>
     <w:p>
@@ -444,7 +612,33 @@
         <w:t xml:space="preserve">Jakob: </w:t>
       </w:r>
       <w:r>
-        <w:t>Vier Dinge haben uns am meisten beschäftigt. Die Perspektive: Werkstatt oder Softwareanbieter? Die Rückfrage des Dozenten hat uns zur klaren Entscheidung gezwungen, und danach mussten Texte und Klassenmodell nachziehen. Das Vokabular: Datenobjekte, Klassen, Lebenslinien und Statuswerte müssen wortgleich sein, sonst zerfällt die Analyse in drei Einzelmodelle. Die Werkzeuge: Der Camunda Modeler meldet für Camunda 8 fehlende technische Details als Fehler, und wir haben die Diagramme so lange angereichert, bis nichts mehr rot war. Und die Vision: Die KI-Sofortdiagnose soll beeindrucken, aber glaubwürdig bleiben. Gelernt haben wir, dass Konsistenz keine Prüfung am Ende ist, sondern eine Regel bei jeder Änderung, und dass klare Hinweise von außen, etwa zum Use-Case-Diagramm und zu den Oberflächen in den Sequenzdiagrammen, ein Modell deutlich besser machen. Wie wir zusammengearbeitet haben, zeigt Nina.</w:t>
+        <w:t>Vier Dinge haben uns besonders beschäftigt.</w:t>
+      </w:r>
+    </w:p>
+    <w:p>
+      <w:r>
+        <w:t>Erstens die Frage, wer wir eigentlich sind: die Werkstatt oder der Softwareanbieter? Nach einer Rückfrage des Dozenten haben wir uns klar entschieden. Wir sind der Anbieter, FixWerk ist unser Pilotkunde. Danach mussten wir Texte und Klassenmodell anpassen.</w:t>
+      </w:r>
+    </w:p>
+    <w:p>
+      <w:r>
+        <w:t>Zweitens die Namen. Klassen, Datenobjekte und Statuswerte müssen in allen Modellen gleich heißen. Sonst zerfällt die Analyse in drei einzelne Modelle.</w:t>
+      </w:r>
+    </w:p>
+    <w:p>
+      <w:r>
+        <w:t>Drittens die Werkzeuge. Der Camunda Modeler zeigt fehlende technische Angaben für Camunda 8 als Fehler an. Wir haben die Diagramme so lange ergänzt, bis keine Fehler mehr kamen.</w:t>
+      </w:r>
+    </w:p>
+    <w:p>
+      <w:r>
+        <w:lastRenderedPageBreak/>
+        <w:t>Viertens die KI-Sofortdiagnose. Sie soll beeindrucken und trotzdem glaubwürdig bleiben. Deshalb trennen wir klar, was heute machbar ist und was Vision ist.</w:t>
+      </w:r>
+    </w:p>
+    <w:p>
+      <w:r>
+        <w:t>Gelernt haben wir vor allem, dass man bei jeder einzelnen Änderung prüfen muss, ob alles noch zusammenpasst. Die Hinweise aus den Coachings haben unsere Modelle außerdem deutlich besser gemacht. Wie wir zusammengearbeitet haben, zeigt Nina.</w:t>
       </w:r>
     </w:p>
     <w:p>
@@ -472,7 +666,10 @@
         <w:t xml:space="preserve">Nina: </w:t>
       </w:r>
       <w:r>
-        <w:t>Gearbeitet haben wir in Sprints im Takt der vier Gruppentermine, mit Review, Retrospektive und Planning je Termin. Ich habe die Projektleitung, David die Stellvertretung und die Sicherungen, Adrian ist Product Owner, Kilian Scrum Master, Maximilian verantwortet BPMN, Jakob die Qualität. Alles Schriftliche liegt in einem GitHub-Repository; jede Änderung geht über einen eigenen Branch, einen Pull Request und ein Review durch eine zweite Person. Das Trello-Board hat eine Liste je Termin und eine Karte je Person und Aufgabe. Jedes Diagramm ist denselben Weg gegangen: Entwurf im Zweierteam, gegenseitiges Review, Abstimmung im Gruppentermin und erst dann die Umsetzung über einen Pull Request. Entscheidungen, die mehrere betreffen, stehen mit Begründung und Datum im Entscheidungslog; so konnten wir bei jeder Korrektur nachvollziehen, warum ein Modell so aussieht.</w:t>
+        <w:t>Gearbeitet haben wir in Sprints im Takt der vier Gruppentermine, mit Review, Retrospektive und Planning je Termin. Ich habe die Projektleitung, David die Stellvertretung und die Sicherungen, Adrian ist Product Owner, Kilian Scrum Master, Maximilian verantwortet BPMN, Jakob die Qualität. Alles Schriftliche liegt in einem GitHub-Repository; jede Änderung geht über einen eigenen Branch, einen Pull Request und ein Review durch eine zweite Person. Das Trello-Board hat eine Liste je Termin und eine Karte je Perso</w:t>
+      </w:r>
+      <w:r>
+        <w:t>n und Aufgabe. Jedes Diagramm ist denselben Weg gegangen: Entwurf im Zweierteam, gegenseitiges Review, Abstimmung im Gruppentermin und erst dann die Umsetzung über einen Pull Request. Entscheidungen, die mehrere betreffen, stehen mit Begründung und Datum im Entscheidungslog; so konnten wir bei jeder Korrektur nachvollziehen, warum ein Modell so aussieht.</w:t>
       </w:r>
     </w:p>
     <w:p>
@@ -500,7 +697,10 @@
         <w:t xml:space="preserve">Nina: </w:t>
       </w:r>
       <w:r>
-        <w:t>Zum Schluss der Blick nach vorn. RepairFlow wird als Abo je Filiale angeboten, in zwei Stufen: Basis mit Auftrags- und Kundenverwaltung, Pro mit filialübergreifender Disposition und KI-Sofortdiagnose. Zielkunden sind unabhängige Werkstätten und kleine Ketten mit zwei bis zehn Filialen im deutschsprachigen Raum, also genau die Betriebe mit den vier Problemen vom Anfang. Der Ausblick geht in drei Richtungen: Predictive Disposition, also eine Bedarfsprognose je Filiale und Saison. Ein Techniker-Copilot, der Reparaturschritte aus der Historie vorschlägt. Und eine digitale Geräteakte, in der jedes Gerät seine Reparaturgeschichte behält. Nichts davon ist modelliert, aber alles baut auf dem Datenmodell auf, das wir heute vorgestellt haben.</w:t>
+        <w:t>Zum Schluss der Blick nach vorn. RepairFlow wird als Abo je Filiale angeboten, in zwei Stufen: Basis mit Auftrags- und Kundenverwaltung, Pro mit filialübergreifender Disposition und KI-Sofortdiagnose. Zielkunden sind unabhängige Werkstätten und kleine Ketten mit zwei bis zehn Filialen im deutschsprachigen Raum, also genau die Betriebe mit den vier Problemen vom Anfang. Der Ausblick geht in drei Richtungen: Predictive Disposition, also eine Bedarfsprognose je Filiale und Saison. Ein Techniker-Copilot, der Re</w:t>
+      </w:r>
+      <w:r>
+        <w:t>paraturschritte aus der Historie vorschlägt. Und eine digitale Geräteakte, in der jedes Gerät seine Reparaturgeschichte behält. Nichts davon ist modelliert, aber alles baut auf dem Datenmodell auf, das wir heute vorgestellt haben.</w:t>
       </w:r>
     </w:p>
     <w:p>
@@ -540,11 +740,6 @@
           <w:b/>
         </w:rPr>
         <w:t>Folie 19 – Anhang: Beiträge der Vortragenden</w:t>
-      </w:r>
-      <w:r>
-        <w:rPr>
-          <w:i/>
-        </w:rPr>
       </w:r>
     </w:p>
     <w:p>

</xml_diff>

<commit_message>
docs: Maximilians Sprechtext (Folien 6-8) überarbeitet
- Folie 6 als User Story mit Thomas (E-Bike, Foto-Upload, Bildanalyse)
- Folie 7 flüssiger formuliert, keine Dopplungen mit anderen Teilen
- Folie 8 Demo-Führung gestrafft, KI-Details an Adrian übergeben
</commit_message>
<xml_diff>
--- a/4_praesentation/Sprechtext_Abschlusspraesentation.docx
+++ b/4_praesentation/Sprechtext_Abschlusspraesentation.docx
@@ -136,7 +136,11 @@
         <w:t xml:space="preserve">David: </w:t>
       </w:r>
       <w:r>
-        <w:t>RepairFlow ist unsere Antwort darauf. Wichtig für die Einordnung: Wir sind nicht die Werkstatt, wir sind das Software-Startup. FixWerk ist unser Pilotkunde, an dessen Abläufen wir die Plattform entworfen haben. RepairFlow ist eine Cloud-Plattform, die den ganzen Reparatur-Lebenszyklus abdeckt, von der ersten Anfrage bis zur Abholung und Reklamation. Sie besteht aus vier Modulen: dem Kundenportal mit App, dem Auftrags- und Werkstattmodul, dem Dispositionsmodul für Ersatzteile und der Abrechnung. Zielkunden sind unabhängige Werkstätten und kleine Ketten mit zwei bis zehn Filialen. Die physische Reparatur, die Lieferantensysteme und die Buchhaltung bleiben außerhalb; dorthin gibt es nur Schnittstellen. Was die Werkstatt davon hat, zeigt Kilian.</w:t>
+        <w:t xml:space="preserve">RepairFlow ist unsere Antwort darauf. Wichtig für die Einordnung: Wir sind nicht die Werkstatt, wir sind das Software-Startup. FixWerk ist unser Pilotkunde, an dessen Abläufen wir die Plattform entworfen haben. RepairFlow ist eine Cloud-Plattform, die den ganzen Reparatur-Lebenszyklus abdeckt, von der ersten Anfrage bis zur Abholung und Reklamation. Sie besteht aus vier Modulen: dem Kundenportal mit App, dem Auftrags- und Werkstattmodul, dem Dispositionsmodul für Ersatzteile und </w:t>
+      </w:r>
+      <w:r>
+        <w:lastRenderedPageBreak/>
+        <w:t>der Abrechnung. Zielkunden sind unabhängige Werkstätten und kleine Ketten mit zwei bis zehn Filialen. Die physische Reparatur, die Lieferantensysteme und die Buchhaltung bleiben außerhalb; dorthin gibt es nur Schnittstellen. Was die Werkstatt davon hat, zeigt Kilian.</w:t>
       </w:r>
     </w:p>
     <w:p>
@@ -177,14 +181,13 @@
         </w:rPr>
         <w:t>Folie 6 – Die Auftragsreise mit RepairFlow</w:t>
       </w:r>
-      <w:r>
-        <w:rPr>
-          <w:i/>
-        </w:rPr>
-        <w:t xml:space="preserve">  (70 s)</w:t>
-      </w:r>
     </w:p>
     <w:p>
+      <w:pPr>
+        <w:rPr>
+          <w:bCs/>
+        </w:rPr>
+      </w:pPr>
       <w:r>
         <w:rPr>
           <w:b/>
@@ -192,7 +195,10 @@
         <w:t xml:space="preserve">Maximilian: </w:t>
       </w:r>
       <w:r>
-        <w:t>So sieht eine Reparatur mit RepairFlow aus. Der Kunde schickt per App ein Foto oder Video und bekommt innerhalb einer Minute Vorschlag, vorläufigen Kostenvoranschlag und Terminvorschlag. In der Filiale wird das Gerät registriert und der Auftrag angelegt. Der Techniker prüft den Vorschlag, stellt die Diagnose und erstellt den Kostenvoranschlag, den der Kunde in der App freigibt. Dann disponiert RepairFlow die Teile über alle Filialen und bestellt Fehlteile beim Lieferanten. Nach der Reparatur folgt die Endkontrolle, der Kunde wird benachrichtigt, holt ab und zahlt. Jeder dieser Schritte ist ein Status des Reparaturauftrags: angenommen, in Diagnose, KVA offen, freigegeben, Teile bestellt, in Reparatur, fertig, abgeholt, und abgelehnt, wenn der Kunde den KVA ablehnt oder die Reparatur scheitert. Dieser Zustandsautomat ist der rote Faden durch alle unsere Modelle. Welche Abläufe dahinterstecken, zeige ich Ihnen an drei Beispielen.</w:t>
+        <w:rPr>
+          <w:bCs/>
+        </w:rPr>
+        <w:t>Stellen Sie sich Thomas vor – er fährt jeden Tag mit dem E-Bike zur Arbeit und bemerkt morgens, dass am Motor etwas ausgetreten ist. Er macht ein Foto davon und öffnet die RepairFlow-App. Er wählt sein E-Bike aus, lädt das Foto hoch – und 60 Sekunden später hat er einen Diagnosevorschlag, einen vorläufigen Kostenvoranschlag und drei freie Termine in der Filiale um die Ecke. Er bucht direkt für den nächsten Morgen. In der Filiale gibt er das Rad ab, der Techniker prüft den Vorschlag, stellt die eigentliche Diagnose und schickt Thomas den finalen Kostenvoranschlag in die App. Thomas tippt auf „Freigeben“ – fertig. RepairFlow sucht das benötigte Ersatzteil in allen Filialen, findet es in einer Nachbarfiliale und lässt es umlegen. Keiner muss beim Lieferanten bestellen. Am Nachmittag bekommt Thomas eine Benachrichtigung: Rad fertig, abholbereit. Er zahlt beim Abholen. Jeder dieser Schritte – von der Voranmeldung bis zur Abholung – ist ein Status im System: angenommen, in Diagnose, KVA offen, freigegeben, Teile bestellt, in Reparatur, fertig, abgeholt. Und abgelehnt, wenn Thomas den KVA nicht freigibt oder die Reparatur scheitert. Dieser Zustandsautomat zieht sich durch alle unsere Modelle. Drei Stellen zeige ich jetzt genauer.</w:t>
       </w:r>
     </w:p>
     <w:p>
@@ -205,14 +211,13 @@
         </w:rPr>
         <w:t>Folie 7 – Drei Prozess-Highlights</w:t>
       </w:r>
-      <w:r>
-        <w:rPr>
-          <w:i/>
-        </w:rPr>
-        <w:t xml:space="preserve">  (80 s)</w:t>
-      </w:r>
     </w:p>
     <w:p>
+      <w:pPr>
+        <w:rPr>
+          <w:bCs/>
+        </w:rPr>
+      </w:pPr>
       <w:r>
         <w:rPr>
           <w:b/>
@@ -220,7 +225,10 @@
         <w:t xml:space="preserve">Maximilian: </w:t>
       </w:r>
       <w:r>
-        <w:t>Hinter jedem dieser Schritte steht ein Geschäftsprozess. Drei Stellen zeigen, was die Prozesse leisten. Erstens der Kostenvoranschlag in Prozess 04: Nach dem Versand wartet ein ereignisbasiertes Gateway auf Freigabe, Ablehnung oder den Ablauf von drei Tagen. Bei Fristablauf erinnert RepairFlow den Kunden, höchstens zweimal. Nach dem dritten Fristablauf ohne Antwort gilt der KVA als abgelehnt und das Gerät geht mit Diagnosepauschale zur Abholung. Kein Auftrag bleibt liegen. Zweitens die Disposition in Prozess 05: Für jedes benötigte Teil läuft parallel eine Prüfung, erst im eigenen Lager, dann in den anderen Filialen. Was lokal liegt, wird reserviert, was anderswo liegt, umgelagert, und nur Fehlteile werden bestellt. Drittens die Reklamation in Prozess 09: Der Techniker prüft den Mangel, RepairFlow entscheidet nach Regel über Gewährleistung, und im Gewährleistungsfall gibt die Werkstattleitung einen kostenfreien Nacharbeitsauftrag frei, der wieder durch die normale Auftragsreise läuft. Wie sich das für den Kunden anfühlt, zeige ich Ihnen jetzt in der App.</w:t>
+        <w:rPr>
+          <w:bCs/>
+        </w:rPr>
+        <w:t>Hinter jedem dieser Schritte steckt ein Geschäftsprozess. Drei davon zeigen, wie RepairFlow mit Ausnahmesituationen umgeht. Beim Kostenvoranschlag in Prozess 04 wartet ein ereignisbasiertes Gateway auf Freigabe, Ablehnung oder Fristablauf nach drei Tagen. Meldet sich der Kunde nicht, erinnert RepairFlow ihn – höchstens zweimal. Kommt nach dem dritten Fristablauf keine Antwort, gilt der KVA als abgelehnt, und das Gerät geht mit Diagnosepauschale zur Abholung. Kein Auftrag bleibt liegen. Bei der Disposition in Prozess 05 laufen für jedes benötigte Teil parallele Prüfungen: erst das eigene Lager, dann die anderen Filialen. Was lokal liegt, wird reserviert, was anderswo liegt, umgelagert – bestellt wird nur, was nirgends vorhanden ist. Und bei der Reklamation in Prozess 09 prüft der Techniker den Mangel, RepairFlow entscheidet nach Regel über Gewährleistung, und bei Gewährleistung gibt die Werkstattleitung einen kostenfreien Nacharbeitsauftrag frei, der wieder durch die normale Auftragsreise läuft. Wie sich das aus Kundensicht anfühlt, zeige ich jetzt in der App.</w:t>
       </w:r>
     </w:p>
     <w:p>
@@ -231,16 +239,16 @@
         <w:rPr>
           <w:b/>
         </w:rPr>
+        <w:lastRenderedPageBreak/>
         <w:t>Folie 8 – Live-Demo: die Kunden-App</w:t>
-      </w:r>
-      <w:r>
-        <w:rPr>
-          <w:i/>
-        </w:rPr>
-        <w:t xml:space="preserve">  (70 s)</w:t>
       </w:r>
     </w:p>
     <w:p>
+      <w:pPr>
+        <w:rPr>
+          <w:bCs/>
+        </w:rPr>
+      </w:pPr>
       <w:r>
         <w:rPr>
           <w:b/>
@@ -248,7 +256,10 @@
         <w:t xml:space="preserve">Maximilian: </w:t>
       </w:r>
       <w:r>
-        <w:t>Wir starten mit der Sofortdiagnose aus Kundensicht. Der Kunde wählt sein Gerät, beschreibt das Problem und lädt ein Foto hoch; im Modell ist das die Voranmeldung mit dem Medienanhang. Der KI-Dienst antwortet mit Ursache, benötigten Teilen und einer Konfidenz, das ist der KIDiagnosevorschlag. RepairFlow rechnet daraus das Angebot, deutlich als vorläufig markiert, und schlägt Filiale und Termin vor. Bestätigt der Kunde, sind die Teile vorreserviert und die Voranmeldung steht. Der eigentliche Reparaturauftrag entsteht erst, wenn das Gerät in der Filiale abgegeben wird. Zum Schluss sieht der Kunde den Status seines Auftrags entlang derselben Zustände, die ich vorhin in der Auftragsreise gezeigt habe. Die KI-Antwort ist in der Demo simuliert; Ablauf und Begriffe sind genau die aus unseren Modellen. Was hinter der Sofortdiagnose steckt, erklärt Adrian.</w:t>
+        <w:rPr>
+          <w:bCs/>
+        </w:rPr>
+        <w:t>Ich führe kurz durch die acht Schritte der Demo. Der Kunde wählt sein Gerät, beschreibt das Problem und lädt ein Foto hoch – das ist die Voranmeldung mit Medienanhang. Dann analysiert der KI-Dienst das Bild; was in der Demo als Animation zu sehen ist, entspricht im Modell dem Schritt T01_KI. Das Ergebnis: Ursache, Konfidenz und eine Teile-Liste, also der KI-Diagnosevorschlag. Daraus rechnet RepairFlow ein Angebot – klar als vorläufig markiert – und schlägt Filiale und Termin vor. Bestätigt der Kunde, sind die Teile vorreserviert und die Voranmeldung steht. Den eigentlichen Reparaturauftrag gibt es erst, wenn das Gerät in der Filiale abgegeben wird. Am Ende sieht der Kunde den Auftragsstatus entlang genau der Zustände, die ich vorhin in der Auftragsreise gezeigt habe. Die KI-Antwort ist simuliert; Begriffe und Ablauf sind die aus unseren Modellen. Was technisch dahintersteckt, erklärt Adrian.</w:t>
       </w:r>
     </w:p>
     <w:p>
@@ -343,6 +354,7 @@
         <w:rPr>
           <w:b/>
         </w:rPr>
+        <w:lastRenderedPageBreak/>
         <w:t>Folie 12 – Wer macht was im System: Rollen und Use Cases</w:t>
       </w:r>
       <w:r>
@@ -416,7 +428,11 @@
         <w:t xml:space="preserve">Jakob: </w:t>
       </w:r>
       <w:r>
-        <w:t>Drei Modelle, die sich auf dieselben Dinge beziehen, laufen schnell auseinander. Dagegen hatten wir drei Mittel. Erstens Konventionen: Datenobjekte in BPMN tragen die Klassennamen, Aktivitäten heißen Verb plus Objekt, jede Rolle ist genau einer Lane und einer Klasse zugeordnet, die Statuswerte sind in allen Modellen identisch, und in jedem Sequenzdiagramm geht der Weg vom Akteur über die Oberfläche zum Objekt. Zweitens Werkzeuge: Die BPMN-Dateien sind für Camunda 8 angereichert, mit Task-Definitionen, Timern und Bedingungen; der Camunda-Linter und bpmnlint melden null Befunde. Drittens Reviews: Jedes Diagramm wurde im Zweierteam geprüft und in den Gruppenterminen abgestimmt, und jede Änderung wird gegen unsere QA-Checkliste geprüft, bevor sie gemergt wird. Ein Beispiel: Als wir die Nacharbeit in Prozess 07 auf zwei Durchläufe begrenzt haben, musste das Sequenzdiagramm SD4 nachziehen. Genau solche Stellen findet die Checkliste.</w:t>
+        <w:t xml:space="preserve">Drei Modelle, die sich auf dieselben Dinge beziehen, laufen schnell auseinander. Dagegen hatten wir drei Mittel. Erstens Konventionen: Datenobjekte in BPMN tragen die Klassennamen, Aktivitäten heißen Verb plus Objekt, jede Rolle ist genau einer Lane und einer Klasse zugeordnet, die Statuswerte sind in allen Modellen identisch, und in jedem Sequenzdiagramm geht der Weg vom Akteur über die Oberfläche zum Objekt. Zweitens Werkzeuge: Die BPMN-Dateien sind für Camunda 8 angereichert, mit Task-Definitionen, Timern und Bedingungen; der Camunda-Linter und bpmnlint melden null Befunde. Drittens Reviews: Jedes Diagramm wurde im Zweierteam geprüft und in den Gruppenterminen abgestimmt, und jede Änderung wird gegen unsere QA-Checkliste geprüft, bevor sie gemergt wird. Ein </w:t>
+      </w:r>
+      <w:r>
+        <w:lastRenderedPageBreak/>
+        <w:t>Beispiel: Als wir die Nacharbeit in Prozess 07 auf zwei Durchläufe begrenzt haben, musste das Sequenzdiagramm SD4 nachziehen. Genau solche Stellen findet die Checkliste.</w:t>
       </w:r>
     </w:p>
     <w:p>
@@ -528,7 +544,11 @@
         <w:t xml:space="preserve">Nina: </w:t>
       </w:r>
       <w:r>
-        <w:t>RepairFlow löst den Medienbruch aus Papier, Excel und Telefon und macht den Reparaturauftrag zum zentralen Zustandsautomaten. Der fachliche Mehrwert liegt in der filialübergreifenden Disposition und in der KI-Sofortdiagnose, die dem Kunden Klarheit gibt, bevor er die Werkstatt betritt. Vielen Dank für Ihre Aufmerksamkeit. Wir freuen uns auf Ihre Fragen.</w:t>
+        <w:t xml:space="preserve">RepairFlow löst den Medienbruch aus Papier, Excel und Telefon und macht den Reparaturauftrag zum zentralen Zustandsautomaten. Der fachliche Mehrwert liegt in der filialübergreifenden Disposition </w:t>
+      </w:r>
+      <w:r>
+        <w:lastRenderedPageBreak/>
+        <w:t>und in der KI-Sofortdiagnose, die dem Kunden Klarheit gibt, bevor er die Werkstatt betritt. Vielen Dank für Ihre Aufmerksamkeit. Wir freuen uns auf Ihre Fragen.</w:t>
       </w:r>
     </w:p>
     <w:p>
@@ -540,11 +560,6 @@
           <w:b/>
         </w:rPr>
         <w:t>Folie 19 – Anhang: Beiträge der Vortragenden</w:t>
-      </w:r>
-      <w:r>
-        <w:rPr>
-          <w:i/>
-        </w:rPr>
       </w:r>
     </w:p>
     <w:p>
@@ -12481,4 +12496,10 @@
     <ds:schemaRef ds:uri="http://schemas.openxmlformats.org/officeDocument/2006/bibliography"/>
   </ds:schemaRefs>
 </ds:datastoreItem>
+</file>
+
+<file path=docMetadata/LabelInfo.xml><?xml version="1.0" encoding="utf-8"?>
+<clbl:labelList xmlns:clbl="http://schemas.microsoft.com/office/2020/mipLabelMetadata">
+  <clbl:label id="{0cf7ac0a-4681-4823-ab0b-04ef02c5f873}" enabled="1" method="Standard" siteId="{42f7676c-f455-423c-82f6-dc2d99791af7}" contentBits="0" removed="0"/>
+</clbl:labelList>
 </file>
</xml_diff>

<commit_message>
docs: Sprechtext Maximilian finale Version eingeschrieben
</commit_message>
<xml_diff>
--- a/4_praesentation/Sprechtext_Abschlusspraesentation.docx
+++ b/4_praesentation/Sprechtext_Abschlusspraesentation.docx
@@ -248,22 +248,87 @@
         </w:rPr>
         <w:t>Folie 6 – Die Auftragsreise mit RepairFlow</w:t>
       </w:r>
-      <w:r>
-        <w:rPr>
-          <w:i/>
-        </w:rPr>
-        <w:t xml:space="preserve">  (70 s)</w:t>
-      </w:r>
     </w:p>
     <w:p>
       <w:r>
         <w:rPr>
           <w:b/>
         </w:rPr>
-        <w:t>Maximilian: Stellen Sie sich Thomas vor – er fährt jeden Tag mit dem E-Bike zur Arbeit und bemerkt morgens, dass am Motor etwas ausgetreten ist. Er macht ein Foto davon und öffnet die RepairFlow-App. Er wählt sein E-Bike aus, lädt das Foto hoch – und 60 Sekunden später hat er einen Diagnosevorschlag, einen vorläufigen Kostenvoranschlag und drei freie Termine in der Filiale um die Ecke. Er bucht direkt für den nächsten Morgen. In der Filiale gibt er das Rad ab, der Techniker prüft den Vorschlag, stellt die eigentliche Diagnose und schickt Thomas den finalen Kostenvoranschlag in die App. Thomas tippt auf „Freigeben“ – fertig. RepairFlow sucht das benötigte Ersatzteil in allen Filialen, findet es in einer Nachbarfiliale und lässt es umlegen. Keiner muss beim Lieferanten bestellen. Am Nachmittag bekommt Thomas eine Benachrichtigung: Rad fertig, abholbereit. Er zahlt beim Abholen. Jeder dieser Schritte – von der Voranmeldung bis zur Abholung – ist ein Status im System: angenommen, in Diagnose, KVA offen, freigegeben, Teile bestellt, in Reparatur, fertig, abgeholt. Und abgelehnt, wenn Thomas den KVA nicht freigibt oder die Reparatur scheitert. Dieser Zustandsautomat zieht sich durch alle unsere Modelle. Drei Stellen zeige ich jetzt genauer.</w:t>
+        <w:t xml:space="preserve">Maximilian: </w:t>
       </w:r>
-      <w:r/>
-      <w:r/>
+      <w:r>
+        <w:rPr>
+          <w:bCs/>
+        </w:rPr>
+        <w:t xml:space="preserve">Stellen Sie sich </w:t>
+      </w:r>
+      <w:r>
+        <w:rPr>
+          <w:bCs/>
+        </w:rPr>
+        <w:t>Mike</w:t>
+      </w:r>
+      <w:r>
+        <w:rPr>
+          <w:bCs/>
+        </w:rPr>
+        <w:t xml:space="preserve"> vor – er fährt jeden Tag mit dem E-Bike zur Arbeit und bemerkt morgens, dass am Motor etwas ausgetreten ist. Er macht ein Foto davon und öffnet die RepairFlow-App. Er wählt sein E-Bike aus, lädt das Foto hoch – und 60 Sekunden später hat er einen Diagnosevorschlag, einen vorläufigen Kostenvoranschlag und drei freie Termine in der Filiale um die Ecke. Er bucht direkt für den nächsten Morgen. In der Filiale gibt er das Rad ab, der Techniker prüft den Vorschlag, stellt die eigentliche Diagnose und schickt </w:t>
+      </w:r>
+      <w:r>
+        <w:rPr>
+          <w:bCs/>
+        </w:rPr>
+        <w:t>Mike</w:t>
+      </w:r>
+      <w:r>
+        <w:rPr>
+          <w:bCs/>
+        </w:rPr>
+        <w:t xml:space="preserve"> den finalen Kostenvoranschlag in die App. </w:t>
+      </w:r>
+      <w:r>
+        <w:rPr>
+          <w:bCs/>
+        </w:rPr>
+        <w:t>Mike</w:t>
+      </w:r>
+      <w:r>
+        <w:rPr>
+          <w:bCs/>
+        </w:rPr>
+        <w:t xml:space="preserve"> tippt auf „Freigeben“ – fertig. RepairFlow sucht das benötigte Ersatzteil in allen Filialen, findet es in einer Nachbarfiliale und lässt es umlegen. Keiner muss beim Lieferanten bestellen. Am Nachmittag bekommt </w:t>
+      </w:r>
+      <w:r>
+        <w:rPr>
+          <w:bCs/>
+        </w:rPr>
+        <w:t>Mike</w:t>
+      </w:r>
+      <w:r>
+        <w:rPr>
+          <w:bCs/>
+        </w:rPr>
+        <w:t xml:space="preserve"> eine Benachrichtigung: Rad fertig, abholbereit. Er zahlt beim Abholen. Jeder dieser Schritte – von der Voranmeldung bis zur Abholung – ist ein Status im System: angenommen, in Diagnose, KVA offen, freigegeben, Teile bestellt, in Reparatur, fertig, abgeholt. Und abgelehnt, wenn </w:t>
+      </w:r>
+      <w:r>
+        <w:rPr>
+          <w:bCs/>
+        </w:rPr>
+        <w:t>Mike</w:t>
+      </w:r>
+      <w:r>
+        <w:rPr>
+          <w:bCs/>
+        </w:rPr>
+        <w:t xml:space="preserve"> den KVA nicht </w:t>
+      </w:r>
+      <w:r>
+        <w:rPr>
+          <w:bCs/>
+        </w:rPr>
+        <w:lastRenderedPageBreak/>
+        <w:t>freigibt oder die Reparatur scheitert. Dieser Zustandsautomat zieht sich durch alle unsere Modelle. Drei Stellen zeige ich jetzt genauer.</w:t>
+      </w:r>
     </w:p>
     <w:p>
       <w:pPr>
@@ -275,23 +340,37 @@
         </w:rPr>
         <w:t>Folie 7 – Drei Prozess-Highlights</w:t>
       </w:r>
-      <w:r>
-        <w:rPr>
-          <w:i/>
-        </w:rPr>
-        <w:t xml:space="preserve">  (80 s)</w:t>
-      </w:r>
     </w:p>
     <w:p>
+      <w:pPr>
+        <w:rPr>
+          <w:bCs/>
+        </w:rPr>
+      </w:pPr>
       <w:r>
         <w:rPr>
           <w:b/>
         </w:rPr>
-        <w:t>Maximilian: Hinter jedem dieser Schritte steckt ein Geschäftsprozess. Drei davon zeigen, wie RepairFlow mit Ausnahmesituationen umgeht. Beim Kostenvoranschlag in Prozess 04 wartet ein ereignisbasiertes Gateway auf Freigabe, Ablehnung oder Fristablauf nach drei Tagen. Meldet sich der Kunde nicht, erinnert RepairFlow ihn – höchstens zweimal. Kommt nach dem dritten Fristablauf keine Antwort, gilt der KVA als abgelehnt, und das Gerät geht mit Diagnosepauschale zur Abholung. Kein Auftrag bleibt liegen. Bei der Disposition in Prozess 05 laufen für jedes benötigte Teil parallele Prüfungen: erst das eigene Lager, dann die anderen Filialen. Was lokal liegt, wird reserviert, was anderswo liegt, umgelagert – bestellt wird nur, was nirgends vorhanden ist. Und bei der Reklamation in Prozess 09 prüft der Techniker den Mangel, RepairFlow entscheidet nach Regel über Gewährleistung, und bei Gewährleistung gibt die Werkstattleitung einen kostenfreien Nacharbeitsauftrag frei, der wieder durch die normale Auftragsreise läuft. Wie sich das aus Kundensicht anfühlt, zeige ich jetzt in der App.</w:t>
+        <w:t xml:space="preserve">Maximilian: </w:t>
       </w:r>
-      <w:r/>
-      <w:r/>
-      <w:r/>
+      <w:r>
+        <w:rPr>
+          <w:bCs/>
+        </w:rPr>
+        <w:t>Hinter jedem dieser Schritte steckt ein Geschäftsprozess. Drei davon zeigen, wie RepairFlow mit Ausnahmesituationen umgeht. Beim Kostenvoranschlag in Prozess 04 wartet ein ereignisbasiertes Gateway auf Freigabe, Ablehnung oder Fristablauf nach drei Tagen. Meldet sich der Kunde nicht, erinnert RepairFlow ihn – höchstens zweimal. Kommt nach dem dritten Fristablauf keine Antwort, gilt der KVA als abgelehnt, und das Gerät geht mit Diagnosepauschale zur Abholung. Kein Auftrag bleibt liegen. Bei der Disposition i</w:t>
+      </w:r>
+      <w:r>
+        <w:rPr>
+          <w:bCs/>
+        </w:rPr>
+        <w:t>n Prozess 05 laufen für jedes benötigte Teil parallele Prüfungen: erst das eigene Lager, dann die anderen Filialen. Was lokal liegt, wird reserviert, was anderswo liegt, umgelagert – bestellt wird nur, was nirgends vorhanden ist. Und bei der Reklamation in Prozess 09 prüft der Techniker den Mangel, RepairFlow entscheidet nach Regel über Gewährleistung, und bei Gewährleistung gibt die Werkstattleitung einen kostenfreien Nacharbeitsauftrag frei, der wieder durch die normale Auftragsreise läuft. Wie sich das a</w:t>
+      </w:r>
+      <w:r>
+        <w:rPr>
+          <w:bCs/>
+        </w:rPr>
+        <w:t>us Kundensicht anfühlt, zeige ich jetzt in der App.</w:t>
+      </w:r>
     </w:p>
     <w:p>
       <w:pPr>
@@ -311,22 +390,31 @@
         </w:rPr>
         <w:t>Folie 8 – Live-Demo: die Kunden-App</w:t>
       </w:r>
-      <w:r>
-        <w:rPr>
-          <w:i/>
-        </w:rPr>
-        <w:t xml:space="preserve">  (70 s)</w:t>
-      </w:r>
     </w:p>
     <w:p>
+      <w:pPr>
+        <w:rPr>
+          <w:bCs/>
+        </w:rPr>
+      </w:pPr>
       <w:r>
         <w:rPr>
           <w:b/>
         </w:rPr>
-        <w:t>Maximilian: Ich führe kurz durch die acht Schritte der Demo. Der Kunde wählt sein Gerät, beschreibt das Problem und lädt ein Foto hoch – das ist die Voranmeldung mit Medienanhang. Dann analysiert der KI-Dienst das Bild; was in der Demo als Animation zu sehen ist, entspricht im Modell dem Schritt T01_KI. Das Ergebnis: Ursache, Konfidenz und eine Teile-Liste, also der KI-Diagnosevorschlag. Daraus rechnet RepairFlow ein Angebot – klar als vorläufig markiert – und schlägt Filiale und Termin vor. Bestätigt der Kunde, sind die Teile vorreserviert und die Voranmeldung steht. Den eigentlichen Reparaturauftrag gibt es erst, wenn das Gerät in der Filiale abgegeben wird. Am Ende sieht der Kunde den Auftragsstatus entlang genau der Zustände, die ich vorhin in der Auftragsreise gezeigt habe. Die KI-Antwort ist simuliert; Begriffe und Ablauf sind die aus unseren Modellen. Was technisch dahintersteckt, erklärt Adrian.</w:t>
+        <w:t xml:space="preserve">Maximilian: </w:t>
       </w:r>
-      <w:r/>
-      <w:r/>
+      <w:r>
+        <w:rPr>
+          <w:bCs/>
+        </w:rPr>
+        <w:t>Ich führe kurz durch die acht Schritte der Demo. Der Kunde wählt sein Gerät, beschreibt das Problem und lädt ein Foto hoch – das ist die Voranmeldung mit Medienanhang. Dann analysiert der KI-Dienst das Bild; was in der Demo als Animation zu sehen ist, entspricht im Modell dem Schritt T01_KI. Das Ergebnis: Ursache, Konfidenz und eine Teile-Liste, also der KI-Diagnosevorschlag. Daraus rechnet RepairFlow ein Angebot – klar als vorläufig markiert – und schlägt Filiale und Termin vor. Bestätigt der Kunde, sind d</w:t>
+      </w:r>
+      <w:r>
+        <w:rPr>
+          <w:bCs/>
+        </w:rPr>
+        <w:t>ie Teile vorreserviert und die Voranmeldung steht. Den eigentlichen Reparaturauftrag gibt es erst, wenn das Gerät in der Filiale abgegeben wird. Am Ende sieht der Kunde den Auftragsstatus entlang genau der Zustände, die ich vorhin in der Auftragsreise gezeigt habe. Die KI-Antwort ist simuliert; Begriffe und Ablauf sind die aus unseren Modellen. Was technisch dahintersteckt, erklärt Adrian.</w:t>
+      </w:r>
     </w:p>
     <w:p>
       <w:pPr>
@@ -381,14 +469,11 @@
         <w:rPr>
           <w:b/>
         </w:rPr>
+        <w:lastRenderedPageBreak/>
         <w:t xml:space="preserve">Adrian: </w:t>
       </w:r>
       <w:r>
-        <w:t xml:space="preserve">Damit zur zweiten Hälfte: Was steckt hinter dieser Geschichte? Wir haben drei Modelle erstellt, die zusammenpassen. Zehn BPMN-Kollaborationsdiagramme mit 136 Aktivitäten im Werkstatt-Pool, dazu die Abläufe des Kunden. Ein Use-Case-Diagramm mit 19 Use Cases und 17 Rollen und Akteuren. Ein vollständiges Klassendiagramm mit 29 Klassen und 40 Assoziationen. Sechs Sequenzdiagramme, </w:t>
-      </w:r>
-      <w:r>
-        <w:lastRenderedPageBreak/>
-        <w:t>gefordert waren fünf. Alle Modelle liegen im Camunda Modeler und in Visual Paradigm und werden mit der Dokumentation abgegeben.</w:t>
+        <w:t>Damit zur zweiten Hälfte: Was steckt hinter dieser Geschichte? Wir haben drei Modelle erstellt, die zusammenpassen. Zehn BPMN-Kollaborationsdiagramme mit 136 Aktivitäten im Werkstatt-Pool, dazu die Abläufe des Kunden. Ein Use-Case-Diagramm mit 19 Use Cases und 17 Rollen und Akteuren. Ein vollständiges Klassendiagramm mit 29 Klassen und 40 Assoziationen. Sechs Sequenzdiagramme, gefordert waren fünf. Alle Modelle liegen im Camunda Modeler und in Visual Paradigm und werden mit der Dokumentation abgegeben.</w:t>
       </w:r>
     </w:p>
     <w:p>
@@ -495,12 +580,12 @@
     </w:p>
     <w:p>
       <w:r>
+        <w:lastRenderedPageBreak/>
         <w:t>Erstens steht der Reparaturauftrag im Mittelpunkt. Befund und Reparaturschritte gehören fest zum Auftrag. Kostenvoranschlag und Gerät sind nur mit ihm verknüpft, weil der erste Kostenvoranschlag schon entsteht, bevor es einen Auftrag gibt.</w:t>
       </w:r>
     </w:p>
     <w:p>
       <w:r>
-        <w:lastRenderedPageBreak/>
         <w:t>Zweitens ist der Lagerbestand eine eigene Klasse. Er sagt, wie viel von einem Teil in welcher Filiale liegt. Nur so kann RepairFlow alle Filialen durchsuchen.</w:t>
       </w:r>
     </w:p>
@@ -607,6 +692,7 @@
     </w:p>
     <w:p>
       <w:r>
+        <w:lastRenderedPageBreak/>
         <w:t>Zweitens die Namen. Klassen, Datenobjekte und Statuswerte müssen in allen Modellen gleich heißen. Sonst zerfällt die Analyse in drei einzelne Modelle.</w:t>
       </w:r>
     </w:p>
@@ -617,7 +703,6 @@
     </w:p>
     <w:p>
       <w:r>
-        <w:lastRenderedPageBreak/>
         <w:t>Viertens die KI-Sofortdiagnose. Sie soll beeindrucken und trotzdem glaubwürdig bleiben. Deshalb trennen wir klar, was heute machbar ist und was Vision ist.</w:t>
       </w:r>
     </w:p>
@@ -729,6 +814,7 @@
     </w:p>
     <w:p>
       <w:r>
+        <w:lastRenderedPageBreak/>
         <w:t>Wird nicht vorgetragen. Pflichtangabe für den PDF-Export laut Ablauf.</w:t>
       </w:r>
     </w:p>
@@ -12661,4 +12747,10 @@
     <ds:schemaRef ds:uri="http://schemas.openxmlformats.org/officeDocument/2006/bibliography"/>
   </ds:schemaRefs>
 </ds:datastoreItem>
+</file>
+
+<file path=docMetadata/LabelInfo.xml><?xml version="1.0" encoding="utf-8"?>
+<clbl:labelList xmlns:clbl="http://schemas.microsoft.com/office/2020/mipLabelMetadata">
+  <clbl:label id="{0cf7ac0a-4681-4823-ab0b-04ef02c5f873}" enabled="1" method="Standard" siteId="{42f7676c-f455-423c-82f6-dc2d99791af7}" contentBits="0" removed="0"/>
+</clbl:labelList>
 </file>
</xml_diff>

<commit_message>
docs: Präsentation und Sprechtext angepasst
</commit_message>
<xml_diff>
--- a/4_praesentation/Sprechtext_Abschlusspraesentation.docx
+++ b/4_praesentation/Sprechtext_Abschlusspraesentation.docx
@@ -9,22 +9,6 @@
           <w:sz w:val="28"/>
         </w:rPr>
         <w:t>Sprechtext Abschlusspräsentation RepairFlow (ca. 19 Minuten)</w:t>
-      </w:r>
-    </w:p>
-    <w:p>
-      <w:r>
-        <w:t>Gruppe 1, WWI25B4 · 27.10.2026, 09:00 Uhr, Raum B458 · Zeitangaben sind Richtwerte für die Generalprobe. Der Text ist ein Vorschlag: Jede Person formuliert ihren Teil so um, dass er zu ihr passt.</w:t>
-      </w:r>
-    </w:p>
-    <w:p>
-      <w:r>
-        <w:rPr>
-          <w:b/>
-        </w:rPr>
-        <w:t xml:space="preserve">Redezeit je Person: </w:t>
-      </w:r>
-      <w:r>
-        <w:t>David 3:30, Kilian 3:45, Maximilian 3:40, Adrian 3:00, Jakob 2:10, Nina 2:35 · gesamt 18:40.</w:t>
       </w:r>
     </w:p>
     <w:p>
@@ -159,7 +143,6 @@
         <w:rPr>
           <w:b/>
         </w:rPr>
-        <w:lastRenderedPageBreak/>
         <w:t>Folie 4 – RepairFlow: die Lösung</w:t>
       </w:r>
       <w:r>
@@ -182,6 +165,7 @@
     </w:p>
     <w:p>
       <w:r>
+        <w:lastRenderedPageBreak/>
         <w:t>RepairFlow läuft in der Cloud und begleitet die ganze Reparatur, von der ersten Anfrage bis zur Abholung und einer möglichen Reklamation. Die Plattform hat vier Bereiche: das Kundenportal mit der App, den Bereich für Aufträge und Werkstatt, die Ersatzteil-Disposition und die Abrechnung.</w:t>
       </w:r>
     </w:p>
@@ -240,182 +224,182 @@
     </w:p>
     <w:p>
       <w:pPr>
-        <w:spacing w:before="200"/>
+        <w:pStyle w:val="paragraph"/>
+        <w:spacing w:before="0" w:beforeAutospacing="0" w:after="0" w:afterAutospacing="0"/>
+        <w:textAlignment w:val="baseline"/>
+        <w:rPr>
+          <w:rFonts w:ascii="Segoe UI" w:hAnsi="Segoe UI" w:cs="Segoe UI"/>
+          <w:sz w:val="18"/>
+          <w:szCs w:val="18"/>
+        </w:rPr>
       </w:pPr>
       <w:r>
         <w:rPr>
+          <w:rStyle w:val="normaltextrun"/>
+          <w:rFonts w:ascii="Calibri" w:hAnsi="Calibri" w:cs="Calibri"/>
           <w:b/>
+          <w:bCs/>
+          <w:sz w:val="22"/>
+          <w:szCs w:val="22"/>
+          <w:lang w:val="en-US"/>
         </w:rPr>
         <w:t>Folie 6 – Die Auftragsreise mit RepairFlow</w:t>
       </w:r>
     </w:p>
     <w:p>
+      <w:pPr>
+        <w:pStyle w:val="paragraph"/>
+        <w:spacing w:before="0" w:beforeAutospacing="0" w:after="0" w:afterAutospacing="0"/>
+        <w:textAlignment w:val="baseline"/>
+        <w:rPr>
+          <w:rStyle w:val="normaltextrun"/>
+          <w:rFonts w:ascii="Calibri" w:hAnsi="Calibri" w:cs="Calibri"/>
+          <w:sz w:val="22"/>
+          <w:szCs w:val="22"/>
+          <w:lang w:val="en-US"/>
+        </w:rPr>
+      </w:pPr>
       <w:r>
         <w:rPr>
-          <w:b/>
+          <w:rStyle w:val="normaltextrun"/>
+          <w:rFonts w:ascii="Calibri" w:hAnsi="Calibri" w:cs="Calibri"/>
+          <w:sz w:val="22"/>
+          <w:szCs w:val="22"/>
+          <w:lang w:val="en-US"/>
         </w:rPr>
-        <w:t xml:space="preserve">Maximilian: </w:t>
-      </w:r>
-      <w:r>
-        <w:rPr>
-          <w:bCs/>
-        </w:rPr>
-        <w:t xml:space="preserve">Stellen Sie sich </w:t>
-      </w:r>
-      <w:r>
-        <w:rPr>
-          <w:bCs/>
-        </w:rPr>
-        <w:t>Mike</w:t>
-      </w:r>
-      <w:r>
-        <w:rPr>
-          <w:bCs/>
-        </w:rPr>
-        <w:t xml:space="preserve"> vor – er fährt jeden Tag mit dem E-Bike zur Arbeit und bemerkt morgens, dass am Motor etwas ausgetreten ist. Er macht ein Foto davon und öffnet die RepairFlow-App. Er wählt sein E-Bike aus, lädt das Foto hoch – und 60 Sekunden später hat er einen Diagnosevorschlag, einen vorläufigen Kostenvoranschlag und drei freie Termine in der Filiale um die Ecke. Er bucht direkt für den nächsten Morgen. In der Filiale gibt er das Rad ab, der Techniker prüft den Vorschlag, stellt die eigentliche Diagnose und schickt </w:t>
-      </w:r>
-      <w:r>
-        <w:rPr>
-          <w:bCs/>
-        </w:rPr>
-        <w:t>Mike</w:t>
-      </w:r>
-      <w:r>
-        <w:rPr>
-          <w:bCs/>
-        </w:rPr>
-        <w:t xml:space="preserve"> den finalen Kostenvoranschlag in die App. </w:t>
-      </w:r>
-      <w:r>
-        <w:rPr>
-          <w:bCs/>
-        </w:rPr>
-        <w:t>Mike</w:t>
-      </w:r>
-      <w:r>
-        <w:rPr>
-          <w:bCs/>
-        </w:rPr>
-        <w:t xml:space="preserve"> tippt auf „Freigeben“ – fertig. RepairFlow sucht das benötigte Ersatzteil in allen Filialen, findet es in einer Nachbarfiliale und lässt es umlegen. Keiner muss beim Lieferanten bestellen. Am Nachmittag bekommt </w:t>
-      </w:r>
-      <w:r>
-        <w:rPr>
-          <w:bCs/>
-        </w:rPr>
-        <w:t>Mike</w:t>
-      </w:r>
-      <w:r>
-        <w:rPr>
-          <w:bCs/>
-        </w:rPr>
-        <w:t xml:space="preserve"> eine Benachrichtigung: Rad fertig, abholbereit. Er zahlt beim Abholen. Jeder dieser Schritte – von der Voranmeldung bis zur Abholung – ist ein Status im System: angenommen, in Diagnose, KVA offen, freigegeben, Teile bestellt, in Reparatur, fertig, abgeholt. Und abgelehnt, wenn </w:t>
-      </w:r>
-      <w:r>
-        <w:rPr>
-          <w:bCs/>
-        </w:rPr>
-        <w:t>Mike</w:t>
-      </w:r>
-      <w:r>
-        <w:rPr>
-          <w:bCs/>
-        </w:rPr>
-        <w:t xml:space="preserve"> den KVA nicht </w:t>
-      </w:r>
-      <w:r>
-        <w:rPr>
-          <w:bCs/>
-        </w:rPr>
-        <w:lastRenderedPageBreak/>
-        <w:t>freigibt oder die Reparatur scheitert. Dieser Zustandsautomat zieht sich durch alle unsere Modelle. Drei Stellen zeige ich jetzt genauer.</w:t>
+        <w:t>Stellen Sie sich Mike vor – er fährt jeden Tag mit dem E-Bike zur Arbeit und bemerkt morgens, dass am Motor etwas ausgetreten ist. Er macht ein Foto davon und öffnet die RepairFlow-App. Er wählt sein E-Bike aus, lädt das Foto hoch – und 60 Sekunden später hat er einen Diagnosevorschlag, einen vorläufigen Kostenvoranschlag und drei freie Termine in der Filiale um die Ecke. Er bucht direkt für den nächsten Morgen. In der Filiale gibt er das Rad ab, der Techniker prüft den Vorschlag, stellt die eigentliche Diagnose und schickt Mike den finalen Kostenvoranschlag in die App. Mike tippt auf „Freigeben“ – fertig. RepairFlow sucht das benötigte Ersatzteil in allen Filialen, findet es in einer Nachbarfiliale und lässt es umlegen. Keiner muss beim Lieferanten bestellen. Am Nachmittag bekommt Mike eine Benachrichtigung: Rad fertig, abholbereit. Er zahlt beim Abholen. Jeder dieser Schritte – von der Voranmeldung bis zur Abholung – ist ein Status im System: angenommen, in Diagnose, KVA offen, freigegeben, Teile bestellt, in Reparatur, fertig, abgeholt. Und abgelehnt, wenn Mike den KVA nicht freigibt oder die Reparatur scheitert. Dieser Zustandsautomat zieht sich durch alle unsere Modelle. Drei Stellen zeige ich jetzt genauer.</w:t>
       </w:r>
     </w:p>
     <w:p>
       <w:pPr>
-        <w:spacing w:before="200"/>
+        <w:pStyle w:val="paragraph"/>
+        <w:spacing w:before="0" w:beforeAutospacing="0" w:after="0" w:afterAutospacing="0"/>
+        <w:textAlignment w:val="baseline"/>
+        <w:rPr>
+          <w:rFonts w:ascii="Segoe UI" w:hAnsi="Segoe UI" w:cs="Segoe UI"/>
+          <w:sz w:val="18"/>
+          <w:szCs w:val="18"/>
+        </w:rPr>
+      </w:pPr>
+    </w:p>
+    <w:p>
+      <w:pPr>
+        <w:pStyle w:val="paragraph"/>
+        <w:spacing w:before="0" w:beforeAutospacing="0" w:after="0" w:afterAutospacing="0"/>
+        <w:textAlignment w:val="baseline"/>
+        <w:rPr>
+          <w:rFonts w:ascii="Segoe UI" w:hAnsi="Segoe UI" w:cs="Segoe UI"/>
+          <w:sz w:val="18"/>
+          <w:szCs w:val="18"/>
+        </w:rPr>
       </w:pPr>
       <w:r>
         <w:rPr>
+          <w:rStyle w:val="normaltextrun"/>
+          <w:rFonts w:ascii="Calibri" w:hAnsi="Calibri" w:cs="Calibri"/>
           <w:b/>
+          <w:bCs/>
+          <w:sz w:val="22"/>
+          <w:szCs w:val="22"/>
+          <w:lang w:val="en-US"/>
         </w:rPr>
         <w:t>Folie 7 – Drei Prozess-Highlights</w:t>
       </w:r>
     </w:p>
     <w:p>
       <w:pPr>
+        <w:pStyle w:val="paragraph"/>
+        <w:spacing w:before="0" w:beforeAutospacing="0" w:after="0" w:afterAutospacing="0"/>
+        <w:textAlignment w:val="baseline"/>
         <w:rPr>
-          <w:bCs/>
+          <w:rStyle w:val="normaltextrun"/>
+          <w:rFonts w:ascii="Calibri" w:hAnsi="Calibri" w:cs="Calibri"/>
+          <w:sz w:val="22"/>
+          <w:szCs w:val="22"/>
+          <w:lang w:val="en-US"/>
         </w:rPr>
       </w:pPr>
       <w:r>
         <w:rPr>
-          <w:b/>
+          <w:rStyle w:val="normaltextrun"/>
+          <w:rFonts w:ascii="Calibri" w:hAnsi="Calibri" w:cs="Calibri"/>
+          <w:sz w:val="22"/>
+          <w:szCs w:val="22"/>
+          <w:lang w:val="en-US"/>
         </w:rPr>
-        <w:t xml:space="preserve">Maximilian: </w:t>
+        <w:t xml:space="preserve">Hinter jedem dieser Schritte steckt ein Geschäftsprozess. Drei davon zeigen, wie RepairFlow mit Ausnahmesituationen umgeht. Beim Kostenvoranschlag in Prozess 04 wartet ein ereignisbasiertes Gateway auf Freigabe, Ablehnung oder Fristablauf nach drei Tagen. Meldet sich der Kunde nicht, erinnert RepairFlow ihn – höchstens zweimal. Kommt nach dem dritten Fristablauf keine Antwort, gilt der KVA als abgelehnt, und das Gerät geht mit Diagnosepauschale zur Abholung. Kein Auftrag bleibt liegen. Bei der Disposition in Prozess 05 laufen für jedes benötigte Teil parallele Prüfungen: erst das </w:t>
       </w:r>
       <w:r>
         <w:rPr>
-          <w:bCs/>
+          <w:rStyle w:val="normaltextrun"/>
+          <w:rFonts w:ascii="Calibri" w:hAnsi="Calibri" w:cs="Calibri"/>
+          <w:sz w:val="22"/>
+          <w:szCs w:val="22"/>
+          <w:lang w:val="en-US"/>
         </w:rPr>
-        <w:t>Hinter jedem dieser Schritte steckt ein Geschäftsprozess. Drei davon zeigen, wie RepairFlow mit Ausnahmesituationen umgeht. Beim Kostenvoranschlag in Prozess 04 wartet ein ereignisbasiertes Gateway auf Freigabe, Ablehnung oder Fristablauf nach drei Tagen. Meldet sich der Kunde nicht, erinnert RepairFlow ihn – höchstens zweimal. Kommt nach dem dritten Fristablauf keine Antwort, gilt der KVA als abgelehnt, und das Gerät geht mit Diagnosepauschale zur Abholung. Kein Auftrag bleibt liegen. Bei der Disposition i</w:t>
-      </w:r>
-      <w:r>
-        <w:rPr>
-          <w:bCs/>
-        </w:rPr>
-        <w:t>n Prozess 05 laufen für jedes benötigte Teil parallele Prüfungen: erst das eigene Lager, dann die anderen Filialen. Was lokal liegt, wird reserviert, was anderswo liegt, umgelagert – bestellt wird nur, was nirgends vorhanden ist. Und bei der Reklamation in Prozess 09 prüft der Techniker den Mangel, RepairFlow entscheidet nach Regel über Gewährleistung, und bei Gewährleistung gibt die Werkstattleitung einen kostenfreien Nacharbeitsauftrag frei, der wieder durch die normale Auftragsreise läuft. Wie sich das a</w:t>
-      </w:r>
-      <w:r>
-        <w:rPr>
-          <w:bCs/>
-        </w:rPr>
-        <w:t>us Kundensicht anfühlt, zeige ich jetzt in der App.</w:t>
+        <w:lastRenderedPageBreak/>
+        <w:t>eigene Lager, dann die anderen Filialen. Was lokal liegt, wird reserviert, was anderswo liegt, umgelagert – bestellt wird nur, was nirgends vorhanden ist. Und bei der Reklamation in Prozess 09 prüft der Techniker den Mangel, RepairFlow entscheidet nach Regel über Gewährleistung, und bei Gewährleistung gibt die Werkstattleitung einen kostenfreien Nacharbeitsauftrag frei, der wieder durch die normale Auftragsreise läuft. Wie sich das aus Kundensicht anfühlt, zeige ich jetzt in der App.</w:t>
       </w:r>
     </w:p>
     <w:p>
       <w:pPr>
-        <w:spacing w:before="200"/>
+        <w:pStyle w:val="paragraph"/>
+        <w:spacing w:before="0" w:beforeAutospacing="0" w:after="0" w:afterAutospacing="0"/>
+        <w:textAlignment w:val="baseline"/>
         <w:rPr>
-          <w:b/>
+          <w:rFonts w:ascii="Segoe UI" w:hAnsi="Segoe UI" w:cs="Segoe UI"/>
+          <w:sz w:val="18"/>
+          <w:szCs w:val="18"/>
         </w:rPr>
       </w:pPr>
     </w:p>
     <w:p>
       <w:pPr>
-        <w:spacing w:before="200"/>
+        <w:pStyle w:val="paragraph"/>
+        <w:spacing w:before="0" w:beforeAutospacing="0" w:after="0" w:afterAutospacing="0"/>
+        <w:textAlignment w:val="baseline"/>
+        <w:rPr>
+          <w:rFonts w:ascii="Segoe UI" w:hAnsi="Segoe UI" w:cs="Segoe UI"/>
+          <w:sz w:val="18"/>
+          <w:szCs w:val="18"/>
+        </w:rPr>
       </w:pPr>
       <w:r>
         <w:rPr>
+          <w:rStyle w:val="normaltextrun"/>
+          <w:rFonts w:ascii="Calibri" w:hAnsi="Calibri" w:cs="Calibri"/>
           <w:b/>
+          <w:bCs/>
+          <w:sz w:val="22"/>
+          <w:szCs w:val="22"/>
+          <w:lang w:val="en-US"/>
         </w:rPr>
         <w:t>Folie 8 – Live-Demo: die Kunden-App</w:t>
       </w:r>
     </w:p>
     <w:p>
       <w:pPr>
+        <w:pStyle w:val="paragraph"/>
+        <w:spacing w:before="0" w:beforeAutospacing="0" w:after="0" w:afterAutospacing="0"/>
+        <w:textAlignment w:val="baseline"/>
         <w:rPr>
-          <w:bCs/>
+          <w:rFonts w:ascii="Segoe UI" w:hAnsi="Segoe UI" w:cs="Segoe UI"/>
+          <w:sz w:val="18"/>
+          <w:szCs w:val="18"/>
         </w:rPr>
       </w:pPr>
       <w:r>
         <w:rPr>
-          <w:b/>
+          <w:rStyle w:val="normaltextrun"/>
+          <w:rFonts w:ascii="Calibri" w:hAnsi="Calibri" w:cs="Calibri"/>
+          <w:sz w:val="22"/>
+          <w:szCs w:val="22"/>
+          <w:lang w:val="en-US"/>
         </w:rPr>
-        <w:t xml:space="preserve">Maximilian: </w:t>
-      </w:r>
-      <w:r>
-        <w:rPr>
-          <w:bCs/>
-        </w:rPr>
-        <w:t>Ich führe kurz durch die acht Schritte der Demo. Der Kunde wählt sein Gerät, beschreibt das Problem und lädt ein Foto hoch – das ist die Voranmeldung mit Medienanhang. Dann analysiert der KI-Dienst das Bild; was in der Demo als Animation zu sehen ist, entspricht im Modell dem Schritt T01_KI. Das Ergebnis: Ursache, Konfidenz und eine Teile-Liste, also der KI-Diagnosevorschlag. Daraus rechnet RepairFlow ein Angebot – klar als vorläufig markiert – und schlägt Filiale und Termin vor. Bestätigt der Kunde, sind d</w:t>
-      </w:r>
-      <w:r>
-        <w:rPr>
-          <w:bCs/>
-        </w:rPr>
-        <w:t>ie Teile vorreserviert und die Voranmeldung steht. Den eigentlichen Reparaturauftrag gibt es erst, wenn das Gerät in der Filiale abgegeben wird. Am Ende sieht der Kunde den Auftragsstatus entlang genau der Zustände, die ich vorhin in der Auftragsreise gezeigt habe. Die KI-Antwort ist simuliert; Begriffe und Ablauf sind die aus unseren Modellen. Was technisch dahintersteckt, erklärt Adrian.</w:t>
+        <w:t>Ich führe kurz durch die acht Schritte der Demo. Der Kunde wählt sein Gerät, beschreibt das Problem und lädt ein Foto hoch – das ist die Voranmeldung mit Medienanhang. Dann analysiert der KI-Dienst das Bild; was in der Demo als Animation zu sehen ist, entspricht im Modell dem Schritt T01_KI. Das Ergebnis: Ursache, Konfidenz und eine Teile-Liste, also der KI-Diagnosevorschlag. Daraus rechnet RepairFlow ein Angebot – klar als vorläufig markiert – und schlägt Filiale und Termin vor. Bestätigt der Kunde, sind die Teile vorreserviert und die Voranmeldung steht. Den eigentlichen Reparaturauftrag gibt es erst, wenn das Gerät in der Filiale abgegeben wird. Am Ende sieht der Kunde den Auftragsstatus entlang genau der Zustände, die ich vorhin in der Auftragsreise gezeigt habe. Die KI-Antwort ist simuliert; Begriffe und Ablauf sind die aus unseren Modellen. Was technisch dahintersteckt, erklärt Adrian.</w:t>
       </w:r>
     </w:p>
+    <w:p/>
     <w:p>
       <w:pPr>
         <w:spacing w:before="200"/>
@@ -430,7 +414,7 @@
         <w:rPr>
           <w:i/>
         </w:rPr>
-        <w:t xml:space="preserve">  (70 s)</w:t>
+        <w:t xml:space="preserve">  (65 s)</w:t>
       </w:r>
     </w:p>
     <w:p>
@@ -441,10 +425,7 @@
         <w:t xml:space="preserve">Adrian: </w:t>
       </w:r>
       <w:r>
-        <w:t>Was Sie gerade in der App gesehen haben, ist unser Alleinstellungsmerkmal, die KI-Sofortdiagnose. Fünf Schritte: Der Kunde nimmt Foto, Video oder Ton auf. Ein KI-Dienst erkennt Gerätetyp, wahrscheinliche Ursache und benötigte Teile. RepairFlow rechnet daraus einen vorläufigen Kostenvoranschlag, prüft die Verfügbarkeit in allen Filialen und schlägt Filiale und Termin vor. Bestätigt der Kunde den Termin, werden die Teile vorreserviert. Heute machbar ist die Erkennung sichtbarer Schäden per Bildanalyse, etwa e</w:t>
-      </w:r>
-      <w:r>
-        <w:t>in gebrochenes Display oder eine gerissene Kette, dazu ein Vorab-KVA aus Teilepreisen und Aufwandsrichtwerten. Vision sind Geräuschanalyse bei E-Bike-Motoren und eine Aufwandsschätzung aus Video. Deshalb bleibt der Vorschlag immer vorläufig: Der Techniker bestätigt oder korrigiert ihn. Die Medien werden nur mit Einwilligung verarbeitet und nach Abschluss gelöscht.</w:t>
+        <w:t>Was RepairFlow von jeder anderen Werkstattsoftware unterscheidet, läuft in unter einer Minute ab. Der Kunde macht ein Foto von seinem Gerät, lädt es in der App hoch, und ein KI-Dienst erkennt daraus Gerätetyp, wahrscheinliche Ursache und benötigte Ersatzteile. RepairFlow rechnet sofort einen vorläufigen KVA, prüft die Verfügbarkeit in allen Filialen und schlägt Termin und Standort vor. Konkret: Der Kunde meldet ein E-Bike mit Motorproblem an, der KI-Dienst erkennt einen Batteriedefekt. Die eigene Filiale hat sie nicht vorrätig, RepairFlow findet sie in der Nachbarfiliale, reserviert sie dort und schlägt dem Kunden direkt den passenden Termin vor. Alles noch bevor er die Werkstatt betreten hat.</w:t>
       </w:r>
     </w:p>
     <w:p>
@@ -455,7 +436,63 @@
         <w:rPr>
           <w:b/>
         </w:rPr>
-        <w:t>Folie 10 – Was wir gebaut haben: Ergebnisse in Zahlen</w:t>
+        <w:t>Folie 10 – KI-Sofortdiagnose: Unsere Vision</w:t>
+      </w:r>
+      <w:r>
+        <w:rPr>
+          <w:i/>
+        </w:rPr>
+        <w:t xml:space="preserve">  (45 s)</w:t>
+      </w:r>
+    </w:p>
+    <w:p>
+      <w:r>
+        <w:rPr>
+          <w:b/>
+        </w:rPr>
+        <w:t xml:space="preserve">Adrian: </w:t>
+      </w:r>
+      <w:r>
+        <w:t>Heute funktioniert das für sichtbare Schäden: ein gebrochenes Display, eine gerissene Kette, ein verbogener Rahmen. Das Modell erkennt den Schaden und rechnet daraus einen Vorab-KVA. Die Vision ist Geräuschanalyse bei E-Bike-Motoren und Aufwandsschätzung aus Video. Der Vorschlag bleibt immer vorläufig, der Techniker bestätigt oder korrigiert. Das ist keine Schwäche, das war eine bewusste Entscheidung. Medien werden nur mit Einwilligung verarbeitet und danach gelöscht.</w:t>
+      </w:r>
+    </w:p>
+    <w:p>
+      <w:pPr>
+        <w:spacing w:before="200"/>
+      </w:pPr>
+      <w:r>
+        <w:rPr>
+          <w:b/>
+        </w:rPr>
+        <w:t>Folie 11 – Was wir gebaut haben: Ergebnisse in Zahlen</w:t>
+      </w:r>
+      <w:r>
+        <w:rPr>
+          <w:i/>
+        </w:rPr>
+        <w:t xml:space="preserve">  (40 s)</w:t>
+      </w:r>
+    </w:p>
+    <w:p>
+      <w:r>
+        <w:rPr>
+          <w:b/>
+        </w:rPr>
+        <w:t xml:space="preserve">Adrian: </w:t>
+      </w:r>
+      <w:r>
+        <w:t>Diese KI steckt in allen drei Modellen. Im BPMN ein Service Task in P01, zehn Prozesse, 136 Aktivitäten. Im Use-Case-Diagramm ein eigener Akteur mit 19 Use Cases. Im Klassendiagramm eine eigene Klasse für den KI-Diagnosevorschlag, 29 Klassen, 40 Assoziationen. Dazu sechs Sequenzdiagramme. Alles in Camunda und Visual Paradigm, mit 20 Seiten Dokumentation.</w:t>
+      </w:r>
+    </w:p>
+    <w:p>
+      <w:pPr>
+        <w:spacing w:before="200"/>
+      </w:pPr>
+      <w:r>
+        <w:rPr>
+          <w:b/>
+        </w:rPr>
+        <w:t>Folie 12 – Zehn Prozesse, 62 Prozent automatisiert</w:t>
       </w:r>
       <w:r>
         <w:rPr>
@@ -469,11 +506,14 @@
         <w:rPr>
           <w:b/>
         </w:rPr>
-        <w:lastRenderedPageBreak/>
         <w:t xml:space="preserve">Adrian: </w:t>
       </w:r>
       <w:r>
-        <w:t>Damit zur zweiten Hälfte: Was steckt hinter dieser Geschichte? Wir haben drei Modelle erstellt, die zusammenpassen. Zehn BPMN-Kollaborationsdiagramme mit 136 Aktivitäten im Werkstatt-Pool, dazu die Abläufe des Kunden. Ein Use-Case-Diagramm mit 19 Use Cases und 17 Rollen und Akteuren. Ein vollständiges Klassendiagramm mit 29 Klassen und 40 Assoziationen. Sechs Sequenzdiagramme, gefordert waren fünf. Alle Modelle liegen im Camunda Modeler und in Visual Paradigm und werden mit der Dokumentation abgegeben.</w:t>
+        <w:t xml:space="preserve">62 Prozent der 136 Aktivitäten erledigt RepairFlow ohne manuellen Eingriff. P01 läuft zu 100 Prozent automatisch, vom KI-Aufruf bis zur Vorreservierung. P05 bei 80 Prozent, das System prüft alle </w:t>
+      </w:r>
+      <w:r>
+        <w:lastRenderedPageBreak/>
+        <w:t>Filialen parallel, reserviert und lagert um. Was niedrig automatisiert ist, ist das absichtlich: P03 Fehlerdiagnose bei 42 Prozent, P07 Reparatur bei 46 Prozent. Dort greift der Techniker ein, unterstützt vom System, nicht ersetzt durch es. Wer welche Rolle dabei hat, zeigt Kilian.</w:t>
       </w:r>
     </w:p>
     <w:p>
@@ -484,38 +524,19 @@
         <w:rPr>
           <w:b/>
         </w:rPr>
-        <w:t>Folie 11 – Zehn Prozesse, 62 Prozent automatisiert</w:t>
+        <w:t>Folie 1</w:t>
       </w:r>
-      <w:r>
-        <w:rPr>
-          <w:i/>
-        </w:rPr>
-        <w:t xml:space="preserve">  (60 s)</w:t>
-      </w:r>
-    </w:p>
-    <w:p>
       <w:r>
         <w:rPr>
           <w:b/>
         </w:rPr>
-        <w:t xml:space="preserve">Adrian: </w:t>
+        <w:t>3</w:t>
       </w:r>
-      <w:r>
-        <w:t>Die zehn Prozesse decken den gesamten Lebenszyklus ab. Prozesse 01 bis 08 sind die durchgehende Auftragsreise, 09 und 10 die Folgeprozesse Reklamation und Retoure; drei Highlights daraus hat Maximilian schon gezeigt. Jedes Diagramm ist eine Kollaboration: Der Werkstattbetrieb ist der ausführbare Pool mit den Lanes Service, Techniker, Werkstattleitung und Disposition, der Kunde hat seinen eigenen Ablauf, der Lieferant bleibt eine Black Box. Die wichtigste Zahl: 62 Prozent der Aktivitäten führt RepairFlow ohn</w:t>
-      </w:r>
-      <w:r>
-        <w:t>e manuelle Arbeit aus, also Statuswechsel, Benachrichtigungen, Prüfungen, Berechnungen und Regeln. Was Handwerk ist, bleibt Handwerk: Diagnose, Reparatur und Endkontrolle macht der Techniker mit Unterstützung durch das System. Wer im System welche Aufgaben hat, zeigt Kilian.</w:t>
-      </w:r>
-    </w:p>
-    <w:p>
-      <w:pPr>
-        <w:spacing w:before="200"/>
-      </w:pPr>
       <w:r>
         <w:rPr>
           <w:b/>
         </w:rPr>
-        <w:t>Folie 12 – Wer macht was im System?</w:t>
+        <w:t xml:space="preserve"> – Wer macht was im System?</w:t>
       </w:r>
       <w:r>
         <w:rPr>
@@ -558,7 +579,19 @@
         <w:rPr>
           <w:b/>
         </w:rPr>
-        <w:t>Folie 13 – Das Datenmodell: fünf Entscheidungen</w:t>
+        <w:t>Folie 1</w:t>
+      </w:r>
+      <w:r>
+        <w:rPr>
+          <w:b/>
+        </w:rPr>
+        <w:t>4</w:t>
+      </w:r>
+      <w:r>
+        <w:rPr>
+          <w:b/>
+        </w:rPr>
+        <w:t xml:space="preserve"> – Das Datenmodell: fünf Entscheidungen</w:t>
       </w:r>
       <w:r>
         <w:rPr>
@@ -580,7 +613,6 @@
     </w:p>
     <w:p>
       <w:r>
-        <w:lastRenderedPageBreak/>
         <w:t>Erstens steht der Reparaturauftrag im Mittelpunkt. Befund und Reparaturschritte gehören fest zum Auftrag. Kostenvoranschlag und Gerät sind nur mit ihm verknüpft, weil der erste Kostenvoranschlag schon entsteht, bevor es einen Auftrag gibt.</w:t>
       </w:r>
     </w:p>
@@ -606,6 +638,7 @@
     </w:p>
     <w:p>
       <w:r>
+        <w:lastRenderedPageBreak/>
         <w:t>Wie wir dafür gesorgt haben, dass alle Modelle zusammenpassen, zeigt Jakob.</w:t>
       </w:r>
     </w:p>
@@ -617,7 +650,19 @@
         <w:rPr>
           <w:b/>
         </w:rPr>
-        <w:t>Folie 14 – Qualität: Regeln, Werkzeuge, Reviews</w:t>
+        <w:t>Folie 1</w:t>
+      </w:r>
+      <w:r>
+        <w:rPr>
+          <w:b/>
+        </w:rPr>
+        <w:t>5</w:t>
+      </w:r>
+      <w:r>
+        <w:rPr>
+          <w:b/>
+        </w:rPr>
+        <w:t xml:space="preserve"> – Qualität: Regeln, Werkzeuge, Reviews</w:t>
       </w:r>
       <w:r>
         <w:rPr>
@@ -665,7 +710,19 @@
         <w:rPr>
           <w:b/>
         </w:rPr>
-        <w:t>Folie 15 – Herausforderungen und Lernerfahrungen</w:t>
+        <w:t>Folie 1</w:t>
+      </w:r>
+      <w:r>
+        <w:rPr>
+          <w:b/>
+        </w:rPr>
+        <w:t>6</w:t>
+      </w:r>
+      <w:r>
+        <w:rPr>
+          <w:b/>
+        </w:rPr>
+        <w:t xml:space="preserve"> – Herausforderungen und Lernerfahrungen</w:t>
       </w:r>
       <w:r>
         <w:rPr>
@@ -692,7 +749,6 @@
     </w:p>
     <w:p>
       <w:r>
-        <w:lastRenderedPageBreak/>
         <w:t>Zweitens die Namen. Klassen, Datenobjekte und Statuswerte müssen in allen Modellen gleich heißen. Sonst zerfällt die Analyse in drei einzelne Modelle.</w:t>
       </w:r>
     </w:p>
@@ -719,7 +775,19 @@
         <w:rPr>
           <w:b/>
         </w:rPr>
-        <w:t>Folie 16 – Vorgehen und Projektmanagement</w:t>
+        <w:t>Folie 1</w:t>
+      </w:r>
+      <w:r>
+        <w:rPr>
+          <w:b/>
+        </w:rPr>
+        <w:t>7</w:t>
+      </w:r>
+      <w:r>
+        <w:rPr>
+          <w:b/>
+        </w:rPr>
+        <w:t xml:space="preserve"> – Vorgehen und Projektmanagement</w:t>
       </w:r>
       <w:r>
         <w:rPr>
@@ -736,10 +804,17 @@
         <w:t xml:space="preserve">Nina: </w:t>
       </w:r>
       <w:r>
-        <w:t>Gearbeitet haben wir in Sprints im Takt der vier Gruppentermine, mit Review, Retrospektive und Planning je Termin. Ich habe die Projektleitung, David die Stellvertretung und die Sicherungen, Adrian ist Product Owner, Kilian Scrum Master, Maximilian verantwortet BPMN, Jakob die Qualität. Alles Schriftliche liegt in einem GitHub-Repository; jede Änderung geht über einen eigenen Branch, einen Pull Request und ein Review durch eine zweite Person. Das Trello-Board hat eine Liste je Termin und eine Karte je Perso</w:t>
+        <w:t>Gearbeitet haben wir in Sprints im Takt der vier Gruppentermine, mit Review, Retrospektive</w:t>
       </w:r>
       <w:r>
-        <w:t>n und Aufgabe. Jedes Diagramm ist denselben Weg gegangen: Entwurf im Zweierteam, gegenseitiges Review, Abstimmung im Gruppentermin und erst dann die Umsetzung über einen Pull Request. Entscheidungen, die mehrere betreffen, stehen mit Begründung und Datum im Entscheidungslog; so konnten wir bei jeder Korrektur nachvollziehen, warum ein Modell so aussieht.</w:t>
+        <w:t xml:space="preserve"> und Planning je Termin. Ich habe die Projektleitung, David die Stellvertretung und die Sicherungen, Adrian ist Product Owner, Kilian Scrum Master, Maximilian verantwortet BPMN, Jakob die Qualität. Alles </w:t>
+      </w:r>
+      <w:r>
+        <w:lastRenderedPageBreak/>
+        <w:t xml:space="preserve">Schriftliche liegt in einem GitHub-Repository; jede Änderung geht über einen eigenen Branch, einen Pull Request und ein Review durch eine zweite Person. Das Trello-Board hat eine Liste je Termin und eine Karte je Person und Aufgabe. Jedes Diagramm ist denselben Weg gegangen: Entwurf im Zweierteam, </w:t>
+      </w:r>
+      <w:r>
+        <w:t>gegenseitiges Review, Abstimmung im Gruppentermin und erst dann die Umsetzung über einen Pull Request. Entscheidungen, die mehrere betreffen, stehen mit Begründung und Datum im Entscheidungslog; so konnten wir bei jeder Korrektur nachvollziehen, warum ein Modell so aussieht.</w:t>
       </w:r>
     </w:p>
     <w:p>
@@ -750,7 +825,19 @@
         <w:rPr>
           <w:b/>
         </w:rPr>
-        <w:t>Folie 17 – Geschäftsmodell und Ausblick</w:t>
+        <w:t>Folie 1</w:t>
+      </w:r>
+      <w:r>
+        <w:rPr>
+          <w:b/>
+        </w:rPr>
+        <w:t>8</w:t>
+      </w:r>
+      <w:r>
+        <w:rPr>
+          <w:b/>
+        </w:rPr>
+        <w:t xml:space="preserve"> – Geschäftsmodell und Ausblick</w:t>
       </w:r>
       <w:r>
         <w:rPr>
@@ -767,10 +854,13 @@
         <w:t xml:space="preserve">Nina: </w:t>
       </w:r>
       <w:r>
-        <w:t>Zum Schluss der Blick nach vorn. RepairFlow wird als Abo je Filiale angeboten, in zwei Stufen: Basis mit Auftrags- und Kundenverwaltung, Pro mit filialübergreifender Disposition und KI-Sofortdiagnose. Zielkunden sind unabhängige Werkstätten und kleine Ketten mit zwei bis zehn Filialen im deutschsprachigen Raum, also genau die Betriebe mit den vier Problemen vom Anfang. Der Ausblick geht in drei Richtungen: Predictive Disposition, also eine Bedarfsprognose je Filiale und Saison. Ein Techniker-Copilot, der Re</w:t>
+        <w:t>Zum Schluss der Blick nach vorn. RepairFlow wird als Abo je Filiale angeboten, in zwei Stufen: Basis mit Auftrags- und Kundenverwaltung, Pro mit filialübergreifender</w:t>
       </w:r>
       <w:r>
-        <w:t>paraturschritte aus der Historie vorschlägt. Und eine digitale Geräteakte, in der jedes Gerät seine Reparaturgeschichte behält. Nichts davon ist modelliert, aber alles baut auf dem Datenmodell auf, das wir heute vorgestellt haben.</w:t>
+        <w:t xml:space="preserve"> Disposition und KI-Sofortdiagnose. Zielkunden sind unabhängige Werkstätten und kleine Ketten mit zwei bis zehn Filialen im deutschsprachigen Raum, also genau die Betriebe mit den vier Problemen vom Anfang. Der Ausblick geht in drei Richtungen: Predictive Disposition, also eine Bedarfsprognose je Filiale und Saison. Ein Techniker-Copilot, der Reparaturschritte aus der Historie vorschlägt. Und eine digitale Geräteakte, in der jedes Gerät seine Reparaturgeschichte behält. Nichts davon ist modelliert, aber </w:t>
+      </w:r>
+      <w:r>
+        <w:t>alles baut auf dem Datenmodell auf, das wir heute vorgestellt haben.</w:t>
       </w:r>
     </w:p>
     <w:p>
@@ -781,7 +871,19 @@
         <w:rPr>
           <w:b/>
         </w:rPr>
-        <w:t>Folie 18 – Fazit und Danke</w:t>
+        <w:t>Folie 1</w:t>
+      </w:r>
+      <w:r>
+        <w:rPr>
+          <w:b/>
+        </w:rPr>
+        <w:t>9</w:t>
+      </w:r>
+      <w:r>
+        <w:rPr>
+          <w:b/>
+        </w:rPr>
+        <w:t xml:space="preserve"> – Fazit und Danke</w:t>
       </w:r>
       <w:r>
         <w:rPr>
@@ -814,7 +916,6 @@
     </w:p>
     <w:p>
       <w:r>
-        <w:lastRenderedPageBreak/>
         <w:t>Wird nicht vorgetragen. Pflichtangabe für den PDF-Export laut Ablauf.</w:t>
       </w:r>
     </w:p>
@@ -12414,6 +12515,25 @@
       </w:tcPr>
     </w:tblStylePr>
   </w:style>
+  <w:style w:type="paragraph" w:customStyle="1" w:styleId="paragraph">
+    <w:name w:val="paragraph"/>
+    <w:basedOn w:val="Standard"/>
+    <w:rsid w:val="00801C32"/>
+    <w:pPr>
+      <w:spacing w:before="100" w:beforeAutospacing="1" w:after="100" w:afterAutospacing="1" w:line="240" w:lineRule="auto"/>
+    </w:pPr>
+    <w:rPr>
+      <w:rFonts w:ascii="Times New Roman" w:eastAsia="Times New Roman" w:hAnsi="Times New Roman" w:cs="Times New Roman"/>
+      <w:sz w:val="24"/>
+      <w:szCs w:val="24"/>
+      <w:lang w:val="de-DE" w:eastAsia="de-DE"/>
+    </w:rPr>
+  </w:style>
+  <w:style w:type="character" w:customStyle="1" w:styleId="normaltextrun">
+    <w:name w:val="normaltextrun"/>
+    <w:basedOn w:val="Absatz-Standardschriftart"/>
+    <w:rsid w:val="00801C32"/>
+  </w:style>
 </w:styles>
 </file>
 
@@ -12747,10 +12867,4 @@
     <ds:schemaRef ds:uri="http://schemas.openxmlformats.org/officeDocument/2006/bibliography"/>
   </ds:schemaRefs>
 </ds:datastoreItem>
-</file>
-
-<file path=docMetadata/LabelInfo.xml><?xml version="1.0" encoding="utf-8"?>
-<clbl:labelList xmlns:clbl="http://schemas.microsoft.com/office/2020/mipLabelMetadata">
-  <clbl:label id="{0cf7ac0a-4681-4823-ab0b-04ef02c5f873}" enabled="1" method="Standard" siteId="{42f7676c-f455-423c-82f6-dc2d99791af7}" contentBits="0" removed="0"/>
-</clbl:labelList>
 </file>
</xml_diff>

<commit_message>
praesentation: Demo-Screens entfernt (21 Folien), Foliennummern in Folie 21, Sprechtext und TODO angepasst
Co-Authored-By: Claude Opus 5.5 <noreply@anthropic.com>
Claude-Session: https://claude.ai/code/session_01H2bGsFaySUqsEjJ1PXuxUw
</commit_message>
<xml_diff>
--- a/4_praesentation/Sprechtext_Abschlusspraesentation.docx
+++ b/4_praesentation/Sprechtext_Abschlusspraesentation.docx
@@ -2893,7 +2893,7 @@
           <w:rFonts w:cs="Calibri"/>
           <w:bCs/>
         </w:rPr>
-        <w:t>Folie 9 – Live-Demo: Die Kundenapp (Folien 10–18 ausgeblendete Demo-Screens)</w:t>
+        <w:t>Folie 9 – Live-Demo: Die Kundenapp</w:t>
       </w:r>
     </w:p>
     <w:p>
@@ -2904,7 +2904,7 @@
     <w:p>
       <w:r>
         <w:rPr/>
-        <w:t>Folie 19 – KI-Sofortdiagnose: KVA in 60 Sekunden  (65 s)</w:t>
+        <w:t>Folie 10 – KI-Sofortdiagnose: KVA in 60 Sekunden  (65 s)</w:t>
       </w:r>
       <w:proofErr w:type="spellStart"/>
       <w:proofErr w:type="spellEnd"/>
@@ -3385,7 +3385,7 @@
     <w:p>
       <w:r>
         <w:rPr/>
-        <w:t>Folie 20 – KI-Sofortdiagnose: Unsere Vision  (45 s)</w:t>
+        <w:t>Folie 11 – KI-Sofortdiagnose: Unsere Vision  (45 s)</w:t>
       </w:r>
       <w:proofErr w:type="spellStart"/>
       <w:proofErr w:type="spellEnd"/>
@@ -3722,7 +3722,7 @@
     <w:p>
       <w:r>
         <w:rPr/>
-        <w:t>Folie 21 – Was wir gebaut haben: Ergebnisse in Zahlen  (40 s)</w:t>
+        <w:t>Folie 12 – Was wir gebaut haben: Ergebnisse in Zahlen  (40 s)</w:t>
       </w:r>
       <w:proofErr w:type="spellStart"/>
       <w:proofErr w:type="spellEnd"/>
@@ -3796,7 +3796,7 @@
     <w:p>
       <w:r>
         <w:rPr/>
-        <w:t>Folie 22 – Zehn Prozesse, 62 Prozent automatisiert  (50 s)</w:t>
+        <w:t>Folie 13 – Zehn Prozesse, 62 Prozent automatisiert  (50 s)</w:t>
       </w:r>
       <w:proofErr w:type="spellStart"/>
       <w:proofErr w:type="spellEnd"/>
@@ -3902,7 +3902,7 @@
     <w:p>
       <w:r>
         <w:rPr/>
-        <w:t>Folie 23 – Wer macht was im System?  (75 s)</w:t>
+        <w:t>Folie 14 – Wer macht was im System?  (75 s)</w:t>
       </w:r>
       <w:proofErr w:type="spellStart"/>
       <w:proofErr w:type="spellEnd"/>
@@ -4565,7 +4565,7 @@
     <w:p>
       <w:r>
         <w:rPr/>
-        <w:t>Folie 24 – Das Datenmodell: fünf Entscheidungen  (85 s)</w:t>
+        <w:t>Folie 15 – Das Datenmodell: fünf Entscheidungen  (85 s)</w:t>
       </w:r>
       <w:proofErr w:type="spellStart"/>
       <w:proofErr w:type="spellEnd"/>
@@ -5246,7 +5246,7 @@
     <w:p>
       <w:r>
         <w:rPr/>
-        <w:t>Folie 25 – Qualität: Regeln, Werkzeuge, Reviews  (65 s)</w:t>
+        <w:t>Folie 16 – Qualität: Regeln, Werkzeuge, Reviews  (65 s)</w:t>
       </w:r>
       <w:proofErr w:type="spellStart"/>
       <w:proofErr w:type="spellEnd"/>
@@ -5838,7 +5838,7 @@
     <w:p>
       <w:r>
         <w:rPr/>
-        <w:t>Folie 26 – Herausforderungen und Lernerfahrungen  (65 s)</w:t>
+        <w:t>Folie 17 – Herausforderungen und Lernerfahrungen  (65 s)</w:t>
       </w:r>
       <w:proofErr w:type="spellStart"/>
       <w:proofErr w:type="spellEnd"/>
@@ -6409,7 +6409,7 @@
         <w:rPr>
           <w:rStyle w:val="Fett"/>
         </w:rPr>
-        <w:t>Folie 27 – Vorgehen und Projektmanagement  (65 s)</w:t>
+        <w:t>Folie 18 – Vorgehen und Projektmanagement  (65 s)</w:t>
       </w:r>
     </w:p>
     <w:p>
@@ -6433,7 +6433,7 @@
         <w:rPr>
           <w:bCs/>
         </w:rPr>
-        <w:t>Folie 28 – Geschäftsmodell und Ausblick  (60 s)</w:t>
+        <w:t>Folie 19 – Geschäftsmodell und Ausblick  (60 s)</w:t>
       </w:r>
       <w:proofErr w:type="gramStart"/>
       <w:proofErr w:type="gramEnd"/>
@@ -6489,7 +6489,7 @@
         <w:rPr>
           <w:bCs/>
         </w:rPr>
-        <w:t>Folie 29 – Fazit und Danke  (30 s)</w:t>
+        <w:t>Folie 20 – Fazit und Danke  (30 s)</w:t>
       </w:r>
       <w:proofErr w:type="gramStart"/>
       <w:proofErr w:type="gramEnd"/>

</xml_diff>

<commit_message>
praesentation: Folie 16/17 ohne Doppelung, Foliennummern, Folie 20, Sprechtext Jakob
</commit_message>
<xml_diff>
--- a/4_praesentation/Sprechtext_Abschlusspraesentation.docx
+++ b/4_praesentation/Sprechtext_Abschlusspraesentation.docx
@@ -2829,13 +2829,17 @@
           <w:rFonts w:cs="Calibri"/>
           <w:bCs/>
         </w:rPr>
-        <w:t>Folien 6 und 7 – Auftragsreise</w:t>
-      </w:r>
-      <w:proofErr w:type="spellStart"/>
-      <w:proofErr w:type="spellEnd"/>
-      <w:proofErr w:type="spellStart"/>
-      <w:proofErr w:type="spellEnd"/>
-      <w:proofErr w:type="spellStart"/>
+        <w:t xml:space="preserve">Folien 6 und 7 – </w:t>
+      </w:r>
+      <w:proofErr w:type="spellStart"/>
+      <w:r>
+        <w:rPr>
+          <w:rStyle w:val="normaltextrun"/>
+          <w:rFonts w:cs="Calibri"/>
+          <w:bCs/>
+        </w:rPr>
+        <w:t>Auftragsreise</w:t>
+      </w:r>
       <w:proofErr w:type="spellEnd"/>
     </w:p>
     <w:p>
@@ -2852,20 +2856,75 @@
           <w:rFonts w:cs="Calibri"/>
           <w:bCs/>
         </w:rPr>
-        <w:t>Maximilian: Stellen Sie sich Mike vor – er fährt jeden Tag mit dem E-Bike zur Arbeit und bemerkt morgens, dass am Motor etwas ausgetreten ist. Er macht ein Foto davon und öffnet die RepairFlow-App. Er wählt sein E-Bike aus, lädt das Foto hoch – und 60 Sekunden später hat er einen Diagnosevorschlag, einen vorläufigen Kostenvoranschlag und drei freie Termine in der Filiale um die Ecke. Er bucht direkt für den nächsten Morgen. In der Filiale gibt er das Rad ab, der Techniker prüft den Vorschlag, stellt die eigentliche Diagnose und schickt Mike den finalen Kostenvoranschlag in die App. Mike tippt auf „Freigeben“ – fertig. RepairFlow sucht das benötigte Ersatzteil in allen Filialen, findet es in einer Nachbarfiliale und lässt es umlegen. Keiner muss beim Lieferanten bestellen. Am Nachmittag bekommt Mike eine Benachrichtigung: Rad fertig, abholbereit. Er zahlt beim Abholen. Jeder dieser Schritte – von der Voranmeldung bis zur Abholung – ist ein Status im System: angenommen, in Diagnose, KVA offen, freigegeben, Teile bestellt, in Reparatur, fertig, abgeholt. Und abgelehnt, wenn Mike den KVA nicht freigibt oder die Reparatur scheitert. Dieser Zustandsautomat zieht sich durch alle unsere Modelle. Drei Stellen zeige ich jetzt genauer.</w:t>
-      </w:r>
-      <w:proofErr w:type="spellStart"/>
-      <w:proofErr w:type="spellEnd"/>
+        <w:t xml:space="preserve">Maximilian: Stellen Sie sich Mike vor – er fährt jeden Tag mit dem E-Bike zur Arbeit und bemerkt morgens, dass am Motor etwas ausgetreten ist. Er macht ein Foto davon und öffnet die RepairFlow-App. Er wählt sein E-Bike aus, lädt das Foto hoch – und 60 Sekunden später hat er einen Diagnosevorschlag, einen vorläufigen Kostenvoranschlag und drei freie Termine in der Filiale um die Ecke. Er bucht direkt für den nächsten Morgen. In der Filiale gibt er das Rad ab, der Techniker prüft den Vorschlag, stellt die eigentliche Diagnose und schickt Mike den finalen Kostenvoranschlag in die App. Mike tippt auf „Freigeben“ – fertig. RepairFlow sucht das benötigte Ersatzteil in allen Filialen, findet es in einer Nachbarfiliale und lässt es umlegen. Keiner muss beim Lieferanten bestellen. Am Nachmittag bekommt Mike eine Benachrichtigung: Rad fertig, abholbereit. Er zahlt beim Abholen. Jeder dieser Schritte – von der Voranmeldung bis zur Abholung – ist ein Status im System: angenommen, in Diagnose, KVA offen, freigegeben, Teile bestellt, in Reparatur, fertig, abgeholt. Und abgelehnt, wenn Mike den KVA nicht freigibt oder die Reparatur scheitert. Dieser Zustandsautomat zieht sich durch alle unsere Modelle. Drei Stellen </w:t>
+      </w:r>
+      <w:proofErr w:type="spellStart"/>
+      <w:r>
+        <w:rPr>
+          <w:rStyle w:val="normaltextrun"/>
+          <w:rFonts w:cs="Calibri"/>
+          <w:bCs/>
+        </w:rPr>
+        <w:t>zeige</w:t>
+      </w:r>
+      <w:proofErr w:type="spellEnd"/>
+      <w:r>
+        <w:rPr>
+          <w:rStyle w:val="normaltextrun"/>
+          <w:rFonts w:cs="Calibri"/>
+          <w:bCs/>
+        </w:rPr>
+        <w:t xml:space="preserve"> ich </w:t>
+      </w:r>
+      <w:proofErr w:type="spellStart"/>
+      <w:r>
+        <w:rPr>
+          <w:rStyle w:val="normaltextrun"/>
+          <w:rFonts w:cs="Calibri"/>
+          <w:bCs/>
+        </w:rPr>
+        <w:t>jetzt</w:t>
+      </w:r>
+      <w:proofErr w:type="spellEnd"/>
+      <w:r>
+        <w:rPr>
+          <w:rStyle w:val="normaltextrun"/>
+          <w:rFonts w:cs="Calibri"/>
+          <w:bCs/>
+        </w:rPr>
+        <w:t xml:space="preserve"> </w:t>
+      </w:r>
+      <w:proofErr w:type="spellStart"/>
+      <w:r>
+        <w:rPr>
+          <w:rStyle w:val="normaltextrun"/>
+          <w:rFonts w:cs="Calibri"/>
+          <w:bCs/>
+        </w:rPr>
+        <w:t>genauer</w:t>
+      </w:r>
+      <w:proofErr w:type="spellEnd"/>
+      <w:r>
+        <w:rPr>
+          <w:rStyle w:val="normaltextrun"/>
+          <w:rFonts w:cs="Calibri"/>
+          <w:bCs/>
+        </w:rPr>
+        <w:t>.</w:t>
+      </w:r>
     </w:p>
     <w:p>
       <w:r>
-        <w:rPr/>
-        <w:t>Folie 8 – Drei Prozess-Highlights</w:t>
-      </w:r>
-      <w:proofErr w:type="spellStart"/>
-      <w:proofErr w:type="gramStart"/>
-      <w:proofErr w:type="spellEnd"/>
-      <w:proofErr w:type="gramEnd"/>
+        <w:t xml:space="preserve">Folie 8 – Drei </w:t>
+      </w:r>
+      <w:proofErr w:type="spellStart"/>
+      <w:r>
+        <w:t>Prozess</w:t>
+      </w:r>
+      <w:proofErr w:type="spellEnd"/>
+      <w:r>
+        <w:t>-Highlights</w:t>
+      </w:r>
     </w:p>
     <w:p>
       <w:pPr>
@@ -2876,7 +2935,11 @@
         </w:rPr>
       </w:pPr>
       <w:r>
-        <w:t>Maximilian: Hinter jedem dieser Schritte steckt ein Geschäftsprozess. Drei davon zeigen, wie RepairFlow mit Ausnahmesituationen umgeht. Beim Kostenvoranschlag in Prozess 04 wartet ein ereignisbasiertes Gateway auf Freigabe, Ablehnung oder Fristablauf nach drei Tagen. Meldet sich der Kunde nicht, erinnert RepairFlow ihn – höchstens zweimal. Kommt nach dem dritten Fristablauf keine Antwort, gilt der KVA als abgelehnt, und das Gerät geht mit Diagnosepauschale zur Abholung. Kein Auftrag bleibt liegen. Bei der Disposition in Prozess 05 laufen für jedes benötigte Teil parallele Prüfungen: erst das eigene Lager, dann die anderen Filialen. Was lokal liegt, wird reserviert, was anderswo liegt, umgelagert – bestellt wird nur, was nirgends vorhanden ist. Und bei der Reklamation in Prozess 09 prüft der Techniker den Mangel, RepairFlow entscheidet nach Regel über Gewährleistung, und bei Gewährleistung gibt die Werkstattleitung einen kostenfreien Nacharbeitsauftrag frei, der wieder durch die normale Auftragsreise läuft. Wie sich das aus Kundensicht anfühlt, zeige ich jetzt in der App.</w:t>
+        <w:t xml:space="preserve">Maximilian: Hinter jedem dieser Schritte steckt ein Geschäftsprozess. Drei davon zeigen, wie RepairFlow mit Ausnahmesituationen umgeht. Beim Kostenvoranschlag in Prozess 04 wartet ein ereignisbasiertes </w:t>
+      </w:r>
+      <w:r>
+        <w:lastRenderedPageBreak/>
+        <w:t>Gateway auf Freigabe, Ablehnung oder Fristablauf nach drei Tagen. Meldet sich der Kunde nicht, erinnert RepairFlow ihn – höchstens zweimal. Kommt nach dem dritten Fristablauf keine Antwort, gilt der KVA als abgelehnt, und das Gerät geht mit Diagnosepauschale zur Abholung. Kein Auftrag bleibt liegen. Bei der Disposition in Prozess 05 laufen für jedes benötigte Teil parallele Prüfungen: erst das eigene Lager, dann die anderen Filialen. Was lokal liegt, wird reserviert, was anderswo liegt, umgelagert – bestellt wird nur, was nirgends vorhanden ist. Und bei der Reklamation in Prozess 09 prüft der Techniker den Mangel, RepairFlow entscheidet nach Regel über Gewährleistung, und bei Gewährleistung gibt die Werkstattleitung einen kostenfreien Nacharbeitsauftrag frei, der wieder durch die normale Auftragsreise läuft. Wie sich das aus Kundensicht anfühlt, zeige ich jetzt in der App.</w:t>
       </w:r>
     </w:p>
     <w:p>
@@ -2903,15 +2966,16 @@
     </w:p>
     <w:p>
       <w:r>
-        <w:rPr/>
-        <w:t>Folie 10 – KI-Sofortdiagnose: KVA in 60 Sekunden  (65 s)</w:t>
-      </w:r>
-      <w:proofErr w:type="spellStart"/>
-      <w:proofErr w:type="spellEnd"/>
-      <w:proofErr w:type="spellStart"/>
+        <w:t xml:space="preserve">Folie 10 – KI-Sofortdiagnose: KVA in 60 </w:t>
+      </w:r>
       <w:proofErr w:type="gramStart"/>
-      <w:proofErr w:type="spellEnd"/>
+      <w:r>
+        <w:t>Sekunden  (</w:t>
+      </w:r>
       <w:proofErr w:type="gramEnd"/>
+      <w:r>
+        <w:t>65 s)</w:t>
+      </w:r>
     </w:p>
     <w:p>
       <w:r>
@@ -3384,15 +3448,16 @@
     </w:p>
     <w:p>
       <w:r>
-        <w:rPr/>
-        <w:t>Folie 11 – KI-Sofortdiagnose: Unsere Vision  (45 s)</w:t>
-      </w:r>
-      <w:proofErr w:type="spellStart"/>
-      <w:proofErr w:type="spellEnd"/>
-      <w:proofErr w:type="spellStart"/>
-      <w:proofErr w:type="spellEnd"/>
+        <w:t xml:space="preserve">Folie 11 – KI-Sofortdiagnose: Unsere </w:t>
+      </w:r>
       <w:proofErr w:type="gramStart"/>
+      <w:r>
+        <w:t>Vision  (</w:t>
+      </w:r>
       <w:proofErr w:type="gramEnd"/>
+      <w:r>
+        <w:t>45 s)</w:t>
+      </w:r>
     </w:p>
     <w:p>
       <w:r>
@@ -3721,195 +3786,80 @@
     </w:p>
     <w:p>
       <w:r>
-        <w:rPr/>
-        <w:t>Folie 12 – Was wir gebaut haben: Ergebnisse in Zahlen  (40 s)</w:t>
-      </w:r>
-      <w:proofErr w:type="spellStart"/>
-      <w:proofErr w:type="spellEnd"/>
-      <w:proofErr w:type="spellStart"/>
-      <w:proofErr w:type="spellEnd"/>
-      <w:proofErr w:type="spellStart"/>
-      <w:proofErr w:type="spellEnd"/>
-      <w:proofErr w:type="spellStart"/>
-      <w:proofErr w:type="spellEnd"/>
+        <w:t xml:space="preserve">Folie 12 – Was wir gebaut haben: Ergebnisse in </w:t>
+      </w:r>
       <w:proofErr w:type="gramStart"/>
+      <w:r>
+        <w:t>Zahlen  (</w:t>
+      </w:r>
       <w:proofErr w:type="gramEnd"/>
+      <w:r>
+        <w:t>40 s)</w:t>
+      </w:r>
     </w:p>
     <w:p>
       <w:r>
-        <w:rPr/>
-        <w:t>Adrian: Diese KI steckt in allen drei Modellen. Im BPMN ein eigener Regel-Schritt in Prozess 01, zehn Prozesse, 143 Aktivitäten. Im Use-Case-Diagramm ein eigener Akteur, einer von 17 bei 19 Use Cases. Im Klassendiagramm eine eigene Klasse für den KI-Diagnosevorschlag, 29 Klassen, 40 Assoziationen. Dazu sechs Sequenzdiagramme. Alles in Camunda und Visual Paradigm, mit 20 Seiten Dokumentation.</w:t>
-      </w:r>
-      <w:proofErr w:type="spellStart"/>
-      <w:proofErr w:type="spellEnd"/>
-      <w:proofErr w:type="spellStart"/>
-      <w:proofErr w:type="spellEnd"/>
-      <w:proofErr w:type="spellStart"/>
-      <w:proofErr w:type="spellEnd"/>
-      <w:proofErr w:type="spellStart"/>
-      <w:proofErr w:type="spellEnd"/>
-      <w:proofErr w:type="spellStart"/>
-      <w:proofErr w:type="spellEnd"/>
-      <w:proofErr w:type="spellStart"/>
-      <w:proofErr w:type="spellEnd"/>
-      <w:proofErr w:type="spellStart"/>
-      <w:proofErr w:type="spellEnd"/>
-      <w:proofErr w:type="spellStart"/>
-      <w:proofErr w:type="spellEnd"/>
-      <w:proofErr w:type="spellStart"/>
-      <w:proofErr w:type="spellEnd"/>
-      <w:proofErr w:type="spellStart"/>
-      <w:proofErr w:type="spellEnd"/>
-      <w:proofErr w:type="spellStart"/>
-      <w:proofErr w:type="spellEnd"/>
-      <w:proofErr w:type="spellStart"/>
-      <w:proofErr w:type="spellEnd"/>
-      <w:proofErr w:type="spellStart"/>
-      <w:proofErr w:type="spellEnd"/>
-      <w:proofErr w:type="spellStart"/>
-      <w:proofErr w:type="spellEnd"/>
-      <w:proofErr w:type="spellStart"/>
-      <w:proofErr w:type="spellEnd"/>
-      <w:proofErr w:type="spellStart"/>
-      <w:proofErr w:type="spellEnd"/>
-      <w:proofErr w:type="spellStart"/>
-      <w:proofErr w:type="spellEnd"/>
-      <w:proofErr w:type="spellStart"/>
-      <w:proofErr w:type="spellEnd"/>
-      <w:proofErr w:type="spellStart"/>
-      <w:proofErr w:type="spellEnd"/>
-      <w:proofErr w:type="spellStart"/>
-      <w:proofErr w:type="spellEnd"/>
-      <w:proofErr w:type="spellStart"/>
-      <w:proofErr w:type="spellEnd"/>
-      <w:proofErr w:type="spellStart"/>
-      <w:proofErr w:type="spellEnd"/>
-      <w:proofErr w:type="spellStart"/>
-      <w:proofErr w:type="spellEnd"/>
-      <w:proofErr w:type="spellStart"/>
-      <w:proofErr w:type="spellEnd"/>
-      <w:proofErr w:type="spellStart"/>
-      <w:proofErr w:type="spellEnd"/>
-      <w:proofErr w:type="spellStart"/>
-      <w:proofErr w:type="spellEnd"/>
+        <w:t xml:space="preserve">Adrian: Diese KI steckt in allen drei Modellen. Im BPMN ein eigener Regel-Schritt in Prozess 01, zehn Prozesse, 143 Aktivitäten. Im Use-Case-Diagramm ein eigener Akteur, einer von 17 bei 19 Use Cases. Im </w:t>
+      </w:r>
+      <w:r>
+        <w:lastRenderedPageBreak/>
+        <w:t xml:space="preserve">Klassendiagramm eine eigene Klasse für den KI-Diagnosevorschlag, 29 Klassen, 40 Assoziationen. Dazu sechs Sequenzdiagramme. Alles in Camunda und Visual Paradigm, </w:t>
+      </w:r>
+      <w:proofErr w:type="spellStart"/>
+      <w:r>
+        <w:t>mit</w:t>
+      </w:r>
+      <w:proofErr w:type="spellEnd"/>
+      <w:r>
+        <w:t xml:space="preserve"> 20 Seiten </w:t>
+      </w:r>
+      <w:proofErr w:type="spellStart"/>
+      <w:r>
+        <w:t>Dokumentation</w:t>
+      </w:r>
+      <w:proofErr w:type="spellEnd"/>
+      <w:r>
+        <w:t>.</w:t>
+      </w:r>
     </w:p>
     <w:p>
       <w:r>
-        <w:rPr/>
-        <w:t>Folie 13 – Zehn Prozesse, 62 Prozent automatisiert  (50 s)</w:t>
-      </w:r>
-      <w:proofErr w:type="spellStart"/>
-      <w:proofErr w:type="spellEnd"/>
-      <w:proofErr w:type="spellStart"/>
-      <w:proofErr w:type="spellEnd"/>
-      <w:proofErr w:type="spellStart"/>
+        <w:t xml:space="preserve">Folie 13 – Zehn Prozesse, 62 Prozent </w:t>
+      </w:r>
       <w:proofErr w:type="gramStart"/>
-      <w:proofErr w:type="spellEnd"/>
+      <w:r>
+        <w:t>automatisiert  (</w:t>
+      </w:r>
       <w:proofErr w:type="gramEnd"/>
+      <w:r>
+        <w:t>50 s)</w:t>
+      </w:r>
     </w:p>
     <w:p>
       <w:r>
-        <w:rPr/>
-        <w:t>Adrian: 62 Prozent der 143 Aktivitäten erledigt RepairFlow ohne manuellen Eingriff. P01 läuft zu 100 Prozent automatisch, vom KI-Aufruf bis zur Vorreservierung. P05 bei 75 Prozent, das System prüft alle Filialen parallel, reserviert und lagert um. Was niedrig automatisiert ist, ist das absichtlich: P03 Fehlerdiagnose bei 46 Prozent, P07 Reparatur bei 46 Prozent. Dort greift der Techniker ein, unterstützt vom System, nicht ersetzt durch es. Wer welche Rolle dabei hat, zeigt Kilian.</w:t>
-      </w:r>
-      <w:proofErr w:type="spellStart"/>
-      <w:proofErr w:type="spellEnd"/>
-      <w:proofErr w:type="spellStart"/>
-      <w:proofErr w:type="spellEnd"/>
-      <w:proofErr w:type="spellStart"/>
-      <w:proofErr w:type="spellEnd"/>
-      <w:proofErr w:type="spellStart"/>
-      <w:proofErr w:type="spellEnd"/>
-      <w:proofErr w:type="spellStart"/>
-      <w:proofErr w:type="spellEnd"/>
-      <w:proofErr w:type="spellStart"/>
-      <w:proofErr w:type="spellEnd"/>
-      <w:proofErr w:type="spellStart"/>
-      <w:proofErr w:type="spellEnd"/>
-      <w:proofErr w:type="spellStart"/>
-      <w:proofErr w:type="spellEnd"/>
-      <w:proofErr w:type="spellStart"/>
-      <w:proofErr w:type="spellEnd"/>
-      <w:proofErr w:type="spellStart"/>
-      <w:proofErr w:type="spellEnd"/>
-      <w:proofErr w:type="spellStart"/>
-      <w:proofErr w:type="spellEnd"/>
-      <w:proofErr w:type="spellStart"/>
-      <w:proofErr w:type="spellEnd"/>
-      <w:proofErr w:type="spellStart"/>
-      <w:proofErr w:type="spellEnd"/>
-      <w:proofErr w:type="spellStart"/>
-      <w:proofErr w:type="spellEnd"/>
-      <w:proofErr w:type="spellStart"/>
-      <w:proofErr w:type="spellEnd"/>
-      <w:proofErr w:type="spellStart"/>
-      <w:proofErr w:type="spellEnd"/>
-      <w:proofErr w:type="spellStart"/>
-      <w:proofErr w:type="spellEnd"/>
-      <w:proofErr w:type="spellStart"/>
-      <w:proofErr w:type="spellEnd"/>
-      <w:proofErr w:type="spellStart"/>
-      <w:proofErr w:type="spellEnd"/>
-      <w:proofErr w:type="spellStart"/>
-      <w:proofErr w:type="spellEnd"/>
-      <w:proofErr w:type="spellStart"/>
-      <w:proofErr w:type="spellEnd"/>
-      <w:proofErr w:type="spellStart"/>
-      <w:proofErr w:type="spellEnd"/>
-      <w:proofErr w:type="spellStart"/>
-      <w:proofErr w:type="spellEnd"/>
-      <w:proofErr w:type="spellStart"/>
-      <w:proofErr w:type="spellEnd"/>
-      <w:proofErr w:type="spellStart"/>
-      <w:proofErr w:type="spellEnd"/>
-      <w:proofErr w:type="spellStart"/>
-      <w:proofErr w:type="spellEnd"/>
-      <w:proofErr w:type="spellStart"/>
-      <w:proofErr w:type="spellEnd"/>
-      <w:proofErr w:type="spellStart"/>
-      <w:proofErr w:type="spellEnd"/>
-      <w:proofErr w:type="spellStart"/>
-      <w:proofErr w:type="spellEnd"/>
-      <w:proofErr w:type="spellStart"/>
-      <w:proofErr w:type="spellEnd"/>
-      <w:proofErr w:type="spellStart"/>
-      <w:proofErr w:type="spellEnd"/>
-      <w:proofErr w:type="spellStart"/>
-      <w:proofErr w:type="spellEnd"/>
-      <w:proofErr w:type="spellStart"/>
-      <w:proofErr w:type="spellEnd"/>
-      <w:proofErr w:type="spellStart"/>
-      <w:proofErr w:type="spellEnd"/>
-      <w:proofErr w:type="spellStart"/>
-      <w:proofErr w:type="spellEnd"/>
-      <w:proofErr w:type="spellStart"/>
-      <w:proofErr w:type="spellEnd"/>
-      <w:proofErr w:type="spellStart"/>
-      <w:proofErr w:type="spellEnd"/>
-      <w:proofErr w:type="spellStart"/>
-      <w:proofErr w:type="spellEnd"/>
-      <w:proofErr w:type="spellStart"/>
-      <w:proofErr w:type="spellEnd"/>
-      <w:proofErr w:type="spellStart"/>
-      <w:proofErr w:type="spellEnd"/>
-      <w:proofErr w:type="spellStart"/>
-      <w:proofErr w:type="spellEnd"/>
-      <w:proofErr w:type="spellStart"/>
-      <w:proofErr w:type="spellEnd"/>
-      <w:proofErr w:type="spellStart"/>
-      <w:proofErr w:type="spellEnd"/>
+        <w:t xml:space="preserve">Adrian: 62 Prozent der 143 Aktivitäten erledigt RepairFlow ohne manuellen Eingriff. P01 läuft zu 100 Prozent automatisch, vom KI-Aufruf bis zur Vorreservierung. P05 bei 75 Prozent, das System prüft alle Filialen parallel, reserviert und lagert um. Was niedrig automatisiert ist, ist das absichtlich: P03 Fehlerdiagnose bei 46 Prozent, P07 Reparatur bei 46 Prozent. Dort greift der Techniker ein, unterstützt vom System, nicht ersetzt durch es. Wer welche Rolle </w:t>
+      </w:r>
+      <w:proofErr w:type="spellStart"/>
+      <w:r>
+        <w:t>dabei</w:t>
+      </w:r>
+      <w:proofErr w:type="spellEnd"/>
+      <w:r>
+        <w:t xml:space="preserve"> hat, </w:t>
+      </w:r>
+      <w:proofErr w:type="spellStart"/>
+      <w:r>
+        <w:t>zeigt</w:t>
+      </w:r>
+      <w:proofErr w:type="spellEnd"/>
+      <w:r>
+        <w:t xml:space="preserve"> Kilian.</w:t>
+      </w:r>
     </w:p>
     <w:p>
       <w:r>
-        <w:rPr/>
         <w:t>Folie 14 – Wer macht was im System?  (75 s)</w:t>
       </w:r>
-      <w:proofErr w:type="spellStart"/>
-      <w:proofErr w:type="spellEnd"/>
-      <w:proofErr w:type="spellStart"/>
-      <w:proofErr w:type="spellEnd"/>
-      <w:proofErr w:type="spellStart"/>
-      <w:proofErr w:type="spellEnd"/>
     </w:p>
     <w:p>
       <w:r>
@@ -4419,63 +4369,24 @@
     </w:p>
     <w:p>
       <w:r>
-        <w:rPr/>
-        <w:t>Nach dem Coaching haben wir eine Regel eingeführt: Jeder Use Case hat genau eine Rolle als Hauptakteur. Früher stand bei fünf Aufgaben einfach „Techniker“. Heute gibt es dafür eigene Rollen, zum Beispiel den Diagnostiker, den Kalkulator und den Endkontrolleur. Welcher Mitarbeiter welche Rolle übernimmt, legt die Werkstatt selbst fest.</w:t>
-      </w:r>
-      <w:proofErr w:type="spellStart"/>
-      <w:proofErr w:type="spellEnd"/>
-      <w:proofErr w:type="spellStart"/>
-      <w:proofErr w:type="spellEnd"/>
-      <w:proofErr w:type="spellStart"/>
-      <w:proofErr w:type="spellEnd"/>
-      <w:proofErr w:type="spellStart"/>
-      <w:proofErr w:type="spellEnd"/>
-      <w:proofErr w:type="spellStart"/>
-      <w:proofErr w:type="spellEnd"/>
-      <w:proofErr w:type="spellStart"/>
-      <w:proofErr w:type="spellEnd"/>
-      <w:proofErr w:type="spellStart"/>
-      <w:proofErr w:type="spellEnd"/>
-      <w:proofErr w:type="spellStart"/>
-      <w:proofErr w:type="spellEnd"/>
-      <w:proofErr w:type="spellStart"/>
-      <w:proofErr w:type="spellEnd"/>
-      <w:proofErr w:type="spellStart"/>
-      <w:proofErr w:type="spellEnd"/>
-      <w:proofErr w:type="spellStart"/>
-      <w:proofErr w:type="spellEnd"/>
-      <w:proofErr w:type="spellStart"/>
-      <w:proofErr w:type="spellEnd"/>
-      <w:proofErr w:type="spellStart"/>
-      <w:proofErr w:type="gramStart"/>
-      <w:proofErr w:type="spellEnd"/>
-      <w:proofErr w:type="gramEnd"/>
-      <w:proofErr w:type="spellStart"/>
-      <w:proofErr w:type="spellEnd"/>
-      <w:proofErr w:type="spellStart"/>
-      <w:proofErr w:type="spellEnd"/>
-      <w:proofErr w:type="spellStart"/>
-      <w:proofErr w:type="spellEnd"/>
-      <w:proofErr w:type="spellStart"/>
-      <w:proofErr w:type="spellEnd"/>
-      <w:proofErr w:type="spellStart"/>
-      <w:proofErr w:type="spellEnd"/>
-      <w:proofErr w:type="spellStart"/>
-      <w:proofErr w:type="spellEnd"/>
-      <w:proofErr w:type="spellStart"/>
-      <w:proofErr w:type="spellEnd"/>
-      <w:proofErr w:type="spellStart"/>
-      <w:proofErr w:type="spellEnd"/>
-      <w:proofErr w:type="spellStart"/>
-      <w:proofErr w:type="spellEnd"/>
-      <w:proofErr w:type="spellStart"/>
-      <w:proofErr w:type="spellEnd"/>
-      <w:proofErr w:type="spellStart"/>
-      <w:proofErr w:type="spellEnd"/>
-      <w:proofErr w:type="spellStart"/>
-      <w:proofErr w:type="spellEnd"/>
-      <w:proofErr w:type="spellStart"/>
-      <w:proofErr w:type="spellEnd"/>
+        <w:t xml:space="preserve">Nach dem Coaching haben wir eine Regel eingeführt: Jeder Use Case hat genau eine Rolle als Hauptakteur. Früher stand bei fünf Aufgaben einfach „Techniker“. Heute gibt es dafür eigene Rollen, zum Beispiel den Diagnostiker, den Kalkulator und den Endkontrolleur. Welcher Mitarbeiter welche Rolle übernimmt, legt die </w:t>
+      </w:r>
+      <w:proofErr w:type="spellStart"/>
+      <w:r>
+        <w:t>Werkstatt</w:t>
+      </w:r>
+      <w:proofErr w:type="spellEnd"/>
+      <w:r>
+        <w:t xml:space="preserve"> </w:t>
+      </w:r>
+      <w:proofErr w:type="spellStart"/>
+      <w:r>
+        <w:t>selbst</w:t>
+      </w:r>
+      <w:proofErr w:type="spellEnd"/>
+      <w:r>
+        <w:t xml:space="preserve"> fest.</w:t>
+      </w:r>
     </w:p>
     <w:p>
       <w:r>
@@ -4564,17 +4475,16 @@
     </w:p>
     <w:p>
       <w:r>
-        <w:rPr/>
-        <w:t>Folie 15 – Das Datenmodell: fünf Entscheidungen  (85 s)</w:t>
-      </w:r>
-      <w:proofErr w:type="spellStart"/>
-      <w:proofErr w:type="spellEnd"/>
-      <w:proofErr w:type="spellStart"/>
-      <w:proofErr w:type="spellEnd"/>
-      <w:proofErr w:type="spellStart"/>
+        <w:t xml:space="preserve">Folie 15 – Das Datenmodell: fünf </w:t>
+      </w:r>
       <w:proofErr w:type="gramStart"/>
-      <w:proofErr w:type="spellEnd"/>
+      <w:r>
+        <w:t>Entscheidungen  (</w:t>
+      </w:r>
       <w:proofErr w:type="gramEnd"/>
+      <w:r>
+        <w:t>85 s)</w:t>
+      </w:r>
     </w:p>
     <w:p>
       <w:r>
@@ -4720,65 +4630,184 @@
     <w:p>
       <w:proofErr w:type="spellStart"/>
       <w:r>
-        <w:rPr/>
-        <w:t>Erstens steht der Reparaturauftrag im Mittelpunkt. Befund und Reparaturschritte gehören fest zum Auftrag. Der Kostenvoranschlag hängt nur lose am Auftrag, weil der erste Kostenvoranschlag schon entsteht, bevor es einen Auftrag gibt.</w:t>
-      </w:r>
-      <w:proofErr w:type="spellEnd"/>
-      <w:proofErr w:type="spellStart"/>
-      <w:proofErr w:type="spellEnd"/>
-      <w:proofErr w:type="spellStart"/>
-      <w:proofErr w:type="spellEnd"/>
-      <w:proofErr w:type="spellStart"/>
-      <w:proofErr w:type="spellEnd"/>
-      <w:proofErr w:type="spellStart"/>
-      <w:proofErr w:type="spellEnd"/>
-      <w:proofErr w:type="spellStart"/>
-      <w:proofErr w:type="spellEnd"/>
-      <w:proofErr w:type="spellStart"/>
-      <w:proofErr w:type="spellEnd"/>
-      <w:proofErr w:type="spellStart"/>
-      <w:proofErr w:type="spellEnd"/>
-      <w:proofErr w:type="spellStart"/>
-      <w:proofErr w:type="spellEnd"/>
-      <w:proofErr w:type="spellStart"/>
-      <w:proofErr w:type="spellEnd"/>
-      <w:proofErr w:type="spellStart"/>
-      <w:proofErr w:type="spellEnd"/>
-      <w:proofErr w:type="spellStart"/>
-      <w:proofErr w:type="spellEnd"/>
-      <w:proofErr w:type="spellStart"/>
-      <w:proofErr w:type="spellEnd"/>
-      <w:proofErr w:type="spellStart"/>
-      <w:proofErr w:type="spellEnd"/>
-      <w:proofErr w:type="spellStart"/>
-      <w:proofErr w:type="spellEnd"/>
-      <w:proofErr w:type="spellStart"/>
-      <w:proofErr w:type="spellEnd"/>
-      <w:proofErr w:type="spellStart"/>
-      <w:proofErr w:type="spellEnd"/>
-      <w:proofErr w:type="spellStart"/>
-      <w:proofErr w:type="spellEnd"/>
-      <w:proofErr w:type="spellStart"/>
-      <w:proofErr w:type="spellEnd"/>
-      <w:proofErr w:type="spellStart"/>
-      <w:proofErr w:type="spellEnd"/>
-      <w:proofErr w:type="spellStart"/>
-      <w:proofErr w:type="spellEnd"/>
-      <w:proofErr w:type="spellStart"/>
-      <w:proofErr w:type="spellEnd"/>
-      <w:proofErr w:type="spellStart"/>
-      <w:proofErr w:type="spellEnd"/>
-      <w:proofErr w:type="spellStart"/>
-      <w:proofErr w:type="spellEnd"/>
-      <w:proofErr w:type="spellStart"/>
-      <w:proofErr w:type="spellEnd"/>
-      <w:proofErr w:type="spellStart"/>
-      <w:proofErr w:type="spellEnd"/>
+        <w:t>Erstens</w:t>
+      </w:r>
+      <w:proofErr w:type="spellEnd"/>
+      <w:r>
+        <w:t xml:space="preserve"> </w:t>
+      </w:r>
+      <w:proofErr w:type="spellStart"/>
+      <w:r>
+        <w:t>steht</w:t>
+      </w:r>
+      <w:proofErr w:type="spellEnd"/>
+      <w:r>
+        <w:t xml:space="preserve"> der </w:t>
+      </w:r>
+      <w:proofErr w:type="spellStart"/>
+      <w:r>
+        <w:t>Reparaturauftrag</w:t>
+      </w:r>
+      <w:proofErr w:type="spellEnd"/>
+      <w:r>
+        <w:t xml:space="preserve"> </w:t>
+      </w:r>
+      <w:proofErr w:type="spellStart"/>
+      <w:r>
+        <w:t>im</w:t>
+      </w:r>
+      <w:proofErr w:type="spellEnd"/>
+      <w:r>
+        <w:t xml:space="preserve"> </w:t>
+      </w:r>
+      <w:proofErr w:type="spellStart"/>
+      <w:r>
+        <w:t>Mittelpunkt</w:t>
+      </w:r>
+      <w:proofErr w:type="spellEnd"/>
+      <w:r>
+        <w:t xml:space="preserve">. </w:t>
+      </w:r>
+      <w:proofErr w:type="spellStart"/>
+      <w:r>
+        <w:t>Befund</w:t>
+      </w:r>
+      <w:proofErr w:type="spellEnd"/>
+      <w:r>
+        <w:t xml:space="preserve"> und </w:t>
+      </w:r>
+      <w:proofErr w:type="spellStart"/>
+      <w:r>
+        <w:t>Reparaturschritte</w:t>
+      </w:r>
+      <w:proofErr w:type="spellEnd"/>
+      <w:r>
+        <w:t xml:space="preserve"> </w:t>
+      </w:r>
+      <w:proofErr w:type="spellStart"/>
+      <w:r>
+        <w:t>gehören</w:t>
+      </w:r>
+      <w:proofErr w:type="spellEnd"/>
+      <w:r>
+        <w:t xml:space="preserve"> fest </w:t>
+      </w:r>
+      <w:proofErr w:type="spellStart"/>
+      <w:r>
+        <w:t>zum</w:t>
+      </w:r>
+      <w:proofErr w:type="spellEnd"/>
+      <w:r>
+        <w:t xml:space="preserve"> </w:t>
+      </w:r>
+      <w:proofErr w:type="spellStart"/>
+      <w:r>
+        <w:t>Auftrag</w:t>
+      </w:r>
+      <w:proofErr w:type="spellEnd"/>
+      <w:r>
+        <w:t xml:space="preserve">. Der </w:t>
+      </w:r>
+      <w:proofErr w:type="spellStart"/>
+      <w:r>
+        <w:t>Kostenvoranschlag</w:t>
+      </w:r>
+      <w:proofErr w:type="spellEnd"/>
+      <w:r>
+        <w:t xml:space="preserve"> </w:t>
+      </w:r>
+      <w:proofErr w:type="spellStart"/>
+      <w:r>
+        <w:t>hängt</w:t>
+      </w:r>
+      <w:proofErr w:type="spellEnd"/>
+      <w:r>
+        <w:t xml:space="preserve"> </w:t>
+      </w:r>
+      <w:proofErr w:type="spellStart"/>
+      <w:r>
+        <w:t>nur</w:t>
+      </w:r>
+      <w:proofErr w:type="spellEnd"/>
+      <w:r>
+        <w:t xml:space="preserve"> lose am </w:t>
+      </w:r>
+      <w:proofErr w:type="spellStart"/>
+      <w:r>
+        <w:t>Auftrag</w:t>
+      </w:r>
+      <w:proofErr w:type="spellEnd"/>
+      <w:r>
+        <w:t xml:space="preserve">, </w:t>
+      </w:r>
+      <w:proofErr w:type="spellStart"/>
+      <w:r>
+        <w:t>weil</w:t>
+      </w:r>
+      <w:proofErr w:type="spellEnd"/>
+      <w:r>
+        <w:t xml:space="preserve"> der </w:t>
+      </w:r>
+      <w:proofErr w:type="spellStart"/>
+      <w:r>
+        <w:t>erste</w:t>
+      </w:r>
+      <w:proofErr w:type="spellEnd"/>
+      <w:r>
+        <w:t xml:space="preserve"> </w:t>
+      </w:r>
+      <w:proofErr w:type="spellStart"/>
+      <w:r>
+        <w:t>Kostenvoranschlag</w:t>
+      </w:r>
+      <w:proofErr w:type="spellEnd"/>
+      <w:r>
+        <w:t xml:space="preserve"> </w:t>
+      </w:r>
+      <w:proofErr w:type="spellStart"/>
+      <w:r>
+        <w:t>schon</w:t>
+      </w:r>
+      <w:proofErr w:type="spellEnd"/>
+      <w:r>
+        <w:t xml:space="preserve"> </w:t>
+      </w:r>
+      <w:proofErr w:type="spellStart"/>
+      <w:r>
+        <w:t>entsteht</w:t>
+      </w:r>
+      <w:proofErr w:type="spellEnd"/>
+      <w:r>
+        <w:t xml:space="preserve">, bevor es </w:t>
+      </w:r>
+      <w:proofErr w:type="spellStart"/>
+      <w:r>
+        <w:t>einen</w:t>
+      </w:r>
+      <w:proofErr w:type="spellEnd"/>
+      <w:r>
+        <w:t xml:space="preserve"> </w:t>
+      </w:r>
+      <w:proofErr w:type="spellStart"/>
+      <w:r>
+        <w:t>Auftrag</w:t>
+      </w:r>
+      <w:proofErr w:type="spellEnd"/>
+      <w:r>
+        <w:t xml:space="preserve"> </w:t>
+      </w:r>
+      <w:proofErr w:type="spellStart"/>
+      <w:r>
+        <w:t>gibt</w:t>
+      </w:r>
+      <w:proofErr w:type="spellEnd"/>
+      <w:r>
+        <w:t>.</w:t>
+      </w:r>
     </w:p>
     <w:p>
       <w:proofErr w:type="spellStart"/>
       <w:r>
-        <w:lastRenderedPageBreak/>
         <w:t>Zweitens</w:t>
       </w:r>
       <w:proofErr w:type="spellEnd"/>
@@ -5055,50 +5084,181 @@
     <w:p>
       <w:proofErr w:type="spellStart"/>
       <w:r>
-        <w:rPr/>
-        <w:t>Viertens ist der Werkstattbetrieb die Zentrale. Er kennt alle Aufträge, Bestellungen und Reklamationen. Die 15 Rollen von eben fassen wir in vier Mitarbeiterklassen zusammen. Kunden und Mitarbeiter kommen nur über zwei Oberflächen an die Daten, die KundenApp und die Werkstattoberfläche.</w:t>
-      </w:r>
-      <w:proofErr w:type="spellEnd"/>
-      <w:proofErr w:type="spellStart"/>
-      <w:proofErr w:type="spellEnd"/>
-      <w:proofErr w:type="spellStart"/>
-      <w:proofErr w:type="spellEnd"/>
-      <w:proofErr w:type="spellStart"/>
-      <w:proofErr w:type="spellEnd"/>
-      <w:proofErr w:type="spellStart"/>
-      <w:proofErr w:type="spellEnd"/>
-      <w:proofErr w:type="spellStart"/>
-      <w:proofErr w:type="spellEnd"/>
-      <w:proofErr w:type="spellStart"/>
-      <w:proofErr w:type="spellEnd"/>
-      <w:proofErr w:type="spellStart"/>
-      <w:proofErr w:type="spellEnd"/>
-      <w:proofErr w:type="spellStart"/>
-      <w:proofErr w:type="spellEnd"/>
-      <w:proofErr w:type="spellStart"/>
-      <w:proofErr w:type="spellEnd"/>
-      <w:proofErr w:type="spellStart"/>
-      <w:proofErr w:type="spellEnd"/>
-      <w:proofErr w:type="spellStart"/>
-      <w:proofErr w:type="spellEnd"/>
-      <w:proofErr w:type="spellStart"/>
-      <w:proofErr w:type="spellEnd"/>
-      <w:proofErr w:type="spellStart"/>
-      <w:proofErr w:type="spellEnd"/>
-      <w:proofErr w:type="spellStart"/>
-      <w:proofErr w:type="spellEnd"/>
-      <w:proofErr w:type="spellStart"/>
-      <w:proofErr w:type="spellEnd"/>
-      <w:proofErr w:type="spellStart"/>
-      <w:proofErr w:type="spellEnd"/>
+        <w:lastRenderedPageBreak/>
+        <w:t>Viertens</w:t>
+      </w:r>
+      <w:proofErr w:type="spellEnd"/>
+      <w:r>
+        <w:t xml:space="preserve"> </w:t>
+      </w:r>
+      <w:proofErr w:type="spellStart"/>
+      <w:r>
+        <w:t>ist</w:t>
+      </w:r>
+      <w:proofErr w:type="spellEnd"/>
+      <w:r>
+        <w:t xml:space="preserve"> der </w:t>
+      </w:r>
+      <w:proofErr w:type="spellStart"/>
+      <w:r>
+        <w:t>Werkstattbetrieb</w:t>
+      </w:r>
+      <w:proofErr w:type="spellEnd"/>
+      <w:r>
+        <w:t xml:space="preserve"> die </w:t>
+      </w:r>
+      <w:proofErr w:type="spellStart"/>
+      <w:r>
+        <w:t>Zentrale</w:t>
+      </w:r>
+      <w:proofErr w:type="spellEnd"/>
+      <w:r>
+        <w:t xml:space="preserve">. Er </w:t>
+      </w:r>
+      <w:proofErr w:type="spellStart"/>
+      <w:r>
+        <w:t>kennt</w:t>
+      </w:r>
+      <w:proofErr w:type="spellEnd"/>
+      <w:r>
+        <w:t xml:space="preserve"> alle </w:t>
+      </w:r>
+      <w:proofErr w:type="spellStart"/>
+      <w:r>
+        <w:t>Aufträge</w:t>
+      </w:r>
+      <w:proofErr w:type="spellEnd"/>
+      <w:r>
+        <w:t xml:space="preserve">, </w:t>
+      </w:r>
+      <w:proofErr w:type="spellStart"/>
+      <w:r>
+        <w:t>Bestellungen</w:t>
+      </w:r>
+      <w:proofErr w:type="spellEnd"/>
+      <w:r>
+        <w:t xml:space="preserve"> und </w:t>
+      </w:r>
+      <w:proofErr w:type="spellStart"/>
+      <w:r>
+        <w:t>Reklamationen</w:t>
+      </w:r>
+      <w:proofErr w:type="spellEnd"/>
+      <w:r>
+        <w:t xml:space="preserve">. Die 15 Rollen von </w:t>
+      </w:r>
+      <w:proofErr w:type="spellStart"/>
+      <w:r>
+        <w:t>eben</w:t>
+      </w:r>
+      <w:proofErr w:type="spellEnd"/>
+      <w:r>
+        <w:t xml:space="preserve"> </w:t>
+      </w:r>
+      <w:proofErr w:type="spellStart"/>
+      <w:r>
+        <w:t>fassen</w:t>
+      </w:r>
+      <w:proofErr w:type="spellEnd"/>
+      <w:r>
+        <w:t xml:space="preserve"> </w:t>
+      </w:r>
+      <w:proofErr w:type="spellStart"/>
+      <w:r>
+        <w:t>wir</w:t>
+      </w:r>
+      <w:proofErr w:type="spellEnd"/>
+      <w:r>
+        <w:t xml:space="preserve"> in vier </w:t>
+      </w:r>
+      <w:proofErr w:type="spellStart"/>
+      <w:r>
+        <w:t>Mitarbeiterklassen</w:t>
+      </w:r>
+      <w:proofErr w:type="spellEnd"/>
+      <w:r>
+        <w:t xml:space="preserve"> </w:t>
+      </w:r>
+      <w:proofErr w:type="spellStart"/>
+      <w:r>
+        <w:t>zusammen</w:t>
+      </w:r>
+      <w:proofErr w:type="spellEnd"/>
+      <w:r>
+        <w:t xml:space="preserve">. Kunden und Mitarbeiter </w:t>
+      </w:r>
+      <w:proofErr w:type="spellStart"/>
+      <w:r>
+        <w:t>kommen</w:t>
+      </w:r>
+      <w:proofErr w:type="spellEnd"/>
+      <w:r>
+        <w:t xml:space="preserve"> </w:t>
+      </w:r>
+      <w:proofErr w:type="spellStart"/>
+      <w:r>
+        <w:t>nur</w:t>
+      </w:r>
+      <w:proofErr w:type="spellEnd"/>
+      <w:r>
+        <w:t xml:space="preserve"> </w:t>
+      </w:r>
+      <w:proofErr w:type="spellStart"/>
+      <w:r>
+        <w:t>über</w:t>
+      </w:r>
+      <w:proofErr w:type="spellEnd"/>
+      <w:r>
+        <w:t xml:space="preserve"> </w:t>
+      </w:r>
+      <w:proofErr w:type="spellStart"/>
+      <w:r>
+        <w:t>zwei</w:t>
+      </w:r>
+      <w:proofErr w:type="spellEnd"/>
+      <w:r>
+        <w:t xml:space="preserve"> </w:t>
+      </w:r>
+      <w:proofErr w:type="spellStart"/>
+      <w:r>
+        <w:t>Oberflächen</w:t>
+      </w:r>
+      <w:proofErr w:type="spellEnd"/>
+      <w:r>
+        <w:t xml:space="preserve"> </w:t>
+      </w:r>
       <w:proofErr w:type="gramStart"/>
+      <w:r>
+        <w:t>an</w:t>
+      </w:r>
       <w:proofErr w:type="gramEnd"/>
-      <w:proofErr w:type="spellStart"/>
-      <w:proofErr w:type="spellEnd"/>
-      <w:proofErr w:type="spellStart"/>
-      <w:proofErr w:type="spellEnd"/>
-      <w:proofErr w:type="spellStart"/>
-      <w:proofErr w:type="spellEnd"/>
+      <w:r>
+        <w:t xml:space="preserve"> die </w:t>
+      </w:r>
+      <w:proofErr w:type="spellStart"/>
+      <w:r>
+        <w:t>Daten</w:t>
+      </w:r>
+      <w:proofErr w:type="spellEnd"/>
+      <w:r>
+        <w:t xml:space="preserve">, die </w:t>
+      </w:r>
+      <w:proofErr w:type="spellStart"/>
+      <w:r>
+        <w:t>KundenApp</w:t>
+      </w:r>
+      <w:proofErr w:type="spellEnd"/>
+      <w:r>
+        <w:t xml:space="preserve"> und die </w:t>
+      </w:r>
+      <w:proofErr w:type="spellStart"/>
+      <w:r>
+        <w:t>Werkstattoberfläche</w:t>
+      </w:r>
+      <w:proofErr w:type="spellEnd"/>
+      <w:r>
+        <w:t>.</w:t>
+      </w:r>
     </w:p>
     <w:p>
       <w:proofErr w:type="spellStart"/>
@@ -5245,17 +5405,16 @@
     </w:p>
     <w:p>
       <w:r>
-        <w:rPr/>
-        <w:t>Folie 16 – Qualität: Regeln, Werkzeuge, Reviews  (65 s)</w:t>
-      </w:r>
-      <w:proofErr w:type="spellStart"/>
-      <w:proofErr w:type="spellEnd"/>
-      <w:proofErr w:type="spellStart"/>
-      <w:proofErr w:type="spellEnd"/>
-      <w:proofErr w:type="spellStart"/>
-      <w:proofErr w:type="spellEnd"/>
+        <w:t xml:space="preserve">Folie 16 – Qualität: Regeln, Werkzeuge, </w:t>
+      </w:r>
       <w:proofErr w:type="gramStart"/>
+      <w:r>
+        <w:t>Reviews  (</w:t>
+      </w:r>
       <w:proofErr w:type="gramEnd"/>
+      <w:r>
+        <w:t>65 s)</w:t>
+      </w:r>
     </w:p>
     <w:p>
       <w:r>
@@ -5385,54 +5544,196 @@
     <w:p>
       <w:proofErr w:type="spellStart"/>
       <w:r>
-        <w:rPr/>
-        <w:t>Erstens feste Regeln. Eine Sache heißt in allen Modellen gleich. Ein Datenobjekt im Prozess trägt also denselben Namen wie die Klasse. Jede Mitarbeiterrolle gehört zu genau einer Lane und einer Klasse, und die Statuswerte sind überall dieselben.</w:t>
-      </w:r>
-      <w:proofErr w:type="spellEnd"/>
-      <w:proofErr w:type="spellStart"/>
-      <w:proofErr w:type="spellEnd"/>
-      <w:proofErr w:type="spellStart"/>
-      <w:proofErr w:type="spellEnd"/>
-      <w:proofErr w:type="spellStart"/>
-      <w:proofErr w:type="spellEnd"/>
-      <w:proofErr w:type="spellStart"/>
-      <w:proofErr w:type="spellEnd"/>
-      <w:proofErr w:type="spellStart"/>
-      <w:proofErr w:type="spellEnd"/>
-      <w:proofErr w:type="spellStart"/>
-      <w:proofErr w:type="spellEnd"/>
-      <w:proofErr w:type="spellStart"/>
-      <w:proofErr w:type="spellEnd"/>
-      <w:proofErr w:type="spellStart"/>
-      <w:proofErr w:type="spellEnd"/>
-      <w:proofErr w:type="spellStart"/>
-      <w:proofErr w:type="spellEnd"/>
-      <w:proofErr w:type="spellStart"/>
-      <w:proofErr w:type="spellEnd"/>
-      <w:proofErr w:type="spellStart"/>
-      <w:proofErr w:type="spellEnd"/>
-      <w:proofErr w:type="spellStart"/>
-      <w:proofErr w:type="spellEnd"/>
-      <w:proofErr w:type="spellStart"/>
-      <w:proofErr w:type="spellEnd"/>
-      <w:proofErr w:type="spellStart"/>
-      <w:proofErr w:type="spellEnd"/>
-      <w:proofErr w:type="spellStart"/>
-      <w:proofErr w:type="spellEnd"/>
-      <w:proofErr w:type="spellStart"/>
-      <w:proofErr w:type="spellEnd"/>
-      <w:proofErr w:type="spellStart"/>
-      <w:proofErr w:type="spellEnd"/>
-      <w:proofErr w:type="spellStart"/>
-      <w:proofErr w:type="spellEnd"/>
-      <w:proofErr w:type="spellStart"/>
-      <w:proofErr w:type="spellEnd"/>
-      <w:proofErr w:type="spellStart"/>
-      <w:proofErr w:type="spellEnd"/>
-      <w:proofErr w:type="spellStart"/>
-      <w:proofErr w:type="spellEnd"/>
-      <w:proofErr w:type="spellStart"/>
-      <w:proofErr w:type="spellEnd"/>
+        <w:t>Erstens</w:t>
+      </w:r>
+      <w:proofErr w:type="spellEnd"/>
+      <w:r>
+        <w:t xml:space="preserve"> </w:t>
+      </w:r>
+      <w:proofErr w:type="spellStart"/>
+      <w:r>
+        <w:t>feste</w:t>
+      </w:r>
+      <w:proofErr w:type="spellEnd"/>
+      <w:r>
+        <w:t xml:space="preserve"> </w:t>
+      </w:r>
+      <w:proofErr w:type="spellStart"/>
+      <w:r>
+        <w:t>Regeln</w:t>
+      </w:r>
+      <w:proofErr w:type="spellEnd"/>
+      <w:r>
+        <w:t xml:space="preserve">. Eine Sache </w:t>
+      </w:r>
+      <w:proofErr w:type="spellStart"/>
+      <w:r>
+        <w:t>heißt</w:t>
+      </w:r>
+      <w:proofErr w:type="spellEnd"/>
+      <w:r>
+        <w:t xml:space="preserve"> in </w:t>
+      </w:r>
+      <w:proofErr w:type="spellStart"/>
+      <w:r>
+        <w:t>allen</w:t>
+      </w:r>
+      <w:proofErr w:type="spellEnd"/>
+      <w:r>
+        <w:t xml:space="preserve"> </w:t>
+      </w:r>
+      <w:proofErr w:type="spellStart"/>
+      <w:r>
+        <w:t>Modellen</w:t>
+      </w:r>
+      <w:proofErr w:type="spellEnd"/>
+      <w:r>
+        <w:t xml:space="preserve"> </w:t>
+      </w:r>
+      <w:proofErr w:type="spellStart"/>
+      <w:r>
+        <w:t>gleich</w:t>
+      </w:r>
+      <w:proofErr w:type="spellEnd"/>
+      <w:r>
+        <w:t xml:space="preserve">. Ein </w:t>
+      </w:r>
+      <w:proofErr w:type="spellStart"/>
+      <w:r>
+        <w:t>Datenobjekt</w:t>
+      </w:r>
+      <w:proofErr w:type="spellEnd"/>
+      <w:r>
+        <w:t xml:space="preserve"> </w:t>
+      </w:r>
+      <w:proofErr w:type="spellStart"/>
+      <w:r>
+        <w:t>im</w:t>
+      </w:r>
+      <w:proofErr w:type="spellEnd"/>
+      <w:r>
+        <w:t xml:space="preserve"> </w:t>
+      </w:r>
+      <w:proofErr w:type="spellStart"/>
+      <w:r>
+        <w:t>Prozess</w:t>
+      </w:r>
+      <w:proofErr w:type="spellEnd"/>
+      <w:r>
+        <w:t xml:space="preserve"> </w:t>
+      </w:r>
+      <w:proofErr w:type="spellStart"/>
+      <w:r>
+        <w:t>trägt</w:t>
+      </w:r>
+      <w:proofErr w:type="spellEnd"/>
+      <w:r>
+        <w:t xml:space="preserve"> also </w:t>
+      </w:r>
+      <w:proofErr w:type="spellStart"/>
+      <w:r>
+        <w:t>denselben</w:t>
+      </w:r>
+      <w:proofErr w:type="spellEnd"/>
+      <w:r>
+        <w:t xml:space="preserve"> Namen </w:t>
+      </w:r>
+      <w:proofErr w:type="spellStart"/>
+      <w:r>
+        <w:t>wie</w:t>
+      </w:r>
+      <w:proofErr w:type="spellEnd"/>
+      <w:r>
+        <w:t xml:space="preserve"> die Klasse. </w:t>
+      </w:r>
+      <w:proofErr w:type="spellStart"/>
+      <w:r>
+        <w:t>Jede</w:t>
+      </w:r>
+      <w:proofErr w:type="spellEnd"/>
+      <w:r>
+        <w:t xml:space="preserve"> </w:t>
+      </w:r>
+      <w:proofErr w:type="spellStart"/>
+      <w:r>
+        <w:t>Mitarbeiterrolle</w:t>
+      </w:r>
+      <w:proofErr w:type="spellEnd"/>
+      <w:r>
+        <w:t xml:space="preserve"> </w:t>
+      </w:r>
+      <w:proofErr w:type="spellStart"/>
+      <w:r>
+        <w:t>gehört</w:t>
+      </w:r>
+      <w:proofErr w:type="spellEnd"/>
+      <w:r>
+        <w:t xml:space="preserve"> </w:t>
+      </w:r>
+      <w:proofErr w:type="spellStart"/>
+      <w:r>
+        <w:t>zu</w:t>
+      </w:r>
+      <w:proofErr w:type="spellEnd"/>
+      <w:r>
+        <w:t xml:space="preserve"> </w:t>
+      </w:r>
+      <w:proofErr w:type="spellStart"/>
+      <w:r>
+        <w:t>genau</w:t>
+      </w:r>
+      <w:proofErr w:type="spellEnd"/>
+      <w:r>
+        <w:t xml:space="preserve"> </w:t>
+      </w:r>
+      <w:proofErr w:type="spellStart"/>
+      <w:r>
+        <w:t>einer</w:t>
+      </w:r>
+      <w:proofErr w:type="spellEnd"/>
+      <w:r>
+        <w:t xml:space="preserve"> Lane und </w:t>
+      </w:r>
+      <w:proofErr w:type="spellStart"/>
+      <w:r>
+        <w:t>einer</w:t>
+      </w:r>
+      <w:proofErr w:type="spellEnd"/>
+      <w:r>
+        <w:t xml:space="preserve"> Klasse, und die </w:t>
+      </w:r>
+      <w:proofErr w:type="spellStart"/>
+      <w:r>
+        <w:t>Statuswerte</w:t>
+      </w:r>
+      <w:proofErr w:type="spellEnd"/>
+      <w:r>
+        <w:t xml:space="preserve"> </w:t>
+      </w:r>
+      <w:proofErr w:type="spellStart"/>
+      <w:r>
+        <w:t>sind</w:t>
+      </w:r>
+      <w:proofErr w:type="spellEnd"/>
+      <w:r>
+        <w:t xml:space="preserve"> </w:t>
+      </w:r>
+      <w:proofErr w:type="spellStart"/>
+      <w:r>
+        <w:t>überall</w:t>
+      </w:r>
+      <w:proofErr w:type="spellEnd"/>
+      <w:r>
+        <w:t xml:space="preserve"> </w:t>
+      </w:r>
+      <w:proofErr w:type="spellStart"/>
+      <w:r>
+        <w:t>dieselben</w:t>
+      </w:r>
+      <w:proofErr w:type="spellEnd"/>
+      <w:r>
+        <w:t>.</w:t>
+      </w:r>
     </w:p>
     <w:p>
       <w:proofErr w:type="spellStart"/>
@@ -5537,11 +5838,11 @@
       </w:r>
       <w:proofErr w:type="spellEnd"/>
       <w:r>
-        <w:t xml:space="preserve">. Zwei </w:t>
-      </w:r>
-      <w:proofErr w:type="spellStart"/>
-      <w:r>
-        <w:t>Prüfprogramme</w:t>
+        <w:t xml:space="preserve">. </w:t>
+      </w:r>
+      <w:proofErr w:type="spellStart"/>
+      <w:r>
+        <w:t>Danach</w:t>
       </w:r>
       <w:proofErr w:type="spellEnd"/>
       <w:r>
@@ -5553,15 +5854,23 @@
       </w:r>
       <w:proofErr w:type="spellEnd"/>
       <w:r>
-        <w:t xml:space="preserve"> </w:t>
-      </w:r>
-      <w:proofErr w:type="spellStart"/>
-      <w:r>
-        <w:t>danach</w:t>
-      </w:r>
-      <w:proofErr w:type="spellEnd"/>
-      <w:r>
-        <w:t xml:space="preserve"> </w:t>
+        <w:t xml:space="preserve"> der Camunda-Linter und die </w:t>
+      </w:r>
+      <w:proofErr w:type="spellStart"/>
+      <w:r>
+        <w:t>Prüfung</w:t>
+      </w:r>
+      <w:proofErr w:type="spellEnd"/>
+      <w:r>
+        <w:t xml:space="preserve"> </w:t>
+      </w:r>
+      <w:proofErr w:type="spellStart"/>
+      <w:r>
+        <w:t>im</w:t>
+      </w:r>
+      <w:proofErr w:type="spellEnd"/>
+      <w:r>
+        <w:t xml:space="preserve"> Camunda Modeler </w:t>
       </w:r>
       <w:proofErr w:type="spellStart"/>
       <w:r>
@@ -5837,15 +6146,16 @@
     </w:p>
     <w:p>
       <w:r>
-        <w:rPr/>
-        <w:t>Folie 17 – Herausforderungen und Lernerfahrungen  (65 s)</w:t>
-      </w:r>
-      <w:proofErr w:type="spellStart"/>
-      <w:proofErr w:type="spellEnd"/>
-      <w:proofErr w:type="spellStart"/>
+        <w:t xml:space="preserve">Folie 17 – Herausforderungen und </w:t>
+      </w:r>
       <w:proofErr w:type="gramStart"/>
-      <w:proofErr w:type="spellEnd"/>
+      <w:r>
+        <w:t>Lernerfahrungen  (</w:t>
+      </w:r>
       <w:proofErr w:type="gramEnd"/>
+      <w:r>
+        <w:t>65 s)</w:t>
+      </w:r>
     </w:p>
     <w:p>
       <w:r>
@@ -6103,306 +6413,265 @@
       </w:r>
     </w:p>
     <w:p>
-      <w:proofErr w:type="spellStart"/>
-      <w:r>
-        <w:t>Zweitens</w:t>
-      </w:r>
-      <w:proofErr w:type="spellEnd"/>
-      <w:r>
-        <w:t xml:space="preserve"> die Namen. Klassen, </w:t>
-      </w:r>
-      <w:proofErr w:type="spellStart"/>
-      <w:r>
-        <w:t>Datenobjekte</w:t>
-      </w:r>
-      <w:proofErr w:type="spellEnd"/>
-      <w:r>
-        <w:t xml:space="preserve"> und </w:t>
-      </w:r>
-      <w:proofErr w:type="spellStart"/>
-      <w:r>
-        <w:t>Statuswerte</w:t>
-      </w:r>
-      <w:proofErr w:type="spellEnd"/>
-      <w:r>
-        <w:t xml:space="preserve"> </w:t>
-      </w:r>
-      <w:proofErr w:type="spellStart"/>
-      <w:r>
-        <w:t>müssen</w:t>
-      </w:r>
-      <w:proofErr w:type="spellEnd"/>
-      <w:r>
-        <w:t xml:space="preserve"> in </w:t>
-      </w:r>
-      <w:proofErr w:type="spellStart"/>
-      <w:r>
-        <w:t>allen</w:t>
-      </w:r>
-      <w:proofErr w:type="spellEnd"/>
-      <w:r>
-        <w:t xml:space="preserve"> </w:t>
-      </w:r>
-      <w:proofErr w:type="spellStart"/>
-      <w:r>
-        <w:t>Modellen</w:t>
-      </w:r>
-      <w:proofErr w:type="spellEnd"/>
-      <w:r>
-        <w:t xml:space="preserve"> </w:t>
-      </w:r>
-      <w:proofErr w:type="spellStart"/>
-      <w:r>
-        <w:t>gleich</w:t>
-      </w:r>
-      <w:proofErr w:type="spellEnd"/>
-      <w:r>
-        <w:t xml:space="preserve"> </w:t>
-      </w:r>
-      <w:proofErr w:type="spellStart"/>
-      <w:r>
-        <w:t>heißen</w:t>
-      </w:r>
-      <w:proofErr w:type="spellEnd"/>
-      <w:r>
-        <w:t xml:space="preserve">. </w:t>
-      </w:r>
-      <w:proofErr w:type="spellStart"/>
-      <w:r>
-        <w:t>Sonst</w:t>
-      </w:r>
-      <w:proofErr w:type="spellEnd"/>
-      <w:r>
-        <w:t xml:space="preserve"> </w:t>
-      </w:r>
-      <w:proofErr w:type="spellStart"/>
-      <w:r>
-        <w:t>zerfällt</w:t>
-      </w:r>
-      <w:proofErr w:type="spellEnd"/>
-      <w:r>
-        <w:t xml:space="preserve"> die </w:t>
-      </w:r>
-      <w:proofErr w:type="spellStart"/>
-      <w:r>
-        <w:t>Analyse</w:t>
-      </w:r>
-      <w:proofErr w:type="spellEnd"/>
-      <w:r>
-        <w:t xml:space="preserve"> in </w:t>
-      </w:r>
-      <w:proofErr w:type="spellStart"/>
-      <w:r>
-        <w:t>drei</w:t>
-      </w:r>
-      <w:proofErr w:type="spellEnd"/>
-      <w:r>
-        <w:t xml:space="preserve"> </w:t>
-      </w:r>
-      <w:proofErr w:type="spellStart"/>
-      <w:r>
-        <w:t>einzelne</w:t>
-      </w:r>
-      <w:proofErr w:type="spellEnd"/>
-      <w:r>
-        <w:t xml:space="preserve"> Modelle.</w:t>
+      <w:pPr>
+        <w:pStyle w:val="StandardWeb"/>
+        <w:rPr>
+          <w:rFonts w:ascii="Calibri" w:eastAsiaTheme="minorEastAsia" w:hAnsi="Calibri" w:cstheme="minorBidi"/>
+          <w:sz w:val="22"/>
+          <w:szCs w:val="22"/>
+          <w:lang w:val="en-US" w:eastAsia="en-US"/>
+        </w:rPr>
+      </w:pPr>
+      <w:r>
+        <w:rPr>
+          <w:rFonts w:ascii="Calibri" w:eastAsiaTheme="minorEastAsia" w:hAnsi="Calibri" w:cstheme="minorBidi"/>
+          <w:sz w:val="22"/>
+          <w:szCs w:val="22"/>
+          <w:lang w:val="en-US" w:eastAsia="en-US"/>
+        </w:rPr>
+        <w:t>Zweitens Pools und Lanes. In einem frühen Entwurf waren Werkstatt und Disposition getrennte Pools. Nach der Regel „ein Pool je Unternehmen, eine Lane je Rolle“ gibt es jetzt einen Pool mit Lanes. Den Kunden hatten wir zuerst als Black Box gezeichnet. Weil man so nicht gesehen hat, wann er antwortet oder entscheidet, hat er einen eigenen Ablauf bekommen.</w:t>
       </w:r>
     </w:p>
     <w:p>
-      <w:proofErr w:type="spellStart"/>
-      <w:r>
-        <w:t>Drittens</w:t>
-      </w:r>
-      <w:proofErr w:type="spellEnd"/>
-      <w:r>
-        <w:t xml:space="preserve"> die </w:t>
-      </w:r>
-      <w:proofErr w:type="spellStart"/>
-      <w:r>
-        <w:t>Werkzeuge</w:t>
-      </w:r>
-      <w:proofErr w:type="spellEnd"/>
-      <w:r>
-        <w:t xml:space="preserve">. Der Camunda Modeler </w:t>
-      </w:r>
-      <w:proofErr w:type="spellStart"/>
-      <w:r>
-        <w:t>zeigt</w:t>
-      </w:r>
-      <w:proofErr w:type="spellEnd"/>
-      <w:r>
-        <w:t xml:space="preserve"> </w:t>
-      </w:r>
-      <w:proofErr w:type="spellStart"/>
-      <w:r>
-        <w:t>fehlende</w:t>
-      </w:r>
-      <w:proofErr w:type="spellEnd"/>
-      <w:r>
-        <w:t xml:space="preserve"> </w:t>
-      </w:r>
-      <w:proofErr w:type="spellStart"/>
-      <w:r>
-        <w:t>technische</w:t>
-      </w:r>
-      <w:proofErr w:type="spellEnd"/>
-      <w:r>
-        <w:t xml:space="preserve"> </w:t>
-      </w:r>
-      <w:proofErr w:type="spellStart"/>
-      <w:r>
-        <w:t>Angaben</w:t>
-      </w:r>
-      <w:proofErr w:type="spellEnd"/>
-      <w:r>
-        <w:t xml:space="preserve"> für Camunda 8 </w:t>
-      </w:r>
-      <w:proofErr w:type="spellStart"/>
-      <w:r>
-        <w:t>als</w:t>
-      </w:r>
-      <w:proofErr w:type="spellEnd"/>
-      <w:r>
-        <w:t xml:space="preserve"> Fehler an. Wir </w:t>
-      </w:r>
-      <w:proofErr w:type="spellStart"/>
-      <w:r>
-        <w:t>haben</w:t>
-      </w:r>
-      <w:proofErr w:type="spellEnd"/>
-      <w:r>
-        <w:t xml:space="preserve"> die </w:t>
-      </w:r>
-      <w:proofErr w:type="spellStart"/>
-      <w:r>
-        <w:t>Diagramme</w:t>
-      </w:r>
-      <w:proofErr w:type="spellEnd"/>
-      <w:r>
-        <w:t xml:space="preserve"> so </w:t>
-      </w:r>
-      <w:proofErr w:type="spellStart"/>
-      <w:r>
-        <w:t>lange</w:t>
-      </w:r>
-      <w:proofErr w:type="spellEnd"/>
-      <w:r>
-        <w:t xml:space="preserve"> </w:t>
-      </w:r>
-      <w:proofErr w:type="spellStart"/>
-      <w:r>
-        <w:t>ergänzt</w:t>
-      </w:r>
-      <w:proofErr w:type="spellEnd"/>
-      <w:r>
-        <w:t xml:space="preserve">, bis </w:t>
-      </w:r>
-      <w:proofErr w:type="spellStart"/>
-      <w:r>
-        <w:t>keine</w:t>
-      </w:r>
-      <w:proofErr w:type="spellEnd"/>
-      <w:r>
-        <w:t xml:space="preserve"> Fehler </w:t>
-      </w:r>
-      <w:proofErr w:type="spellStart"/>
-      <w:r>
-        <w:t>mehr</w:t>
-      </w:r>
-      <w:proofErr w:type="spellEnd"/>
-      <w:r>
-        <w:t xml:space="preserve"> </w:t>
-      </w:r>
-      <w:proofErr w:type="spellStart"/>
-      <w:r>
-        <w:t>kamen</w:t>
-      </w:r>
-      <w:proofErr w:type="spellEnd"/>
-      <w:r>
-        <w:t>.</w:t>
+      <w:pPr>
+        <w:pStyle w:val="StandardWeb"/>
+        <w:rPr>
+          <w:rFonts w:ascii="Calibri" w:eastAsiaTheme="minorEastAsia" w:hAnsi="Calibri" w:cstheme="minorBidi"/>
+          <w:sz w:val="22"/>
+          <w:szCs w:val="22"/>
+          <w:lang w:val="en-US" w:eastAsia="en-US"/>
+        </w:rPr>
+      </w:pPr>
+      <w:r>
+        <w:rPr>
+          <w:rFonts w:ascii="Calibri" w:eastAsiaTheme="minorEastAsia" w:hAnsi="Calibri" w:cstheme="minorBidi"/>
+          <w:sz w:val="22"/>
+          <w:szCs w:val="22"/>
+          <w:lang w:val="en-US" w:eastAsia="en-US"/>
+        </w:rPr>
+        <w:t>Drittens überschriebene Diagramme. Bei einem Update vom Teamwork-Server wurden das Use-Case- und das Klassendiagramm mit alten Versionen überlagert. Am Ende mussten wir beide neu anlegen. Seitdem gilt: vor jeder Sitzung ein Update, nach jeder Änderung sofort ein Commit, und nie zwei Personen gleichzeitig im selben Diagramm.</w:t>
       </w:r>
     </w:p>
     <w:p>
       <w:proofErr w:type="spellStart"/>
       <w:r>
-        <w:rPr/>
-        <w:t>Viertens das Feedback aus den Coachings. Seitdem gibt es eine Rolle je Use Case und eigene Oberflächenklassen.</w:t>
-      </w:r>
-      <w:proofErr w:type="spellEnd"/>
-      <w:proofErr w:type="spellStart"/>
-      <w:proofErr w:type="spellEnd"/>
-      <w:proofErr w:type="spellStart"/>
-      <w:proofErr w:type="spellEnd"/>
-      <w:proofErr w:type="spellStart"/>
-      <w:proofErr w:type="spellEnd"/>
-      <w:proofErr w:type="spellStart"/>
-      <w:proofErr w:type="spellEnd"/>
-      <w:proofErr w:type="spellStart"/>
-      <w:proofErr w:type="spellEnd"/>
-      <w:proofErr w:type="spellStart"/>
-      <w:proofErr w:type="spellEnd"/>
+        <w:lastRenderedPageBreak/>
+        <w:t>Viertens</w:t>
+      </w:r>
+      <w:proofErr w:type="spellEnd"/>
+      <w:r>
+        <w:t xml:space="preserve"> das Feedback </w:t>
+      </w:r>
+      <w:proofErr w:type="spellStart"/>
+      <w:r>
+        <w:t>aus</w:t>
+      </w:r>
+      <w:proofErr w:type="spellEnd"/>
+      <w:r>
+        <w:t xml:space="preserve"> den </w:t>
+      </w:r>
+      <w:proofErr w:type="spellStart"/>
+      <w:r>
+        <w:t>Coachings</w:t>
+      </w:r>
+      <w:proofErr w:type="spellEnd"/>
+      <w:r>
+        <w:t xml:space="preserve">. </w:t>
+      </w:r>
+      <w:proofErr w:type="spellStart"/>
+      <w:r>
+        <w:t>Seitdem</w:t>
+      </w:r>
+      <w:proofErr w:type="spellEnd"/>
+      <w:r>
+        <w:t xml:space="preserve"> </w:t>
+      </w:r>
+      <w:proofErr w:type="spellStart"/>
+      <w:r>
+        <w:t>gibt</w:t>
+      </w:r>
+      <w:proofErr w:type="spellEnd"/>
+      <w:r>
+        <w:t xml:space="preserve"> es </w:t>
+      </w:r>
+      <w:proofErr w:type="spellStart"/>
+      <w:r>
+        <w:t>eine</w:t>
+      </w:r>
+      <w:proofErr w:type="spellEnd"/>
+      <w:r>
+        <w:t xml:space="preserve"> Rolle je Use Case und </w:t>
+      </w:r>
+      <w:proofErr w:type="spellStart"/>
+      <w:r>
+        <w:t>eigene</w:t>
+      </w:r>
+      <w:proofErr w:type="spellEnd"/>
+      <w:r>
+        <w:t xml:space="preserve"> </w:t>
+      </w:r>
+      <w:proofErr w:type="spellStart"/>
+      <w:r>
+        <w:t>Oberflächenklassen</w:t>
+      </w:r>
+      <w:proofErr w:type="spellEnd"/>
+      <w:r>
+        <w:t>.</w:t>
+      </w:r>
     </w:p>
     <w:p>
       <w:proofErr w:type="spellStart"/>
       <w:r>
-        <w:rPr/>
-        <w:t>Gelernt haben wir vor allem, dass man bei jeder einzelnen Änderung prüfen muss, ob alles noch zusammenpasst. Wie wir zusammengearbeitet haben, zeigt Nina.</w:t>
-      </w:r>
-      <w:proofErr w:type="spellEnd"/>
-      <w:proofErr w:type="spellStart"/>
-      <w:proofErr w:type="spellEnd"/>
-      <w:proofErr w:type="spellStart"/>
-      <w:proofErr w:type="spellEnd"/>
-      <w:proofErr w:type="spellStart"/>
-      <w:proofErr w:type="spellEnd"/>
-      <w:proofErr w:type="spellStart"/>
-      <w:proofErr w:type="spellEnd"/>
-      <w:proofErr w:type="spellStart"/>
-      <w:proofErr w:type="spellEnd"/>
-      <w:proofErr w:type="spellStart"/>
-      <w:proofErr w:type="spellEnd"/>
-      <w:proofErr w:type="spellStart"/>
-      <w:proofErr w:type="spellEnd"/>
-      <w:proofErr w:type="spellStart"/>
-      <w:proofErr w:type="spellEnd"/>
-      <w:proofErr w:type="spellStart"/>
-      <w:proofErr w:type="spellEnd"/>
-      <w:proofErr w:type="spellStart"/>
-      <w:proofErr w:type="spellEnd"/>
-      <w:proofErr w:type="spellStart"/>
-      <w:proofErr w:type="spellEnd"/>
-      <w:proofErr w:type="spellStart"/>
-      <w:proofErr w:type="spellEnd"/>
-      <w:proofErr w:type="spellStart"/>
-      <w:proofErr w:type="spellEnd"/>
-      <w:proofErr w:type="spellStart"/>
-      <w:proofErr w:type="spellEnd"/>
-      <w:proofErr w:type="spellStart"/>
-      <w:proofErr w:type="spellEnd"/>
-      <w:proofErr w:type="spellStart"/>
-      <w:proofErr w:type="spellEnd"/>
-      <w:proofErr w:type="spellStart"/>
-      <w:proofErr w:type="spellEnd"/>
-      <w:proofErr w:type="spellStart"/>
-      <w:proofErr w:type="spellEnd"/>
-      <w:proofErr w:type="spellStart"/>
-      <w:proofErr w:type="spellEnd"/>
-      <w:proofErr w:type="spellStart"/>
-      <w:proofErr w:type="spellEnd"/>
-      <w:proofErr w:type="spellStart"/>
-      <w:proofErr w:type="spellEnd"/>
-      <w:proofErr w:type="spellStart"/>
-      <w:proofErr w:type="spellEnd"/>
-      <w:proofErr w:type="spellStart"/>
-      <w:proofErr w:type="spellEnd"/>
-      <w:proofErr w:type="spellStart"/>
-      <w:proofErr w:type="spellEnd"/>
-      <w:proofErr w:type="spellStart"/>
-      <w:proofErr w:type="spellEnd"/>
-      <w:proofErr w:type="spellStart"/>
-      <w:proofErr w:type="spellEnd"/>
-      <w:proofErr w:type="spellStart"/>
-      <w:proofErr w:type="spellEnd"/>
+        <w:t>Gelernt</w:t>
+      </w:r>
+      <w:proofErr w:type="spellEnd"/>
+      <w:r>
+        <w:t xml:space="preserve"> </w:t>
+      </w:r>
+      <w:proofErr w:type="spellStart"/>
+      <w:r>
+        <w:t>haben</w:t>
+      </w:r>
+      <w:proofErr w:type="spellEnd"/>
+      <w:r>
+        <w:t xml:space="preserve"> </w:t>
+      </w:r>
+      <w:proofErr w:type="spellStart"/>
+      <w:r>
+        <w:t>wir</w:t>
+      </w:r>
+      <w:proofErr w:type="spellEnd"/>
+      <w:r>
+        <w:t xml:space="preserve"> </w:t>
+      </w:r>
+      <w:proofErr w:type="spellStart"/>
+      <w:r>
+        <w:t>vor</w:t>
+      </w:r>
+      <w:proofErr w:type="spellEnd"/>
+      <w:r>
+        <w:t xml:space="preserve"> </w:t>
+      </w:r>
+      <w:proofErr w:type="spellStart"/>
+      <w:r>
+        <w:t>allem</w:t>
+      </w:r>
+      <w:proofErr w:type="spellEnd"/>
+      <w:r>
+        <w:t xml:space="preserve">, </w:t>
+      </w:r>
+      <w:proofErr w:type="spellStart"/>
+      <w:r>
+        <w:t>dass</w:t>
+      </w:r>
+      <w:proofErr w:type="spellEnd"/>
+      <w:r>
+        <w:t xml:space="preserve"> man </w:t>
+      </w:r>
+      <w:proofErr w:type="spellStart"/>
+      <w:r>
+        <w:t>bei</w:t>
+      </w:r>
+      <w:proofErr w:type="spellEnd"/>
+      <w:r>
+        <w:t xml:space="preserve"> </w:t>
+      </w:r>
+      <w:proofErr w:type="spellStart"/>
+      <w:r>
+        <w:t>jeder</w:t>
+      </w:r>
+      <w:proofErr w:type="spellEnd"/>
+      <w:r>
+        <w:t xml:space="preserve"> </w:t>
+      </w:r>
+      <w:proofErr w:type="spellStart"/>
+      <w:r>
+        <w:t>einzelnen</w:t>
+      </w:r>
+      <w:proofErr w:type="spellEnd"/>
+      <w:r>
+        <w:t xml:space="preserve"> </w:t>
+      </w:r>
+      <w:proofErr w:type="spellStart"/>
+      <w:r>
+        <w:t>Änderung</w:t>
+      </w:r>
+      <w:proofErr w:type="spellEnd"/>
+      <w:r>
+        <w:t xml:space="preserve"> </w:t>
+      </w:r>
+      <w:proofErr w:type="spellStart"/>
+      <w:r>
+        <w:t>prüfen</w:t>
+      </w:r>
+      <w:proofErr w:type="spellEnd"/>
+      <w:r>
+        <w:t xml:space="preserve"> muss, </w:t>
+      </w:r>
+      <w:proofErr w:type="spellStart"/>
+      <w:r>
+        <w:t>ob</w:t>
+      </w:r>
+      <w:proofErr w:type="spellEnd"/>
+      <w:r>
+        <w:t xml:space="preserve"> </w:t>
+      </w:r>
+      <w:proofErr w:type="spellStart"/>
+      <w:r>
+        <w:t>alles</w:t>
+      </w:r>
+      <w:proofErr w:type="spellEnd"/>
+      <w:r>
+        <w:t xml:space="preserve"> </w:t>
+      </w:r>
+      <w:proofErr w:type="spellStart"/>
+      <w:r>
+        <w:t>noch</w:t>
+      </w:r>
+      <w:proofErr w:type="spellEnd"/>
+      <w:r>
+        <w:t xml:space="preserve"> </w:t>
+      </w:r>
+      <w:proofErr w:type="spellStart"/>
+      <w:r>
+        <w:t>zusammenpasst</w:t>
+      </w:r>
+      <w:proofErr w:type="spellEnd"/>
+      <w:r>
+        <w:t xml:space="preserve">. Wie </w:t>
+      </w:r>
+      <w:proofErr w:type="spellStart"/>
+      <w:r>
+        <w:t>wir</w:t>
+      </w:r>
+      <w:proofErr w:type="spellEnd"/>
+      <w:r>
+        <w:t xml:space="preserve"> </w:t>
+      </w:r>
+      <w:proofErr w:type="spellStart"/>
+      <w:r>
+        <w:t>zusammengearbeitet</w:t>
+      </w:r>
+      <w:proofErr w:type="spellEnd"/>
+      <w:r>
+        <w:t xml:space="preserve"> </w:t>
+      </w:r>
+      <w:proofErr w:type="spellStart"/>
+      <w:r>
+        <w:t>haben</w:t>
+      </w:r>
+      <w:proofErr w:type="spellEnd"/>
+      <w:r>
+        <w:t xml:space="preserve">, </w:t>
+      </w:r>
+      <w:proofErr w:type="spellStart"/>
+      <w:r>
+        <w:t>zeigt</w:t>
+      </w:r>
+      <w:proofErr w:type="spellEnd"/>
+      <w:r>
+        <w:t xml:space="preserve"> Nina.</w:t>
+      </w:r>
     </w:p>
     <w:p>
       <w:r>
@@ -6414,95 +6683,241 @@
     </w:p>
     <w:p>
       <w:r>
-        <w:rPr/>
-        <w:t>Nina: Gearbeitet haben wir in Sprints im Takt der vier Gruppentermine, mit Review, Retrospektive und Planning je Termin. Ich habe die Projektleitung, David die Stellvertretung und UML, Adrian ist Product Owner, Kilian Scrum Master und ebenfalls für UML zuständig, Maximilian verantwortet BPMN und Jakob die Qualität. Alles Schriftliche liegt in unserem privaten GitHub-Repository. Änderungen gehen über einen eigenen Branch, einen Pull Request und ein Review durch eine zweite Person. Außerdem führen wir ein Trello-Board mit einer Liste je Termin und eine Karte je Person und Aufgabe. Jedes Diagramm ist denselben Weg gegangen: Zuerst der Entwurf im Zweierteam, dann gegenseitiges Review, anschließend Abstimmung im Gruppentermin und erst dann der Merge über Pull Request. Entscheidungen, die mehrere betreffen, haben wir mit Begründung und Datum in den Entscheidungslog geschrieben. So konnten wir bei jeder Korrektur nachvollziehen, warum ein Modell so aussieht.</w:t>
-      </w:r>
-      <w:proofErr w:type="spellStart"/>
-      <w:proofErr w:type="spellEnd"/>
-      <w:proofErr w:type="spellStart"/>
-      <w:proofErr w:type="spellEnd"/>
-      <w:proofErr w:type="spellStart"/>
-      <w:proofErr w:type="spellEnd"/>
-      <w:proofErr w:type="spellStart"/>
-      <w:proofErr w:type="gramStart"/>
-      <w:proofErr w:type="spellEnd"/>
-      <w:proofErr w:type="gramEnd"/>
+        <w:t xml:space="preserve">Nina: Gearbeitet haben wir in Sprints im Takt der vier Gruppentermine, mit Review, Retrospektive und Planning je Termin. Ich habe die Projektleitung, David die Stellvertretung und UML, Adrian ist Product Owner, Kilian Scrum Master und ebenfalls für UML zuständig, Maximilian verantwortet BPMN und Jakob die Qualität. Alles Schriftliche liegt in unserem privaten GitHub-Repository. Änderungen gehen über einen eigenen Branch, einen Pull Request und ein Review durch eine zweite Person. Außerdem führen wir ein Trello-Board mit einer Liste je Termin und eine Karte je Person und Aufgabe. Jedes Diagramm ist denselben Weg gegangen: Zuerst der Entwurf im Zweierteam, dann gegenseitiges Review, anschließend Abstimmung im Gruppentermin und erst dann der Merge über Pull Request. Entscheidungen, die mehrere betreffen, haben wir mit Begründung und Datum in den Entscheidungslog geschrieben. So konnten wir bei jeder Korrektur nachvollziehen, warum </w:t>
+      </w:r>
+      <w:proofErr w:type="spellStart"/>
+      <w:r>
+        <w:t>ein</w:t>
+      </w:r>
+      <w:proofErr w:type="spellEnd"/>
+      <w:r>
+        <w:t xml:space="preserve"> Modell so </w:t>
+      </w:r>
+      <w:proofErr w:type="spellStart"/>
+      <w:r>
+        <w:t>aussieht</w:t>
+      </w:r>
+      <w:proofErr w:type="spellEnd"/>
+      <w:r>
+        <w:t>.</w:t>
+      </w:r>
     </w:p>
     <w:p>
       <w:r>
         <w:rPr>
           <w:bCs/>
         </w:rPr>
-        <w:t>Folie 19 – Geschäftsmodell und Ausblick  (60 s)</w:t>
+        <w:t xml:space="preserve">Folie 19 – Geschäftsmodell und </w:t>
       </w:r>
       <w:proofErr w:type="gramStart"/>
-      <w:proofErr w:type="gramEnd"/>
-    </w:p>
-    <w:p>
       <w:r>
         <w:rPr>
           <w:bCs/>
         </w:rPr>
-        <w:t>Nina: Zum Schluss unser Blick nach vorn. Wir bieten RepairFlow als Abo je Filiale in zwei Stufen an: Basis mit Auftrags- und Kundenverwaltung, Pro zusätzlich mit filialübergreifender Disposition und KI-Sofortdiagnose. Zielkunden sind unabhängige Werkstätten und kleine Ketten mit zwei bis zehn Filialen im deutschsprachigen Raum.</w:t>
-      </w:r>
-      <w:proofErr w:type="spellStart"/>
-      <w:proofErr w:type="spellEnd"/>
-    </w:p>
-    <w:p>
-      <w:r>
-        <w:rPr/>
-        <w:t>Für die Weiterentwicklung sehen wir drei Richtungen.</w:t>
-      </w:r>
-    </w:p>
-    <w:p>
-      <w:r>
-        <w:rPr/>
-        <w:t>Erstens Predictive Disposition: Aus Lagerbeständen, Bestellhistorie und Saisonverläufen sagt RepairFlow den Bedarf vorher, bevor Fehlteile einen Auftrag blockieren.</w:t>
-      </w:r>
-      <w:proofErr w:type="spellStart"/>
-      <w:proofErr w:type="spellEnd"/>
-      <w:proofErr w:type="spellStart"/>
-      <w:proofErr w:type="spellEnd"/>
-    </w:p>
-    <w:p>
-      <w:r>
-        <w:rPr/>
-        <w:t>Zweitens ein Techniker-Copilot, der aus der Auftragshistorie lernt und bei ähnlichen Reparaturen Schritt für Schritt Empfehlungen gibt.</w:t>
-      </w:r>
-      <w:proofErr w:type="spellStart"/>
-      <w:proofErr w:type="spellEnd"/>
-    </w:p>
-    <w:p>
-      <w:r>
-        <w:rPr/>
-        <w:t>Drittens eine digitale Geräteakte mit der gesamten Reparaturgeschichte jedes Geräts.</w:t>
-      </w:r>
-    </w:p>
-    <w:p>
-      <w:r>
-        <w:rPr/>
-        <w:t>Modelliert ist davon noch nichts, alle drei bauen aber direkt auf unserem Klassenmodell auf.</w:t>
-      </w:r>
-    </w:p>
-    <w:p>
+        <w:t>Ausblick  (</w:t>
+      </w:r>
+      <w:proofErr w:type="gramEnd"/>
       <w:r>
         <w:rPr>
           <w:bCs/>
         </w:rPr>
-        <w:t>Folie 20 – Fazit und Danke  (30 s)</w:t>
-      </w:r>
-      <w:proofErr w:type="gramStart"/>
-      <w:proofErr w:type="gramEnd"/>
+        <w:t>60 s)</w:t>
+      </w:r>
     </w:p>
     <w:p>
       <w:r>
         <w:rPr>
           <w:bCs/>
         </w:rPr>
-        <w:t>Nina: Lassen Sie mich RepairFlow kurz zusammenfassen: Wir ersetzen Papier, Excel und Telefon durch einen digitalen Reparaturauftrag als zentralen Zustandsautomaten. Der fachliche Mehrwert liegt in der filialübergreifenden Disposition und in der KI-Sofortdiagnose, die dem Kunden Klarheit gibt, noch bevor er die Werkstatt betritt. Und mit dem Potenzial, das wir gerade gezeigt haben, ist das erst der Anfang. Vielen Dank. Wir freuen uns auf Ihre Fragen.</w:t>
-      </w:r>
-      <w:proofErr w:type="spellStart"/>
-      <w:proofErr w:type="spellEnd"/>
+        <w:t xml:space="preserve">Nina: Zum Schluss unser Blick nach vorn. Wir bieten RepairFlow als Abo je Filiale in zwei Stufen an: Basis mit Auftrags- und Kundenverwaltung, Pro zusätzlich mit filialübergreifender Disposition und KI-Sofortdiagnose. Zielkunden sind unabhängige Werkstätten und kleine Ketten mit zwei bis zehn </w:t>
+      </w:r>
+      <w:proofErr w:type="spellStart"/>
+      <w:r>
+        <w:rPr>
+          <w:bCs/>
+        </w:rPr>
+        <w:t>Filialen</w:t>
+      </w:r>
+      <w:proofErr w:type="spellEnd"/>
+      <w:r>
+        <w:rPr>
+          <w:bCs/>
+        </w:rPr>
+        <w:t xml:space="preserve"> </w:t>
+      </w:r>
+      <w:proofErr w:type="spellStart"/>
+      <w:r>
+        <w:rPr>
+          <w:bCs/>
+        </w:rPr>
+        <w:t>im</w:t>
+      </w:r>
+      <w:proofErr w:type="spellEnd"/>
+      <w:r>
+        <w:rPr>
+          <w:bCs/>
+        </w:rPr>
+        <w:t xml:space="preserve"> </w:t>
+      </w:r>
+      <w:proofErr w:type="spellStart"/>
+      <w:r>
+        <w:rPr>
+          <w:bCs/>
+        </w:rPr>
+        <w:t>deutschsprachigen</w:t>
+      </w:r>
+      <w:proofErr w:type="spellEnd"/>
+      <w:r>
+        <w:rPr>
+          <w:bCs/>
+        </w:rPr>
+        <w:t xml:space="preserve"> Raum.</w:t>
+      </w:r>
+    </w:p>
+    <w:p>
+      <w:r>
+        <w:t>Für die Weiterentwicklung sehen wir drei Richtungen.</w:t>
+      </w:r>
+    </w:p>
+    <w:p>
+      <w:r>
+        <w:t xml:space="preserve">Erstens Predictive Disposition: Aus Lagerbeständen, Bestellhistorie und Saisonverläufen sagt RepairFlow den Bedarf vorher, bevor </w:t>
+      </w:r>
+      <w:proofErr w:type="spellStart"/>
+      <w:r>
+        <w:t>Fehlteile</w:t>
+      </w:r>
+      <w:proofErr w:type="spellEnd"/>
+      <w:r>
+        <w:t xml:space="preserve"> </w:t>
+      </w:r>
+      <w:proofErr w:type="spellStart"/>
+      <w:r>
+        <w:t>einen</w:t>
+      </w:r>
+      <w:proofErr w:type="spellEnd"/>
+      <w:r>
+        <w:t xml:space="preserve"> </w:t>
+      </w:r>
+      <w:proofErr w:type="spellStart"/>
+      <w:r>
+        <w:t>Auftrag</w:t>
+      </w:r>
+      <w:proofErr w:type="spellEnd"/>
+      <w:r>
+        <w:t xml:space="preserve"> </w:t>
+      </w:r>
+      <w:proofErr w:type="spellStart"/>
+      <w:r>
+        <w:t>blockieren</w:t>
+      </w:r>
+      <w:proofErr w:type="spellEnd"/>
+      <w:r>
+        <w:t>.</w:t>
+      </w:r>
+    </w:p>
+    <w:p>
+      <w:r>
+        <w:t xml:space="preserve">Zweitens ein Techniker-Copilot, der aus der Auftragshistorie lernt und bei ähnlichen Reparaturen Schritt für Schritt </w:t>
+      </w:r>
+      <w:proofErr w:type="spellStart"/>
+      <w:r>
+        <w:t>Empfehlungen</w:t>
+      </w:r>
+      <w:proofErr w:type="spellEnd"/>
+      <w:r>
+        <w:t xml:space="preserve"> </w:t>
+      </w:r>
+      <w:proofErr w:type="spellStart"/>
+      <w:r>
+        <w:t>gibt</w:t>
+      </w:r>
+      <w:proofErr w:type="spellEnd"/>
+      <w:r>
+        <w:t>.</w:t>
+      </w:r>
+    </w:p>
+    <w:p>
+      <w:r>
+        <w:t>Drittens eine digitale Geräteakte mit der gesamten Reparaturgeschichte jedes Geräts.</w:t>
+      </w:r>
+    </w:p>
+    <w:p>
+      <w:r>
+        <w:t>Modelliert ist davon noch nichts, alle drei bauen aber direkt auf unserem Klassenmodell auf.</w:t>
+      </w:r>
+    </w:p>
+    <w:p>
+      <w:r>
+        <w:rPr>
+          <w:bCs/>
+        </w:rPr>
+        <w:t xml:space="preserve">Folie 20 – Fazit und </w:t>
+      </w:r>
+      <w:proofErr w:type="gramStart"/>
+      <w:r>
+        <w:rPr>
+          <w:bCs/>
+        </w:rPr>
+        <w:t>Danke  (</w:t>
+      </w:r>
+      <w:proofErr w:type="gramEnd"/>
+      <w:r>
+        <w:rPr>
+          <w:bCs/>
+        </w:rPr>
+        <w:t>30 s)</w:t>
+      </w:r>
+    </w:p>
+    <w:p>
+      <w:r>
+        <w:rPr>
+          <w:bCs/>
+        </w:rPr>
+        <w:t xml:space="preserve">Nina: Lassen Sie mich RepairFlow kurz zusammenfassen: Wir ersetzen Papier, Excel und Telefon durch einen digitalen Reparaturauftrag als zentralen Zustandsautomaten. Der fachliche Mehrwert liegt in der filialübergreifenden Disposition und in der KI-Sofortdiagnose, die dem Kunden Klarheit gibt, noch bevor er die Werkstatt betritt. Und mit dem Potenzial, das wir gerade gezeigt haben, ist das erst der Anfang. Vielen Dank. Wir freuen </w:t>
+      </w:r>
+      <w:proofErr w:type="spellStart"/>
+      <w:r>
+        <w:rPr>
+          <w:bCs/>
+        </w:rPr>
+        <w:t>uns</w:t>
+      </w:r>
+      <w:proofErr w:type="spellEnd"/>
+      <w:r>
+        <w:rPr>
+          <w:bCs/>
+        </w:rPr>
+        <w:t xml:space="preserve"> auf </w:t>
+      </w:r>
+      <w:proofErr w:type="spellStart"/>
+      <w:r>
+        <w:rPr>
+          <w:bCs/>
+        </w:rPr>
+        <w:t>Ihre</w:t>
+      </w:r>
+      <w:proofErr w:type="spellEnd"/>
+      <w:r>
+        <w:rPr>
+          <w:bCs/>
+        </w:rPr>
+        <w:t xml:space="preserve"> </w:t>
+      </w:r>
+      <w:proofErr w:type="spellStart"/>
+      <w:r>
+        <w:rPr>
+          <w:bCs/>
+        </w:rPr>
+        <w:t>Fragen</w:t>
+      </w:r>
+      <w:proofErr w:type="spellEnd"/>
+      <w:r>
+        <w:rPr>
+          <w:bCs/>
+        </w:rPr>
+        <w:t>.</w:t>
+      </w:r>
     </w:p>
     <w:p/>
     <w:sectPr>

</xml_diff>

<commit_message>
praesentation: Davids Folien 1-7 uebernommen, Foliennummern im Sprechtext und auf Folie 24
</commit_message>
<xml_diff>
--- a/4_praesentation/Sprechtext_Abschlusspraesentation.docx
+++ b/4_praesentation/Sprechtext_Abschlusspraesentation.docx
@@ -66,2070 +66,224 @@
       </w:r>
     </w:p>
     <w:p>
-      <w:r>
-        <w:t xml:space="preserve">Folie 1 – </w:t>
-      </w:r>
-      <w:proofErr w:type="gramStart"/>
-      <w:r>
-        <w:t>Titel</w:t>
+      <w:pPr>
+        <w:spacing w:before="200"/>
+      </w:pPr>
+      <w:r>
+        <w:rPr>
+          <w:b/>
+        </w:rPr>
+        <w:t>Folie 1 – Titel</w:t>
       </w:r>
       <w:r>
         <w:rPr>
           <w:i/>
         </w:rPr>
-        <w:t xml:space="preserve">  (</w:t>
-      </w:r>
-      <w:proofErr w:type="gramEnd"/>
+        <w:t xml:space="preserve">  (12 s)</w:t>
+      </w:r>
+    </w:p>
+    <w:p>
+      <w:r>
+        <w:rPr>
+          <w:b/>
+        </w:rPr>
+        <w:t xml:space="preserve">David: </w:t>
+      </w:r>
+      <w:r>
+        <w:t>Guten Morgen. Wir sind Gruppe 1 und stellen Ihnen RepairFlow vor, eine Plattform, mit der Reparaturwerkstätten ihre Aufträge, Ersatzteile und Kunden an einer Stelle verwalten.</w:t>
+      </w:r>
+    </w:p>
+    <w:p>
+      <w:pPr>
+        <w:spacing w:before="200"/>
+      </w:pPr>
+      <w:r>
+        <w:rPr>
+          <w:b/>
+        </w:rPr>
+        <w:t>Folie 2 – Unser Team</w:t>
+      </w:r>
       <w:r>
         <w:rPr>
           <w:i/>
         </w:rPr>
-        <w:t>30 s)</w:t>
+        <w:t xml:space="preserve">  (19 s)</w:t>
       </w:r>
     </w:p>
     <w:p>
       <w:r>
+        <w:rPr>
+          <w:b/>
+        </w:rPr>
         <w:t xml:space="preserve">David: </w:t>
       </w:r>
-      <w:proofErr w:type="spellStart"/>
-      <w:r>
-        <w:t>Guten</w:t>
-      </w:r>
-      <w:proofErr w:type="spellEnd"/>
-      <w:r>
-        <w:t xml:space="preserve"> Morgen. Wir </w:t>
-      </w:r>
-      <w:proofErr w:type="spellStart"/>
-      <w:r>
-        <w:t>sind</w:t>
-      </w:r>
-      <w:proofErr w:type="spellEnd"/>
-      <w:r>
-        <w:t xml:space="preserve"> Gruppe 1 und </w:t>
-      </w:r>
-      <w:proofErr w:type="spellStart"/>
-      <w:r>
-        <w:t>stellen</w:t>
-      </w:r>
-      <w:proofErr w:type="spellEnd"/>
-      <w:r>
-        <w:t xml:space="preserve"> Ihnen </w:t>
-      </w:r>
-      <w:proofErr w:type="spellStart"/>
-      <w:r>
-        <w:t>RepairFlow</w:t>
-      </w:r>
-      <w:proofErr w:type="spellEnd"/>
-      <w:r>
-        <w:t xml:space="preserve"> </w:t>
-      </w:r>
-      <w:proofErr w:type="spellStart"/>
-      <w:r>
-        <w:t>vor</w:t>
-      </w:r>
-      <w:proofErr w:type="spellEnd"/>
-      <w:r>
-        <w:t xml:space="preserve">. Mit </w:t>
-      </w:r>
-      <w:proofErr w:type="spellStart"/>
-      <w:r>
-        <w:t>dieser</w:t>
-      </w:r>
-      <w:proofErr w:type="spellEnd"/>
-      <w:r>
-        <w:t xml:space="preserve"> </w:t>
-      </w:r>
-      <w:proofErr w:type="spellStart"/>
-      <w:r>
-        <w:t>Plattform</w:t>
-      </w:r>
-      <w:proofErr w:type="spellEnd"/>
-      <w:r>
-        <w:t xml:space="preserve"> </w:t>
-      </w:r>
-      <w:proofErr w:type="spellStart"/>
-      <w:r>
-        <w:t>verwalten</w:t>
-      </w:r>
-      <w:proofErr w:type="spellEnd"/>
-      <w:r>
-        <w:t xml:space="preserve"> </w:t>
-      </w:r>
-      <w:proofErr w:type="spellStart"/>
-      <w:r>
-        <w:t>Reparaturwerkstätten</w:t>
-      </w:r>
-      <w:proofErr w:type="spellEnd"/>
-      <w:r>
-        <w:t xml:space="preserve"> </w:t>
-      </w:r>
-      <w:proofErr w:type="spellStart"/>
-      <w:r>
-        <w:t>ihre</w:t>
-      </w:r>
-      <w:proofErr w:type="spellEnd"/>
-      <w:r>
-        <w:t xml:space="preserve"> </w:t>
-      </w:r>
-      <w:proofErr w:type="spellStart"/>
-      <w:r>
-        <w:t>Aufträge</w:t>
-      </w:r>
-      <w:proofErr w:type="spellEnd"/>
-      <w:r>
-        <w:t xml:space="preserve">, </w:t>
-      </w:r>
-      <w:proofErr w:type="spellStart"/>
-      <w:r>
-        <w:t>Ersatzteile</w:t>
-      </w:r>
-      <w:proofErr w:type="spellEnd"/>
-      <w:r>
-        <w:t xml:space="preserve"> und Kunden an </w:t>
-      </w:r>
-      <w:proofErr w:type="spellStart"/>
-      <w:r>
-        <w:t>einer</w:t>
-      </w:r>
-      <w:proofErr w:type="spellEnd"/>
-      <w:r>
-        <w:t xml:space="preserve"> Stelle.</w:t>
+      <w:r>
+        <w:t>Kurz zu uns: Wir haben das Projekt aufgeteilt wie ein kleines Startup, mit Projektleitung, Product Owner, Scrum Master und je einer Person für die Prozesse und die Qualität. Unter jedem Namen sehen Sie, welches Thema die Person heute vorstellt.</w:t>
       </w:r>
     </w:p>
     <w:p>
-      <w:r>
-        <w:t xml:space="preserve">Ich </w:t>
-      </w:r>
-      <w:proofErr w:type="spellStart"/>
-      <w:r>
-        <w:t>erkläre</w:t>
-      </w:r>
-      <w:proofErr w:type="spellEnd"/>
-      <w:r>
-        <w:t xml:space="preserve"> </w:t>
-      </w:r>
-      <w:proofErr w:type="spellStart"/>
-      <w:r>
-        <w:t>zuerst</w:t>
-      </w:r>
-      <w:proofErr w:type="spellEnd"/>
-      <w:r>
-        <w:t xml:space="preserve"> das Problem und </w:t>
-      </w:r>
-      <w:proofErr w:type="spellStart"/>
-      <w:r>
-        <w:t>unsere</w:t>
-      </w:r>
-      <w:proofErr w:type="spellEnd"/>
-      <w:r>
-        <w:t xml:space="preserve"> </w:t>
-      </w:r>
-      <w:proofErr w:type="spellStart"/>
-      <w:r>
-        <w:t>Lösung</w:t>
-      </w:r>
-      <w:proofErr w:type="spellEnd"/>
-      <w:r>
-        <w:t xml:space="preserve">. Kilian </w:t>
-      </w:r>
-      <w:proofErr w:type="spellStart"/>
-      <w:r>
-        <w:t>zeigt</w:t>
-      </w:r>
-      <w:proofErr w:type="spellEnd"/>
-      <w:r>
-        <w:t xml:space="preserve"> den </w:t>
-      </w:r>
-      <w:proofErr w:type="spellStart"/>
-      <w:r>
-        <w:t>Nutzen</w:t>
-      </w:r>
-      <w:proofErr w:type="spellEnd"/>
-      <w:r>
-        <w:t xml:space="preserve">, Maximilian den Weg </w:t>
-      </w:r>
-      <w:proofErr w:type="spellStart"/>
-      <w:r>
-        <w:t>eines</w:t>
-      </w:r>
-      <w:proofErr w:type="spellEnd"/>
-      <w:r>
-        <w:t xml:space="preserve"> </w:t>
-      </w:r>
-      <w:proofErr w:type="spellStart"/>
-      <w:r>
-        <w:t>Auftrags</w:t>
-      </w:r>
-      <w:proofErr w:type="spellEnd"/>
-      <w:r>
-        <w:t>, Adrian die KI-</w:t>
-      </w:r>
-      <w:proofErr w:type="spellStart"/>
-      <w:r>
-        <w:t>Sofortdiagnose</w:t>
-      </w:r>
-      <w:proofErr w:type="spellEnd"/>
-      <w:r>
-        <w:t xml:space="preserve">. </w:t>
-      </w:r>
-      <w:proofErr w:type="spellStart"/>
-      <w:r>
-        <w:t>Danach</w:t>
-      </w:r>
-      <w:proofErr w:type="spellEnd"/>
-      <w:r>
-        <w:t xml:space="preserve"> </w:t>
-      </w:r>
-      <w:proofErr w:type="spellStart"/>
-      <w:r>
-        <w:t>geht</w:t>
-      </w:r>
-      <w:proofErr w:type="spellEnd"/>
-      <w:r>
-        <w:t xml:space="preserve"> es um </w:t>
-      </w:r>
-      <w:proofErr w:type="spellStart"/>
-      <w:r>
-        <w:t>unsere</w:t>
-      </w:r>
-      <w:proofErr w:type="spellEnd"/>
-      <w:r>
-        <w:t xml:space="preserve"> Modelle und die </w:t>
-      </w:r>
-      <w:proofErr w:type="spellStart"/>
-      <w:r>
-        <w:t>Quelitätssicherung</w:t>
-      </w:r>
-      <w:proofErr w:type="spellEnd"/>
-      <w:r>
-        <w:t>.</w:t>
-      </w:r>
-      <w:r>
-        <w:t xml:space="preserve"> </w:t>
-      </w:r>
-      <w:r>
-        <w:t xml:space="preserve">Nina </w:t>
-      </w:r>
-      <w:proofErr w:type="spellStart"/>
-      <w:r>
-        <w:t>schließt</w:t>
-      </w:r>
-      <w:proofErr w:type="spellEnd"/>
-      <w:r>
-        <w:t xml:space="preserve"> </w:t>
-      </w:r>
-      <w:proofErr w:type="spellStart"/>
-      <w:r>
-        <w:t>mit</w:t>
-      </w:r>
-      <w:proofErr w:type="spellEnd"/>
-      <w:r>
-        <w:t xml:space="preserve"> </w:t>
-      </w:r>
-      <w:proofErr w:type="spellStart"/>
-      <w:r>
-        <w:t>unserem</w:t>
-      </w:r>
-      <w:proofErr w:type="spellEnd"/>
-      <w:r>
-        <w:t xml:space="preserve"> </w:t>
-      </w:r>
-      <w:proofErr w:type="spellStart"/>
-      <w:r>
-        <w:t>Vorgehen</w:t>
-      </w:r>
-      <w:proofErr w:type="spellEnd"/>
-      <w:r>
-        <w:t xml:space="preserve">, dem </w:t>
-      </w:r>
-      <w:proofErr w:type="spellStart"/>
-      <w:r>
-        <w:t>Geschäftsmodell</w:t>
-      </w:r>
-      <w:proofErr w:type="spellEnd"/>
-      <w:r>
-        <w:t xml:space="preserve"> und dem </w:t>
-      </w:r>
-      <w:proofErr w:type="spellStart"/>
-      <w:r>
-        <w:t>Ausblick</w:t>
-      </w:r>
-      <w:proofErr w:type="spellEnd"/>
-      <w:r>
-        <w:t>.</w:t>
-      </w:r>
-    </w:p>
-    <w:p>
-      <w:r>
-        <w:t xml:space="preserve">Folie 2 – </w:t>
-      </w:r>
-      <w:proofErr w:type="gramStart"/>
-      <w:r>
-        <w:t>Agenda</w:t>
+      <w:pPr>
+        <w:spacing w:before="200"/>
+      </w:pPr>
+      <w:r>
+        <w:rPr>
+          <w:b/>
+        </w:rPr>
+        <w:t>Folie 3 – Agenda, Teil 1</w:t>
       </w:r>
       <w:r>
         <w:rPr>
           <w:i/>
         </w:rPr>
-        <w:t xml:space="preserve">  (</w:t>
-      </w:r>
-      <w:proofErr w:type="gramEnd"/>
+        <w:t xml:space="preserve">  (18 s)</w:t>
+      </w:r>
+    </w:p>
+    <w:p>
+      <w:r>
+        <w:rPr>
+          <w:b/>
+        </w:rPr>
+        <w:t xml:space="preserve">David: </w:t>
+      </w:r>
+      <w:r>
+        <w:t>Die Präsentation hat zwei Teile. Im ersten stellen wir RepairFlow so vor, wie wir es einer Werkstatt zeigen würden: vom Problem über unsere Lösung und ihren Nutzen zur Auftragsreise mit Live-Demo und schließlich zur KI-Sofortdiagnose.</w:t>
+      </w:r>
+    </w:p>
+    <w:p>
+      <w:pPr>
+        <w:spacing w:before="200"/>
+      </w:pPr>
+      <w:r>
+        <w:rPr>
+          <w:b/>
+        </w:rPr>
+        <w:t>Folie 4 – Agenda, Teil 2</w:t>
+      </w:r>
       <w:r>
         <w:rPr>
           <w:i/>
         </w:rPr>
-        <w:t>40 s)</w:t>
+        <w:t xml:space="preserve">  (18 s)</w:t>
       </w:r>
     </w:p>
     <w:p>
       <w:r>
+        <w:rPr>
+          <w:b/>
+        </w:rPr>
         <w:t xml:space="preserve">David: </w:t>
       </w:r>
-      <w:proofErr w:type="spellStart"/>
-      <w:r>
-        <w:t>Unsere</w:t>
-      </w:r>
-      <w:proofErr w:type="spellEnd"/>
-      <w:r>
-        <w:t xml:space="preserve"> </w:t>
-      </w:r>
-      <w:proofErr w:type="spellStart"/>
-      <w:r>
-        <w:t>Präsentation</w:t>
-      </w:r>
-      <w:proofErr w:type="spellEnd"/>
-      <w:r>
-        <w:t xml:space="preserve"> hat </w:t>
-      </w:r>
-      <w:proofErr w:type="spellStart"/>
-      <w:r>
-        <w:t>zwei</w:t>
-      </w:r>
-      <w:proofErr w:type="spellEnd"/>
-      <w:r>
-        <w:t xml:space="preserve"> </w:t>
-      </w:r>
-      <w:proofErr w:type="spellStart"/>
-      <w:r>
-        <w:t>Teile</w:t>
-      </w:r>
-      <w:proofErr w:type="spellEnd"/>
-      <w:r>
-        <w:t>.</w:t>
+      <w:r>
+        <w:t>Im zweiten Teil zeigen wir, was dahintersteckt: die Ergebnisse und Prozesse, Rollen und Datenmodell, wie wir die Qualität gesichert haben, und zum Schluss unser Vorgehen und das Geschäftsmodell. Ich beginne mit der Ausgangslage bei FixWerk.</w:t>
       </w:r>
     </w:p>
     <w:p>
-      <w:proofErr w:type="spellStart"/>
-      <w:r>
-        <w:t>Im</w:t>
-      </w:r>
-      <w:proofErr w:type="spellEnd"/>
-      <w:r>
-        <w:t xml:space="preserve"> </w:t>
-      </w:r>
-      <w:proofErr w:type="spellStart"/>
-      <w:r>
-        <w:t>ersten</w:t>
-      </w:r>
-      <w:proofErr w:type="spellEnd"/>
-      <w:r>
-        <w:t xml:space="preserve"> Teil </w:t>
-      </w:r>
-      <w:proofErr w:type="spellStart"/>
-      <w:r>
-        <w:t>stellen</w:t>
-      </w:r>
-      <w:proofErr w:type="spellEnd"/>
-      <w:r>
-        <w:t xml:space="preserve"> </w:t>
-      </w:r>
-      <w:proofErr w:type="spellStart"/>
-      <w:r>
-        <w:t>wir</w:t>
-      </w:r>
-      <w:proofErr w:type="spellEnd"/>
-      <w:r>
-        <w:t xml:space="preserve"> </w:t>
-      </w:r>
-      <w:proofErr w:type="spellStart"/>
-      <w:r>
-        <w:t>RepairFlow</w:t>
-      </w:r>
-      <w:proofErr w:type="spellEnd"/>
-      <w:r>
-        <w:t xml:space="preserve"> so </w:t>
-      </w:r>
-      <w:proofErr w:type="spellStart"/>
-      <w:r>
-        <w:t>vor</w:t>
-      </w:r>
-      <w:proofErr w:type="spellEnd"/>
-      <w:r>
-        <w:t xml:space="preserve">, </w:t>
-      </w:r>
-      <w:proofErr w:type="spellStart"/>
-      <w:r>
-        <w:t>wie</w:t>
-      </w:r>
-      <w:proofErr w:type="spellEnd"/>
-      <w:r>
-        <w:t xml:space="preserve"> </w:t>
-      </w:r>
-      <w:proofErr w:type="spellStart"/>
-      <w:r>
-        <w:t>wir</w:t>
-      </w:r>
-      <w:proofErr w:type="spellEnd"/>
-      <w:r>
-        <w:t xml:space="preserve"> es </w:t>
-      </w:r>
-      <w:proofErr w:type="spellStart"/>
-      <w:r>
-        <w:t>einer</w:t>
-      </w:r>
-      <w:proofErr w:type="spellEnd"/>
-      <w:r>
-        <w:t xml:space="preserve"> </w:t>
-      </w:r>
-      <w:proofErr w:type="spellStart"/>
-      <w:r>
-        <w:t>Werkstatt</w:t>
-      </w:r>
-      <w:proofErr w:type="spellEnd"/>
-      <w:r>
-        <w:t xml:space="preserve"> </w:t>
-      </w:r>
-      <w:proofErr w:type="spellStart"/>
-      <w:r>
-        <w:t>zeigen</w:t>
-      </w:r>
-      <w:proofErr w:type="spellEnd"/>
-      <w:r>
-        <w:t xml:space="preserve"> </w:t>
-      </w:r>
-      <w:proofErr w:type="spellStart"/>
-      <w:r>
-        <w:t>würden</w:t>
-      </w:r>
-      <w:proofErr w:type="spellEnd"/>
-      <w:r>
-        <w:t xml:space="preserve">. Es </w:t>
-      </w:r>
-      <w:proofErr w:type="spellStart"/>
-      <w:r>
-        <w:t>geht</w:t>
-      </w:r>
-      <w:proofErr w:type="spellEnd"/>
-      <w:r>
-        <w:t xml:space="preserve"> um das Problem, </w:t>
-      </w:r>
-      <w:proofErr w:type="spellStart"/>
-      <w:r>
-        <w:t>unsere</w:t>
-      </w:r>
-      <w:proofErr w:type="spellEnd"/>
-      <w:r>
-        <w:t xml:space="preserve"> </w:t>
-      </w:r>
-      <w:proofErr w:type="spellStart"/>
-      <w:r>
-        <w:t>Lösung</w:t>
-      </w:r>
-      <w:proofErr w:type="spellEnd"/>
-      <w:r>
-        <w:t xml:space="preserve">, den </w:t>
-      </w:r>
-      <w:proofErr w:type="spellStart"/>
-      <w:r>
-        <w:t>Nutzen</w:t>
-      </w:r>
-      <w:proofErr w:type="spellEnd"/>
-      <w:r>
-        <w:t xml:space="preserve">, den Weg </w:t>
-      </w:r>
-      <w:proofErr w:type="spellStart"/>
-      <w:r>
-        <w:t>eines</w:t>
-      </w:r>
-      <w:proofErr w:type="spellEnd"/>
-      <w:r>
-        <w:t xml:space="preserve"> </w:t>
-      </w:r>
-      <w:proofErr w:type="spellStart"/>
-      <w:r>
-        <w:t>Auftrags</w:t>
-      </w:r>
-      <w:proofErr w:type="spellEnd"/>
-      <w:r>
-        <w:t xml:space="preserve"> und um die KI-</w:t>
-      </w:r>
-      <w:proofErr w:type="spellStart"/>
-      <w:r>
-        <w:t>Sofortdiagnose</w:t>
-      </w:r>
-      <w:proofErr w:type="spellEnd"/>
-      <w:r>
-        <w:t xml:space="preserve"> </w:t>
-      </w:r>
-      <w:proofErr w:type="spellStart"/>
-      <w:r>
-        <w:t>mit</w:t>
-      </w:r>
-      <w:proofErr w:type="spellEnd"/>
-      <w:r>
-        <w:t xml:space="preserve"> </w:t>
-      </w:r>
-      <w:proofErr w:type="spellStart"/>
-      <w:r>
-        <w:t>einer</w:t>
-      </w:r>
-      <w:proofErr w:type="spellEnd"/>
-      <w:r>
-        <w:t xml:space="preserve"> </w:t>
-      </w:r>
-      <w:proofErr w:type="spellStart"/>
-      <w:r>
-        <w:t>kurzen</w:t>
-      </w:r>
-      <w:proofErr w:type="spellEnd"/>
-      <w:r>
-        <w:t xml:space="preserve"> Demo der App.</w:t>
-      </w:r>
-    </w:p>
-    <w:p>
-      <w:proofErr w:type="spellStart"/>
-      <w:r>
-        <w:t>Im</w:t>
-      </w:r>
-      <w:proofErr w:type="spellEnd"/>
-      <w:r>
-        <w:t xml:space="preserve"> </w:t>
-      </w:r>
-      <w:proofErr w:type="spellStart"/>
-      <w:r>
-        <w:t>zweiten</w:t>
-      </w:r>
-      <w:proofErr w:type="spellEnd"/>
-      <w:r>
-        <w:t xml:space="preserve"> Teil </w:t>
-      </w:r>
-      <w:proofErr w:type="spellStart"/>
-      <w:r>
-        <w:t>zeigen</w:t>
-      </w:r>
-      <w:proofErr w:type="spellEnd"/>
-      <w:r>
-        <w:t xml:space="preserve"> </w:t>
-      </w:r>
-      <w:proofErr w:type="spellStart"/>
-      <w:r>
-        <w:t>wir</w:t>
-      </w:r>
-      <w:proofErr w:type="spellEnd"/>
-      <w:r>
-        <w:t xml:space="preserve">, was </w:t>
-      </w:r>
-      <w:proofErr w:type="spellStart"/>
-      <w:r>
-        <w:t>dahintersteckt</w:t>
-      </w:r>
-      <w:proofErr w:type="spellEnd"/>
-      <w:r>
-        <w:t xml:space="preserve">: die </w:t>
-      </w:r>
-      <w:proofErr w:type="spellStart"/>
-      <w:r>
-        <w:t>Geschäftsprozesse</w:t>
-      </w:r>
-      <w:proofErr w:type="spellEnd"/>
-      <w:r>
-        <w:t xml:space="preserve">, die Rollen, das </w:t>
-      </w:r>
-      <w:proofErr w:type="spellStart"/>
-      <w:r>
-        <w:t>Datenmodell</w:t>
-      </w:r>
-      <w:proofErr w:type="spellEnd"/>
-      <w:r>
-        <w:t xml:space="preserve">, </w:t>
-      </w:r>
-      <w:proofErr w:type="spellStart"/>
-      <w:r>
-        <w:t>unsere</w:t>
-      </w:r>
-      <w:proofErr w:type="spellEnd"/>
-      <w:r>
-        <w:t xml:space="preserve"> </w:t>
-      </w:r>
-      <w:proofErr w:type="spellStart"/>
-      <w:r>
-        <w:t>Qualitätssicherung</w:t>
-      </w:r>
-      <w:proofErr w:type="spellEnd"/>
-      <w:r>
-        <w:t xml:space="preserve"> und </w:t>
-      </w:r>
-      <w:proofErr w:type="spellStart"/>
-      <w:r>
-        <w:t>wie</w:t>
-      </w:r>
-      <w:proofErr w:type="spellEnd"/>
-      <w:r>
-        <w:t xml:space="preserve"> </w:t>
-      </w:r>
-      <w:proofErr w:type="spellStart"/>
-      <w:r>
-        <w:t>wir</w:t>
-      </w:r>
-      <w:proofErr w:type="spellEnd"/>
-      <w:r>
-        <w:t xml:space="preserve"> </w:t>
-      </w:r>
-      <w:proofErr w:type="spellStart"/>
-      <w:r>
-        <w:t>als</w:t>
-      </w:r>
-      <w:proofErr w:type="spellEnd"/>
-      <w:r>
-        <w:t xml:space="preserve"> Team </w:t>
-      </w:r>
-      <w:proofErr w:type="spellStart"/>
-      <w:r>
-        <w:t>gearbeitet</w:t>
-      </w:r>
-      <w:proofErr w:type="spellEnd"/>
-      <w:r>
-        <w:t xml:space="preserve"> </w:t>
-      </w:r>
-      <w:proofErr w:type="spellStart"/>
-      <w:r>
-        <w:t>haben</w:t>
-      </w:r>
-      <w:proofErr w:type="spellEnd"/>
-      <w:r>
-        <w:t xml:space="preserve">. Die </w:t>
-      </w:r>
-      <w:proofErr w:type="spellStart"/>
-      <w:r>
-        <w:t>Diagramme</w:t>
-      </w:r>
-      <w:proofErr w:type="spellEnd"/>
-      <w:r>
-        <w:t xml:space="preserve"> </w:t>
-      </w:r>
-      <w:proofErr w:type="spellStart"/>
-      <w:r>
-        <w:t>selbst</w:t>
-      </w:r>
-      <w:proofErr w:type="spellEnd"/>
-      <w:r>
-        <w:t xml:space="preserve"> </w:t>
-      </w:r>
-      <w:proofErr w:type="spellStart"/>
-      <w:r>
-        <w:t>finden</w:t>
-      </w:r>
-      <w:proofErr w:type="spellEnd"/>
-      <w:r>
-        <w:t xml:space="preserve"> Sie in der </w:t>
-      </w:r>
-      <w:proofErr w:type="spellStart"/>
-      <w:r>
-        <w:t>Dokumentation</w:t>
-      </w:r>
-      <w:proofErr w:type="spellEnd"/>
-      <w:r>
-        <w:t xml:space="preserve">. </w:t>
-      </w:r>
-      <w:proofErr w:type="spellStart"/>
-      <w:r>
-        <w:t>Fragen</w:t>
-      </w:r>
-      <w:proofErr w:type="spellEnd"/>
-      <w:r>
-        <w:t xml:space="preserve"> gerne am Ende.</w:t>
-      </w:r>
-    </w:p>
-    <w:p>
-      <w:r>
-        <w:t xml:space="preserve">Folie 3 – Das Problem: </w:t>
-      </w:r>
-      <w:proofErr w:type="spellStart"/>
-      <w:r>
-        <w:t>Werkstätten</w:t>
-      </w:r>
-      <w:proofErr w:type="spellEnd"/>
-      <w:r>
-        <w:t xml:space="preserve"> </w:t>
-      </w:r>
-      <w:proofErr w:type="spellStart"/>
-      <w:proofErr w:type="gramStart"/>
-      <w:r>
-        <w:t>heute</w:t>
-      </w:r>
-      <w:proofErr w:type="spellEnd"/>
+      <w:pPr>
+        <w:spacing w:before="200"/>
+      </w:pPr>
+      <w:r>
+        <w:rPr>
+          <w:b/>
+        </w:rPr>
+        <w:t>Folie 5 – Das Problem: Werkstätten heute</w:t>
+      </w:r>
       <w:r>
         <w:rPr>
           <w:i/>
         </w:rPr>
-        <w:t xml:space="preserve">  (</w:t>
-      </w:r>
-      <w:proofErr w:type="gramEnd"/>
+        <w:t xml:space="preserve">  (45 s)</w:t>
+      </w:r>
+    </w:p>
+    <w:p>
+      <w:r>
+        <w:rPr>
+          <w:b/>
+        </w:rPr>
+        <w:t xml:space="preserve">David: </w:t>
+      </w:r>
+      <w:r>
+        <w:t>Wie weit ist mein Auftrag? Um diese Frage geht es. Unser Szenario ist FixWerk, eine fiktive Werkstattkette mit vier Filialen hier in der Region Karlsruhe, für Fahrräder, E-Bikes und Elektronik. Organisiert wird mit Papier, Excel und Telefon.</w:t>
+      </w:r>
+    </w:p>
+    <w:p>
+      <w:r>
+        <w:t>Für den Kunden heißt das: Ob er den Kostenvoranschlag freigeben kann oder sein Gerät abholbereit ist, erfährt er oft erst durch einen Anruf. Manche Geräte liegen wochenlang im Lager.</w:t>
+      </w:r>
+    </w:p>
+    <w:p>
+      <w:r>
+        <w:t>Und in der Werkstatt fehlt der Überblick. Niemand sieht sofort, wie weit ein Auftrag ist, Teile werden bestellt, obwohl sie nebenan liegen, und Termine nach Gefühl zugesagt.</w:t>
+      </w:r>
+    </w:p>
+    <w:p>
+      <w:r>
+        <w:t>Das sind Annahmen unseres Szenarios. Daraus leiten wir die Anforderungen an RepairFlow ab.</w:t>
+      </w:r>
+    </w:p>
+    <w:p>
+      <w:pPr>
+        <w:spacing w:before="200"/>
+      </w:pPr>
+      <w:r>
+        <w:rPr>
+          <w:b/>
+        </w:rPr>
+        <w:t>Folie 6 – RepairFlow: die Lösung, Stufe 1</w:t>
+      </w:r>
       <w:r>
         <w:rPr>
           <w:i/>
         </w:rPr>
-        <w:t>70 s)</w:t>
+        <w:t xml:space="preserve">  (30 s)</w:t>
       </w:r>
     </w:p>
     <w:p>
       <w:r>
+        <w:rPr>
+          <w:b/>
+        </w:rPr>
         <w:t xml:space="preserve">David: </w:t>
       </w:r>
-      <w:proofErr w:type="spellStart"/>
-      <w:r>
-        <w:t>Stellen</w:t>
-      </w:r>
-      <w:proofErr w:type="spellEnd"/>
-      <w:r>
-        <w:t xml:space="preserve"> Sie </w:t>
-      </w:r>
-      <w:proofErr w:type="spellStart"/>
-      <w:r>
-        <w:t>sich</w:t>
-      </w:r>
-      <w:proofErr w:type="spellEnd"/>
-      <w:r>
-        <w:t xml:space="preserve"> </w:t>
-      </w:r>
-      <w:proofErr w:type="spellStart"/>
-      <w:r>
-        <w:t>eine</w:t>
-      </w:r>
-      <w:proofErr w:type="spellEnd"/>
-      <w:r>
-        <w:t xml:space="preserve"> </w:t>
-      </w:r>
-      <w:proofErr w:type="spellStart"/>
-      <w:r>
-        <w:t>Werkstattkette</w:t>
-      </w:r>
-      <w:proofErr w:type="spellEnd"/>
-      <w:r>
-        <w:t xml:space="preserve"> </w:t>
-      </w:r>
-      <w:proofErr w:type="spellStart"/>
-      <w:r>
-        <w:t>mit</w:t>
-      </w:r>
-      <w:proofErr w:type="spellEnd"/>
-      <w:r>
-        <w:t xml:space="preserve"> vier </w:t>
-      </w:r>
-      <w:proofErr w:type="spellStart"/>
-      <w:r>
-        <w:t>Filialen</w:t>
-      </w:r>
-      <w:proofErr w:type="spellEnd"/>
-      <w:r>
-        <w:t xml:space="preserve"> </w:t>
-      </w:r>
-      <w:proofErr w:type="spellStart"/>
-      <w:r>
-        <w:t>vor</w:t>
-      </w:r>
-      <w:proofErr w:type="spellEnd"/>
-      <w:r>
-        <w:t xml:space="preserve">. Sie </w:t>
-      </w:r>
-      <w:proofErr w:type="spellStart"/>
-      <w:r>
-        <w:t>repariert</w:t>
-      </w:r>
-      <w:proofErr w:type="spellEnd"/>
-      <w:r>
-        <w:t xml:space="preserve"> </w:t>
-      </w:r>
-      <w:proofErr w:type="spellStart"/>
-      <w:r>
-        <w:t>Fahrräder</w:t>
-      </w:r>
-      <w:proofErr w:type="spellEnd"/>
-      <w:r>
-        <w:t xml:space="preserve">, E-Bikes und Elektronik. In </w:t>
-      </w:r>
-      <w:proofErr w:type="spellStart"/>
-      <w:r>
-        <w:t>unserem</w:t>
-      </w:r>
-      <w:proofErr w:type="spellEnd"/>
-      <w:r>
-        <w:t xml:space="preserve"> </w:t>
-      </w:r>
-      <w:proofErr w:type="spellStart"/>
-      <w:r>
-        <w:t>Szenario</w:t>
-      </w:r>
-      <w:proofErr w:type="spellEnd"/>
-      <w:r>
-        <w:t xml:space="preserve"> </w:t>
-      </w:r>
-      <w:proofErr w:type="spellStart"/>
-      <w:r>
-        <w:t>heißt</w:t>
-      </w:r>
-      <w:proofErr w:type="spellEnd"/>
-      <w:r>
-        <w:t xml:space="preserve"> </w:t>
-      </w:r>
-      <w:proofErr w:type="spellStart"/>
-      <w:r>
-        <w:t>sie</w:t>
-      </w:r>
-      <w:proofErr w:type="spellEnd"/>
-      <w:r>
-        <w:t xml:space="preserve"> </w:t>
-      </w:r>
-      <w:proofErr w:type="spellStart"/>
-      <w:r>
-        <w:t>FixWerk</w:t>
-      </w:r>
-      <w:proofErr w:type="spellEnd"/>
-      <w:r>
-        <w:t xml:space="preserve">. Dort </w:t>
-      </w:r>
-      <w:proofErr w:type="spellStart"/>
-      <w:r>
-        <w:t>läuft</w:t>
-      </w:r>
-      <w:proofErr w:type="spellEnd"/>
-      <w:r>
-        <w:t xml:space="preserve"> fast </w:t>
-      </w:r>
-      <w:proofErr w:type="spellStart"/>
-      <w:r>
-        <w:t>alles</w:t>
-      </w:r>
-      <w:proofErr w:type="spellEnd"/>
-      <w:r>
-        <w:t xml:space="preserve"> </w:t>
-      </w:r>
-      <w:proofErr w:type="spellStart"/>
-      <w:r>
-        <w:t>über</w:t>
-      </w:r>
-      <w:proofErr w:type="spellEnd"/>
-      <w:r>
-        <w:t xml:space="preserve"> </w:t>
-      </w:r>
-      <w:proofErr w:type="spellStart"/>
-      <w:r>
-        <w:t>Papierzettel</w:t>
-      </w:r>
-      <w:proofErr w:type="spellEnd"/>
-      <w:r>
-        <w:t xml:space="preserve">, Excel-Listen und das </w:t>
-      </w:r>
-      <w:proofErr w:type="spellStart"/>
-      <w:r>
-        <w:t>Telefon</w:t>
-      </w:r>
-      <w:proofErr w:type="spellEnd"/>
-      <w:r>
-        <w:t xml:space="preserve">. </w:t>
-      </w:r>
-      <w:proofErr w:type="spellStart"/>
-      <w:r>
-        <w:t>Daraus</w:t>
-      </w:r>
-      <w:proofErr w:type="spellEnd"/>
-      <w:r>
-        <w:t xml:space="preserve"> </w:t>
-      </w:r>
-      <w:proofErr w:type="spellStart"/>
-      <w:r>
-        <w:t>entstehen</w:t>
-      </w:r>
-      <w:proofErr w:type="spellEnd"/>
-      <w:r>
-        <w:t xml:space="preserve"> vier </w:t>
-      </w:r>
-      <w:proofErr w:type="spellStart"/>
-      <w:r>
-        <w:t>Probleme</w:t>
-      </w:r>
-      <w:proofErr w:type="spellEnd"/>
-      <w:r>
-        <w:t>.</w:t>
+      <w:r>
+        <w:t>Genau hier setzt RepairFlow an. Wir sind nicht die Werkstatt, sondern der Softwareanbieter dahinter. FixWerk ist unser fiktiver Pilotkunde, an seinen Abläufen haben wir die Anforderungen modelliert. Gedacht ist die Plattform für Werkstätten und kleine Ketten mit zwei bis zehn Filialen.</w:t>
       </w:r>
     </w:p>
     <w:p>
-      <w:proofErr w:type="spellStart"/>
-      <w:r>
-        <w:t>Erstens</w:t>
-      </w:r>
-      <w:proofErr w:type="spellEnd"/>
-      <w:r>
-        <w:t xml:space="preserve"> </w:t>
-      </w:r>
-      <w:proofErr w:type="spellStart"/>
-      <w:r>
-        <w:t>hört</w:t>
-      </w:r>
-      <w:proofErr w:type="spellEnd"/>
-      <w:r>
-        <w:t xml:space="preserve"> der Kunde </w:t>
-      </w:r>
-      <w:proofErr w:type="spellStart"/>
-      <w:r>
-        <w:t>nach</w:t>
-      </w:r>
-      <w:proofErr w:type="spellEnd"/>
-      <w:r>
-        <w:t xml:space="preserve"> der </w:t>
-      </w:r>
-      <w:proofErr w:type="spellStart"/>
-      <w:r>
-        <w:t>Abgabe</w:t>
-      </w:r>
-      <w:proofErr w:type="spellEnd"/>
-      <w:r>
-        <w:t xml:space="preserve"> </w:t>
-      </w:r>
-      <w:proofErr w:type="spellStart"/>
-      <w:r>
-        <w:t>nichts</w:t>
-      </w:r>
-      <w:proofErr w:type="spellEnd"/>
-      <w:r>
-        <w:t xml:space="preserve"> </w:t>
-      </w:r>
-      <w:proofErr w:type="spellStart"/>
-      <w:r>
-        <w:t>mehr</w:t>
-      </w:r>
-      <w:proofErr w:type="spellEnd"/>
-      <w:r>
-        <w:t xml:space="preserve">. Ob der </w:t>
-      </w:r>
-      <w:proofErr w:type="spellStart"/>
-      <w:r>
-        <w:t>Kostenvoranschlag</w:t>
-      </w:r>
-      <w:proofErr w:type="spellEnd"/>
-      <w:r>
-        <w:t xml:space="preserve"> da </w:t>
-      </w:r>
-      <w:proofErr w:type="spellStart"/>
-      <w:r>
-        <w:t>ist</w:t>
-      </w:r>
-      <w:proofErr w:type="spellEnd"/>
-      <w:r>
-        <w:t xml:space="preserve"> </w:t>
-      </w:r>
-      <w:proofErr w:type="spellStart"/>
-      <w:r>
-        <w:t>oder</w:t>
-      </w:r>
-      <w:proofErr w:type="spellEnd"/>
-      <w:r>
-        <w:t xml:space="preserve"> das </w:t>
-      </w:r>
-      <w:proofErr w:type="spellStart"/>
-      <w:r>
-        <w:t>Gerät</w:t>
-      </w:r>
-      <w:proofErr w:type="spellEnd"/>
-      <w:r>
-        <w:t xml:space="preserve"> </w:t>
-      </w:r>
-      <w:proofErr w:type="spellStart"/>
-      <w:r>
-        <w:t>fertig</w:t>
-      </w:r>
-      <w:proofErr w:type="spellEnd"/>
-      <w:r>
-        <w:t xml:space="preserve"> </w:t>
-      </w:r>
-      <w:proofErr w:type="spellStart"/>
-      <w:r>
-        <w:t>ist</w:t>
-      </w:r>
-      <w:proofErr w:type="spellEnd"/>
-      <w:r>
-        <w:t xml:space="preserve">, </w:t>
-      </w:r>
-      <w:proofErr w:type="spellStart"/>
-      <w:r>
-        <w:t>erfährt</w:t>
-      </w:r>
-      <w:proofErr w:type="spellEnd"/>
-      <w:r>
-        <w:t xml:space="preserve"> er </w:t>
-      </w:r>
-      <w:proofErr w:type="spellStart"/>
-      <w:r>
-        <w:t>nur</w:t>
-      </w:r>
-      <w:proofErr w:type="spellEnd"/>
-      <w:r>
-        <w:t xml:space="preserve">, </w:t>
-      </w:r>
-      <w:proofErr w:type="spellStart"/>
-      <w:r>
-        <w:t>wenn</w:t>
-      </w:r>
-      <w:proofErr w:type="spellEnd"/>
-      <w:r>
-        <w:t xml:space="preserve"> er </w:t>
-      </w:r>
-      <w:proofErr w:type="spellStart"/>
-      <w:r>
-        <w:t>anruft</w:t>
-      </w:r>
-      <w:proofErr w:type="spellEnd"/>
-      <w:r>
-        <w:t>.</w:t>
+      <w:r>
+        <w:t>Der Kunde kommt über Portal und App, das Werkstattteam arbeitet direkt in der Plattform. Beide arbeiten am selben Auftrag und sehen denselben Stand, ohne Zettel und Telefon.</w:t>
       </w:r>
     </w:p>
     <w:p>
-      <w:proofErr w:type="spellStart"/>
-      <w:r>
-        <w:t>Zweitens</w:t>
-      </w:r>
-      <w:proofErr w:type="spellEnd"/>
-      <w:r>
-        <w:t xml:space="preserve"> </w:t>
-      </w:r>
-      <w:proofErr w:type="spellStart"/>
-      <w:r>
-        <w:t>weiß</w:t>
-      </w:r>
-      <w:proofErr w:type="spellEnd"/>
-      <w:r>
-        <w:t xml:space="preserve"> </w:t>
-      </w:r>
-      <w:proofErr w:type="spellStart"/>
-      <w:r>
-        <w:t>niemand</w:t>
-      </w:r>
-      <w:proofErr w:type="spellEnd"/>
-      <w:r>
-        <w:t xml:space="preserve"> </w:t>
-      </w:r>
-      <w:proofErr w:type="spellStart"/>
-      <w:r>
-        <w:t>ohne</w:t>
-      </w:r>
-      <w:proofErr w:type="spellEnd"/>
-      <w:r>
-        <w:t xml:space="preserve"> </w:t>
-      </w:r>
-      <w:proofErr w:type="spellStart"/>
-      <w:r>
-        <w:t>Nachfragen</w:t>
-      </w:r>
-      <w:proofErr w:type="spellEnd"/>
-      <w:r>
-        <w:t xml:space="preserve">, wo </w:t>
-      </w:r>
-      <w:proofErr w:type="spellStart"/>
-      <w:r>
-        <w:t>ein</w:t>
-      </w:r>
-      <w:proofErr w:type="spellEnd"/>
-      <w:r>
-        <w:t xml:space="preserve"> </w:t>
-      </w:r>
-      <w:proofErr w:type="spellStart"/>
-      <w:r>
-        <w:t>Auftrag</w:t>
-      </w:r>
-      <w:proofErr w:type="spellEnd"/>
-      <w:r>
-        <w:t xml:space="preserve"> </w:t>
-      </w:r>
-      <w:proofErr w:type="spellStart"/>
-      <w:r>
-        <w:t>gerade</w:t>
-      </w:r>
-      <w:proofErr w:type="spellEnd"/>
-      <w:r>
-        <w:t xml:space="preserve"> </w:t>
-      </w:r>
-      <w:proofErr w:type="spellStart"/>
-      <w:r>
-        <w:t>steht</w:t>
-      </w:r>
-      <w:proofErr w:type="spellEnd"/>
-      <w:r>
-        <w:t xml:space="preserve">. Die Zettel und die Listen </w:t>
-      </w:r>
-      <w:proofErr w:type="spellStart"/>
-      <w:r>
-        <w:t>passen</w:t>
-      </w:r>
-      <w:proofErr w:type="spellEnd"/>
-      <w:r>
-        <w:t xml:space="preserve"> oft nicht </w:t>
-      </w:r>
-      <w:proofErr w:type="spellStart"/>
-      <w:r>
-        <w:t>zusammen</w:t>
-      </w:r>
-      <w:proofErr w:type="spellEnd"/>
-      <w:r>
-        <w:t>.</w:t>
-      </w:r>
-    </w:p>
-    <w:p>
-      <w:proofErr w:type="spellStart"/>
-      <w:r>
-        <w:t>Drittens</w:t>
-      </w:r>
-      <w:proofErr w:type="spellEnd"/>
-      <w:r>
-        <w:t xml:space="preserve"> </w:t>
-      </w:r>
-      <w:proofErr w:type="spellStart"/>
-      <w:r>
-        <w:t>bestellt</w:t>
-      </w:r>
-      <w:proofErr w:type="spellEnd"/>
-      <w:r>
-        <w:t xml:space="preserve"> </w:t>
-      </w:r>
-      <w:proofErr w:type="spellStart"/>
-      <w:r>
-        <w:t>jede</w:t>
-      </w:r>
-      <w:proofErr w:type="spellEnd"/>
-      <w:r>
-        <w:t xml:space="preserve"> </w:t>
-      </w:r>
-      <w:proofErr w:type="spellStart"/>
-      <w:r>
-        <w:t>Filiale</w:t>
-      </w:r>
-      <w:proofErr w:type="spellEnd"/>
-      <w:r>
-        <w:t xml:space="preserve"> </w:t>
-      </w:r>
-      <w:proofErr w:type="spellStart"/>
-      <w:r>
-        <w:t>ihre</w:t>
-      </w:r>
-      <w:proofErr w:type="spellEnd"/>
-      <w:r>
-        <w:t xml:space="preserve"> </w:t>
-      </w:r>
-      <w:proofErr w:type="spellStart"/>
-      <w:r>
-        <w:t>Ersatzteile</w:t>
-      </w:r>
-      <w:proofErr w:type="spellEnd"/>
-      <w:r>
-        <w:t xml:space="preserve"> </w:t>
-      </w:r>
-      <w:proofErr w:type="spellStart"/>
-      <w:r>
-        <w:t>selbst</w:t>
-      </w:r>
-      <w:proofErr w:type="spellEnd"/>
-      <w:r>
-        <w:t xml:space="preserve">, </w:t>
-      </w:r>
-      <w:proofErr w:type="spellStart"/>
-      <w:r>
-        <w:t>obwohl</w:t>
-      </w:r>
-      <w:proofErr w:type="spellEnd"/>
-      <w:r>
-        <w:t xml:space="preserve"> das Teil oft in der </w:t>
-      </w:r>
-      <w:proofErr w:type="spellStart"/>
-      <w:r>
-        <w:t>Nachbarfiliale</w:t>
-      </w:r>
-      <w:proofErr w:type="spellEnd"/>
-      <w:r>
-        <w:t xml:space="preserve"> </w:t>
-      </w:r>
-      <w:proofErr w:type="spellStart"/>
-      <w:r>
-        <w:t>liegt</w:t>
-      </w:r>
-      <w:proofErr w:type="spellEnd"/>
-      <w:r>
-        <w:t>.</w:t>
-      </w:r>
-    </w:p>
-    <w:p>
-      <w:proofErr w:type="spellStart"/>
-      <w:r>
-        <w:t>Viertens</w:t>
-      </w:r>
-      <w:proofErr w:type="spellEnd"/>
-      <w:r>
-        <w:t xml:space="preserve"> </w:t>
-      </w:r>
-      <w:proofErr w:type="spellStart"/>
-      <w:r>
-        <w:t>werden</w:t>
-      </w:r>
-      <w:proofErr w:type="spellEnd"/>
-      <w:r>
-        <w:t xml:space="preserve"> Termine </w:t>
-      </w:r>
-      <w:proofErr w:type="spellStart"/>
-      <w:r>
-        <w:t>nach</w:t>
-      </w:r>
-      <w:proofErr w:type="spellEnd"/>
-      <w:r>
-        <w:t xml:space="preserve"> </w:t>
-      </w:r>
-      <w:proofErr w:type="spellStart"/>
-      <w:r>
-        <w:t>Gefühl</w:t>
-      </w:r>
-      <w:proofErr w:type="spellEnd"/>
-      <w:r>
-        <w:t xml:space="preserve"> </w:t>
-      </w:r>
-      <w:proofErr w:type="spellStart"/>
-      <w:r>
-        <w:t>zugesagt</w:t>
-      </w:r>
-      <w:proofErr w:type="spellEnd"/>
-      <w:r>
-        <w:t xml:space="preserve">, </w:t>
-      </w:r>
-      <w:proofErr w:type="spellStart"/>
-      <w:r>
-        <w:t>weil</w:t>
-      </w:r>
-      <w:proofErr w:type="spellEnd"/>
-      <w:r>
-        <w:t xml:space="preserve"> </w:t>
-      </w:r>
-      <w:proofErr w:type="spellStart"/>
-      <w:r>
-        <w:t>niemand</w:t>
-      </w:r>
-      <w:proofErr w:type="spellEnd"/>
-      <w:r>
-        <w:t xml:space="preserve"> </w:t>
-      </w:r>
-      <w:proofErr w:type="spellStart"/>
-      <w:r>
-        <w:t>sieht</w:t>
-      </w:r>
-      <w:proofErr w:type="spellEnd"/>
-      <w:r>
-        <w:t xml:space="preserve">, </w:t>
-      </w:r>
-      <w:proofErr w:type="spellStart"/>
-      <w:r>
-        <w:t>wie</w:t>
-      </w:r>
-      <w:proofErr w:type="spellEnd"/>
-      <w:r>
-        <w:t xml:space="preserve"> </w:t>
-      </w:r>
-      <w:proofErr w:type="spellStart"/>
-      <w:r>
-        <w:t>ausgelastet</w:t>
-      </w:r>
-      <w:proofErr w:type="spellEnd"/>
-      <w:r>
-        <w:t xml:space="preserve"> die </w:t>
-      </w:r>
-      <w:proofErr w:type="spellStart"/>
-      <w:r>
-        <w:t>Techniker</w:t>
-      </w:r>
-      <w:proofErr w:type="spellEnd"/>
-      <w:r>
-        <w:t xml:space="preserve"> </w:t>
-      </w:r>
-      <w:proofErr w:type="spellStart"/>
-      <w:r>
-        <w:t>sind</w:t>
-      </w:r>
-      <w:proofErr w:type="spellEnd"/>
-      <w:r>
-        <w:t>.</w:t>
-      </w:r>
-    </w:p>
-    <w:p>
-      <w:proofErr w:type="spellStart"/>
-      <w:r>
-        <w:t>Diese</w:t>
-      </w:r>
-      <w:proofErr w:type="spellEnd"/>
-      <w:r>
-        <w:t xml:space="preserve"> vier </w:t>
-      </w:r>
-      <w:proofErr w:type="spellStart"/>
-      <w:r>
-        <w:t>Punkte</w:t>
-      </w:r>
-      <w:proofErr w:type="spellEnd"/>
-      <w:r>
-        <w:t xml:space="preserve"> </w:t>
-      </w:r>
-      <w:proofErr w:type="spellStart"/>
-      <w:r>
-        <w:t>sind</w:t>
-      </w:r>
-      <w:proofErr w:type="spellEnd"/>
-      <w:r>
-        <w:t xml:space="preserve"> </w:t>
-      </w:r>
-      <w:proofErr w:type="spellStart"/>
-      <w:r>
-        <w:t>Annahmen</w:t>
-      </w:r>
-      <w:proofErr w:type="spellEnd"/>
-      <w:r>
-        <w:t xml:space="preserve"> </w:t>
-      </w:r>
-      <w:proofErr w:type="spellStart"/>
-      <w:r>
-        <w:t>aus</w:t>
-      </w:r>
-      <w:proofErr w:type="spellEnd"/>
-      <w:r>
-        <w:t xml:space="preserve"> </w:t>
-      </w:r>
-      <w:proofErr w:type="spellStart"/>
-      <w:r>
-        <w:t>unserem</w:t>
-      </w:r>
-      <w:proofErr w:type="spellEnd"/>
-      <w:r>
-        <w:t xml:space="preserve"> </w:t>
-      </w:r>
-      <w:proofErr w:type="spellStart"/>
-      <w:r>
-        <w:t>Szenario</w:t>
-      </w:r>
-      <w:proofErr w:type="spellEnd"/>
-      <w:r>
-        <w:t xml:space="preserve">. </w:t>
-      </w:r>
-      <w:proofErr w:type="spellStart"/>
-      <w:r>
-        <w:t>Wer</w:t>
-      </w:r>
-      <w:proofErr w:type="spellEnd"/>
-      <w:r>
-        <w:t xml:space="preserve"> </w:t>
-      </w:r>
-      <w:proofErr w:type="spellStart"/>
-      <w:r>
-        <w:t>schon</w:t>
-      </w:r>
-      <w:proofErr w:type="spellEnd"/>
-      <w:r>
-        <w:t xml:space="preserve"> </w:t>
-      </w:r>
-      <w:proofErr w:type="spellStart"/>
-      <w:r>
-        <w:t>einmal</w:t>
-      </w:r>
-      <w:proofErr w:type="spellEnd"/>
-      <w:r>
-        <w:t xml:space="preserve"> </w:t>
-      </w:r>
-      <w:proofErr w:type="spellStart"/>
-      <w:r>
-        <w:t>ein</w:t>
-      </w:r>
-      <w:proofErr w:type="spellEnd"/>
-      <w:r>
-        <w:t xml:space="preserve"> </w:t>
-      </w:r>
-      <w:proofErr w:type="spellStart"/>
-      <w:r>
-        <w:t>Gerät</w:t>
-      </w:r>
-      <w:proofErr w:type="spellEnd"/>
-      <w:r>
-        <w:t xml:space="preserve"> </w:t>
-      </w:r>
-      <w:proofErr w:type="spellStart"/>
-      <w:r>
-        <w:t>zur</w:t>
-      </w:r>
-      <w:proofErr w:type="spellEnd"/>
-      <w:r>
-        <w:t xml:space="preserve"> </w:t>
-      </w:r>
-      <w:proofErr w:type="spellStart"/>
-      <w:r>
-        <w:t>Reparatur</w:t>
-      </w:r>
-      <w:proofErr w:type="spellEnd"/>
-      <w:r>
-        <w:t xml:space="preserve"> </w:t>
-      </w:r>
-      <w:proofErr w:type="spellStart"/>
-      <w:r>
-        <w:t>gebracht</w:t>
-      </w:r>
-      <w:proofErr w:type="spellEnd"/>
-      <w:r>
-        <w:t xml:space="preserve"> hat, </w:t>
-      </w:r>
-      <w:proofErr w:type="spellStart"/>
-      <w:r>
-        <w:t>kennt</w:t>
-      </w:r>
-      <w:proofErr w:type="spellEnd"/>
-      <w:r>
-        <w:t xml:space="preserve"> </w:t>
-      </w:r>
-      <w:proofErr w:type="spellStart"/>
-      <w:r>
-        <w:t>aber</w:t>
-      </w:r>
-      <w:proofErr w:type="spellEnd"/>
-      <w:r>
-        <w:t xml:space="preserve"> </w:t>
-      </w:r>
-      <w:proofErr w:type="spellStart"/>
-      <w:r>
-        <w:t>sicher</w:t>
-      </w:r>
-      <w:proofErr w:type="spellEnd"/>
-      <w:r>
-        <w:t xml:space="preserve"> </w:t>
-      </w:r>
-      <w:proofErr w:type="spellStart"/>
-      <w:r>
-        <w:t>mindestens</w:t>
-      </w:r>
-      <w:proofErr w:type="spellEnd"/>
-      <w:r>
-        <w:t xml:space="preserve"> </w:t>
-      </w:r>
-      <w:proofErr w:type="spellStart"/>
-      <w:r>
-        <w:t>einen</w:t>
-      </w:r>
-      <w:proofErr w:type="spellEnd"/>
-      <w:r>
-        <w:t xml:space="preserve"> </w:t>
-      </w:r>
-      <w:proofErr w:type="spellStart"/>
-      <w:r>
-        <w:t>davon</w:t>
-      </w:r>
-      <w:proofErr w:type="spellEnd"/>
-      <w:r>
-        <w:t>.</w:t>
-      </w:r>
-    </w:p>
-    <w:p>
-      <w:r>
-        <w:t xml:space="preserve">Folie 4 – </w:t>
-      </w:r>
-      <w:proofErr w:type="spellStart"/>
-      <w:r>
-        <w:t>RepairFlow</w:t>
-      </w:r>
-      <w:proofErr w:type="spellEnd"/>
-      <w:r>
-        <w:t xml:space="preserve">: die </w:t>
-      </w:r>
-      <w:proofErr w:type="spellStart"/>
-      <w:proofErr w:type="gramStart"/>
-      <w:r>
-        <w:t>Lösung</w:t>
-      </w:r>
-      <w:proofErr w:type="spellEnd"/>
+      <w:pPr>
+        <w:spacing w:before="200"/>
+      </w:pPr>
+      <w:r>
+        <w:rPr>
+          <w:b/>
+        </w:rPr>
+        <w:t>Folie 7 – RepairFlow: die Lösung, Stufe 2</w:t>
+      </w:r>
       <w:r>
         <w:rPr>
           <w:i/>
         </w:rPr>
-        <w:t xml:space="preserve">  (</w:t>
-      </w:r>
-      <w:proofErr w:type="gramEnd"/>
-      <w:r>
-        <w:rPr>
-          <w:i/>
-        </w:rPr>
-        <w:t>65 s)</w:t>
+        <w:t xml:space="preserve">  (20 s)</w:t>
       </w:r>
     </w:p>
     <w:p>
       <w:r>
+        <w:rPr>
+          <w:b/>
+        </w:rPr>
         <w:t xml:space="preserve">David: </w:t>
       </w:r>
-      <w:proofErr w:type="spellStart"/>
-      <w:r>
-        <w:t>Unsere</w:t>
-      </w:r>
-      <w:proofErr w:type="spellEnd"/>
-      <w:r>
-        <w:t xml:space="preserve"> </w:t>
-      </w:r>
-      <w:proofErr w:type="spellStart"/>
-      <w:r>
-        <w:t>Antwort</w:t>
-      </w:r>
-      <w:proofErr w:type="spellEnd"/>
-      <w:r>
-        <w:t xml:space="preserve"> </w:t>
-      </w:r>
-      <w:proofErr w:type="spellStart"/>
-      <w:r>
-        <w:t>darauf</w:t>
-      </w:r>
-      <w:proofErr w:type="spellEnd"/>
-      <w:r>
-        <w:t xml:space="preserve"> </w:t>
-      </w:r>
-      <w:proofErr w:type="spellStart"/>
-      <w:r>
-        <w:t>ist</w:t>
-      </w:r>
-      <w:proofErr w:type="spellEnd"/>
-      <w:r>
-        <w:t xml:space="preserve"> </w:t>
-      </w:r>
-      <w:proofErr w:type="spellStart"/>
-      <w:r>
-        <w:t>RepairFlow</w:t>
-      </w:r>
-      <w:proofErr w:type="spellEnd"/>
-      <w:r>
-        <w:t xml:space="preserve">. </w:t>
-      </w:r>
-      <w:proofErr w:type="spellStart"/>
-      <w:r>
-        <w:t>Wichtig</w:t>
-      </w:r>
-      <w:proofErr w:type="spellEnd"/>
-      <w:r>
-        <w:t xml:space="preserve"> </w:t>
-      </w:r>
-      <w:proofErr w:type="spellStart"/>
-      <w:r>
-        <w:t>dabei</w:t>
-      </w:r>
-      <w:proofErr w:type="spellEnd"/>
-      <w:r>
-        <w:t xml:space="preserve">: Wir </w:t>
-      </w:r>
-      <w:proofErr w:type="spellStart"/>
-      <w:r>
-        <w:t>sind</w:t>
-      </w:r>
-      <w:proofErr w:type="spellEnd"/>
-      <w:r>
-        <w:t xml:space="preserve"> nicht die </w:t>
-      </w:r>
-      <w:proofErr w:type="spellStart"/>
-      <w:r>
-        <w:t>Werkstatt</w:t>
-      </w:r>
-      <w:proofErr w:type="spellEnd"/>
-      <w:r>
-        <w:t xml:space="preserve">. Wir </w:t>
-      </w:r>
-      <w:proofErr w:type="spellStart"/>
-      <w:r>
-        <w:t>sind</w:t>
-      </w:r>
-      <w:proofErr w:type="spellEnd"/>
-      <w:r>
-        <w:t xml:space="preserve"> </w:t>
-      </w:r>
-      <w:proofErr w:type="spellStart"/>
-      <w:r>
-        <w:t>ein</w:t>
-      </w:r>
-      <w:proofErr w:type="spellEnd"/>
-      <w:r>
-        <w:t xml:space="preserve"> Software-Startup. </w:t>
-      </w:r>
-      <w:proofErr w:type="spellStart"/>
-      <w:r>
-        <w:t>FixWerk</w:t>
-      </w:r>
-      <w:proofErr w:type="spellEnd"/>
-      <w:r>
-        <w:t xml:space="preserve"> </w:t>
-      </w:r>
-      <w:proofErr w:type="spellStart"/>
-      <w:r>
-        <w:t>ist</w:t>
-      </w:r>
-      <w:proofErr w:type="spellEnd"/>
-      <w:r>
-        <w:t xml:space="preserve"> </w:t>
-      </w:r>
-      <w:proofErr w:type="spellStart"/>
-      <w:r>
-        <w:t>unser</w:t>
-      </w:r>
-      <w:proofErr w:type="spellEnd"/>
-      <w:r>
-        <w:t xml:space="preserve"> </w:t>
-      </w:r>
-      <w:proofErr w:type="spellStart"/>
-      <w:r>
-        <w:t>Pilotkunde</w:t>
-      </w:r>
-      <w:proofErr w:type="spellEnd"/>
-      <w:r>
-        <w:t xml:space="preserve">, also der </w:t>
-      </w:r>
-      <w:proofErr w:type="spellStart"/>
-      <w:r>
-        <w:t>erste</w:t>
-      </w:r>
-      <w:proofErr w:type="spellEnd"/>
-      <w:r>
-        <w:t xml:space="preserve"> Kunde, </w:t>
-      </w:r>
-      <w:proofErr w:type="gramStart"/>
-      <w:r>
-        <w:t>an</w:t>
-      </w:r>
-      <w:proofErr w:type="gramEnd"/>
-      <w:r>
-        <w:t xml:space="preserve"> </w:t>
-      </w:r>
-      <w:proofErr w:type="spellStart"/>
-      <w:r>
-        <w:t>dessen</w:t>
-      </w:r>
-      <w:proofErr w:type="spellEnd"/>
-      <w:r>
-        <w:t xml:space="preserve"> </w:t>
-      </w:r>
-      <w:proofErr w:type="spellStart"/>
-      <w:r>
-        <w:t>Abläufen</w:t>
-      </w:r>
-      <w:proofErr w:type="spellEnd"/>
-      <w:r>
-        <w:t xml:space="preserve"> </w:t>
-      </w:r>
-      <w:proofErr w:type="spellStart"/>
-      <w:r>
-        <w:t>wir</w:t>
-      </w:r>
-      <w:proofErr w:type="spellEnd"/>
-      <w:r>
-        <w:t xml:space="preserve"> die </w:t>
-      </w:r>
-      <w:proofErr w:type="spellStart"/>
-      <w:r>
-        <w:t>Plattform</w:t>
-      </w:r>
-      <w:proofErr w:type="spellEnd"/>
-      <w:r>
-        <w:t xml:space="preserve"> </w:t>
-      </w:r>
-      <w:proofErr w:type="spellStart"/>
-      <w:r>
-        <w:t>entworfen</w:t>
-      </w:r>
-      <w:proofErr w:type="spellEnd"/>
-      <w:r>
-        <w:t xml:space="preserve"> </w:t>
-      </w:r>
-      <w:proofErr w:type="spellStart"/>
-      <w:r>
-        <w:t>haben</w:t>
-      </w:r>
-      <w:proofErr w:type="spellEnd"/>
-      <w:r>
-        <w:t>.</w:t>
+      <w:r>
+        <w:t>Wichtig für die Analyse ist die Grenze: Drinnen liegt nur unsere Software. Die Reparatur selbst bleibt draußen, die macht weiter die Werkstatt. Den KI-Dienst und die Lieferanten binden wir von außen an, die Buchhaltung bekommt nur einen Export. Was das im Alltag bringt, zeigt Ihnen jetzt Kilian.</w:t>
       </w:r>
     </w:p>
     <w:p>
-      <w:proofErr w:type="spellStart"/>
-      <w:r>
-        <w:lastRenderedPageBreak/>
-        <w:t>RepairFlow</w:t>
-      </w:r>
-      <w:proofErr w:type="spellEnd"/>
-      <w:r>
-        <w:t xml:space="preserve"> </w:t>
-      </w:r>
-      <w:proofErr w:type="spellStart"/>
-      <w:r>
-        <w:t>läuft</w:t>
-      </w:r>
-      <w:proofErr w:type="spellEnd"/>
-      <w:r>
-        <w:t xml:space="preserve"> in der Cloud und </w:t>
-      </w:r>
-      <w:proofErr w:type="spellStart"/>
-      <w:r>
-        <w:t>begleitet</w:t>
-      </w:r>
-      <w:proofErr w:type="spellEnd"/>
-      <w:r>
-        <w:t xml:space="preserve"> die </w:t>
-      </w:r>
-      <w:proofErr w:type="spellStart"/>
-      <w:r>
-        <w:t>ganze</w:t>
-      </w:r>
-      <w:proofErr w:type="spellEnd"/>
-      <w:r>
-        <w:t xml:space="preserve"> </w:t>
-      </w:r>
-      <w:proofErr w:type="spellStart"/>
-      <w:r>
-        <w:t>Reparatur</w:t>
-      </w:r>
-      <w:proofErr w:type="spellEnd"/>
-      <w:r>
-        <w:t xml:space="preserve">, von der </w:t>
-      </w:r>
-      <w:proofErr w:type="spellStart"/>
-      <w:r>
-        <w:t>ersten</w:t>
-      </w:r>
-      <w:proofErr w:type="spellEnd"/>
-      <w:r>
-        <w:t xml:space="preserve"> </w:t>
-      </w:r>
-      <w:proofErr w:type="spellStart"/>
-      <w:r>
-        <w:t>Anfrage</w:t>
-      </w:r>
-      <w:proofErr w:type="spellEnd"/>
-      <w:r>
-        <w:t xml:space="preserve"> bis </w:t>
-      </w:r>
-      <w:proofErr w:type="spellStart"/>
-      <w:r>
-        <w:t>zur</w:t>
-      </w:r>
-      <w:proofErr w:type="spellEnd"/>
-      <w:r>
-        <w:t xml:space="preserve"> </w:t>
-      </w:r>
-      <w:proofErr w:type="spellStart"/>
-      <w:r>
-        <w:t>Abholung</w:t>
-      </w:r>
-      <w:proofErr w:type="spellEnd"/>
-      <w:r>
-        <w:t xml:space="preserve"> und </w:t>
-      </w:r>
-      <w:proofErr w:type="spellStart"/>
-      <w:r>
-        <w:t>einer</w:t>
-      </w:r>
-      <w:proofErr w:type="spellEnd"/>
-      <w:r>
-        <w:t xml:space="preserve"> </w:t>
-      </w:r>
-      <w:proofErr w:type="spellStart"/>
-      <w:r>
-        <w:t>möglichen</w:t>
-      </w:r>
-      <w:proofErr w:type="spellEnd"/>
-      <w:r>
-        <w:t xml:space="preserve"> </w:t>
-      </w:r>
-      <w:proofErr w:type="spellStart"/>
-      <w:r>
-        <w:t>Reklamation</w:t>
-      </w:r>
-      <w:proofErr w:type="spellEnd"/>
-      <w:r>
-        <w:t xml:space="preserve">. Die </w:t>
-      </w:r>
-      <w:proofErr w:type="spellStart"/>
-      <w:r>
-        <w:t>Plattform</w:t>
-      </w:r>
-      <w:proofErr w:type="spellEnd"/>
-      <w:r>
-        <w:t xml:space="preserve"> hat vier </w:t>
-      </w:r>
-      <w:proofErr w:type="spellStart"/>
-      <w:r>
-        <w:t>Bereiche</w:t>
-      </w:r>
-      <w:proofErr w:type="spellEnd"/>
-      <w:r>
-        <w:t xml:space="preserve">: das </w:t>
-      </w:r>
-      <w:proofErr w:type="spellStart"/>
-      <w:r>
-        <w:t>Kundenportal</w:t>
-      </w:r>
-      <w:proofErr w:type="spellEnd"/>
-      <w:r>
-        <w:t xml:space="preserve"> </w:t>
-      </w:r>
-      <w:proofErr w:type="spellStart"/>
-      <w:r>
-        <w:t>mit</w:t>
-      </w:r>
-      <w:proofErr w:type="spellEnd"/>
-      <w:r>
-        <w:t xml:space="preserve"> der App, den </w:t>
-      </w:r>
-      <w:proofErr w:type="spellStart"/>
-      <w:r>
-        <w:t>Bereich</w:t>
-      </w:r>
-      <w:proofErr w:type="spellEnd"/>
-      <w:r>
-        <w:t xml:space="preserve"> für </w:t>
-      </w:r>
-      <w:proofErr w:type="spellStart"/>
-      <w:r>
-        <w:t>Aufträge</w:t>
-      </w:r>
-      <w:proofErr w:type="spellEnd"/>
-      <w:r>
-        <w:t xml:space="preserve"> und </w:t>
-      </w:r>
-      <w:proofErr w:type="spellStart"/>
-      <w:r>
-        <w:t>Werkstatt</w:t>
-      </w:r>
-      <w:proofErr w:type="spellEnd"/>
-      <w:r>
-        <w:t xml:space="preserve">, die </w:t>
-      </w:r>
-      <w:proofErr w:type="spellStart"/>
-      <w:r>
-        <w:t>Ersatzteil</w:t>
-      </w:r>
-      <w:proofErr w:type="spellEnd"/>
-      <w:r>
-        <w:t xml:space="preserve">-Disposition und die </w:t>
-      </w:r>
-      <w:proofErr w:type="spellStart"/>
-      <w:r>
-        <w:t>Abrechnung</w:t>
-      </w:r>
-      <w:proofErr w:type="spellEnd"/>
-      <w:r>
-        <w:t>.</w:t>
-      </w:r>
-    </w:p>
-    <w:p>
-      <w:proofErr w:type="spellStart"/>
-      <w:r>
-        <w:t>Unsere</w:t>
-      </w:r>
-      <w:proofErr w:type="spellEnd"/>
-      <w:r>
-        <w:t xml:space="preserve"> </w:t>
-      </w:r>
-      <w:proofErr w:type="spellStart"/>
-      <w:r>
-        <w:t>Zielkunden</w:t>
-      </w:r>
-      <w:proofErr w:type="spellEnd"/>
-      <w:r>
-        <w:t xml:space="preserve"> </w:t>
-      </w:r>
-      <w:proofErr w:type="spellStart"/>
-      <w:r>
-        <w:t>sind</w:t>
-      </w:r>
-      <w:proofErr w:type="spellEnd"/>
-      <w:r>
-        <w:t xml:space="preserve"> </w:t>
-      </w:r>
-      <w:proofErr w:type="spellStart"/>
-      <w:r>
-        <w:t>unabhängige</w:t>
-      </w:r>
-      <w:proofErr w:type="spellEnd"/>
-      <w:r>
-        <w:t xml:space="preserve"> </w:t>
-      </w:r>
-      <w:proofErr w:type="spellStart"/>
-      <w:r>
-        <w:t>Werkstätten</w:t>
-      </w:r>
-      <w:proofErr w:type="spellEnd"/>
-      <w:r>
-        <w:t xml:space="preserve"> und </w:t>
-      </w:r>
-      <w:proofErr w:type="spellStart"/>
-      <w:r>
-        <w:t>kleine</w:t>
-      </w:r>
-      <w:proofErr w:type="spellEnd"/>
-      <w:r>
-        <w:t xml:space="preserve"> Ketten </w:t>
-      </w:r>
-      <w:proofErr w:type="spellStart"/>
-      <w:r>
-        <w:t>mit</w:t>
-      </w:r>
-      <w:proofErr w:type="spellEnd"/>
-      <w:r>
-        <w:t xml:space="preserve"> </w:t>
-      </w:r>
-      <w:proofErr w:type="spellStart"/>
-      <w:r>
-        <w:t>zwei</w:t>
-      </w:r>
-      <w:proofErr w:type="spellEnd"/>
-      <w:r>
-        <w:t xml:space="preserve"> bis </w:t>
-      </w:r>
-      <w:proofErr w:type="spellStart"/>
-      <w:r>
-        <w:t>zehn</w:t>
-      </w:r>
-      <w:proofErr w:type="spellEnd"/>
-      <w:r>
-        <w:t xml:space="preserve"> </w:t>
-      </w:r>
-      <w:proofErr w:type="spellStart"/>
-      <w:r>
-        <w:t>Filialen</w:t>
-      </w:r>
-      <w:proofErr w:type="spellEnd"/>
-      <w:r>
-        <w:t xml:space="preserve">. Die </w:t>
-      </w:r>
-      <w:proofErr w:type="spellStart"/>
-      <w:r>
-        <w:t>Reparatur</w:t>
-      </w:r>
-      <w:proofErr w:type="spellEnd"/>
-      <w:r>
-        <w:t xml:space="preserve"> </w:t>
-      </w:r>
-      <w:proofErr w:type="spellStart"/>
-      <w:r>
-        <w:t>selbst</w:t>
-      </w:r>
-      <w:proofErr w:type="spellEnd"/>
-      <w:r>
-        <w:t xml:space="preserve">, die Systeme der </w:t>
-      </w:r>
-      <w:proofErr w:type="spellStart"/>
-      <w:r>
-        <w:t>Lieferanten</w:t>
-      </w:r>
-      <w:proofErr w:type="spellEnd"/>
-      <w:r>
-        <w:t xml:space="preserve"> und die </w:t>
-      </w:r>
-      <w:proofErr w:type="spellStart"/>
-      <w:r>
-        <w:t>Buchhaltung</w:t>
-      </w:r>
-      <w:proofErr w:type="spellEnd"/>
-      <w:r>
-        <w:t xml:space="preserve"> </w:t>
-      </w:r>
-      <w:proofErr w:type="spellStart"/>
-      <w:r>
-        <w:t>gehören</w:t>
-      </w:r>
-      <w:proofErr w:type="spellEnd"/>
-      <w:r>
-        <w:t xml:space="preserve"> nicht </w:t>
-      </w:r>
-      <w:proofErr w:type="spellStart"/>
-      <w:r>
-        <w:t>zu</w:t>
-      </w:r>
-      <w:proofErr w:type="spellEnd"/>
-      <w:r>
-        <w:t xml:space="preserve"> </w:t>
-      </w:r>
-      <w:proofErr w:type="spellStart"/>
-      <w:r>
-        <w:t>RepairFlow</w:t>
-      </w:r>
-      <w:proofErr w:type="spellEnd"/>
-      <w:r>
-        <w:t xml:space="preserve">. </w:t>
-      </w:r>
-      <w:proofErr w:type="spellStart"/>
-      <w:r>
-        <w:t>Dorthin</w:t>
-      </w:r>
-      <w:proofErr w:type="spellEnd"/>
-      <w:r>
-        <w:t xml:space="preserve"> </w:t>
-      </w:r>
-      <w:proofErr w:type="spellStart"/>
-      <w:r>
-        <w:t>gibt</w:t>
-      </w:r>
-      <w:proofErr w:type="spellEnd"/>
-      <w:r>
-        <w:t xml:space="preserve"> es </w:t>
-      </w:r>
-      <w:proofErr w:type="spellStart"/>
-      <w:r>
-        <w:t>nur</w:t>
-      </w:r>
-      <w:proofErr w:type="spellEnd"/>
-      <w:r>
-        <w:t xml:space="preserve"> </w:t>
-      </w:r>
-      <w:proofErr w:type="spellStart"/>
-      <w:r>
-        <w:t>Schnittstellen</w:t>
-      </w:r>
-      <w:proofErr w:type="spellEnd"/>
-      <w:r>
-        <w:t xml:space="preserve">. </w:t>
-      </w:r>
-      <w:proofErr w:type="gramStart"/>
-      <w:r>
-        <w:t>Was die</w:t>
-      </w:r>
-      <w:proofErr w:type="gramEnd"/>
-      <w:r>
-        <w:t xml:space="preserve"> </w:t>
-      </w:r>
-      <w:proofErr w:type="spellStart"/>
-      <w:r>
-        <w:t>Werkstatt</w:t>
-      </w:r>
-      <w:proofErr w:type="spellEnd"/>
-      <w:r>
-        <w:t xml:space="preserve"> </w:t>
-      </w:r>
-      <w:proofErr w:type="spellStart"/>
-      <w:r>
-        <w:t>davon</w:t>
-      </w:r>
-      <w:proofErr w:type="spellEnd"/>
-      <w:r>
-        <w:t xml:space="preserve"> hat, </w:t>
-      </w:r>
-      <w:proofErr w:type="spellStart"/>
-      <w:r>
-        <w:t>zeigt</w:t>
-      </w:r>
-      <w:proofErr w:type="spellEnd"/>
-      <w:r>
-        <w:t xml:space="preserve"> Kilian.</w:t>
-      </w:r>
-    </w:p>
-    <w:p>
-      <w:r>
-        <w:t xml:space="preserve">Folie 5 – Drei </w:t>
+      <w:r>
+        <w:t xml:space="preserve">Folie 8 – Drei </w:t>
       </w:r>
       <w:proofErr w:type="spellStart"/>
       <w:proofErr w:type="gramStart"/>
@@ -2829,7 +983,7 @@
           <w:rFonts w:cs="Calibri"/>
           <w:bCs/>
         </w:rPr>
-        <w:t xml:space="preserve">Folien 6 und 7 – </w:t>
+        <w:t xml:space="preserve">Folien 9 und 10 – </w:t>
       </w:r>
       <w:proofErr w:type="spellStart"/>
       <w:r>
@@ -2915,7 +1069,7 @@
     </w:p>
     <w:p>
       <w:r>
-        <w:t xml:space="preserve">Folie 8 – Drei </w:t>
+        <w:t xml:space="preserve">Folie 11 – Drei </w:t>
       </w:r>
       <w:proofErr w:type="spellStart"/>
       <w:r>
@@ -2956,7 +1110,7 @@
           <w:rFonts w:cs="Calibri"/>
           <w:bCs/>
         </w:rPr>
-        <w:t>Folie 9 – Live-Demo: Die Kundenapp</w:t>
+        <w:t>Folie 12 – Live-Demo: Die Kundenapp</w:t>
       </w:r>
     </w:p>
     <w:p>
@@ -2966,7 +1120,7 @@
     </w:p>
     <w:p>
       <w:r>
-        <w:t xml:space="preserve">Folie 10 – KI-Sofortdiagnose: KVA in 60 </w:t>
+        <w:t xml:space="preserve">Folie 13 – KI-Sofortdiagnose: KVA in 60 </w:t>
       </w:r>
       <w:proofErr w:type="gramStart"/>
       <w:r>
@@ -3448,7 +1602,7 @@
     </w:p>
     <w:p>
       <w:r>
-        <w:t xml:space="preserve">Folie 11 – KI-Sofortdiagnose: Unsere </w:t>
+        <w:t xml:space="preserve">Folie 14 – KI-Sofortdiagnose: Unsere </w:t>
       </w:r>
       <w:proofErr w:type="gramStart"/>
       <w:r>
@@ -3786,7 +1940,7 @@
     </w:p>
     <w:p>
       <w:r>
-        <w:t xml:space="preserve">Folie 12 – Was wir gebaut haben: Ergebnisse in </w:t>
+        <w:t xml:space="preserve">Folie 15 – Was wir gebaut haben: Ergebnisse in </w:t>
       </w:r>
       <w:proofErr w:type="gramStart"/>
       <w:r>
@@ -3824,7 +1978,7 @@
     </w:p>
     <w:p>
       <w:r>
-        <w:t xml:space="preserve">Folie 13 – Zehn Prozesse, 62 Prozent </w:t>
+        <w:t xml:space="preserve">Folie 16 – Zehn Prozesse, 62 Prozent </w:t>
       </w:r>
       <w:proofErr w:type="gramStart"/>
       <w:r>
@@ -3858,7 +2012,7 @@
     </w:p>
     <w:p>
       <w:r>
-        <w:t>Folie 14 – Wer macht was im System?  (75 s)</w:t>
+        <w:t>Folie 17 – Wer macht was im System?  (75 s)</w:t>
       </w:r>
     </w:p>
     <w:p>
@@ -4475,7 +2629,7 @@
     </w:p>
     <w:p>
       <w:r>
-        <w:t xml:space="preserve">Folie 15 – Das Datenmodell: fünf </w:t>
+        <w:t xml:space="preserve">Folie 18 – Das Datenmodell: fünf </w:t>
       </w:r>
       <w:proofErr w:type="gramStart"/>
       <w:r>
@@ -5405,7 +3559,7 @@
     </w:p>
     <w:p>
       <w:r>
-        <w:t xml:space="preserve">Folie 16 – Qualität: Regeln, Werkzeuge, </w:t>
+        <w:t xml:space="preserve">Folie 19 – Qualität: Regeln, Werkzeuge, </w:t>
       </w:r>
       <w:proofErr w:type="gramStart"/>
       <w:r>
@@ -6146,7 +4300,7 @@
     </w:p>
     <w:p>
       <w:r>
-        <w:t xml:space="preserve">Folie 17 – Herausforderungen und </w:t>
+        <w:t xml:space="preserve">Folie 20 – Herausforderungen und </w:t>
       </w:r>
       <w:proofErr w:type="gramStart"/>
       <w:r>
@@ -6678,7 +4832,7 @@
         <w:rPr>
           <w:rStyle w:val="Fett"/>
         </w:rPr>
-        <w:t>Folie 18 – Vorgehen und Projektmanagement  (65 s)</w:t>
+        <w:t>Folie 21 – Vorgehen und Projektmanagement  (65 s)</w:t>
       </w:r>
     </w:p>
     <w:p>
@@ -6707,7 +4861,7 @@
         <w:rPr>
           <w:bCs/>
         </w:rPr>
-        <w:t xml:space="preserve">Folie 19 – Geschäftsmodell und </w:t>
+        <w:t xml:space="preserve">Folie 22 – Geschäftsmodell und </w:t>
       </w:r>
       <w:proofErr w:type="gramStart"/>
       <w:r>
@@ -6852,7 +5006,7 @@
         <w:rPr>
           <w:bCs/>
         </w:rPr>
-        <w:t xml:space="preserve">Folie 20 – Fazit und </w:t>
+        <w:t xml:space="preserve">Folie 23 – Fazit und </w:t>
       </w:r>
       <w:proofErr w:type="gramStart"/>
       <w:r>

</xml_diff>

<commit_message>
docs: Sprechtext Folien 17 und 18 vereinfacht
</commit_message>
<xml_diff>
--- a/4_praesentation/Sprechtext_Abschlusspraesentation.docx
+++ b/4_praesentation/Sprechtext_Abschlusspraesentation.docx
@@ -10,59 +10,13 @@
           <w:u w:val="single"/>
         </w:rPr>
       </w:pPr>
-      <w:proofErr w:type="spellStart"/>
       <w:r>
         <w:rPr>
           <w:b/>
           <w:bCs/>
           <w:u w:val="single"/>
         </w:rPr>
-        <w:t>Sprechtext</w:t>
-      </w:r>
-      <w:proofErr w:type="spellEnd"/>
-      <w:r>
-        <w:rPr>
-          <w:b/>
-          <w:bCs/>
-          <w:u w:val="single"/>
-        </w:rPr>
-        <w:t xml:space="preserve"> </w:t>
-      </w:r>
-      <w:proofErr w:type="spellStart"/>
-      <w:r>
-        <w:rPr>
-          <w:b/>
-          <w:bCs/>
-          <w:u w:val="single"/>
-        </w:rPr>
-        <w:t>Abschlusspräsentation</w:t>
-      </w:r>
-      <w:proofErr w:type="spellEnd"/>
-      <w:r>
-        <w:rPr>
-          <w:b/>
-          <w:bCs/>
-          <w:u w:val="single"/>
-        </w:rPr>
-        <w:t xml:space="preserve"> </w:t>
-      </w:r>
-      <w:proofErr w:type="spellStart"/>
-      <w:r>
-        <w:rPr>
-          <w:b/>
-          <w:bCs/>
-          <w:u w:val="single"/>
-        </w:rPr>
-        <w:t>RepairFlow</w:t>
-      </w:r>
-      <w:proofErr w:type="spellEnd"/>
-      <w:r>
-        <w:rPr>
-          <w:b/>
-          <w:bCs/>
-          <w:u w:val="single"/>
-        </w:rPr>
-        <w:t xml:space="preserve"> (ca. 19 Minuten)</w:t>
+        <w:t>Sprechtext Abschlusspräsentation RepairFlow (ca. 19 Minuten)</w:t>
       </w:r>
     </w:p>
     <w:p>
@@ -76,7 +30,6 @@
         <w:t>Folie 1 – Titel</w:t>
       </w:r>
       <w:r>
-        <w:rPr/>
         <w:t xml:space="preserve">  (12 s)</w:t>
       </w:r>
     </w:p>
@@ -102,7 +55,6 @@
         <w:t>Folie 2 – Unser Team</w:t>
       </w:r>
       <w:r>
-        <w:rPr/>
         <w:t xml:space="preserve">  (19 s)</w:t>
       </w:r>
     </w:p>
@@ -128,7 +80,6 @@
         <w:t>Folie 3 – Agenda, Teil 1</w:t>
       </w:r>
       <w:r>
-        <w:rPr/>
         <w:t xml:space="preserve">  (18 s)</w:t>
       </w:r>
     </w:p>
@@ -154,7 +105,6 @@
         <w:t>Folie 4 – Agenda, Teil 2</w:t>
       </w:r>
       <w:r>
-        <w:rPr/>
         <w:t xml:space="preserve">  (18 s)</w:t>
       </w:r>
     </w:p>
@@ -180,7 +130,6 @@
         <w:t>Folie 5 – Das Problem</w:t>
       </w:r>
       <w:r>
-        <w:rPr/>
         <w:t xml:space="preserve">  (45 s)</w:t>
       </w:r>
     </w:p>
@@ -221,7 +170,6 @@
         <w:t>Folie 6 – RepairFlow: die Lösung, Stufe 1</w:t>
       </w:r>
       <w:r>
-        <w:rPr/>
         <w:t xml:space="preserve">  (30 s)</w:t>
       </w:r>
     </w:p>
@@ -249,10 +197,10 @@
         <w:rPr>
           <w:b/>
         </w:rPr>
+        <w:lastRenderedPageBreak/>
         <w:t>Folie 7 – RepairFlow: die Lösung, Stufe 2</w:t>
       </w:r>
       <w:r>
-        <w:rPr/>
         <w:t xml:space="preserve">  (20 s)</w:t>
       </w:r>
     </w:p>
@@ -275,676 +223,44 @@
         <w:t>Folie 8 – Drei Nutzenversprechen</w:t>
       </w:r>
       <w:r>
-        <w:rPr/>
         <w:t xml:space="preserve">  (60 s)</w:t>
-      </w:r>
-      <w:proofErr w:type="spellStart"/>
-      <w:proofErr w:type="gramStart"/>
-      <w:proofErr w:type="spellEnd"/>
-      <w:proofErr w:type="gramEnd"/>
-    </w:p>
-    <w:p>
-      <w:r>
-        <w:t xml:space="preserve">Kilian: Was hat </w:t>
-      </w:r>
-      <w:proofErr w:type="spellStart"/>
-      <w:r>
-        <w:t>eine</w:t>
-      </w:r>
-      <w:proofErr w:type="spellEnd"/>
-      <w:r>
-        <w:t xml:space="preserve"> </w:t>
-      </w:r>
-      <w:proofErr w:type="spellStart"/>
-      <w:r>
-        <w:t>Werkstatt</w:t>
-      </w:r>
-      <w:proofErr w:type="spellEnd"/>
-      <w:r>
-        <w:t xml:space="preserve"> von </w:t>
-      </w:r>
-      <w:proofErr w:type="spellStart"/>
-      <w:r>
-        <w:t>RepairFlow</w:t>
-      </w:r>
-      <w:proofErr w:type="spellEnd"/>
-      <w:r>
-        <w:t xml:space="preserve">? Auf der Folie </w:t>
-      </w:r>
-      <w:proofErr w:type="spellStart"/>
-      <w:r>
-        <w:t>sehen</w:t>
-      </w:r>
-      <w:proofErr w:type="spellEnd"/>
-      <w:r>
-        <w:t xml:space="preserve"> Sie </w:t>
-      </w:r>
-      <w:proofErr w:type="spellStart"/>
-      <w:r>
-        <w:t>drei</w:t>
-      </w:r>
-      <w:proofErr w:type="spellEnd"/>
-      <w:r>
-        <w:t xml:space="preserve"> </w:t>
-      </w:r>
-      <w:proofErr w:type="spellStart"/>
-      <w:r>
-        <w:t>Punkte</w:t>
-      </w:r>
-      <w:proofErr w:type="spellEnd"/>
-      <w:r>
-        <w:t>.</w:t>
-      </w:r>
-    </w:p>
-    <w:p>
-      <w:proofErr w:type="spellStart"/>
-      <w:r>
-        <w:t>Erstens</w:t>
-      </w:r>
-      <w:proofErr w:type="spellEnd"/>
-      <w:r>
-        <w:t xml:space="preserve"> </w:t>
-      </w:r>
-      <w:proofErr w:type="spellStart"/>
-      <w:r>
-        <w:t>eine</w:t>
-      </w:r>
-      <w:proofErr w:type="spellEnd"/>
-      <w:r>
-        <w:t xml:space="preserve"> </w:t>
-      </w:r>
-      <w:proofErr w:type="spellStart"/>
-      <w:r>
-        <w:t>Plattform</w:t>
-      </w:r>
-      <w:proofErr w:type="spellEnd"/>
-      <w:r>
-        <w:t xml:space="preserve"> für </w:t>
-      </w:r>
-      <w:proofErr w:type="spellStart"/>
-      <w:r>
-        <w:t>alles</w:t>
-      </w:r>
-      <w:proofErr w:type="spellEnd"/>
-      <w:r>
-        <w:t xml:space="preserve">. </w:t>
-      </w:r>
-      <w:proofErr w:type="spellStart"/>
-      <w:r>
-        <w:t>Fahrräder</w:t>
-      </w:r>
-      <w:proofErr w:type="spellEnd"/>
-      <w:r>
-        <w:t xml:space="preserve">, E-Bikes und Elektronik </w:t>
-      </w:r>
-      <w:proofErr w:type="spellStart"/>
-      <w:r>
-        <w:t>laufen</w:t>
-      </w:r>
-      <w:proofErr w:type="spellEnd"/>
-      <w:r>
-        <w:t xml:space="preserve"> </w:t>
-      </w:r>
-      <w:proofErr w:type="spellStart"/>
-      <w:r>
-        <w:t>über</w:t>
-      </w:r>
-      <w:proofErr w:type="spellEnd"/>
-      <w:r>
-        <w:t xml:space="preserve"> </w:t>
-      </w:r>
-      <w:proofErr w:type="spellStart"/>
-      <w:r>
-        <w:t>dasselbe</w:t>
-      </w:r>
-      <w:proofErr w:type="spellEnd"/>
-      <w:r>
-        <w:t xml:space="preserve"> System. Es </w:t>
-      </w:r>
-      <w:proofErr w:type="spellStart"/>
-      <w:r>
-        <w:t>gibt</w:t>
-      </w:r>
-      <w:proofErr w:type="spellEnd"/>
-      <w:r>
-        <w:t xml:space="preserve"> </w:t>
-      </w:r>
-      <w:proofErr w:type="spellStart"/>
-      <w:r>
-        <w:t>eine</w:t>
-      </w:r>
-      <w:proofErr w:type="spellEnd"/>
-      <w:r>
-        <w:t xml:space="preserve"> </w:t>
-      </w:r>
-      <w:proofErr w:type="spellStart"/>
-      <w:r>
-        <w:t>Kundenliste</w:t>
-      </w:r>
-      <w:proofErr w:type="spellEnd"/>
-      <w:r>
-        <w:t xml:space="preserve">, </w:t>
-      </w:r>
-      <w:proofErr w:type="spellStart"/>
-      <w:r>
-        <w:t>ein</w:t>
-      </w:r>
-      <w:proofErr w:type="spellEnd"/>
-      <w:r>
-        <w:t xml:space="preserve"> </w:t>
-      </w:r>
-      <w:proofErr w:type="spellStart"/>
-      <w:r>
-        <w:t>Ersatzteillager</w:t>
-      </w:r>
-      <w:proofErr w:type="spellEnd"/>
-      <w:r>
-        <w:t xml:space="preserve"> und für </w:t>
-      </w:r>
-      <w:proofErr w:type="spellStart"/>
-      <w:r>
-        <w:t>jeden</w:t>
-      </w:r>
-      <w:proofErr w:type="spellEnd"/>
-      <w:r>
-        <w:t xml:space="preserve"> </w:t>
-      </w:r>
-      <w:proofErr w:type="spellStart"/>
-      <w:r>
-        <w:t>Auftrag</w:t>
-      </w:r>
-      <w:proofErr w:type="spellEnd"/>
-      <w:r>
-        <w:t xml:space="preserve"> </w:t>
-      </w:r>
-      <w:proofErr w:type="spellStart"/>
-      <w:r>
-        <w:t>einen</w:t>
-      </w:r>
-      <w:proofErr w:type="spellEnd"/>
-      <w:r>
-        <w:t xml:space="preserve"> Status, den alle </w:t>
-      </w:r>
-      <w:proofErr w:type="spellStart"/>
-      <w:r>
-        <w:t>sehen</w:t>
-      </w:r>
-      <w:proofErr w:type="spellEnd"/>
-      <w:r>
-        <w:t>.</w:t>
-      </w:r>
-    </w:p>
-    <w:p>
-      <w:proofErr w:type="spellStart"/>
-      <w:r>
-        <w:t>Zweitens</w:t>
-      </w:r>
-      <w:proofErr w:type="spellEnd"/>
-      <w:r>
-        <w:t xml:space="preserve"> </w:t>
-      </w:r>
-      <w:proofErr w:type="spellStart"/>
-      <w:r>
-        <w:t>arbeiten</w:t>
-      </w:r>
-      <w:proofErr w:type="spellEnd"/>
-      <w:r>
-        <w:t xml:space="preserve"> die </w:t>
-      </w:r>
-      <w:proofErr w:type="spellStart"/>
-      <w:r>
-        <w:t>Filialen</w:t>
-      </w:r>
-      <w:proofErr w:type="spellEnd"/>
-      <w:r>
-        <w:t xml:space="preserve"> </w:t>
-      </w:r>
-      <w:proofErr w:type="spellStart"/>
-      <w:r>
-        <w:t>zusammen</w:t>
-      </w:r>
-      <w:proofErr w:type="spellEnd"/>
-      <w:r>
-        <w:t xml:space="preserve">. </w:t>
-      </w:r>
-      <w:proofErr w:type="spellStart"/>
-      <w:r>
-        <w:t>RepairFlow</w:t>
-      </w:r>
-      <w:proofErr w:type="spellEnd"/>
-      <w:r>
-        <w:t xml:space="preserve"> </w:t>
-      </w:r>
-      <w:proofErr w:type="spellStart"/>
-      <w:r>
-        <w:t>sieht</w:t>
-      </w:r>
-      <w:proofErr w:type="spellEnd"/>
-      <w:r>
-        <w:t xml:space="preserve"> die Lager </w:t>
-      </w:r>
-      <w:proofErr w:type="spellStart"/>
-      <w:r>
-        <w:t>aller</w:t>
-      </w:r>
-      <w:proofErr w:type="spellEnd"/>
-      <w:r>
-        <w:t xml:space="preserve"> </w:t>
-      </w:r>
-      <w:proofErr w:type="spellStart"/>
-      <w:r>
-        <w:t>Standorte</w:t>
-      </w:r>
-      <w:proofErr w:type="spellEnd"/>
-      <w:r>
-        <w:t xml:space="preserve">. </w:t>
-      </w:r>
-      <w:proofErr w:type="spellStart"/>
-      <w:r>
-        <w:t>Liegt</w:t>
-      </w:r>
-      <w:proofErr w:type="spellEnd"/>
-      <w:r>
-        <w:t xml:space="preserve"> </w:t>
-      </w:r>
-      <w:proofErr w:type="spellStart"/>
-      <w:r>
-        <w:t>ein</w:t>
-      </w:r>
-      <w:proofErr w:type="spellEnd"/>
-      <w:r>
-        <w:t xml:space="preserve"> Teil in der </w:t>
-      </w:r>
-      <w:proofErr w:type="spellStart"/>
-      <w:r>
-        <w:t>Nachbarfiliale</w:t>
-      </w:r>
-      <w:proofErr w:type="spellEnd"/>
-      <w:r>
-        <w:t xml:space="preserve">, </w:t>
-      </w:r>
-      <w:proofErr w:type="spellStart"/>
-      <w:r>
-        <w:t>wird</w:t>
-      </w:r>
-      <w:proofErr w:type="spellEnd"/>
-      <w:r>
-        <w:t xml:space="preserve"> es </w:t>
-      </w:r>
-      <w:proofErr w:type="spellStart"/>
-      <w:r>
-        <w:t>dort</w:t>
-      </w:r>
-      <w:proofErr w:type="spellEnd"/>
-      <w:r>
-        <w:t xml:space="preserve"> </w:t>
-      </w:r>
-      <w:proofErr w:type="spellStart"/>
-      <w:r>
-        <w:t>reserviert</w:t>
-      </w:r>
-      <w:proofErr w:type="spellEnd"/>
-      <w:r>
-        <w:t xml:space="preserve"> </w:t>
-      </w:r>
-      <w:proofErr w:type="spellStart"/>
-      <w:r>
-        <w:t>oder</w:t>
-      </w:r>
-      <w:proofErr w:type="spellEnd"/>
-      <w:r>
-        <w:t xml:space="preserve"> </w:t>
-      </w:r>
-      <w:proofErr w:type="spellStart"/>
-      <w:r>
-        <w:t>herübergeschickt</w:t>
-      </w:r>
-      <w:proofErr w:type="spellEnd"/>
-      <w:r>
-        <w:t xml:space="preserve">. </w:t>
-      </w:r>
-      <w:proofErr w:type="spellStart"/>
-      <w:r>
-        <w:t>Bestellt</w:t>
-      </w:r>
-      <w:proofErr w:type="spellEnd"/>
-      <w:r>
-        <w:t xml:space="preserve"> </w:t>
-      </w:r>
-      <w:proofErr w:type="spellStart"/>
-      <w:r>
-        <w:t>wird</w:t>
-      </w:r>
-      <w:proofErr w:type="spellEnd"/>
-      <w:r>
-        <w:t xml:space="preserve"> </w:t>
-      </w:r>
-      <w:proofErr w:type="spellStart"/>
-      <w:r>
-        <w:t>nur</w:t>
-      </w:r>
-      <w:proofErr w:type="spellEnd"/>
-      <w:r>
-        <w:t xml:space="preserve">, was </w:t>
-      </w:r>
-      <w:proofErr w:type="spellStart"/>
-      <w:r>
-        <w:t>nirgends</w:t>
-      </w:r>
-      <w:proofErr w:type="spellEnd"/>
-      <w:r>
-        <w:t xml:space="preserve"> da </w:t>
-      </w:r>
-      <w:proofErr w:type="spellStart"/>
-      <w:r>
-        <w:t>ist</w:t>
-      </w:r>
-      <w:proofErr w:type="spellEnd"/>
-      <w:r>
-        <w:t>.</w:t>
-      </w:r>
-    </w:p>
-    <w:p>
-      <w:proofErr w:type="spellStart"/>
-      <w:r>
-        <w:t>Drittens</w:t>
-      </w:r>
-      <w:proofErr w:type="spellEnd"/>
-      <w:r>
-        <w:t xml:space="preserve"> </w:t>
-      </w:r>
-      <w:proofErr w:type="spellStart"/>
-      <w:r>
-        <w:t>weiß</w:t>
-      </w:r>
-      <w:proofErr w:type="spellEnd"/>
-      <w:r>
-        <w:t xml:space="preserve"> der Kunde </w:t>
-      </w:r>
-      <w:proofErr w:type="spellStart"/>
-      <w:r>
-        <w:t>vorher</w:t>
-      </w:r>
-      <w:proofErr w:type="spellEnd"/>
-      <w:r>
-        <w:t xml:space="preserve"> </w:t>
-      </w:r>
-      <w:proofErr w:type="spellStart"/>
-      <w:r>
-        <w:t>Bescheid</w:t>
-      </w:r>
-      <w:proofErr w:type="spellEnd"/>
-      <w:r>
-        <w:t xml:space="preserve">. Er </w:t>
-      </w:r>
-      <w:proofErr w:type="spellStart"/>
-      <w:r>
-        <w:t>schickt</w:t>
-      </w:r>
-      <w:proofErr w:type="spellEnd"/>
-      <w:r>
-        <w:t xml:space="preserve"> </w:t>
-      </w:r>
-      <w:proofErr w:type="spellStart"/>
-      <w:r>
-        <w:t>ein</w:t>
-      </w:r>
-      <w:proofErr w:type="spellEnd"/>
-      <w:r>
-        <w:t xml:space="preserve"> Foto </w:t>
-      </w:r>
-      <w:proofErr w:type="spellStart"/>
-      <w:r>
-        <w:t>über</w:t>
-      </w:r>
-      <w:proofErr w:type="spellEnd"/>
-      <w:r>
-        <w:t xml:space="preserve"> die App und </w:t>
-      </w:r>
-      <w:proofErr w:type="spellStart"/>
-      <w:r>
-        <w:t>bekommt</w:t>
-      </w:r>
-      <w:proofErr w:type="spellEnd"/>
-      <w:r>
-        <w:t xml:space="preserve"> </w:t>
-      </w:r>
-      <w:proofErr w:type="spellStart"/>
-      <w:r>
-        <w:t>einen</w:t>
-      </w:r>
-      <w:proofErr w:type="spellEnd"/>
-      <w:r>
-        <w:t xml:space="preserve"> </w:t>
-      </w:r>
-      <w:proofErr w:type="spellStart"/>
-      <w:r>
-        <w:t>Diagnosevorschlag</w:t>
-      </w:r>
-      <w:proofErr w:type="spellEnd"/>
-      <w:r>
-        <w:t xml:space="preserve">, </w:t>
-      </w:r>
-      <w:proofErr w:type="spellStart"/>
-      <w:r>
-        <w:t>einen</w:t>
-      </w:r>
-      <w:proofErr w:type="spellEnd"/>
-      <w:r>
-        <w:t xml:space="preserve"> </w:t>
-      </w:r>
-      <w:proofErr w:type="spellStart"/>
-      <w:r>
-        <w:t>ersten</w:t>
-      </w:r>
-      <w:proofErr w:type="spellEnd"/>
-      <w:r>
-        <w:t xml:space="preserve"> </w:t>
-      </w:r>
-      <w:proofErr w:type="spellStart"/>
-      <w:r>
-        <w:t>Kostenvoranschlag</w:t>
-      </w:r>
-      <w:proofErr w:type="spellEnd"/>
-      <w:r>
-        <w:t xml:space="preserve"> und </w:t>
-      </w:r>
-      <w:proofErr w:type="spellStart"/>
-      <w:r>
-        <w:t>einen</w:t>
-      </w:r>
-      <w:proofErr w:type="spellEnd"/>
-      <w:r>
-        <w:t xml:space="preserve"> Termin, </w:t>
-      </w:r>
-      <w:proofErr w:type="spellStart"/>
-      <w:r>
-        <w:t>noch</w:t>
-      </w:r>
-      <w:proofErr w:type="spellEnd"/>
-      <w:r>
-        <w:t xml:space="preserve"> bevor er in die </w:t>
-      </w:r>
-      <w:proofErr w:type="spellStart"/>
-      <w:r>
-        <w:t>Werkstatt</w:t>
-      </w:r>
-      <w:proofErr w:type="spellEnd"/>
-      <w:r>
-        <w:t xml:space="preserve"> </w:t>
-      </w:r>
-      <w:proofErr w:type="spellStart"/>
-      <w:r>
-        <w:t>kommt</w:t>
-      </w:r>
-      <w:proofErr w:type="spellEnd"/>
-      <w:r>
-        <w:t>.</w:t>
       </w:r>
     </w:p>
     <w:p>
       <w:r>
-        <w:t xml:space="preserve">Die </w:t>
+        <w:t>Kilian: Was hat eine Werkstatt von RepairFlow</w:t>
       </w:r>
-      <w:proofErr w:type="spellStart"/>
       <w:r>
-        <w:t>Werkstatt</w:t>
+        <w:t xml:space="preserve"> an Bausteinen</w:t>
       </w:r>
-      <w:proofErr w:type="spellEnd"/>
       <w:r>
-        <w:t xml:space="preserve"> muss </w:t>
+        <w:t>? Auf der Folie seh</w:t>
       </w:r>
-      <w:proofErr w:type="spellStart"/>
       <w:r>
-        <w:t>dadurch</w:t>
+        <w:t xml:space="preserve">t ihr </w:t>
       </w:r>
-      <w:proofErr w:type="spellEnd"/>
       <w:r>
-        <w:t xml:space="preserve"> </w:t>
+        <w:t>drei Punkte.</w:t>
       </w:r>
-      <w:proofErr w:type="spellStart"/>
+    </w:p>
+    <w:p>
       <w:r>
-        <w:t>weniger</w:t>
+        <w:t>Erstens eine Plattform für alles. Fahrräder, E-Bikes und Elektronik laufen über dasselbe System. Es gibt eine Kundenliste, ein Ersatzteillager und für jeden Auftrag einen Status, den alle sehen.</w:t>
       </w:r>
-      <w:proofErr w:type="spellEnd"/>
+    </w:p>
+    <w:p>
       <w:r>
-        <w:t xml:space="preserve"> </w:t>
+        <w:t>Zweitens arbeiten die Filialen zusammen. RepairFlow sieht die Lager aller Standorte. Liegt ein Teil in der Nachbarfiliale, wird es dort reserviert oder herübergeschickt. Bestellt wird nur, was nirgends da ist.</w:t>
       </w:r>
-      <w:proofErr w:type="spellStart"/>
+    </w:p>
+    <w:p>
       <w:r>
-        <w:t>telefonieren</w:t>
+        <w:t>Drittens weiß der Kunde vorher Bescheid. Er schickt ein Foto über die App und bekommt einen Diagnosevorschlag, einen ersten Kostenvoranschlag und einen Termin, noch bevor er in die Werkstatt kommt.</w:t>
       </w:r>
-      <w:proofErr w:type="spellEnd"/>
+    </w:p>
+    <w:p>
       <w:r>
-        <w:t xml:space="preserve">, </w:t>
-      </w:r>
-      <w:proofErr w:type="spellStart"/>
-      <w:r>
-        <w:t>Teile</w:t>
-      </w:r>
-      <w:proofErr w:type="spellEnd"/>
-      <w:r>
-        <w:t xml:space="preserve"> </w:t>
-      </w:r>
-      <w:proofErr w:type="spellStart"/>
-      <w:r>
-        <w:t>liegen</w:t>
-      </w:r>
-      <w:proofErr w:type="spellEnd"/>
-      <w:r>
-        <w:t xml:space="preserve"> </w:t>
-      </w:r>
-      <w:proofErr w:type="spellStart"/>
-      <w:r>
-        <w:t>kürzer</w:t>
-      </w:r>
-      <w:proofErr w:type="spellEnd"/>
-      <w:r>
-        <w:t xml:space="preserve"> </w:t>
-      </w:r>
-      <w:proofErr w:type="spellStart"/>
-      <w:r>
-        <w:t>im</w:t>
-      </w:r>
-      <w:proofErr w:type="spellEnd"/>
-      <w:r>
-        <w:t xml:space="preserve"> Lager, und </w:t>
-      </w:r>
-      <w:proofErr w:type="spellStart"/>
-      <w:r>
-        <w:t>sie</w:t>
-      </w:r>
-      <w:proofErr w:type="spellEnd"/>
-      <w:r>
-        <w:t xml:space="preserve"> </w:t>
-      </w:r>
-      <w:proofErr w:type="spellStart"/>
-      <w:r>
-        <w:t>sieht</w:t>
-      </w:r>
-      <w:proofErr w:type="spellEnd"/>
-      <w:r>
-        <w:t xml:space="preserve">, </w:t>
-      </w:r>
-      <w:proofErr w:type="spellStart"/>
-      <w:r>
-        <w:t>wie</w:t>
-      </w:r>
-      <w:proofErr w:type="spellEnd"/>
-      <w:r>
-        <w:t xml:space="preserve"> </w:t>
-      </w:r>
-      <w:proofErr w:type="spellStart"/>
-      <w:r>
-        <w:t>ausgelastet</w:t>
-      </w:r>
-      <w:proofErr w:type="spellEnd"/>
-      <w:r>
-        <w:t xml:space="preserve"> </w:t>
-      </w:r>
-      <w:proofErr w:type="spellStart"/>
-      <w:r>
-        <w:t>ihre</w:t>
-      </w:r>
-      <w:proofErr w:type="spellEnd"/>
-      <w:r>
-        <w:t xml:space="preserve"> </w:t>
-      </w:r>
-      <w:proofErr w:type="spellStart"/>
-      <w:r>
-        <w:t>Techniker</w:t>
-      </w:r>
-      <w:proofErr w:type="spellEnd"/>
-      <w:r>
-        <w:t xml:space="preserve"> </w:t>
-      </w:r>
-      <w:proofErr w:type="spellStart"/>
-      <w:r>
-        <w:t>sind</w:t>
-      </w:r>
-      <w:proofErr w:type="spellEnd"/>
-      <w:r>
-        <w:t xml:space="preserve">. Wie </w:t>
-      </w:r>
-      <w:proofErr w:type="spellStart"/>
-      <w:r>
-        <w:t>ein</w:t>
-      </w:r>
-      <w:proofErr w:type="spellEnd"/>
-      <w:r>
-        <w:t xml:space="preserve"> </w:t>
-      </w:r>
-      <w:proofErr w:type="spellStart"/>
-      <w:r>
-        <w:t>einzelner</w:t>
-      </w:r>
-      <w:proofErr w:type="spellEnd"/>
-      <w:r>
-        <w:t xml:space="preserve"> </w:t>
-      </w:r>
-      <w:proofErr w:type="spellStart"/>
-      <w:r>
-        <w:t>Auftrag</w:t>
-      </w:r>
-      <w:proofErr w:type="spellEnd"/>
-      <w:r>
-        <w:t xml:space="preserve"> </w:t>
-      </w:r>
-      <w:proofErr w:type="spellStart"/>
-      <w:r>
-        <w:t>abläuft</w:t>
-      </w:r>
-      <w:proofErr w:type="spellEnd"/>
-      <w:r>
-        <w:t xml:space="preserve">, </w:t>
-      </w:r>
-      <w:proofErr w:type="spellStart"/>
-      <w:r>
-        <w:t>zeigt</w:t>
-      </w:r>
-      <w:proofErr w:type="spellEnd"/>
-      <w:r>
-        <w:t xml:space="preserve"> Maximilian.</w:t>
+        <w:t>Die Werkstatt muss dadurch weniger telefonieren, Teile liegen kürzer im Lager, und sie sieht, wie ausgelastet ihre Techniker sind. Wie ein einzelner Auftrag abläuft, zeigt Maximilian.</w:t>
       </w:r>
     </w:p>
     <w:p>
@@ -964,8 +280,6 @@
         </w:rPr>
         <w:t>Folien 9 und 10 – Auftragsreise</w:t>
       </w:r>
-      <w:proofErr w:type="spellStart"/>
-      <w:proofErr w:type="spellEnd"/>
     </w:p>
     <w:p>
       <w:pPr>
@@ -981,61 +295,7 @@
           <w:rFonts w:cs="Calibri"/>
           <w:bCs/>
         </w:rPr>
-        <w:t xml:space="preserve">Maximilian: Stellen Sie sich Mike vor – er fährt jeden Tag mit dem E-Bike zur Arbeit und bemerkt morgens, dass am Motor etwas ausgetreten ist. Er macht ein Foto davon und öffnet die RepairFlow-App. Er wählt sein E-Bike aus, lädt das Foto hoch – und 60 Sekunden später hat er einen Diagnosevorschlag, einen vorläufigen Kostenvoranschlag und einen Terminvorschlag in der Filiale um die Ecke. Er bestätigt für den nächsten Morgen. In der Filiale gibt er das Rad ab, der Techniker prüft den Vorschlag, stellt die eigentliche Diagnose und schickt Mike den finalen Kostenvoranschlag in die App. Mike tippt auf „Freigeben“ – fertig. RepairFlow sucht das benötigte Ersatzteil in allen Filialen, findet es in einer Nachbarfiliale und lässt es umlegen. Keiner muss beim Lieferanten bestellen. Am Nachmittag bekommt Mike eine Benachrichtigung: Rad fertig, abholbereit. Er zahlt beim Abholen. Jeder dieser Schritte – von der Voranmeldung bis zur Abholung – ist ein Status im System: angenommen, in Diagnose, KVA offen, freigegeben, Teile bestellt, in Reparatur, fertig, abgeholt. Und abgelehnt, wenn Mike den KVA nicht freigibt oder die Reparatur scheitert. Dieser Zustandsautomat zieht sich durch alle unsere Modelle. Drei Stellen </w:t>
-      </w:r>
-      <w:proofErr w:type="spellStart"/>
-      <w:r>
-        <w:rPr>
-          <w:rStyle w:val="normaltextrun"/>
-          <w:rFonts w:cs="Calibri"/>
-          <w:bCs/>
-        </w:rPr>
-        <w:t>zeige</w:t>
-      </w:r>
-      <w:proofErr w:type="spellEnd"/>
-      <w:r>
-        <w:rPr>
-          <w:rStyle w:val="normaltextrun"/>
-          <w:rFonts w:cs="Calibri"/>
-          <w:bCs/>
-        </w:rPr>
-        <w:t xml:space="preserve"> ich </w:t>
-      </w:r>
-      <w:proofErr w:type="spellStart"/>
-      <w:r>
-        <w:rPr>
-          <w:rStyle w:val="normaltextrun"/>
-          <w:rFonts w:cs="Calibri"/>
-          <w:bCs/>
-        </w:rPr>
-        <w:t>jetzt</w:t>
-      </w:r>
-      <w:proofErr w:type="spellEnd"/>
-      <w:r>
-        <w:rPr>
-          <w:rStyle w:val="normaltextrun"/>
-          <w:rFonts w:cs="Calibri"/>
-          <w:bCs/>
-        </w:rPr>
-        <w:t xml:space="preserve"> </w:t>
-      </w:r>
-      <w:proofErr w:type="spellStart"/>
-      <w:r>
-        <w:rPr>
-          <w:rStyle w:val="normaltextrun"/>
-          <w:rFonts w:cs="Calibri"/>
-          <w:bCs/>
-        </w:rPr>
-        <w:t>genauer</w:t>
-      </w:r>
-      <w:proofErr w:type="spellEnd"/>
-      <w:r>
-        <w:rPr>
-          <w:rStyle w:val="normaltextrun"/>
-          <w:rFonts w:cs="Calibri"/>
-          <w:bCs/>
-        </w:rPr>
-        <w:t>.</w:t>
+        <w:t>Maximilian: Stellen Sie sich Mike vor – er fährt jeden Tag mit dem E-Bike zur Arbeit und bemerkt morgens, dass am Motor etwas ausgetreten ist. Er macht ein Foto davon und öffnet die RepairFlow-App. Er wählt sein E-Bike aus, lädt das Foto hoch – und 60 Sekunden später hat er einen Diagnosevorschlag, einen vorläufigen Kostenvoranschlag und einen Terminvorschlag in der Filiale um die Ecke. Er bestätigt für den nächsten Morgen. In der Filiale gibt er das Rad ab, der Techniker prüft den Vorschlag, stellt die eigentliche Diagnose und schickt Mike den finalen Kostenvoranschlag in die App. Mike tippt auf „Freigeben“ – fertig. RepairFlow sucht das benötigte Ersatzteil in allen Filialen, findet es in einer Nachbarfiliale und lässt es umlegen. Keiner muss beim Lieferanten bestellen. Am Nachmittag bekommt Mike eine Benachrichtigung: Rad fertig, abholbereit. Er zahlt beim Abholen. Jeder dieser Schritte – von der Voranmeldung bis zur Abholung – ist ein Status im System: angenommen, in Diagnose, KVA offen, freigegeben, Teile bestellt, in Reparatur, fertig, abgeholt. Und abgelehnt, wenn Mike den KVA nicht freigibt oder die Reparatur scheitert. Dieser Zustandsautomat zieht sich durch alle unsere Modelle. Drei Stellen zeige ich jetzt genauer.</w:t>
       </w:r>
     </w:p>
     <w:p>
@@ -1045,8 +305,6 @@
         </w:rPr>
         <w:t>Folie 11 – Drei Prozess-Highlights</w:t>
       </w:r>
-      <w:proofErr w:type="spellStart"/>
-      <w:proofErr w:type="spellEnd"/>
     </w:p>
     <w:p>
       <w:pPr>
@@ -1057,11 +315,11 @@
         </w:rPr>
       </w:pPr>
       <w:r>
-        <w:t xml:space="preserve">Maximilian: Hinter jedem dieser Schritte steckt ein Geschäftsprozess. Drei davon zeigen, wie RepairFlow mit Ausnahmesituationen umgeht. Beim Kostenvoranschlag in Prozess 04 wartet ein ereignisbasiertes </w:t>
+        <w:t xml:space="preserve">Maximilian: Hinter jedem dieser Schritte steckt ein Geschäftsprozess. Drei davon zeigen, wie RepairFlow mit Ausnahmesituationen umgeht. Beim Kostenvoranschlag in Prozess 04 wartet ein ereignisbasiertes Gateway auf Freigabe, Ablehnung oder Fristablauf nach drei Tagen. Meldet sich der Kunde nicht, erinnert RepairFlow ihn – höchstens zweimal. Kommt nach dem dritten Fristablauf keine Antwort, gilt </w:t>
       </w:r>
       <w:r>
         <w:lastRenderedPageBreak/>
-        <w:t>Gateway auf Freigabe, Ablehnung oder Fristablauf nach drei Tagen. Meldet sich der Kunde nicht, erinnert RepairFlow ihn – höchstens zweimal. Kommt nach dem dritten Fristablauf keine Antwort, gilt der KVA als abgelehnt, und das Gerät geht mit Diagnosepauschale zur Abholung. Kein Auftrag bleibt liegen. Bei der Disposition in Prozess 05 laufen für jedes benötigte Teil parallele Prüfungen: erst das eigene Lager, dann die anderen Filialen. Was lokal liegt, wird reserviert, was anderswo liegt, umgelagert – bestellt wird nur, was nirgends vorhanden ist. Und bei der Reklamation in Prozess 09 prüft der Techniker den Mangel, RepairFlow entscheidet nach Regel über Gewährleistung, und bei Gewährleistung gibt die Werkstattleitung einen kostenfreien Nacharbeitsauftrag frei, der wieder durch die normale Auftragsreise läuft. Wie sich das aus Kundensicht anfühlt, zeige ich jetzt in der App.</w:t>
+        <w:t>der KVA als abgelehnt, und das Gerät geht mit Diagnosepauschale zur Abholung. Kein Auftrag bleibt liegen. Bei der Disposition in Prozess 05 laufen für jedes benötigte Teil parallele Prüfungen: erst das eigene Lager, dann die anderen Filialen. Was lokal liegt, wird reserviert, was anderswo liegt, umgelagert – bestellt wird nur, was nirgends vorhanden ist. Und bei der Reklamation in Prozess 09 prüft der Techniker den Mangel, RepairFlow entscheidet nach Regel über Gewährleistung, und bei Gewährleistung gibt die Werkstattleitung einen kostenfreien Nacharbeitsauftrag frei, der wieder durch die normale Auftragsreise läuft. Wie sich das aus Kundensicht anfühlt, zeige ich jetzt in der App.</w:t>
       </w:r>
     </w:p>
     <w:p>
@@ -1095,421 +353,12 @@
         <w:t>Folie 13 – KI-Sofortdiagnose: KVA in 60 Sekunden</w:t>
       </w:r>
       <w:r>
-        <w:rPr/>
         <w:t xml:space="preserve">  (65 s)</w:t>
       </w:r>
-      <w:proofErr w:type="gramStart"/>
-      <w:proofErr w:type="gramEnd"/>
     </w:p>
     <w:p>
       <w:r>
-        <w:t xml:space="preserve">Adrian: Was </w:t>
-      </w:r>
-      <w:proofErr w:type="spellStart"/>
-      <w:r>
-        <w:t>RepairFlow</w:t>
-      </w:r>
-      <w:proofErr w:type="spellEnd"/>
-      <w:r>
-        <w:t xml:space="preserve"> von </w:t>
-      </w:r>
-      <w:proofErr w:type="spellStart"/>
-      <w:r>
-        <w:t>jeder</w:t>
-      </w:r>
-      <w:proofErr w:type="spellEnd"/>
-      <w:r>
-        <w:t xml:space="preserve"> </w:t>
-      </w:r>
-      <w:proofErr w:type="spellStart"/>
-      <w:r>
-        <w:t>anderen</w:t>
-      </w:r>
-      <w:proofErr w:type="spellEnd"/>
-      <w:r>
-        <w:t xml:space="preserve"> </w:t>
-      </w:r>
-      <w:proofErr w:type="spellStart"/>
-      <w:r>
-        <w:t>Werkstattsoftware</w:t>
-      </w:r>
-      <w:proofErr w:type="spellEnd"/>
-      <w:r>
-        <w:t xml:space="preserve"> </w:t>
-      </w:r>
-      <w:proofErr w:type="spellStart"/>
-      <w:r>
-        <w:t>unterscheidet</w:t>
-      </w:r>
-      <w:proofErr w:type="spellEnd"/>
-      <w:r>
-        <w:t xml:space="preserve">, </w:t>
-      </w:r>
-      <w:proofErr w:type="spellStart"/>
-      <w:r>
-        <w:t>läuft</w:t>
-      </w:r>
-      <w:proofErr w:type="spellEnd"/>
-      <w:r>
-        <w:t xml:space="preserve"> in </w:t>
-      </w:r>
-      <w:proofErr w:type="spellStart"/>
-      <w:r>
-        <w:t>unter</w:t>
-      </w:r>
-      <w:proofErr w:type="spellEnd"/>
-      <w:r>
-        <w:t xml:space="preserve"> </w:t>
-      </w:r>
-      <w:proofErr w:type="spellStart"/>
-      <w:r>
-        <w:t>einer</w:t>
-      </w:r>
-      <w:proofErr w:type="spellEnd"/>
-      <w:r>
-        <w:t xml:space="preserve"> Minute ab. Der Kunde </w:t>
-      </w:r>
-      <w:proofErr w:type="spellStart"/>
-      <w:r>
-        <w:t>macht</w:t>
-      </w:r>
-      <w:proofErr w:type="spellEnd"/>
-      <w:r>
-        <w:t xml:space="preserve"> </w:t>
-      </w:r>
-      <w:proofErr w:type="spellStart"/>
-      <w:r>
-        <w:t>ein</w:t>
-      </w:r>
-      <w:proofErr w:type="spellEnd"/>
-      <w:r>
-        <w:t xml:space="preserve"> Foto von </w:t>
-      </w:r>
-      <w:proofErr w:type="spellStart"/>
-      <w:r>
-        <w:t>seinem</w:t>
-      </w:r>
-      <w:proofErr w:type="spellEnd"/>
-      <w:r>
-        <w:t xml:space="preserve"> Gerät, </w:t>
-      </w:r>
-      <w:proofErr w:type="spellStart"/>
-      <w:r>
-        <w:t>lädt</w:t>
-      </w:r>
-      <w:proofErr w:type="spellEnd"/>
-      <w:r>
-        <w:t xml:space="preserve"> es in der App </w:t>
-      </w:r>
-      <w:proofErr w:type="spellStart"/>
-      <w:r>
-        <w:t>hoch</w:t>
-      </w:r>
-      <w:proofErr w:type="spellEnd"/>
-      <w:r>
-        <w:t xml:space="preserve">, und </w:t>
-      </w:r>
-      <w:proofErr w:type="spellStart"/>
-      <w:r>
-        <w:t>ein</w:t>
-      </w:r>
-      <w:proofErr w:type="spellEnd"/>
-      <w:r>
-        <w:t xml:space="preserve"> KI-Dienst </w:t>
-      </w:r>
-      <w:proofErr w:type="spellStart"/>
-      <w:r>
-        <w:t>erkennt</w:t>
-      </w:r>
-      <w:proofErr w:type="spellEnd"/>
-      <w:r>
-        <w:t xml:space="preserve"> </w:t>
-      </w:r>
-      <w:proofErr w:type="spellStart"/>
-      <w:r>
-        <w:t>daraus</w:t>
-      </w:r>
-      <w:proofErr w:type="spellEnd"/>
-      <w:r>
-        <w:t xml:space="preserve"> </w:t>
-      </w:r>
-      <w:proofErr w:type="spellStart"/>
-      <w:r>
-        <w:t>Gerätetyp</w:t>
-      </w:r>
-      <w:proofErr w:type="spellEnd"/>
-      <w:r>
-        <w:t xml:space="preserve">, </w:t>
-      </w:r>
-      <w:proofErr w:type="spellStart"/>
-      <w:r>
-        <w:t>wahrscheinliche</w:t>
-      </w:r>
-      <w:proofErr w:type="spellEnd"/>
-      <w:r>
-        <w:t xml:space="preserve"> Ursache und </w:t>
-      </w:r>
-      <w:proofErr w:type="spellStart"/>
-      <w:r>
-        <w:t>benötigte</w:t>
-      </w:r>
-      <w:proofErr w:type="spellEnd"/>
-      <w:r>
-        <w:t xml:space="preserve"> </w:t>
-      </w:r>
-      <w:proofErr w:type="spellStart"/>
-      <w:r>
-        <w:t>Ersatzteile</w:t>
-      </w:r>
-      <w:proofErr w:type="spellEnd"/>
-      <w:r>
-        <w:t xml:space="preserve">. </w:t>
-      </w:r>
-      <w:proofErr w:type="spellStart"/>
-      <w:r>
-        <w:t>RepairFlow</w:t>
-      </w:r>
-      <w:proofErr w:type="spellEnd"/>
-      <w:r>
-        <w:t xml:space="preserve"> </w:t>
-      </w:r>
-      <w:proofErr w:type="spellStart"/>
-      <w:r>
-        <w:t>rechnet</w:t>
-      </w:r>
-      <w:proofErr w:type="spellEnd"/>
-      <w:r>
-        <w:t xml:space="preserve"> </w:t>
-      </w:r>
-      <w:proofErr w:type="spellStart"/>
-      <w:r>
-        <w:t>sofort</w:t>
-      </w:r>
-      <w:proofErr w:type="spellEnd"/>
-      <w:r>
-        <w:t xml:space="preserve"> </w:t>
-      </w:r>
-      <w:proofErr w:type="spellStart"/>
-      <w:r>
-        <w:t>einen</w:t>
-      </w:r>
-      <w:proofErr w:type="spellEnd"/>
-      <w:r>
-        <w:t xml:space="preserve"> </w:t>
-      </w:r>
-      <w:proofErr w:type="spellStart"/>
-      <w:r>
-        <w:t>vorläufigen</w:t>
-      </w:r>
-      <w:proofErr w:type="spellEnd"/>
-      <w:r>
-        <w:t xml:space="preserve"> KVA, </w:t>
-      </w:r>
-      <w:proofErr w:type="spellStart"/>
-      <w:r>
-        <w:t>prüft</w:t>
-      </w:r>
-      <w:proofErr w:type="spellEnd"/>
-      <w:r>
-        <w:t xml:space="preserve"> die </w:t>
-      </w:r>
-      <w:proofErr w:type="spellStart"/>
-      <w:r>
-        <w:t>Verfügbarkeit</w:t>
-      </w:r>
-      <w:proofErr w:type="spellEnd"/>
-      <w:r>
-        <w:t xml:space="preserve"> in </w:t>
-      </w:r>
-      <w:proofErr w:type="spellStart"/>
-      <w:r>
-        <w:t>allen</w:t>
-      </w:r>
-      <w:proofErr w:type="spellEnd"/>
-      <w:r>
-        <w:t xml:space="preserve"> </w:t>
-      </w:r>
-      <w:proofErr w:type="spellStart"/>
-      <w:r>
-        <w:t>Filialen</w:t>
-      </w:r>
-      <w:proofErr w:type="spellEnd"/>
-      <w:r>
-        <w:t xml:space="preserve"> und </w:t>
-      </w:r>
-      <w:proofErr w:type="spellStart"/>
-      <w:r>
-        <w:t>schlägt</w:t>
-      </w:r>
-      <w:proofErr w:type="spellEnd"/>
-      <w:r>
-        <w:t xml:space="preserve"> Termin und </w:t>
-      </w:r>
-      <w:proofErr w:type="spellStart"/>
-      <w:r>
-        <w:t>Standort</w:t>
-      </w:r>
-      <w:proofErr w:type="spellEnd"/>
-      <w:r>
-        <w:t xml:space="preserve"> </w:t>
-      </w:r>
-      <w:proofErr w:type="spellStart"/>
-      <w:r>
-        <w:t>vor</w:t>
-      </w:r>
-      <w:proofErr w:type="spellEnd"/>
-      <w:r>
-        <w:t xml:space="preserve">. </w:t>
-      </w:r>
-      <w:proofErr w:type="spellStart"/>
-      <w:r>
-        <w:t>Konkret</w:t>
-      </w:r>
-      <w:proofErr w:type="spellEnd"/>
-      <w:r>
-        <w:t xml:space="preserve">: Der Kunde </w:t>
-      </w:r>
-      <w:proofErr w:type="spellStart"/>
-      <w:r>
-        <w:t>meldet</w:t>
-      </w:r>
-      <w:proofErr w:type="spellEnd"/>
-      <w:r>
-        <w:t xml:space="preserve"> </w:t>
-      </w:r>
-      <w:proofErr w:type="spellStart"/>
-      <w:r>
-        <w:t>ein</w:t>
-      </w:r>
-      <w:proofErr w:type="spellEnd"/>
-      <w:r>
-        <w:t xml:space="preserve"> E-Bike </w:t>
-      </w:r>
-      <w:proofErr w:type="spellStart"/>
-      <w:r>
-        <w:t>mit</w:t>
-      </w:r>
-      <w:proofErr w:type="spellEnd"/>
-      <w:r>
-        <w:t xml:space="preserve"> </w:t>
-      </w:r>
-      <w:proofErr w:type="spellStart"/>
-      <w:r>
-        <w:t>Motorproblem</w:t>
-      </w:r>
-      <w:proofErr w:type="spellEnd"/>
-      <w:r>
-        <w:t xml:space="preserve"> an, der KI-Dienst </w:t>
-      </w:r>
-      <w:proofErr w:type="spellStart"/>
-      <w:r>
-        <w:t>erkennt</w:t>
-      </w:r>
-      <w:proofErr w:type="spellEnd"/>
-      <w:r>
-        <w:t xml:space="preserve"> </w:t>
-      </w:r>
-      <w:proofErr w:type="spellStart"/>
-      <w:r>
-        <w:t>einen</w:t>
-      </w:r>
-      <w:proofErr w:type="spellEnd"/>
-      <w:r>
-        <w:t xml:space="preserve"> </w:t>
-      </w:r>
-      <w:proofErr w:type="spellStart"/>
-      <w:r>
-        <w:t>Batteriedefekt</w:t>
-      </w:r>
-      <w:proofErr w:type="spellEnd"/>
-      <w:r>
-        <w:t>. Die eigene Filiale hat sie nicht vorrätig. RepairFlow findet sie in der Nachbarfiliale und schlägt dem Kunden direkt Filiale und Termin vor. Bestätigt er, wird die Batterie dort vorreserviert.</w:t>
-      </w:r>
-      <w:proofErr w:type="spellStart"/>
-      <w:r/>
-      <w:proofErr w:type="spellEnd"/>
-      <w:r/>
-      <w:proofErr w:type="spellStart"/>
-      <w:r/>
-      <w:proofErr w:type="spellEnd"/>
-      <w:r/>
-      <w:proofErr w:type="spellStart"/>
-      <w:r/>
-      <w:proofErr w:type="spellEnd"/>
-      <w:r/>
-      <w:proofErr w:type="spellStart"/>
-      <w:r/>
-      <w:proofErr w:type="spellEnd"/>
-      <w:r/>
-      <w:proofErr w:type="spellStart"/>
-      <w:r/>
-      <w:proofErr w:type="spellEnd"/>
-      <w:r/>
-      <w:proofErr w:type="spellStart"/>
-      <w:r/>
-      <w:proofErr w:type="spellEnd"/>
-      <w:r/>
-      <w:proofErr w:type="spellStart"/>
-      <w:r/>
-      <w:proofErr w:type="spellEnd"/>
-      <w:r/>
-      <w:proofErr w:type="spellStart"/>
-      <w:r/>
-      <w:proofErr w:type="spellEnd"/>
-      <w:r/>
-      <w:proofErr w:type="spellStart"/>
-      <w:r/>
-      <w:proofErr w:type="spellEnd"/>
-      <w:r/>
-      <w:proofErr w:type="spellStart"/>
-      <w:r/>
-      <w:proofErr w:type="spellEnd"/>
-      <w:r/>
-      <w:proofErr w:type="spellStart"/>
-      <w:r/>
-      <w:proofErr w:type="spellEnd"/>
-      <w:r/>
-      <w:proofErr w:type="spellStart"/>
-      <w:r/>
-      <w:proofErr w:type="spellEnd"/>
-      <w:r/>
-      <w:proofErr w:type="spellStart"/>
-      <w:r/>
-      <w:proofErr w:type="spellEnd"/>
-      <w:r/>
-      <w:proofErr w:type="spellStart"/>
-      <w:r/>
-      <w:proofErr w:type="spellEnd"/>
-      <w:r/>
-      <w:proofErr w:type="spellStart"/>
-      <w:r/>
-      <w:proofErr w:type="spellEnd"/>
-      <w:r>
-        <w:t xml:space="preserve"> Alles </w:t>
-      </w:r>
-      <w:proofErr w:type="spellStart"/>
-      <w:r>
-        <w:t>noch</w:t>
-      </w:r>
-      <w:proofErr w:type="spellEnd"/>
-      <w:r>
-        <w:t xml:space="preserve"> bevor er die </w:t>
-      </w:r>
-      <w:proofErr w:type="spellStart"/>
-      <w:r>
-        <w:t>Werkstatt</w:t>
-      </w:r>
-      <w:proofErr w:type="spellEnd"/>
-      <w:r>
-        <w:t xml:space="preserve"> </w:t>
-      </w:r>
-      <w:proofErr w:type="spellStart"/>
-      <w:r>
-        <w:t>betreten</w:t>
-      </w:r>
-      <w:proofErr w:type="spellEnd"/>
-      <w:r>
-        <w:t xml:space="preserve"> hat.</w:t>
+        <w:t>Adrian: Was RepairFlow von jeder anderen Werkstattsoftware unterscheidet, läuft in unter einer Minute ab. Der Kunde macht ein Foto von seinem Gerät, lädt es in der App hoch, und ein KI-Dienst erkennt daraus Gerätetyp, wahrscheinliche Ursache und benötigte Ersatzteile. RepairFlow rechnet sofort einen vorläufigen KVA, prüft die Verfügbarkeit in allen Filialen und schlägt Termin und Standort vor. Konkret: Der Kunde meldet ein E-Bike mit Motorproblem an, der KI-Dienst erkennt einen Batteriedefekt. Die eigene Filiale hat sie nicht vorrätig. RepairFlow findet sie in der Nachbarfiliale und schlägt dem Kunden direkt Filiale und Termin vor. Bestätigt er, wird die Batterie dort vorreserviert. Alles noch bevor er die Werkstatt betreten hat.</w:t>
       </w:r>
     </w:p>
     <w:p>
@@ -1520,335 +369,12 @@
         <w:t>Folie 14 – KI-Sofortdiagnose: Unsere Vision</w:t>
       </w:r>
       <w:r>
-        <w:rPr/>
         <w:t xml:space="preserve">  (45 s)</w:t>
       </w:r>
-      <w:proofErr w:type="gramStart"/>
-      <w:proofErr w:type="gramEnd"/>
     </w:p>
     <w:p>
       <w:r>
-        <w:t xml:space="preserve">Adrian: Heute </w:t>
-      </w:r>
-      <w:proofErr w:type="spellStart"/>
-      <w:r>
-        <w:t>funktioniert</w:t>
-      </w:r>
-      <w:proofErr w:type="spellEnd"/>
-      <w:r>
-        <w:t xml:space="preserve"> das für </w:t>
-      </w:r>
-      <w:proofErr w:type="spellStart"/>
-      <w:r>
-        <w:t>sichtbare</w:t>
-      </w:r>
-      <w:proofErr w:type="spellEnd"/>
-      <w:r>
-        <w:t xml:space="preserve"> </w:t>
-      </w:r>
-      <w:proofErr w:type="spellStart"/>
-      <w:r>
-        <w:t>Schäden</w:t>
-      </w:r>
-      <w:proofErr w:type="spellEnd"/>
-      <w:r>
-        <w:t xml:space="preserve">: </w:t>
-      </w:r>
-      <w:proofErr w:type="spellStart"/>
-      <w:r>
-        <w:t>ein</w:t>
-      </w:r>
-      <w:proofErr w:type="spellEnd"/>
-      <w:r>
-        <w:t xml:space="preserve"> </w:t>
-      </w:r>
-      <w:proofErr w:type="spellStart"/>
-      <w:r>
-        <w:t>gebrochenes</w:t>
-      </w:r>
-      <w:proofErr w:type="spellEnd"/>
-      <w:r>
-        <w:t xml:space="preserve"> Display, </w:t>
-      </w:r>
-      <w:proofErr w:type="spellStart"/>
-      <w:r>
-        <w:t>eine</w:t>
-      </w:r>
-      <w:proofErr w:type="spellEnd"/>
-      <w:r>
-        <w:t xml:space="preserve"> </w:t>
-      </w:r>
-      <w:proofErr w:type="spellStart"/>
-      <w:r>
-        <w:t>gerissene</w:t>
-      </w:r>
-      <w:proofErr w:type="spellEnd"/>
-      <w:r>
-        <w:t xml:space="preserve"> Kette, </w:t>
-      </w:r>
-      <w:proofErr w:type="spellStart"/>
-      <w:r>
-        <w:t>ein</w:t>
-      </w:r>
-      <w:proofErr w:type="spellEnd"/>
-      <w:r>
-        <w:t xml:space="preserve"> </w:t>
-      </w:r>
-      <w:proofErr w:type="spellStart"/>
-      <w:r>
-        <w:t>verbogener</w:t>
-      </w:r>
-      <w:proofErr w:type="spellEnd"/>
-      <w:r>
-        <w:t xml:space="preserve"> Rahmen. Das Modell </w:t>
-      </w:r>
-      <w:proofErr w:type="spellStart"/>
-      <w:r>
-        <w:t>erkennt</w:t>
-      </w:r>
-      <w:proofErr w:type="spellEnd"/>
-      <w:r>
-        <w:t xml:space="preserve"> den Schaden und </w:t>
-      </w:r>
-      <w:proofErr w:type="spellStart"/>
-      <w:r>
-        <w:t>rechnet</w:t>
-      </w:r>
-      <w:proofErr w:type="spellEnd"/>
-      <w:r>
-        <w:t xml:space="preserve"> </w:t>
-      </w:r>
-      <w:proofErr w:type="spellStart"/>
-      <w:r>
-        <w:t>daraus</w:t>
-      </w:r>
-      <w:proofErr w:type="spellEnd"/>
-      <w:r>
-        <w:t xml:space="preserve"> </w:t>
-      </w:r>
-      <w:proofErr w:type="spellStart"/>
-      <w:r>
-        <w:t>einen</w:t>
-      </w:r>
-      <w:proofErr w:type="spellEnd"/>
-      <w:r>
-        <w:t xml:space="preserve"> </w:t>
-      </w:r>
-      <w:proofErr w:type="spellStart"/>
-      <w:r>
-        <w:t>Vorab</w:t>
-      </w:r>
-      <w:proofErr w:type="spellEnd"/>
-      <w:r>
-        <w:t xml:space="preserve">-KVA. Die Vision </w:t>
-      </w:r>
-      <w:proofErr w:type="spellStart"/>
-      <w:r>
-        <w:t>ist</w:t>
-      </w:r>
-      <w:proofErr w:type="spellEnd"/>
-      <w:r>
-        <w:t xml:space="preserve"> </w:t>
-      </w:r>
-      <w:proofErr w:type="spellStart"/>
-      <w:r>
-        <w:t>Geräuschanalyse</w:t>
-      </w:r>
-      <w:proofErr w:type="spellEnd"/>
-      <w:r>
-        <w:t xml:space="preserve"> </w:t>
-      </w:r>
-      <w:proofErr w:type="spellStart"/>
-      <w:r>
-        <w:t>bei</w:t>
-      </w:r>
-      <w:proofErr w:type="spellEnd"/>
-      <w:r>
-        <w:t xml:space="preserve"> E-Bike-</w:t>
-      </w:r>
-      <w:proofErr w:type="spellStart"/>
-      <w:r>
-        <w:t>Motoren</w:t>
-      </w:r>
-      <w:proofErr w:type="spellEnd"/>
-      <w:r>
-        <w:t xml:space="preserve"> und </w:t>
-      </w:r>
-      <w:proofErr w:type="spellStart"/>
-      <w:r>
-        <w:t>Aufwandsschätzung</w:t>
-      </w:r>
-      <w:proofErr w:type="spellEnd"/>
-      <w:r>
-        <w:t xml:space="preserve"> </w:t>
-      </w:r>
-      <w:proofErr w:type="spellStart"/>
-      <w:r>
-        <w:t>aus</w:t>
-      </w:r>
-      <w:proofErr w:type="spellEnd"/>
-      <w:r>
-        <w:t xml:space="preserve"> Video. Der </w:t>
-      </w:r>
-      <w:proofErr w:type="spellStart"/>
-      <w:r>
-        <w:t>Vorschlag</w:t>
-      </w:r>
-      <w:proofErr w:type="spellEnd"/>
-      <w:r>
-        <w:t xml:space="preserve"> </w:t>
-      </w:r>
-      <w:proofErr w:type="spellStart"/>
-      <w:r>
-        <w:t>bleibt</w:t>
-      </w:r>
-      <w:proofErr w:type="spellEnd"/>
-      <w:r>
-        <w:t xml:space="preserve"> immer </w:t>
-      </w:r>
-      <w:proofErr w:type="spellStart"/>
-      <w:r>
-        <w:t>vorläufig</w:t>
-      </w:r>
-      <w:proofErr w:type="spellEnd"/>
-      <w:r>
-        <w:t xml:space="preserve">, der </w:t>
-      </w:r>
-      <w:proofErr w:type="spellStart"/>
-      <w:r>
-        <w:t>Techniker</w:t>
-      </w:r>
-      <w:proofErr w:type="spellEnd"/>
-      <w:r>
-        <w:t xml:space="preserve"> </w:t>
-      </w:r>
-      <w:proofErr w:type="spellStart"/>
-      <w:r>
-        <w:t>bestätigt</w:t>
-      </w:r>
-      <w:proofErr w:type="spellEnd"/>
-      <w:r>
-        <w:t xml:space="preserve"> </w:t>
-      </w:r>
-      <w:proofErr w:type="spellStart"/>
-      <w:r>
-        <w:t>oder</w:t>
-      </w:r>
-      <w:proofErr w:type="spellEnd"/>
-      <w:r>
-        <w:t xml:space="preserve"> </w:t>
-      </w:r>
-      <w:proofErr w:type="spellStart"/>
-      <w:r>
-        <w:t>korrigiert</w:t>
-      </w:r>
-      <w:proofErr w:type="spellEnd"/>
-      <w:r>
-        <w:t xml:space="preserve">. Das </w:t>
-      </w:r>
-      <w:proofErr w:type="spellStart"/>
-      <w:r>
-        <w:t>ist</w:t>
-      </w:r>
-      <w:proofErr w:type="spellEnd"/>
-      <w:r>
-        <w:t xml:space="preserve"> </w:t>
-      </w:r>
-      <w:proofErr w:type="spellStart"/>
-      <w:r>
-        <w:t>keine</w:t>
-      </w:r>
-      <w:proofErr w:type="spellEnd"/>
-      <w:r>
-        <w:t xml:space="preserve"> </w:t>
-      </w:r>
-      <w:proofErr w:type="spellStart"/>
-      <w:r>
-        <w:t>Schwäche</w:t>
-      </w:r>
-      <w:proofErr w:type="spellEnd"/>
-      <w:r>
-        <w:t xml:space="preserve">, das war </w:t>
-      </w:r>
-      <w:proofErr w:type="spellStart"/>
-      <w:r>
-        <w:t>eine</w:t>
-      </w:r>
-      <w:proofErr w:type="spellEnd"/>
-      <w:r>
-        <w:t xml:space="preserve"> </w:t>
-      </w:r>
-      <w:proofErr w:type="spellStart"/>
-      <w:r>
-        <w:t>bewusste</w:t>
-      </w:r>
-      <w:proofErr w:type="spellEnd"/>
-      <w:r>
-        <w:t xml:space="preserve"> </w:t>
-      </w:r>
-      <w:proofErr w:type="spellStart"/>
-      <w:r>
-        <w:t>Entscheidung</w:t>
-      </w:r>
-      <w:proofErr w:type="spellEnd"/>
-      <w:r>
-        <w:t xml:space="preserve">. Medien </w:t>
-      </w:r>
-      <w:proofErr w:type="spellStart"/>
-      <w:r>
-        <w:t>werden</w:t>
-      </w:r>
-      <w:proofErr w:type="spellEnd"/>
-      <w:r>
-        <w:t xml:space="preserve"> </w:t>
-      </w:r>
-      <w:proofErr w:type="spellStart"/>
-      <w:r>
-        <w:t>nur</w:t>
-      </w:r>
-      <w:proofErr w:type="spellEnd"/>
-      <w:r>
-        <w:t xml:space="preserve"> </w:t>
-      </w:r>
-      <w:proofErr w:type="spellStart"/>
-      <w:r>
-        <w:t>mit</w:t>
-      </w:r>
-      <w:proofErr w:type="spellEnd"/>
-      <w:r>
-        <w:t xml:space="preserve"> </w:t>
-      </w:r>
-      <w:proofErr w:type="spellStart"/>
-      <w:r>
-        <w:t>Einwilligung</w:t>
-      </w:r>
-      <w:proofErr w:type="spellEnd"/>
-      <w:r>
-        <w:t xml:space="preserve"> </w:t>
-      </w:r>
-      <w:proofErr w:type="spellStart"/>
-      <w:r>
-        <w:t>verarbeitet</w:t>
-      </w:r>
-      <w:proofErr w:type="spellEnd"/>
-      <w:r>
-        <w:t xml:space="preserve"> und </w:t>
-      </w:r>
-      <w:proofErr w:type="spellStart"/>
-      <w:r>
-        <w:t>danach</w:t>
-      </w:r>
-      <w:proofErr w:type="spellEnd"/>
-      <w:r>
-        <w:t xml:space="preserve"> </w:t>
-      </w:r>
-      <w:proofErr w:type="spellStart"/>
-      <w:r>
-        <w:t>gelöscht</w:t>
-      </w:r>
-      <w:proofErr w:type="spellEnd"/>
-      <w:r>
-        <w:t>.</w:t>
+        <w:t>Adrian: Heute funktioniert das für sichtbare Schäden: ein gebrochenes Display, eine gerissene Kette, ein verbogener Rahmen. Das Modell erkennt den Schaden und rechnet daraus einen Vorab-KVA. Die Vision ist Geräuschanalyse bei E-Bike-Motoren und Aufwandsschätzung aus Video. Der Vorschlag bleibt immer vorläufig, der Techniker bestätigt oder korrigiert. Das ist keine Schwäche, das war eine bewusste Entscheidung. Medien werden nur mit Einwilligung verarbeitet und danach gelöscht.</w:t>
       </w:r>
     </w:p>
     <w:p>
@@ -1859,11 +385,8 @@
         <w:t>Folie 15 – Was wir gebaut haben: Ergebnisse in Zahlen</w:t>
       </w:r>
       <w:r>
-        <w:rPr/>
         <w:t xml:space="preserve">  (40 s)</w:t>
       </w:r>
-      <w:proofErr w:type="gramStart"/>
-      <w:proofErr w:type="gramEnd"/>
     </w:p>
     <w:p>
       <w:r>
@@ -1871,23 +394,7 @@
       </w:r>
       <w:r>
         <w:lastRenderedPageBreak/>
-        <w:t xml:space="preserve">Klassendiagramm eine eigene Klasse für den KI-Diagnosevorschlag, 29 Klassen, 40 Assoziationen. Dazu sechs Sequenzdiagramme. Alles in Camunda und Visual Paradigm, </w:t>
-      </w:r>
-      <w:proofErr w:type="spellStart"/>
-      <w:r>
-        <w:t>mit</w:t>
-      </w:r>
-      <w:proofErr w:type="spellEnd"/>
-      <w:r>
-        <w:t xml:space="preserve"> 20 Seiten </w:t>
-      </w:r>
-      <w:proofErr w:type="spellStart"/>
-      <w:r>
-        <w:t>Dokumentation</w:t>
-      </w:r>
-      <w:proofErr w:type="spellEnd"/>
-      <w:r>
-        <w:t>.</w:t>
+        <w:t>Klassendiagramm eine eigene Klasse für den KI-Diagnosevorschlag, 29 Klassen, 40 Assoziationen. Dazu sechs Sequenzdiagramme. Alles in Camunda und Visual Paradigm, mit 20 Seiten Dokumentation.</w:t>
       </w:r>
     </w:p>
     <w:p>
@@ -1898,649 +405,67 @@
         <w:t>Folie 16 – Zehn Prozesse, 62 Prozent automatisiert</w:t>
       </w:r>
       <w:r>
-        <w:rPr/>
         <w:t xml:space="preserve">  (50 s)</w:t>
       </w:r>
-      <w:proofErr w:type="gramStart"/>
-      <w:proofErr w:type="gramEnd"/>
     </w:p>
     <w:p>
       <w:r>
         <w:t xml:space="preserve">Adrian: 62 Prozent der 143 Aktivitäten erledigt RepairFlow ohne manuellen Eingriff. P01 läuft zu 100 Prozent automatisch, vom KI-Aufruf bis zur Vorreservierung. P05 bei 75 Prozent: Das System prüft alle Teile gleichzeitig, je Teil erst die eigene Filiale und dann die anderen, reserviert und lagert um. Was niedrig automatisiert ist, ist das absichtlich: P03 Fehlerdiagnose bei 46 Prozent, P07 Reparatur bei 46 Prozent. Dort greift der Techniker ein, unterstützt vom System, nicht ersetzt durch es. Wer welche Rolle </w:t>
       </w:r>
-      <w:proofErr w:type="spellStart"/>
+    </w:p>
+    <w:p>
+      <w:pPr>
+        <w:rPr>
+          <w:b/>
+          <w:bCs/>
+        </w:rPr>
+      </w:pPr>
       <w:r>
-        <w:t>dabei</w:t>
-      </w:r>
-      <w:proofErr w:type="spellEnd"/>
-      <w:r>
-        <w:t xml:space="preserve"> hat, </w:t>
-      </w:r>
-      <w:proofErr w:type="spellStart"/>
-      <w:r>
-        <w:t>zeigt</w:t>
-      </w:r>
-      <w:proofErr w:type="spellEnd"/>
-      <w:r>
-        <w:t xml:space="preserve"> Kilian.</w:t>
+        <w:rPr>
+          <w:b/>
+          <w:bCs/>
+        </w:rPr>
+        <w:t>Folie 17 – Wer macht was im System? (75 s)</w:t>
       </w:r>
     </w:p>
     <w:p>
       <w:r>
-        <w:rPr>
-          <w:b/>
-        </w:rPr>
-        <w:t>Folie 17 – Wer macht was im System?</w:t>
-      </w:r>
-      <w:r>
-        <w:rPr/>
-        <w:t xml:space="preserve">  (75 s)</w:t>
+        <w:t>Kilian: Jetzt geht es darum, wer im System was macht. Dafür nutzen wir Use Cases. Ein Use Case ist eine Aufgabe, die jemand mit RepairFlow erledigt. Zum Beispiel: einen Kostenvoranschlag freigeben.</w:t>
       </w:r>
     </w:p>
     <w:p>
       <w:r>
-        <w:t xml:space="preserve">Kilian: </w:t>
-      </w:r>
-      <w:proofErr w:type="spellStart"/>
-      <w:r>
-        <w:t>Jetzt</w:t>
-      </w:r>
-      <w:proofErr w:type="spellEnd"/>
-      <w:r>
-        <w:t xml:space="preserve"> </w:t>
-      </w:r>
-      <w:proofErr w:type="spellStart"/>
-      <w:r>
-        <w:t>geht</w:t>
-      </w:r>
-      <w:proofErr w:type="spellEnd"/>
-      <w:r>
-        <w:t xml:space="preserve"> es </w:t>
-      </w:r>
-      <w:proofErr w:type="spellStart"/>
-      <w:r>
-        <w:t>darum</w:t>
-      </w:r>
-      <w:proofErr w:type="spellEnd"/>
-      <w:r>
-        <w:t xml:space="preserve">, </w:t>
-      </w:r>
-      <w:proofErr w:type="spellStart"/>
-      <w:r>
-        <w:t>wer</w:t>
-      </w:r>
-      <w:proofErr w:type="spellEnd"/>
-      <w:r>
-        <w:t xml:space="preserve"> </w:t>
-      </w:r>
-      <w:proofErr w:type="spellStart"/>
-      <w:r>
-        <w:t>im</w:t>
-      </w:r>
-      <w:proofErr w:type="spellEnd"/>
-      <w:r>
-        <w:t xml:space="preserve"> System was </w:t>
-      </w:r>
-      <w:proofErr w:type="spellStart"/>
-      <w:r>
-        <w:t>macht</w:t>
-      </w:r>
-      <w:proofErr w:type="spellEnd"/>
-      <w:r>
-        <w:t xml:space="preserve">. </w:t>
-      </w:r>
-      <w:proofErr w:type="spellStart"/>
-      <w:r>
-        <w:t>Dafür</w:t>
-      </w:r>
-      <w:proofErr w:type="spellEnd"/>
-      <w:r>
-        <w:t xml:space="preserve"> </w:t>
-      </w:r>
-      <w:proofErr w:type="spellStart"/>
-      <w:r>
-        <w:t>haben</w:t>
-      </w:r>
-      <w:proofErr w:type="spellEnd"/>
-      <w:r>
-        <w:t xml:space="preserve"> </w:t>
-      </w:r>
-      <w:proofErr w:type="spellStart"/>
-      <w:r>
-        <w:t>wir</w:t>
-      </w:r>
-      <w:proofErr w:type="spellEnd"/>
-      <w:r>
-        <w:t xml:space="preserve"> Use Cases </w:t>
-      </w:r>
-      <w:proofErr w:type="spellStart"/>
-      <w:r>
-        <w:t>beschrieben</w:t>
-      </w:r>
-      <w:proofErr w:type="spellEnd"/>
-      <w:r>
-        <w:t xml:space="preserve">. Ein Use Case </w:t>
-      </w:r>
-      <w:proofErr w:type="spellStart"/>
-      <w:r>
-        <w:t>ist</w:t>
-      </w:r>
-      <w:proofErr w:type="spellEnd"/>
-      <w:r>
-        <w:t xml:space="preserve"> </w:t>
-      </w:r>
-      <w:proofErr w:type="spellStart"/>
-      <w:r>
-        <w:t>eine</w:t>
-      </w:r>
-      <w:proofErr w:type="spellEnd"/>
-      <w:r>
-        <w:t xml:space="preserve"> Aufgabe, die </w:t>
-      </w:r>
-      <w:proofErr w:type="spellStart"/>
-      <w:r>
-        <w:t>jemand</w:t>
-      </w:r>
-      <w:proofErr w:type="spellEnd"/>
-      <w:r>
-        <w:t xml:space="preserve"> </w:t>
-      </w:r>
-      <w:proofErr w:type="spellStart"/>
-      <w:r>
-        <w:t>mit</w:t>
-      </w:r>
-      <w:proofErr w:type="spellEnd"/>
-      <w:r>
-        <w:t xml:space="preserve"> </w:t>
-      </w:r>
-      <w:proofErr w:type="spellStart"/>
-      <w:r>
-        <w:t>RepairFlow</w:t>
-      </w:r>
-      <w:proofErr w:type="spellEnd"/>
-      <w:r>
-        <w:t xml:space="preserve"> </w:t>
-      </w:r>
-      <w:proofErr w:type="spellStart"/>
-      <w:r>
-        <w:t>erledigt</w:t>
-      </w:r>
-      <w:proofErr w:type="spellEnd"/>
-      <w:r>
-        <w:t xml:space="preserve">, </w:t>
-      </w:r>
-      <w:proofErr w:type="spellStart"/>
-      <w:r>
-        <w:t>zum</w:t>
-      </w:r>
-      <w:proofErr w:type="spellEnd"/>
-      <w:r>
-        <w:t xml:space="preserve"> </w:t>
-      </w:r>
-      <w:proofErr w:type="spellStart"/>
-      <w:r>
-        <w:t>Beispiel</w:t>
-      </w:r>
-      <w:proofErr w:type="spellEnd"/>
-      <w:r>
-        <w:t xml:space="preserve"> </w:t>
-      </w:r>
-      <w:proofErr w:type="spellStart"/>
-      <w:r>
-        <w:t>einen</w:t>
-      </w:r>
-      <w:proofErr w:type="spellEnd"/>
-      <w:r>
-        <w:t xml:space="preserve"> </w:t>
-      </w:r>
-      <w:proofErr w:type="spellStart"/>
-      <w:r>
-        <w:t>Kostenvoranschlag</w:t>
-      </w:r>
-      <w:proofErr w:type="spellEnd"/>
-      <w:r>
-        <w:t xml:space="preserve"> </w:t>
-      </w:r>
-      <w:proofErr w:type="spellStart"/>
-      <w:r>
-        <w:t>freigeben</w:t>
-      </w:r>
-      <w:proofErr w:type="spellEnd"/>
-      <w:r>
-        <w:t>.</w:t>
+        <w:t>Insgesamt haben wir 19 Use Cases. Wir haben sie in vier Bereiche aufgeteilt.</w:t>
       </w:r>
     </w:p>
     <w:p>
       <w:r>
-        <w:t>Wir haben die 19 Use Cases in vier Arbeitsbereiche gegliedert. Drei davon entsprechen unseren Modulen, die Abrechnung gehört zu Auftrag und Werkstatt. Dazu kommt die Verwaltung des Betriebs.</w:t>
-      </w:r>
-      <w:proofErr w:type="spellStart"/>
-      <w:r/>
-      <w:proofErr w:type="spellEnd"/>
-      <w:r/>
-      <w:proofErr w:type="spellStart"/>
-      <w:r/>
-      <w:proofErr w:type="spellEnd"/>
-      <w:r>
-        <w:t xml:space="preserve"> </w:t>
-      </w:r>
-      <w:proofErr w:type="spellStart"/>
-      <w:r>
-        <w:t>Im</w:t>
-      </w:r>
-      <w:proofErr w:type="spellEnd"/>
-      <w:r>
-        <w:t xml:space="preserve"> </w:t>
-      </w:r>
-      <w:proofErr w:type="spellStart"/>
-      <w:r>
-        <w:t>Kundenportal</w:t>
-      </w:r>
-      <w:proofErr w:type="spellEnd"/>
-      <w:r>
-        <w:t xml:space="preserve"> </w:t>
-      </w:r>
-      <w:proofErr w:type="spellStart"/>
-      <w:r>
-        <w:t>arbeitet</w:t>
-      </w:r>
-      <w:proofErr w:type="spellEnd"/>
-      <w:r>
-        <w:t xml:space="preserve"> der Kunde. Er </w:t>
-      </w:r>
-      <w:proofErr w:type="spellStart"/>
-      <w:r>
-        <w:t>fordert</w:t>
-      </w:r>
-      <w:proofErr w:type="spellEnd"/>
-      <w:r>
-        <w:t xml:space="preserve"> die </w:t>
-      </w:r>
-      <w:proofErr w:type="spellStart"/>
-      <w:r>
-        <w:t>Sofortdiagnose</w:t>
-      </w:r>
-      <w:proofErr w:type="spellEnd"/>
-      <w:r>
-        <w:t xml:space="preserve"> an, </w:t>
-      </w:r>
-      <w:proofErr w:type="spellStart"/>
-      <w:r>
-        <w:t>bestätigt seine Voranmeldung</w:t>
-      </w:r>
-      <w:proofErr w:type="spellEnd"/>
-      <w:r>
-        <w:t xml:space="preserve"> und </w:t>
-      </w:r>
-      <w:proofErr w:type="spellStart"/>
-      <w:r>
-        <w:t>gibt</w:t>
-      </w:r>
-      <w:proofErr w:type="spellEnd"/>
-      <w:r>
-        <w:t xml:space="preserve"> den </w:t>
-      </w:r>
-      <w:proofErr w:type="spellStart"/>
-      <w:r>
-        <w:t>Kostenvoranschlag</w:t>
-      </w:r>
-      <w:proofErr w:type="spellEnd"/>
-      <w:r>
-        <w:t xml:space="preserve"> </w:t>
-      </w:r>
-      <w:proofErr w:type="spellStart"/>
-      <w:r>
-        <w:t>frei</w:t>
-      </w:r>
-      <w:proofErr w:type="spellEnd"/>
-      <w:r>
-        <w:t xml:space="preserve"> </w:t>
-      </w:r>
-      <w:proofErr w:type="spellStart"/>
-      <w:r>
-        <w:t>oder</w:t>
-      </w:r>
-      <w:proofErr w:type="spellEnd"/>
-      <w:r>
-        <w:t xml:space="preserve"> </w:t>
-      </w:r>
-      <w:proofErr w:type="spellStart"/>
-      <w:r>
-        <w:t>lehnt</w:t>
-      </w:r>
-      <w:proofErr w:type="spellEnd"/>
-      <w:r>
-        <w:t xml:space="preserve"> </w:t>
-      </w:r>
-      <w:proofErr w:type="spellStart"/>
-      <w:r>
-        <w:t>ihn</w:t>
-      </w:r>
-      <w:proofErr w:type="spellEnd"/>
-      <w:r>
-        <w:t xml:space="preserve"> ab. Die Diagnose </w:t>
-      </w:r>
-      <w:proofErr w:type="spellStart"/>
-      <w:r>
-        <w:t>selbst</w:t>
-      </w:r>
-      <w:proofErr w:type="spellEnd"/>
-      <w:r>
-        <w:t xml:space="preserve"> </w:t>
-      </w:r>
-      <w:proofErr w:type="spellStart"/>
-      <w:r>
-        <w:t>liefert</w:t>
-      </w:r>
-      <w:proofErr w:type="spellEnd"/>
-      <w:r>
-        <w:t xml:space="preserve"> </w:t>
-      </w:r>
-      <w:proofErr w:type="spellStart"/>
-      <w:r>
-        <w:t>ein</w:t>
-      </w:r>
-      <w:proofErr w:type="spellEnd"/>
-      <w:r>
-        <w:t xml:space="preserve"> </w:t>
-      </w:r>
-      <w:proofErr w:type="spellStart"/>
-      <w:r>
-        <w:t>externer</w:t>
-      </w:r>
-      <w:proofErr w:type="spellEnd"/>
-      <w:r>
-        <w:t xml:space="preserve"> KI-Dienst. </w:t>
-      </w:r>
-      <w:proofErr w:type="spellStart"/>
-      <w:r>
-        <w:t>Im</w:t>
-      </w:r>
-      <w:proofErr w:type="spellEnd"/>
-      <w:r>
-        <w:t xml:space="preserve"> </w:t>
-      </w:r>
-      <w:proofErr w:type="spellStart"/>
-      <w:r>
-        <w:t>Bereich</w:t>
-      </w:r>
-      <w:proofErr w:type="spellEnd"/>
-      <w:r>
-        <w:t xml:space="preserve"> </w:t>
-      </w:r>
-      <w:proofErr w:type="spellStart"/>
-      <w:r>
-        <w:t>Auftrag</w:t>
-      </w:r>
-      <w:proofErr w:type="spellEnd"/>
-      <w:r>
-        <w:t xml:space="preserve"> und </w:t>
-      </w:r>
-      <w:proofErr w:type="spellStart"/>
-      <w:r>
-        <w:t>Werkstatt</w:t>
-      </w:r>
-      <w:proofErr w:type="spellEnd"/>
-      <w:r>
-        <w:t xml:space="preserve"> </w:t>
-      </w:r>
-      <w:proofErr w:type="spellStart"/>
-      <w:r>
-        <w:t>geht</w:t>
-      </w:r>
-      <w:proofErr w:type="spellEnd"/>
-      <w:r>
-        <w:t xml:space="preserve"> es von der </w:t>
-      </w:r>
-      <w:proofErr w:type="spellStart"/>
-      <w:r>
-        <w:t>Annahme</w:t>
-      </w:r>
-      <w:proofErr w:type="spellEnd"/>
-      <w:r>
-        <w:t xml:space="preserve"> des </w:t>
-      </w:r>
-      <w:proofErr w:type="spellStart"/>
-      <w:r>
-        <w:t>Geräts</w:t>
-      </w:r>
-      <w:proofErr w:type="spellEnd"/>
-      <w:r>
-        <w:t xml:space="preserve"> bis </w:t>
-      </w:r>
-      <w:proofErr w:type="spellStart"/>
-      <w:r>
-        <w:t>zur</w:t>
-      </w:r>
-      <w:proofErr w:type="spellEnd"/>
-      <w:r>
-        <w:t xml:space="preserve"> </w:t>
-      </w:r>
-      <w:proofErr w:type="spellStart"/>
-      <w:r>
-        <w:t>Reklamation</w:t>
-      </w:r>
-      <w:proofErr w:type="spellEnd"/>
-      <w:r>
-        <w:t xml:space="preserve">. Bei der </w:t>
-      </w:r>
-      <w:proofErr w:type="spellStart"/>
-      <w:r>
-        <w:t>Ersatzteil</w:t>
-      </w:r>
-      <w:proofErr w:type="spellEnd"/>
-      <w:r>
-        <w:t xml:space="preserve">-Disposition </w:t>
-      </w:r>
-      <w:proofErr w:type="spellStart"/>
-      <w:r>
-        <w:t>werden</w:t>
-      </w:r>
-      <w:proofErr w:type="spellEnd"/>
-      <w:r>
-        <w:t xml:space="preserve"> </w:t>
-      </w:r>
-      <w:proofErr w:type="spellStart"/>
-      <w:r>
-        <w:t>Teile</w:t>
-      </w:r>
-      <w:proofErr w:type="spellEnd"/>
-      <w:r>
-        <w:t xml:space="preserve"> </w:t>
-      </w:r>
-      <w:proofErr w:type="spellStart"/>
-      <w:r>
-        <w:t>reserviert</w:t>
-      </w:r>
-      <w:proofErr w:type="spellEnd"/>
-      <w:r>
-        <w:t xml:space="preserve">, </w:t>
-      </w:r>
-      <w:proofErr w:type="spellStart"/>
-      <w:r>
-        <w:t>bestellt</w:t>
-      </w:r>
-      <w:proofErr w:type="spellEnd"/>
-      <w:r>
-        <w:t xml:space="preserve">, </w:t>
-      </w:r>
-      <w:proofErr w:type="spellStart"/>
-      <w:r>
-        <w:t>eingebucht</w:t>
-      </w:r>
-      <w:proofErr w:type="spellEnd"/>
-      <w:r>
-        <w:t xml:space="preserve"> und </w:t>
-      </w:r>
-      <w:proofErr w:type="spellStart"/>
-      <w:r>
-        <w:t>bei</w:t>
-      </w:r>
-      <w:proofErr w:type="spellEnd"/>
-      <w:r>
-        <w:t xml:space="preserve"> </w:t>
-      </w:r>
-      <w:proofErr w:type="spellStart"/>
-      <w:r>
-        <w:t>Mängeln</w:t>
-      </w:r>
-      <w:proofErr w:type="spellEnd"/>
-      <w:r>
-        <w:t xml:space="preserve"> </w:t>
-      </w:r>
-      <w:proofErr w:type="spellStart"/>
-      <w:r>
-        <w:t>zurückgeschickt</w:t>
-      </w:r>
-      <w:proofErr w:type="spellEnd"/>
-      <w:r>
-        <w:t xml:space="preserve">. Und </w:t>
-      </w:r>
-      <w:proofErr w:type="spellStart"/>
-      <w:r>
-        <w:t>ein</w:t>
-      </w:r>
-      <w:proofErr w:type="spellEnd"/>
-      <w:r>
-        <w:t xml:space="preserve"> Administrator </w:t>
-      </w:r>
-      <w:proofErr w:type="spellStart"/>
-      <w:r>
-        <w:t>verwaltet</w:t>
-      </w:r>
-      <w:proofErr w:type="spellEnd"/>
-      <w:r>
-        <w:t xml:space="preserve"> den </w:t>
-      </w:r>
-      <w:proofErr w:type="spellStart"/>
-      <w:r>
-        <w:t>Betrieb</w:t>
-      </w:r>
-      <w:proofErr w:type="spellEnd"/>
-      <w:r>
-        <w:t xml:space="preserve"> </w:t>
-      </w:r>
-      <w:proofErr w:type="spellStart"/>
-      <w:r>
-        <w:t>mit</w:t>
-      </w:r>
-      <w:proofErr w:type="spellEnd"/>
-      <w:r>
-        <w:t xml:space="preserve"> seinen </w:t>
-      </w:r>
-      <w:proofErr w:type="spellStart"/>
-      <w:r>
-        <w:t>Filialen</w:t>
-      </w:r>
-      <w:proofErr w:type="spellEnd"/>
-      <w:r>
-        <w:t>.</w:t>
+        <w:t>Im Kundenportal arbeitet der Kunde. Er fordert die Sofortdiagnose an, bestätigt den vorgeschlagenen Termin und nimmt den Kostenvoranschlag an oder lehnt ihn ab. Die Diagnose selbst kommt von einem externen KI-Dienst.</w:t>
       </w:r>
     </w:p>
     <w:p>
       <w:r>
-        <w:t xml:space="preserve">Nach dem Coaching haben wir eine Regel eingeführt: Jeder Use Case hat genau eine Rolle als Hauptakteur. Früher stand bei fünf Aufgaben einfach „Techniker“. Heute gibt es dafür eigene Rollen, zum Beispiel den Diagnostiker, den Kalkulator und den Endkontrolleur. Welcher Mitarbeiter welche Rolle übernimmt, legt die </w:t>
-      </w:r>
-      <w:proofErr w:type="spellStart"/>
-      <w:r>
-        <w:t>Werkstatt</w:t>
-      </w:r>
-      <w:proofErr w:type="spellEnd"/>
-      <w:r>
-        <w:t xml:space="preserve"> </w:t>
-      </w:r>
-      <w:proofErr w:type="spellStart"/>
-      <w:r>
-        <w:t>selbst</w:t>
-      </w:r>
-      <w:proofErr w:type="spellEnd"/>
-      <w:r>
-        <w:t xml:space="preserve"> fest.</w:t>
+        <w:t>Im Bereich Auftrag und Werkstatt geht es um alles von der Abgabe des Geräts bis zur Reklamation. Auch die Rechnung gehört dazu.</w:t>
       </w:r>
     </w:p>
     <w:p>
       <w:r>
-        <w:t xml:space="preserve">Den </w:t>
+        <w:t>Bei den Ersatzteilen werden Teile reserviert, bestellt, eingebucht und bei Mängeln zurückgeschickt.</w:t>
       </w:r>
-      <w:proofErr w:type="spellStart"/>
+    </w:p>
+    <w:p>
       <w:r>
-        <w:t>Lieferanten</w:t>
+        <w:t>Der vierte Bereich ist die Verwaltung. Dort pflegt ein Administrator den Betrieb und seine Filialen.</w:t>
       </w:r>
-      <w:proofErr w:type="spellEnd"/>
+    </w:p>
+    <w:p>
       <w:r>
-        <w:t xml:space="preserve"> </w:t>
+        <w:t>Nach einem Coaching haben wir eine Regel eingeführt: Für jede Aufgabe ist genau eine Rolle zuständig. Früher stand bei fünf Aufgaben einfach „Techniker“. Jetzt gibt es dafür eigene Rollen, zum Beispiel den Diagnostiker oder den Endkontrolleur. Welcher Mitarbeiter welche Rolle übernimmt, entscheidet die Werkstatt selbst.</w:t>
       </w:r>
-      <w:proofErr w:type="spellStart"/>
+    </w:p>
+    <w:p>
       <w:r>
-        <w:t>haben</w:t>
-      </w:r>
-      <w:proofErr w:type="spellEnd"/>
-      <w:r>
-        <w:t xml:space="preserve"> </w:t>
-      </w:r>
-      <w:proofErr w:type="spellStart"/>
-      <w:r>
-        <w:t>wir</w:t>
-      </w:r>
-      <w:proofErr w:type="spellEnd"/>
-      <w:r>
-        <w:t xml:space="preserve"> nicht </w:t>
-      </w:r>
-      <w:proofErr w:type="spellStart"/>
-      <w:r>
-        <w:t>aufgenommen</w:t>
-      </w:r>
-      <w:proofErr w:type="spellEnd"/>
-      <w:r>
-        <w:t xml:space="preserve">. Er </w:t>
-      </w:r>
-      <w:proofErr w:type="spellStart"/>
-      <w:r>
-        <w:t>arbeitet</w:t>
-      </w:r>
-      <w:proofErr w:type="spellEnd"/>
-      <w:r>
-        <w:t xml:space="preserve"> nicht </w:t>
-      </w:r>
-      <w:proofErr w:type="spellStart"/>
-      <w:r>
-        <w:t>mit</w:t>
-      </w:r>
-      <w:proofErr w:type="spellEnd"/>
-      <w:r>
-        <w:t xml:space="preserve"> </w:t>
-      </w:r>
-      <w:proofErr w:type="spellStart"/>
-      <w:r>
-        <w:t>RepairFlow</w:t>
-      </w:r>
-      <w:proofErr w:type="spellEnd"/>
-      <w:r>
-        <w:t xml:space="preserve"> und </w:t>
-      </w:r>
-      <w:proofErr w:type="spellStart"/>
-      <w:r>
-        <w:t>bleibt</w:t>
-      </w:r>
-      <w:proofErr w:type="spellEnd"/>
-      <w:r>
-        <w:t xml:space="preserve"> für </w:t>
-      </w:r>
-      <w:proofErr w:type="spellStart"/>
-      <w:r>
-        <w:t>uns</w:t>
-      </w:r>
-      <w:proofErr w:type="spellEnd"/>
-      <w:r>
-        <w:t xml:space="preserve"> </w:t>
-      </w:r>
-      <w:proofErr w:type="spellStart"/>
-      <w:r>
-        <w:t>eine</w:t>
-      </w:r>
-      <w:proofErr w:type="spellEnd"/>
-      <w:r>
-        <w:t xml:space="preserve"> Black Box.</w:t>
+        <w:t>Den Lieferanten haben wir hier bewusst weggelassen. Er arbeitet nicht in RepairFlow. Er bekommt von uns nur Nachrichten, zum Beispiel Bestellungen.</w:t>
       </w:r>
     </w:p>
     <w:p>
@@ -2551,905 +476,43 @@
         <w:t>Folie 18 – Das Datenmodell: Fünf Entscheidungen</w:t>
       </w:r>
       <w:r>
-        <w:rPr/>
         <w:t xml:space="preserve">  (85 s)</w:t>
-      </w:r>
-      <w:proofErr w:type="gramStart"/>
-      <w:proofErr w:type="gramEnd"/>
-    </w:p>
-    <w:p>
-      <w:r>
-        <w:t xml:space="preserve">Kilian: Zum </w:t>
-      </w:r>
-      <w:proofErr w:type="spellStart"/>
-      <w:r>
-        <w:t>Schluss</w:t>
-      </w:r>
-      <w:proofErr w:type="spellEnd"/>
-      <w:r>
-        <w:t xml:space="preserve"> </w:t>
-      </w:r>
-      <w:proofErr w:type="spellStart"/>
-      <w:r>
-        <w:t>meines</w:t>
-      </w:r>
-      <w:proofErr w:type="spellEnd"/>
-      <w:r>
-        <w:t xml:space="preserve"> Teils das </w:t>
-      </w:r>
-      <w:proofErr w:type="spellStart"/>
-      <w:r>
-        <w:t>Datenmodell</w:t>
-      </w:r>
-      <w:proofErr w:type="spellEnd"/>
-      <w:r>
-        <w:t xml:space="preserve">. Es </w:t>
-      </w:r>
-      <w:proofErr w:type="spellStart"/>
-      <w:r>
-        <w:t>beschreibt</w:t>
-      </w:r>
-      <w:proofErr w:type="spellEnd"/>
-      <w:r>
-        <w:t xml:space="preserve">, </w:t>
-      </w:r>
-      <w:proofErr w:type="spellStart"/>
-      <w:r>
-        <w:t>welche</w:t>
-      </w:r>
-      <w:proofErr w:type="spellEnd"/>
-      <w:r>
-        <w:t xml:space="preserve"> </w:t>
-      </w:r>
-      <w:proofErr w:type="spellStart"/>
-      <w:r>
-        <w:t>Daten</w:t>
-      </w:r>
-      <w:proofErr w:type="spellEnd"/>
-      <w:r>
-        <w:t xml:space="preserve"> </w:t>
-      </w:r>
-      <w:proofErr w:type="spellStart"/>
-      <w:r>
-        <w:t>RepairFlow</w:t>
-      </w:r>
-      <w:proofErr w:type="spellEnd"/>
-      <w:r>
-        <w:t xml:space="preserve"> </w:t>
-      </w:r>
-      <w:proofErr w:type="spellStart"/>
-      <w:r>
-        <w:t>speichert</w:t>
-      </w:r>
-      <w:proofErr w:type="spellEnd"/>
-      <w:r>
-        <w:t xml:space="preserve"> und </w:t>
-      </w:r>
-      <w:proofErr w:type="spellStart"/>
-      <w:r>
-        <w:t>wie</w:t>
-      </w:r>
-      <w:proofErr w:type="spellEnd"/>
-      <w:r>
-        <w:t xml:space="preserve"> </w:t>
-      </w:r>
-      <w:proofErr w:type="spellStart"/>
-      <w:r>
-        <w:t>sie</w:t>
-      </w:r>
-      <w:proofErr w:type="spellEnd"/>
-      <w:r>
-        <w:t xml:space="preserve"> </w:t>
-      </w:r>
-      <w:proofErr w:type="spellStart"/>
-      <w:r>
-        <w:t>zusammenhängen</w:t>
-      </w:r>
-      <w:proofErr w:type="spellEnd"/>
-      <w:r>
-        <w:t xml:space="preserve">. </w:t>
-      </w:r>
-      <w:proofErr w:type="spellStart"/>
-      <w:r>
-        <w:t>Insgesamt</w:t>
-      </w:r>
-      <w:proofErr w:type="spellEnd"/>
-      <w:r>
-        <w:t xml:space="preserve"> </w:t>
-      </w:r>
-      <w:proofErr w:type="spellStart"/>
-      <w:r>
-        <w:t>sind</w:t>
-      </w:r>
-      <w:proofErr w:type="spellEnd"/>
-      <w:r>
-        <w:t xml:space="preserve"> es 29 Klassen. </w:t>
-      </w:r>
-      <w:proofErr w:type="spellStart"/>
-      <w:r>
-        <w:t>Fünf</w:t>
-      </w:r>
-      <w:proofErr w:type="spellEnd"/>
-      <w:r>
-        <w:t xml:space="preserve"> </w:t>
-      </w:r>
-      <w:proofErr w:type="spellStart"/>
-      <w:r>
-        <w:t>Entscheidungen</w:t>
-      </w:r>
-      <w:proofErr w:type="spellEnd"/>
-      <w:r>
-        <w:t xml:space="preserve"> </w:t>
-      </w:r>
-      <w:proofErr w:type="spellStart"/>
-      <w:r>
-        <w:t>erkläre</w:t>
-      </w:r>
-      <w:proofErr w:type="spellEnd"/>
-      <w:r>
-        <w:t xml:space="preserve"> ich </w:t>
-      </w:r>
-      <w:proofErr w:type="spellStart"/>
-      <w:r>
-        <w:t>kurz</w:t>
-      </w:r>
-      <w:proofErr w:type="spellEnd"/>
-      <w:r>
-        <w:t>.</w:t>
-      </w:r>
-    </w:p>
-    <w:p>
-      <w:proofErr w:type="spellStart"/>
-      <w:r>
-        <w:t>Erstens</w:t>
-      </w:r>
-      <w:proofErr w:type="spellEnd"/>
-      <w:r>
-        <w:t xml:space="preserve"> </w:t>
-      </w:r>
-      <w:proofErr w:type="spellStart"/>
-      <w:r>
-        <w:t>steht</w:t>
-      </w:r>
-      <w:proofErr w:type="spellEnd"/>
-      <w:r>
-        <w:t xml:space="preserve"> der </w:t>
-      </w:r>
-      <w:proofErr w:type="spellStart"/>
-      <w:r>
-        <w:t>Reparaturauftrag</w:t>
-      </w:r>
-      <w:proofErr w:type="spellEnd"/>
-      <w:r>
-        <w:t xml:space="preserve"> </w:t>
-      </w:r>
-      <w:proofErr w:type="spellStart"/>
-      <w:r>
-        <w:t>im</w:t>
-      </w:r>
-      <w:proofErr w:type="spellEnd"/>
-      <w:r>
-        <w:t xml:space="preserve"> </w:t>
-      </w:r>
-      <w:proofErr w:type="spellStart"/>
-      <w:r>
-        <w:t>Mittelpunkt</w:t>
-      </w:r>
-      <w:proofErr w:type="spellEnd"/>
-      <w:r>
-        <w:t xml:space="preserve">. </w:t>
-      </w:r>
-      <w:proofErr w:type="spellStart"/>
-      <w:r>
-        <w:t>Befund</w:t>
-      </w:r>
-      <w:proofErr w:type="spellEnd"/>
-      <w:r>
-        <w:t xml:space="preserve"> und </w:t>
-      </w:r>
-      <w:proofErr w:type="spellStart"/>
-      <w:r>
-        <w:t>Reparaturschritte</w:t>
-      </w:r>
-      <w:proofErr w:type="spellEnd"/>
-      <w:r>
-        <w:t xml:space="preserve"> </w:t>
-      </w:r>
-      <w:proofErr w:type="spellStart"/>
-      <w:r>
-        <w:t>gehören</w:t>
-      </w:r>
-      <w:proofErr w:type="spellEnd"/>
-      <w:r>
-        <w:t xml:space="preserve"> fest </w:t>
-      </w:r>
-      <w:proofErr w:type="spellStart"/>
-      <w:r>
-        <w:t>zum</w:t>
-      </w:r>
-      <w:proofErr w:type="spellEnd"/>
-      <w:r>
-        <w:t xml:space="preserve"> </w:t>
-      </w:r>
-      <w:proofErr w:type="spellStart"/>
-      <w:r>
-        <w:t>Auftrag</w:t>
-      </w:r>
-      <w:proofErr w:type="spellEnd"/>
-      <w:r>
-        <w:t xml:space="preserve">. Der </w:t>
-      </w:r>
-      <w:proofErr w:type="spellStart"/>
-      <w:r>
-        <w:t>Kostenvoranschlag</w:t>
-      </w:r>
-      <w:proofErr w:type="spellEnd"/>
-      <w:r>
-        <w:t xml:space="preserve"> </w:t>
-      </w:r>
-      <w:proofErr w:type="spellStart"/>
-      <w:r>
-        <w:t>hängt</w:t>
-      </w:r>
-      <w:proofErr w:type="spellEnd"/>
-      <w:r>
-        <w:t xml:space="preserve"> </w:t>
-      </w:r>
-      <w:proofErr w:type="spellStart"/>
-      <w:r>
-        <w:t>nur</w:t>
-      </w:r>
-      <w:proofErr w:type="spellEnd"/>
-      <w:r>
-        <w:t xml:space="preserve"> lose am </w:t>
-      </w:r>
-      <w:proofErr w:type="spellStart"/>
-      <w:r>
-        <w:t>Auftrag</w:t>
-      </w:r>
-      <w:proofErr w:type="spellEnd"/>
-      <w:r>
-        <w:t xml:space="preserve">, </w:t>
-      </w:r>
-      <w:proofErr w:type="spellStart"/>
-      <w:r>
-        <w:t>weil</w:t>
-      </w:r>
-      <w:proofErr w:type="spellEnd"/>
-      <w:r>
-        <w:t xml:space="preserve"> der </w:t>
-      </w:r>
-      <w:proofErr w:type="spellStart"/>
-      <w:r>
-        <w:t>erste</w:t>
-      </w:r>
-      <w:proofErr w:type="spellEnd"/>
-      <w:r>
-        <w:t xml:space="preserve"> </w:t>
-      </w:r>
-      <w:proofErr w:type="spellStart"/>
-      <w:r>
-        <w:t>Kostenvoranschlag</w:t>
-      </w:r>
-      <w:proofErr w:type="spellEnd"/>
-      <w:r>
-        <w:t xml:space="preserve"> </w:t>
-      </w:r>
-      <w:proofErr w:type="spellStart"/>
-      <w:r>
-        <w:t>schon</w:t>
-      </w:r>
-      <w:proofErr w:type="spellEnd"/>
-      <w:r>
-        <w:t xml:space="preserve"> </w:t>
-      </w:r>
-      <w:proofErr w:type="spellStart"/>
-      <w:r>
-        <w:t>entsteht</w:t>
-      </w:r>
-      <w:proofErr w:type="spellEnd"/>
-      <w:r>
-        <w:t xml:space="preserve">, bevor es </w:t>
-      </w:r>
-      <w:proofErr w:type="spellStart"/>
-      <w:r>
-        <w:t>einen</w:t>
-      </w:r>
-      <w:proofErr w:type="spellEnd"/>
-      <w:r>
-        <w:t xml:space="preserve"> </w:t>
-      </w:r>
-      <w:proofErr w:type="spellStart"/>
-      <w:r>
-        <w:t>Auftrag</w:t>
-      </w:r>
-      <w:proofErr w:type="spellEnd"/>
-      <w:r>
-        <w:t xml:space="preserve"> </w:t>
-      </w:r>
-      <w:proofErr w:type="spellStart"/>
-      <w:r>
-        <w:t>gibt</w:t>
-      </w:r>
-      <w:proofErr w:type="spellEnd"/>
-      <w:r>
-        <w:t>.</w:t>
-      </w:r>
-    </w:p>
-    <w:p>
-      <w:proofErr w:type="spellStart"/>
-      <w:r>
-        <w:t>Zweitens</w:t>
-      </w:r>
-      <w:proofErr w:type="spellEnd"/>
-      <w:r>
-        <w:t xml:space="preserve"> </w:t>
-      </w:r>
-      <w:proofErr w:type="spellStart"/>
-      <w:r>
-        <w:t>ist</w:t>
-      </w:r>
-      <w:proofErr w:type="spellEnd"/>
-      <w:r>
-        <w:t xml:space="preserve"> der </w:t>
-      </w:r>
-      <w:proofErr w:type="spellStart"/>
-      <w:r>
-        <w:t>Lagerbestand</w:t>
-      </w:r>
-      <w:proofErr w:type="spellEnd"/>
-      <w:r>
-        <w:t xml:space="preserve"> </w:t>
-      </w:r>
-      <w:proofErr w:type="spellStart"/>
-      <w:r>
-        <w:t>eine</w:t>
-      </w:r>
-      <w:proofErr w:type="spellEnd"/>
-      <w:r>
-        <w:t xml:space="preserve"> </w:t>
-      </w:r>
-      <w:proofErr w:type="spellStart"/>
-      <w:r>
-        <w:t>eigene</w:t>
-      </w:r>
-      <w:proofErr w:type="spellEnd"/>
-      <w:r>
-        <w:t xml:space="preserve"> Klasse. Er </w:t>
-      </w:r>
-      <w:proofErr w:type="spellStart"/>
-      <w:r>
-        <w:t>sagt</w:t>
-      </w:r>
-      <w:proofErr w:type="spellEnd"/>
-      <w:r>
-        <w:t xml:space="preserve">, </w:t>
-      </w:r>
-      <w:proofErr w:type="spellStart"/>
-      <w:r>
-        <w:t>wie</w:t>
-      </w:r>
-      <w:proofErr w:type="spellEnd"/>
-      <w:r>
-        <w:t xml:space="preserve"> </w:t>
-      </w:r>
-      <w:proofErr w:type="spellStart"/>
-      <w:r>
-        <w:t>viel</w:t>
-      </w:r>
-      <w:proofErr w:type="spellEnd"/>
-      <w:r>
-        <w:t xml:space="preserve"> von </w:t>
-      </w:r>
-      <w:proofErr w:type="spellStart"/>
-      <w:r>
-        <w:t>einem</w:t>
-      </w:r>
-      <w:proofErr w:type="spellEnd"/>
-      <w:r>
-        <w:t xml:space="preserve"> Teil in </w:t>
-      </w:r>
-      <w:proofErr w:type="spellStart"/>
-      <w:r>
-        <w:t>welcher</w:t>
-      </w:r>
-      <w:proofErr w:type="spellEnd"/>
-      <w:r>
-        <w:t xml:space="preserve"> </w:t>
-      </w:r>
-      <w:proofErr w:type="spellStart"/>
-      <w:r>
-        <w:t>Filiale</w:t>
-      </w:r>
-      <w:proofErr w:type="spellEnd"/>
-      <w:r>
-        <w:t xml:space="preserve"> </w:t>
-      </w:r>
-      <w:proofErr w:type="spellStart"/>
-      <w:r>
-        <w:t>liegt</w:t>
-      </w:r>
-      <w:proofErr w:type="spellEnd"/>
-      <w:r>
-        <w:t xml:space="preserve">. Nur so </w:t>
-      </w:r>
-      <w:proofErr w:type="spellStart"/>
-      <w:r>
-        <w:t>kann</w:t>
-      </w:r>
-      <w:proofErr w:type="spellEnd"/>
-      <w:r>
-        <w:t xml:space="preserve"> </w:t>
-      </w:r>
-      <w:proofErr w:type="spellStart"/>
-      <w:r>
-        <w:t>RepairFlow</w:t>
-      </w:r>
-      <w:proofErr w:type="spellEnd"/>
-      <w:r>
-        <w:t xml:space="preserve"> alle </w:t>
-      </w:r>
-      <w:proofErr w:type="spellStart"/>
-      <w:r>
-        <w:t>Filialen</w:t>
-      </w:r>
-      <w:proofErr w:type="spellEnd"/>
-      <w:r>
-        <w:t xml:space="preserve"> </w:t>
-      </w:r>
-      <w:proofErr w:type="spellStart"/>
-      <w:r>
-        <w:t>durchsuchen</w:t>
-      </w:r>
-      <w:proofErr w:type="spellEnd"/>
-      <w:r>
-        <w:t>.</w:t>
-      </w:r>
-    </w:p>
-    <w:p>
-      <w:proofErr w:type="spellStart"/>
-      <w:r>
-        <w:t>Drittens</w:t>
-      </w:r>
-      <w:proofErr w:type="spellEnd"/>
-      <w:r>
-        <w:t xml:space="preserve"> </w:t>
-      </w:r>
-      <w:proofErr w:type="spellStart"/>
-      <w:r>
-        <w:t>ist</w:t>
-      </w:r>
-      <w:proofErr w:type="spellEnd"/>
-      <w:r>
-        <w:t xml:space="preserve"> </w:t>
-      </w:r>
-      <w:proofErr w:type="spellStart"/>
-      <w:r>
-        <w:t>auch</w:t>
-      </w:r>
-      <w:proofErr w:type="spellEnd"/>
-      <w:r>
-        <w:t xml:space="preserve"> die </w:t>
-      </w:r>
-      <w:proofErr w:type="spellStart"/>
-      <w:r>
-        <w:t>Reservierung</w:t>
-      </w:r>
-      <w:proofErr w:type="spellEnd"/>
-      <w:r>
-        <w:t xml:space="preserve"> </w:t>
-      </w:r>
-      <w:proofErr w:type="spellStart"/>
-      <w:r>
-        <w:t>eine</w:t>
-      </w:r>
-      <w:proofErr w:type="spellEnd"/>
-      <w:r>
-        <w:t xml:space="preserve"> </w:t>
-      </w:r>
-      <w:proofErr w:type="spellStart"/>
-      <w:r>
-        <w:t>eigene</w:t>
-      </w:r>
-      <w:proofErr w:type="spellEnd"/>
-      <w:r>
-        <w:t xml:space="preserve"> Klasse, </w:t>
-      </w:r>
-      <w:proofErr w:type="spellStart"/>
-      <w:r>
-        <w:t>weil</w:t>
-      </w:r>
-      <w:proofErr w:type="spellEnd"/>
-      <w:r>
-        <w:t xml:space="preserve"> </w:t>
-      </w:r>
-      <w:proofErr w:type="spellStart"/>
-      <w:r>
-        <w:t>sie</w:t>
-      </w:r>
-      <w:proofErr w:type="spellEnd"/>
-      <w:r>
-        <w:t xml:space="preserve"> </w:t>
-      </w:r>
-      <w:proofErr w:type="spellStart"/>
-      <w:r>
-        <w:t>sich</w:t>
-      </w:r>
-      <w:proofErr w:type="spellEnd"/>
-      <w:r>
-        <w:t xml:space="preserve"> </w:t>
-      </w:r>
-      <w:proofErr w:type="spellStart"/>
-      <w:r>
-        <w:t>verändert</w:t>
-      </w:r>
-      <w:proofErr w:type="spellEnd"/>
-      <w:r>
-        <w:t xml:space="preserve">. Erst </w:t>
-      </w:r>
-      <w:proofErr w:type="spellStart"/>
-      <w:r>
-        <w:t>ist</w:t>
-      </w:r>
-      <w:proofErr w:type="spellEnd"/>
-      <w:r>
-        <w:t xml:space="preserve"> </w:t>
-      </w:r>
-      <w:proofErr w:type="spellStart"/>
-      <w:r>
-        <w:t>ein</w:t>
-      </w:r>
-      <w:proofErr w:type="spellEnd"/>
-      <w:r>
-        <w:t xml:space="preserve"> Teil </w:t>
-      </w:r>
-      <w:proofErr w:type="spellStart"/>
-      <w:r>
-        <w:t>vorreserviert</w:t>
-      </w:r>
-      <w:proofErr w:type="spellEnd"/>
-      <w:r>
-        <w:t xml:space="preserve">, </w:t>
-      </w:r>
-      <w:proofErr w:type="spellStart"/>
-      <w:r>
-        <w:t>dann</w:t>
-      </w:r>
-      <w:proofErr w:type="spellEnd"/>
-      <w:r>
-        <w:t xml:space="preserve"> </w:t>
-      </w:r>
-      <w:proofErr w:type="spellStart"/>
-      <w:r>
-        <w:t>reserviert</w:t>
-      </w:r>
-      <w:proofErr w:type="spellEnd"/>
-      <w:r>
-        <w:t xml:space="preserve"> und am Ende </w:t>
-      </w:r>
-      <w:proofErr w:type="spellStart"/>
-      <w:r>
-        <w:t>entnommen</w:t>
-      </w:r>
-      <w:proofErr w:type="spellEnd"/>
-      <w:r>
-        <w:t xml:space="preserve"> </w:t>
-      </w:r>
-      <w:proofErr w:type="spellStart"/>
-      <w:r>
-        <w:t>oder</w:t>
-      </w:r>
-      <w:proofErr w:type="spellEnd"/>
-      <w:r>
-        <w:t xml:space="preserve"> </w:t>
-      </w:r>
-      <w:proofErr w:type="spellStart"/>
-      <w:r>
-        <w:t>storniert</w:t>
-      </w:r>
-      <w:proofErr w:type="spellEnd"/>
-      <w:r>
-        <w:t>.</w:t>
-      </w:r>
-    </w:p>
-    <w:p>
-      <w:proofErr w:type="spellStart"/>
-      <w:r>
-        <w:lastRenderedPageBreak/>
-        <w:t>Viertens</w:t>
-      </w:r>
-      <w:proofErr w:type="spellEnd"/>
-      <w:r>
-        <w:t xml:space="preserve"> </w:t>
-      </w:r>
-      <w:proofErr w:type="spellStart"/>
-      <w:r>
-        <w:t>ist</w:t>
-      </w:r>
-      <w:proofErr w:type="spellEnd"/>
-      <w:r>
-        <w:t xml:space="preserve"> der </w:t>
-      </w:r>
-      <w:proofErr w:type="spellStart"/>
-      <w:r>
-        <w:t>Werkstattbetrieb</w:t>
-      </w:r>
-      <w:proofErr w:type="spellEnd"/>
-      <w:r>
-        <w:t xml:space="preserve"> die </w:t>
-      </w:r>
-      <w:proofErr w:type="spellStart"/>
-      <w:r>
-        <w:t>Zentrale</w:t>
-      </w:r>
-      <w:proofErr w:type="spellEnd"/>
-      <w:r>
-        <w:t xml:space="preserve">. Er </w:t>
-      </w:r>
-      <w:proofErr w:type="spellStart"/>
-      <w:r>
-        <w:t>kennt</w:t>
-      </w:r>
-      <w:proofErr w:type="spellEnd"/>
-      <w:r>
-        <w:t xml:space="preserve"> alle </w:t>
-      </w:r>
-      <w:proofErr w:type="spellStart"/>
-      <w:r>
-        <w:t>Aufträge</w:t>
-      </w:r>
-      <w:proofErr w:type="spellEnd"/>
-      <w:r>
-        <w:t xml:space="preserve"> und </w:t>
-      </w:r>
-      <w:proofErr w:type="spellStart"/>
-      <w:r/>
-      <w:proofErr w:type="spellEnd"/>
-      <w:r/>
-      <w:proofErr w:type="spellStart"/>
-      <w:r>
-        <w:t>Reklamationen</w:t>
-      </w:r>
-      <w:proofErr w:type="spellEnd"/>
-      <w:r>
-        <w:t>. 14 der 15 Rollen von eben fassen wir in vier Mitarbeiterklassen zusammen. Der Betriebsadministrator arbeitet direkt am Werkstattbetrieb.</w:t>
-      </w:r>
-      <w:proofErr w:type="spellStart"/>
-      <w:r/>
-      <w:proofErr w:type="spellEnd"/>
-      <w:r/>
-      <w:proofErr w:type="spellStart"/>
-      <w:r/>
-      <w:proofErr w:type="spellEnd"/>
-      <w:r/>
-      <w:proofErr w:type="spellStart"/>
-      <w:r/>
-      <w:proofErr w:type="spellEnd"/>
-      <w:r/>
-      <w:proofErr w:type="spellStart"/>
-      <w:r/>
-      <w:proofErr w:type="spellEnd"/>
-      <w:r/>
-      <w:proofErr w:type="spellStart"/>
-      <w:r/>
-      <w:proofErr w:type="spellEnd"/>
-      <w:r>
-        <w:t xml:space="preserve"> Kunden und Mitarbeiter </w:t>
-      </w:r>
-      <w:proofErr w:type="spellStart"/>
-      <w:r>
-        <w:t>kommen</w:t>
-      </w:r>
-      <w:proofErr w:type="spellEnd"/>
-      <w:r>
-        <w:t xml:space="preserve"> </w:t>
-      </w:r>
-      <w:proofErr w:type="spellStart"/>
-      <w:r>
-        <w:t>nur</w:t>
-      </w:r>
-      <w:proofErr w:type="spellEnd"/>
-      <w:r>
-        <w:t xml:space="preserve"> </w:t>
-      </w:r>
-      <w:proofErr w:type="spellStart"/>
-      <w:r>
-        <w:t>über</w:t>
-      </w:r>
-      <w:proofErr w:type="spellEnd"/>
-      <w:r>
-        <w:t xml:space="preserve"> </w:t>
-      </w:r>
-      <w:proofErr w:type="spellStart"/>
-      <w:r>
-        <w:t>zwei</w:t>
-      </w:r>
-      <w:proofErr w:type="spellEnd"/>
-      <w:r>
-        <w:t xml:space="preserve"> </w:t>
-      </w:r>
-      <w:proofErr w:type="spellStart"/>
-      <w:r>
-        <w:t>Oberflächen</w:t>
-      </w:r>
-      <w:proofErr w:type="spellEnd"/>
-      <w:r>
-        <w:t xml:space="preserve"> </w:t>
-      </w:r>
-      <w:proofErr w:type="gramStart"/>
-      <w:r>
-        <w:t>an</w:t>
-      </w:r>
-      <w:proofErr w:type="gramEnd"/>
-      <w:r>
-        <w:t xml:space="preserve"> die </w:t>
-      </w:r>
-      <w:proofErr w:type="spellStart"/>
-      <w:r>
-        <w:t>Daten</w:t>
-      </w:r>
-      <w:proofErr w:type="spellEnd"/>
-      <w:r>
-        <w:t xml:space="preserve">, die </w:t>
-      </w:r>
-      <w:proofErr w:type="spellStart"/>
-      <w:r>
-        <w:t>KundenApp</w:t>
-      </w:r>
-      <w:proofErr w:type="spellEnd"/>
-      <w:r>
-        <w:t xml:space="preserve"> und die </w:t>
-      </w:r>
-      <w:proofErr w:type="spellStart"/>
-      <w:r>
-        <w:t>Werkstattoberfläche</w:t>
-      </w:r>
-      <w:proofErr w:type="spellEnd"/>
-      <w:r>
-        <w:t>.</w:t>
-      </w:r>
-    </w:p>
-    <w:p>
-      <w:proofErr w:type="spellStart"/>
-      <w:r>
-        <w:t>Fünftens</w:t>
-      </w:r>
-      <w:proofErr w:type="spellEnd"/>
-      <w:r>
-        <w:t xml:space="preserve"> hat </w:t>
-      </w:r>
-      <w:proofErr w:type="gramStart"/>
-      <w:r>
-        <w:t>die</w:t>
-      </w:r>
-      <w:proofErr w:type="gramEnd"/>
-      <w:r>
-        <w:t xml:space="preserve"> </w:t>
-      </w:r>
-      <w:proofErr w:type="spellStart"/>
-      <w:r>
-        <w:t>Sofortdiagnose</w:t>
-      </w:r>
-      <w:proofErr w:type="spellEnd"/>
-      <w:r>
-        <w:t xml:space="preserve"> </w:t>
-      </w:r>
-      <w:proofErr w:type="spellStart"/>
-      <w:r>
-        <w:t>drei</w:t>
-      </w:r>
-      <w:proofErr w:type="spellEnd"/>
-      <w:r>
-        <w:t xml:space="preserve"> </w:t>
-      </w:r>
-      <w:proofErr w:type="spellStart"/>
-      <w:r>
-        <w:t>eigene</w:t>
-      </w:r>
-      <w:proofErr w:type="spellEnd"/>
-      <w:r>
-        <w:t xml:space="preserve"> Klassen: die </w:t>
-      </w:r>
-      <w:proofErr w:type="spellStart"/>
-      <w:r>
-        <w:t>Voranmeldung</w:t>
-      </w:r>
-      <w:proofErr w:type="spellEnd"/>
-      <w:r>
-        <w:t xml:space="preserve">, den </w:t>
-      </w:r>
-      <w:proofErr w:type="spellStart"/>
-      <w:r>
-        <w:t>Medienanhang</w:t>
-      </w:r>
-      <w:proofErr w:type="spellEnd"/>
-      <w:r>
-        <w:t xml:space="preserve"> </w:t>
-      </w:r>
-      <w:proofErr w:type="spellStart"/>
-      <w:r>
-        <w:t>mit</w:t>
-      </w:r>
-      <w:proofErr w:type="spellEnd"/>
-      <w:r>
-        <w:t xml:space="preserve"> Foto </w:t>
-      </w:r>
-      <w:proofErr w:type="spellStart"/>
-      <w:r>
-        <w:t>oder</w:t>
-      </w:r>
-      <w:proofErr w:type="spellEnd"/>
-      <w:r>
-        <w:t xml:space="preserve"> Video und den </w:t>
-      </w:r>
-      <w:proofErr w:type="spellStart"/>
-      <w:r>
-        <w:t>Vorschlag</w:t>
-      </w:r>
-      <w:proofErr w:type="spellEnd"/>
-      <w:r>
-        <w:t xml:space="preserve"> der KI.</w:t>
       </w:r>
     </w:p>
     <w:p>
       <w:r>
-        <w:t xml:space="preserve">Wie </w:t>
+        <w:t>Kilian: Zum Schluss das Datenmodell. Es zeigt, welche Daten RepairFlow speichert und wie sie zusammenhängen. Jede Art von Daten ist eine Klasse, zum Beispiel der Reparaturauftrag oder der Kunde. Insgesamt sind es 29 Klassen. Fünf Entscheidungen erkläre ich kurz.</w:t>
       </w:r>
-      <w:proofErr w:type="spellStart"/>
+    </w:p>
+    <w:p>
       <w:r>
-        <w:t>wir</w:t>
+        <w:t>Erstens: Der Reparaturauftrag steht im Mittelpunkt. Befund und Reparaturschritte gehören fest zu ihm. Ohne Auftrag gibt es sie nicht. Der Kostenvoranschlag ist dagegen nur locker verbunden. Der erste Kostenvoranschlag entsteht nämlich schon bei der Sofortdiagnose, also bevor es einen Auftrag gibt.</w:t>
       </w:r>
-      <w:proofErr w:type="spellEnd"/>
+    </w:p>
+    <w:p>
       <w:r>
-        <w:t xml:space="preserve"> </w:t>
+        <w:lastRenderedPageBreak/>
+        <w:t>Zweitens: Wir speichern den Lagerbestand für jede Filiale. So weiß RepairFlow, wie viele Teile wo liegen, und kann in allen Filialen suchen.</w:t>
       </w:r>
-      <w:proofErr w:type="spellStart"/>
+    </w:p>
+    <w:p>
       <w:r>
-        <w:t>dafür</w:t>
+        <w:t>Drittens: Auch die Reservierung ist eine eigene Klasse, denn sie durchläuft mehrere Stufen. Erst ist ein Teil vorreserviert, dann reserviert. Am Ende wird es aus dem Lager entnommen, oder die Reservierung wird storniert.</w:t>
       </w:r>
-      <w:proofErr w:type="spellEnd"/>
+    </w:p>
+    <w:p>
       <w:r>
-        <w:t xml:space="preserve"> </w:t>
+        <w:t>Viertens: Der Werkstattbetrieb ist die Zentrale. Er kennt alle Aufträge und Reklamationen. Fast alle Rollen von eben fassen wir in vier Mitarbeiterklassen zusammen: Servicemitarbeiter, Techniker, Disponent und Werkstattleiter. Kunden und Mitarbeiter kommen nur über zwei Oberflächen an die Daten. Der Kunde nutzt die App, die Mitarbeiter nutzen die Werkstattoberfläche.</w:t>
       </w:r>
-      <w:proofErr w:type="spellStart"/>
+    </w:p>
+    <w:p>
       <w:r>
-        <w:t>gesorgt</w:t>
+        <w:t>Fünftens: Die Sofortdiagnose hat drei eigene Klassen. Die Voranmeldung, das hochgeladene Foto oder Video und den Vorschlag der KI.</w:t>
       </w:r>
-      <w:proofErr w:type="spellEnd"/>
+    </w:p>
+    <w:p>
       <w:r>
-        <w:t xml:space="preserve"> </w:t>
-      </w:r>
-      <w:proofErr w:type="spellStart"/>
-      <w:r>
-        <w:t>haben</w:t>
-      </w:r>
-      <w:proofErr w:type="spellEnd"/>
-      <w:r>
-        <w:t xml:space="preserve">, </w:t>
-      </w:r>
-      <w:proofErr w:type="spellStart"/>
-      <w:r>
-        <w:t>dass</w:t>
-      </w:r>
-      <w:proofErr w:type="spellEnd"/>
-      <w:r>
-        <w:t xml:space="preserve"> alle Modelle </w:t>
-      </w:r>
-      <w:proofErr w:type="spellStart"/>
-      <w:r>
-        <w:t>zusammenpassen</w:t>
-      </w:r>
-      <w:proofErr w:type="spellEnd"/>
-      <w:r>
-        <w:t xml:space="preserve">, </w:t>
-      </w:r>
-      <w:proofErr w:type="spellStart"/>
-      <w:r>
-        <w:t>zeigt</w:t>
-      </w:r>
-      <w:proofErr w:type="spellEnd"/>
-      <w:r>
-        <w:t xml:space="preserve"> Jakob.</w:t>
+        <w:t>Wie wir sichergestellt haben, dass alle Modelle zusammenpassen, zeigt jetzt Jakob.</w:t>
       </w:r>
     </w:p>
     <w:p>
@@ -3460,738 +523,32 @@
         <w:t>Folie 19 – Qualität: Regeln, Werkzeuge, Reviews</w:t>
       </w:r>
       <w:r>
-        <w:rPr/>
         <w:t xml:space="preserve">  (65 s)</w:t>
-      </w:r>
-      <w:proofErr w:type="gramStart"/>
-      <w:proofErr w:type="gramEnd"/>
-    </w:p>
-    <w:p>
-      <w:r>
-        <w:t xml:space="preserve">Jakob: Wir </w:t>
-      </w:r>
-      <w:proofErr w:type="spellStart"/>
-      <w:r>
-        <w:t>haben</w:t>
-      </w:r>
-      <w:proofErr w:type="spellEnd"/>
-      <w:r>
-        <w:t xml:space="preserve"> </w:t>
-      </w:r>
-      <w:proofErr w:type="spellStart"/>
-      <w:r>
-        <w:t>drei</w:t>
-      </w:r>
-      <w:proofErr w:type="spellEnd"/>
-      <w:r>
-        <w:t xml:space="preserve"> Modelle </w:t>
-      </w:r>
-      <w:proofErr w:type="spellStart"/>
-      <w:r>
-        <w:t>gebaut</w:t>
-      </w:r>
-      <w:proofErr w:type="spellEnd"/>
-      <w:r>
-        <w:t xml:space="preserve">, die </w:t>
-      </w:r>
-      <w:proofErr w:type="spellStart"/>
-      <w:r>
-        <w:t>über</w:t>
-      </w:r>
-      <w:proofErr w:type="spellEnd"/>
-      <w:r>
-        <w:t xml:space="preserve"> </w:t>
-      </w:r>
-      <w:proofErr w:type="spellStart"/>
-      <w:r>
-        <w:t>dieselben</w:t>
-      </w:r>
-      <w:proofErr w:type="spellEnd"/>
-      <w:r>
-        <w:t xml:space="preserve"> Dinge </w:t>
-      </w:r>
-      <w:proofErr w:type="spellStart"/>
-      <w:r>
-        <w:t>sprechen</w:t>
-      </w:r>
-      <w:proofErr w:type="spellEnd"/>
-      <w:r>
-        <w:t xml:space="preserve">. Da </w:t>
-      </w:r>
-      <w:proofErr w:type="spellStart"/>
-      <w:r>
-        <w:t>passiert</w:t>
-      </w:r>
-      <w:proofErr w:type="spellEnd"/>
-      <w:r>
-        <w:t xml:space="preserve"> es schnell, </w:t>
-      </w:r>
-      <w:proofErr w:type="spellStart"/>
-      <w:r>
-        <w:t>dass</w:t>
-      </w:r>
-      <w:proofErr w:type="spellEnd"/>
-      <w:r>
-        <w:t xml:space="preserve"> </w:t>
-      </w:r>
-      <w:proofErr w:type="spellStart"/>
-      <w:r>
-        <w:t>sie</w:t>
-      </w:r>
-      <w:proofErr w:type="spellEnd"/>
-      <w:r>
-        <w:t xml:space="preserve"> </w:t>
-      </w:r>
-      <w:proofErr w:type="spellStart"/>
-      <w:r>
-        <w:t>auseinanderlaufen</w:t>
-      </w:r>
-      <w:proofErr w:type="spellEnd"/>
-      <w:r>
-        <w:t xml:space="preserve">. </w:t>
-      </w:r>
-      <w:proofErr w:type="spellStart"/>
-      <w:r>
-        <w:t>Dagegen</w:t>
-      </w:r>
-      <w:proofErr w:type="spellEnd"/>
-      <w:r>
-        <w:t xml:space="preserve"> </w:t>
-      </w:r>
-      <w:proofErr w:type="spellStart"/>
-      <w:r>
-        <w:t>haben</w:t>
-      </w:r>
-      <w:proofErr w:type="spellEnd"/>
-      <w:r>
-        <w:t xml:space="preserve"> </w:t>
-      </w:r>
-      <w:proofErr w:type="spellStart"/>
-      <w:r>
-        <w:t>wir</w:t>
-      </w:r>
-      <w:proofErr w:type="spellEnd"/>
-      <w:r>
-        <w:t xml:space="preserve"> </w:t>
-      </w:r>
-      <w:proofErr w:type="spellStart"/>
-      <w:r>
-        <w:t>drei</w:t>
-      </w:r>
-      <w:proofErr w:type="spellEnd"/>
-      <w:r>
-        <w:t xml:space="preserve"> Dinge </w:t>
-      </w:r>
-      <w:proofErr w:type="spellStart"/>
-      <w:r>
-        <w:t>getan</w:t>
-      </w:r>
-      <w:proofErr w:type="spellEnd"/>
-      <w:r>
-        <w:t>.</w:t>
-      </w:r>
-    </w:p>
-    <w:p>
-      <w:proofErr w:type="spellStart"/>
-      <w:r>
-        <w:t>Erstens</w:t>
-      </w:r>
-      <w:proofErr w:type="spellEnd"/>
-      <w:r>
-        <w:t xml:space="preserve"> </w:t>
-      </w:r>
-      <w:proofErr w:type="spellStart"/>
-      <w:r>
-        <w:t>feste</w:t>
-      </w:r>
-      <w:proofErr w:type="spellEnd"/>
-      <w:r>
-        <w:t xml:space="preserve"> </w:t>
-      </w:r>
-      <w:proofErr w:type="spellStart"/>
-      <w:r>
-        <w:t>Regeln</w:t>
-      </w:r>
-      <w:proofErr w:type="spellEnd"/>
-      <w:r>
-        <w:t xml:space="preserve">. Eine Sache </w:t>
-      </w:r>
-      <w:proofErr w:type="spellStart"/>
-      <w:r>
-        <w:t>heißt</w:t>
-      </w:r>
-      <w:proofErr w:type="spellEnd"/>
-      <w:r>
-        <w:t xml:space="preserve"> in </w:t>
-      </w:r>
-      <w:proofErr w:type="spellStart"/>
-      <w:r>
-        <w:t>allen</w:t>
-      </w:r>
-      <w:proofErr w:type="spellEnd"/>
-      <w:r>
-        <w:t xml:space="preserve"> </w:t>
-      </w:r>
-      <w:proofErr w:type="spellStart"/>
-      <w:r>
-        <w:t>Modellen</w:t>
-      </w:r>
-      <w:proofErr w:type="spellEnd"/>
-      <w:r>
-        <w:t xml:space="preserve"> </w:t>
-      </w:r>
-      <w:proofErr w:type="spellStart"/>
-      <w:r>
-        <w:t>gleich</w:t>
-      </w:r>
-      <w:proofErr w:type="spellEnd"/>
-      <w:r>
-        <w:t xml:space="preserve">. Ein </w:t>
-      </w:r>
-      <w:proofErr w:type="spellStart"/>
-      <w:r>
-        <w:t>Datenobjekt</w:t>
-      </w:r>
-      <w:proofErr w:type="spellEnd"/>
-      <w:r>
-        <w:t xml:space="preserve"> </w:t>
-      </w:r>
-      <w:proofErr w:type="spellStart"/>
-      <w:r>
-        <w:t>im</w:t>
-      </w:r>
-      <w:proofErr w:type="spellEnd"/>
-      <w:r>
-        <w:t xml:space="preserve"> </w:t>
-      </w:r>
-      <w:proofErr w:type="spellStart"/>
-      <w:r>
-        <w:t>Prozess</w:t>
-      </w:r>
-      <w:proofErr w:type="spellEnd"/>
-      <w:r>
-        <w:t xml:space="preserve"> </w:t>
-      </w:r>
-      <w:proofErr w:type="spellStart"/>
-      <w:r>
-        <w:t>trägt</w:t>
-      </w:r>
-      <w:proofErr w:type="spellEnd"/>
-      <w:r>
-        <w:t xml:space="preserve"> also </w:t>
-      </w:r>
-      <w:proofErr w:type="spellStart"/>
-      <w:r>
-        <w:t>denselben</w:t>
-      </w:r>
-      <w:proofErr w:type="spellEnd"/>
-      <w:r>
-        <w:t xml:space="preserve"> Namen </w:t>
-      </w:r>
-      <w:proofErr w:type="spellStart"/>
-      <w:r>
-        <w:t>wie</w:t>
-      </w:r>
-      <w:proofErr w:type="spellEnd"/>
-      <w:r>
-        <w:t xml:space="preserve"> die Klasse. </w:t>
-      </w:r>
-      <w:proofErr w:type="spellStart"/>
-      <w:r>
-        <w:t>Jede</w:t>
-      </w:r>
-      <w:proofErr w:type="spellEnd"/>
-      <w:r>
-        <w:t xml:space="preserve"> </w:t>
-      </w:r>
-      <w:proofErr w:type="spellStart"/>
-      <w:r>
-        <w:t>Mitarbeiterrolle</w:t>
-      </w:r>
-      <w:proofErr w:type="spellEnd"/>
-      <w:r>
-        <w:t xml:space="preserve"> </w:t>
-      </w:r>
-      <w:proofErr w:type="spellStart"/>
-      <w:r>
-        <w:t>gehört</w:t>
-      </w:r>
-      <w:proofErr w:type="spellEnd"/>
-      <w:r>
-        <w:t xml:space="preserve"> </w:t>
-      </w:r>
-      <w:proofErr w:type="spellStart"/>
-      <w:r>
-        <w:t>zu</w:t>
-      </w:r>
-      <w:proofErr w:type="spellEnd"/>
-      <w:r>
-        <w:t xml:space="preserve"> </w:t>
-      </w:r>
-      <w:proofErr w:type="spellStart"/>
-      <w:r>
-        <w:t>genau</w:t>
-      </w:r>
-      <w:proofErr w:type="spellEnd"/>
-      <w:r>
-        <w:t xml:space="preserve"> </w:t>
-      </w:r>
-      <w:proofErr w:type="spellStart"/>
-      <w:r>
-        <w:t>einer</w:t>
-      </w:r>
-      <w:proofErr w:type="spellEnd"/>
-      <w:r>
-        <w:t xml:space="preserve"> Lane und </w:t>
-      </w:r>
-      <w:proofErr w:type="spellStart"/>
-      <w:r>
-        <w:t>einer</w:t>
-      </w:r>
-      <w:proofErr w:type="spellEnd"/>
-      <w:r>
-        <w:t xml:space="preserve"> Klasse, und die </w:t>
-      </w:r>
-      <w:proofErr w:type="spellStart"/>
-      <w:r>
-        <w:t>Statuswerte</w:t>
-      </w:r>
-      <w:proofErr w:type="spellEnd"/>
-      <w:r>
-        <w:t xml:space="preserve"> </w:t>
-      </w:r>
-      <w:proofErr w:type="spellStart"/>
-      <w:r>
-        <w:t>sind</w:t>
-      </w:r>
-      <w:proofErr w:type="spellEnd"/>
-      <w:r>
-        <w:t xml:space="preserve"> </w:t>
-      </w:r>
-      <w:proofErr w:type="spellStart"/>
-      <w:r>
-        <w:t>überall</w:t>
-      </w:r>
-      <w:proofErr w:type="spellEnd"/>
-      <w:r>
-        <w:t xml:space="preserve"> </w:t>
-      </w:r>
-      <w:proofErr w:type="spellStart"/>
-      <w:r>
-        <w:t>dieselben</w:t>
-      </w:r>
-      <w:proofErr w:type="spellEnd"/>
-      <w:r>
-        <w:t>.</w:t>
-      </w:r>
-    </w:p>
-    <w:p>
-      <w:proofErr w:type="spellStart"/>
-      <w:r>
-        <w:t>Zweitens</w:t>
-      </w:r>
-      <w:proofErr w:type="spellEnd"/>
-      <w:r>
-        <w:t xml:space="preserve"> </w:t>
-      </w:r>
-      <w:proofErr w:type="spellStart"/>
-      <w:r>
-        <w:t>Werkzeuge</w:t>
-      </w:r>
-      <w:proofErr w:type="spellEnd"/>
-      <w:r>
-        <w:t xml:space="preserve">. Wir </w:t>
-      </w:r>
-      <w:proofErr w:type="spellStart"/>
-      <w:r>
-        <w:t>haben</w:t>
-      </w:r>
-      <w:proofErr w:type="spellEnd"/>
-      <w:r>
-        <w:t xml:space="preserve"> die </w:t>
-      </w:r>
-      <w:proofErr w:type="spellStart"/>
-      <w:r>
-        <w:t>Prozessdiagramme</w:t>
-      </w:r>
-      <w:proofErr w:type="spellEnd"/>
-      <w:r>
-        <w:t xml:space="preserve"> für Camunda 8 </w:t>
-      </w:r>
-      <w:proofErr w:type="spellStart"/>
-      <w:r>
-        <w:t>mit</w:t>
-      </w:r>
-      <w:proofErr w:type="spellEnd"/>
-      <w:r>
-        <w:t xml:space="preserve"> </w:t>
-      </w:r>
-      <w:proofErr w:type="spellStart"/>
-      <w:r>
-        <w:t>technischen</w:t>
-      </w:r>
-      <w:proofErr w:type="spellEnd"/>
-      <w:r>
-        <w:t xml:space="preserve"> </w:t>
-      </w:r>
-      <w:proofErr w:type="spellStart"/>
-      <w:r>
-        <w:t>Angaben</w:t>
-      </w:r>
-      <w:proofErr w:type="spellEnd"/>
-      <w:r>
-        <w:t xml:space="preserve"> </w:t>
-      </w:r>
-      <w:proofErr w:type="spellStart"/>
-      <w:r>
-        <w:t>ergänzt</w:t>
-      </w:r>
-      <w:proofErr w:type="spellEnd"/>
-      <w:r>
-        <w:t xml:space="preserve">, </w:t>
-      </w:r>
-      <w:proofErr w:type="spellStart"/>
-      <w:r>
-        <w:t>zum</w:t>
-      </w:r>
-      <w:proofErr w:type="spellEnd"/>
-      <w:r>
-        <w:t xml:space="preserve"> </w:t>
-      </w:r>
-      <w:proofErr w:type="spellStart"/>
-      <w:r>
-        <w:t>Beispiel</w:t>
-      </w:r>
-      <w:proofErr w:type="spellEnd"/>
-      <w:r>
-        <w:t xml:space="preserve"> </w:t>
-      </w:r>
-      <w:proofErr w:type="spellStart"/>
-      <w:r>
-        <w:t>mit</w:t>
-      </w:r>
-      <w:proofErr w:type="spellEnd"/>
-      <w:r>
-        <w:t xml:space="preserve"> </w:t>
-      </w:r>
-      <w:proofErr w:type="spellStart"/>
-      <w:r>
-        <w:t>Timern</w:t>
-      </w:r>
-      <w:proofErr w:type="spellEnd"/>
-      <w:r>
-        <w:t xml:space="preserve"> und </w:t>
-      </w:r>
-      <w:proofErr w:type="spellStart"/>
-      <w:r>
-        <w:t>Bedingungen</w:t>
-      </w:r>
-      <w:proofErr w:type="spellEnd"/>
-      <w:r>
-        <w:t xml:space="preserve">. </w:t>
-      </w:r>
-      <w:proofErr w:type="spellStart"/>
-      <w:r>
-        <w:t>Danach</w:t>
-      </w:r>
-      <w:proofErr w:type="spellEnd"/>
-      <w:r>
-        <w:t xml:space="preserve"> </w:t>
-      </w:r>
-      <w:proofErr w:type="spellStart"/>
-      <w:r>
-        <w:t>melden</w:t>
-      </w:r>
-      <w:proofErr w:type="spellEnd"/>
-      <w:r>
-        <w:t xml:space="preserve"> der Camunda-Linter und die </w:t>
-      </w:r>
-      <w:proofErr w:type="spellStart"/>
-      <w:r>
-        <w:t>Prüfung</w:t>
-      </w:r>
-      <w:proofErr w:type="spellEnd"/>
-      <w:r>
-        <w:t xml:space="preserve"> </w:t>
-      </w:r>
-      <w:proofErr w:type="spellStart"/>
-      <w:r>
-        <w:t>im</w:t>
-      </w:r>
-      <w:proofErr w:type="spellEnd"/>
-      <w:r>
-        <w:t xml:space="preserve"> Camunda Modeler </w:t>
-      </w:r>
-      <w:proofErr w:type="spellStart"/>
-      <w:r>
-        <w:t>keinen</w:t>
-      </w:r>
-      <w:proofErr w:type="spellEnd"/>
-      <w:r>
-        <w:t xml:space="preserve"> </w:t>
-      </w:r>
-      <w:proofErr w:type="spellStart"/>
-      <w:r>
-        <w:t>einzigen</w:t>
-      </w:r>
-      <w:proofErr w:type="spellEnd"/>
-      <w:r>
-        <w:t xml:space="preserve"> Fehler.</w:t>
-      </w:r>
-    </w:p>
-    <w:p>
-      <w:proofErr w:type="spellStart"/>
-      <w:r>
-        <w:t>Drittens</w:t>
-      </w:r>
-      <w:proofErr w:type="spellEnd"/>
-      <w:r>
-        <w:t xml:space="preserve"> Reviews. </w:t>
-      </w:r>
-      <w:proofErr w:type="spellStart"/>
-      <w:r>
-        <w:t>Jedes</w:t>
-      </w:r>
-      <w:proofErr w:type="spellEnd"/>
-      <w:r>
-        <w:t xml:space="preserve"> </w:t>
-      </w:r>
-      <w:proofErr w:type="spellStart"/>
-      <w:r>
-        <w:t>Diagramm</w:t>
-      </w:r>
-      <w:proofErr w:type="spellEnd"/>
-      <w:r>
-        <w:t xml:space="preserve"> hat </w:t>
-      </w:r>
-      <w:proofErr w:type="spellStart"/>
-      <w:r>
-        <w:t>eine</w:t>
-      </w:r>
-      <w:proofErr w:type="spellEnd"/>
-      <w:r>
-        <w:t xml:space="preserve"> </w:t>
-      </w:r>
-      <w:proofErr w:type="spellStart"/>
-      <w:r>
-        <w:t>zweite</w:t>
-      </w:r>
-      <w:proofErr w:type="spellEnd"/>
-      <w:r>
-        <w:t xml:space="preserve"> Person </w:t>
-      </w:r>
-      <w:proofErr w:type="spellStart"/>
-      <w:r>
-        <w:t>geprüft</w:t>
-      </w:r>
-      <w:proofErr w:type="spellEnd"/>
-      <w:r>
-        <w:t xml:space="preserve">, und </w:t>
-      </w:r>
-      <w:proofErr w:type="spellStart"/>
-      <w:r>
-        <w:t>jede</w:t>
-      </w:r>
-      <w:proofErr w:type="spellEnd"/>
-      <w:r>
-        <w:t xml:space="preserve"> </w:t>
-      </w:r>
-      <w:proofErr w:type="spellStart"/>
-      <w:r>
-        <w:t>Änderung</w:t>
-      </w:r>
-      <w:proofErr w:type="spellEnd"/>
-      <w:r>
-        <w:t xml:space="preserve"> </w:t>
-      </w:r>
-      <w:proofErr w:type="spellStart"/>
-      <w:r>
-        <w:t>prüfen</w:t>
-      </w:r>
-      <w:proofErr w:type="spellEnd"/>
-      <w:r>
-        <w:t xml:space="preserve"> </w:t>
-      </w:r>
-      <w:proofErr w:type="spellStart"/>
-      <w:r>
-        <w:t>wir</w:t>
-      </w:r>
-      <w:proofErr w:type="spellEnd"/>
-      <w:r>
-        <w:t xml:space="preserve"> </w:t>
-      </w:r>
-      <w:proofErr w:type="spellStart"/>
-      <w:r>
-        <w:t>gegen</w:t>
-      </w:r>
-      <w:proofErr w:type="spellEnd"/>
-      <w:r>
-        <w:t xml:space="preserve"> </w:t>
-      </w:r>
-      <w:proofErr w:type="spellStart"/>
-      <w:r>
-        <w:t>eine</w:t>
-      </w:r>
-      <w:proofErr w:type="spellEnd"/>
-      <w:r>
-        <w:t xml:space="preserve"> </w:t>
-      </w:r>
-      <w:proofErr w:type="spellStart"/>
-      <w:r>
-        <w:t>Checkliste</w:t>
-      </w:r>
-      <w:proofErr w:type="spellEnd"/>
-      <w:r>
-        <w:t>.</w:t>
       </w:r>
     </w:p>
     <w:p>
       <w:r>
-        <w:t xml:space="preserve">Ein </w:t>
+        <w:t>Jakob: Wir haben drei Modelle gebaut, die über dieselben Dinge sprechen. Da passiert es schnell, dass sie auseinanderlaufen. Dagegen haben wir drei Dinge getan.</w:t>
       </w:r>
-      <w:proofErr w:type="spellStart"/>
+    </w:p>
+    <w:p>
       <w:r>
-        <w:t>Beispiel</w:t>
+        <w:t>Erstens feste Regeln. Eine Sache heißt in allen Modellen gleich. Ein Datenobjekt im Prozess trägt also denselben Namen wie die Klasse. Jede Mitarbeiterrolle gehört zu genau einer Lane und einer Klasse, und die Statuswerte sind überall dieselben.</w:t>
       </w:r>
-      <w:proofErr w:type="spellEnd"/>
+    </w:p>
+    <w:p>
       <w:r>
-        <w:t xml:space="preserve">: Als </w:t>
+        <w:t>Zweitens Werkzeuge. Wir haben die Prozessdiagramme für Camunda 8 mit technischen Angaben ergänzt, zum Beispiel mit Timern und Bedingungen. Danach melden der Camunda-Linter und die Prüfung im Camunda Modeler keinen einzigen Fehler.</w:t>
       </w:r>
-      <w:proofErr w:type="spellStart"/>
+    </w:p>
+    <w:p>
       <w:r>
-        <w:t>wir</w:t>
+        <w:t>Drittens Reviews. Jedes Diagramm hat eine zweite Person geprüft, und jede Änderung prüfen wir gegen eine Checkliste.</w:t>
       </w:r>
-      <w:proofErr w:type="spellEnd"/>
+    </w:p>
+    <w:p>
       <w:r>
-        <w:t xml:space="preserve"> die </w:t>
-      </w:r>
-      <w:proofErr w:type="spellStart"/>
-      <w:r>
-        <w:t>Nacharbeit</w:t>
-      </w:r>
-      <w:proofErr w:type="spellEnd"/>
-      <w:r>
-        <w:t xml:space="preserve"> auf </w:t>
-      </w:r>
-      <w:proofErr w:type="spellStart"/>
-      <w:r>
-        <w:t>höchstens</w:t>
-      </w:r>
-      <w:proofErr w:type="spellEnd"/>
-      <w:r>
-        <w:t xml:space="preserve"> </w:t>
-      </w:r>
-      <w:proofErr w:type="spellStart"/>
-      <w:r>
-        <w:t>zwei</w:t>
-      </w:r>
-      <w:proofErr w:type="spellEnd"/>
-      <w:r>
-        <w:t xml:space="preserve"> </w:t>
-      </w:r>
-      <w:proofErr w:type="spellStart"/>
-      <w:r>
-        <w:t>Durchläufe</w:t>
-      </w:r>
-      <w:proofErr w:type="spellEnd"/>
-      <w:r>
-        <w:t xml:space="preserve"> </w:t>
-      </w:r>
-      <w:proofErr w:type="spellStart"/>
-      <w:r>
-        <w:t>begrenzt</w:t>
-      </w:r>
-      <w:proofErr w:type="spellEnd"/>
-      <w:r>
-        <w:t xml:space="preserve"> </w:t>
-      </w:r>
-      <w:proofErr w:type="spellStart"/>
-      <w:r>
-        <w:t>haben</w:t>
-      </w:r>
-      <w:proofErr w:type="spellEnd"/>
-      <w:r>
-        <w:t xml:space="preserve">, </w:t>
-      </w:r>
-      <w:proofErr w:type="spellStart"/>
-      <w:r>
-        <w:t>mussten</w:t>
-      </w:r>
-      <w:proofErr w:type="spellEnd"/>
-      <w:r>
-        <w:t xml:space="preserve"> </w:t>
-      </w:r>
-      <w:proofErr w:type="spellStart"/>
-      <w:r>
-        <w:t>auch</w:t>
-      </w:r>
-      <w:proofErr w:type="spellEnd"/>
-      <w:r>
-        <w:t xml:space="preserve"> die </w:t>
-      </w:r>
-      <w:proofErr w:type="spellStart"/>
-      <w:r>
-        <w:t>anderen</w:t>
-      </w:r>
-      <w:proofErr w:type="spellEnd"/>
-      <w:r>
-        <w:t xml:space="preserve"> Modelle </w:t>
-      </w:r>
-      <w:proofErr w:type="spellStart"/>
-      <w:r>
-        <w:t>angepasst</w:t>
-      </w:r>
-      <w:proofErr w:type="spellEnd"/>
-      <w:r>
-        <w:t xml:space="preserve"> </w:t>
-      </w:r>
-      <w:proofErr w:type="spellStart"/>
-      <w:r>
-        <w:t>werden</w:t>
-      </w:r>
-      <w:proofErr w:type="spellEnd"/>
-      <w:r>
-        <w:t xml:space="preserve">. </w:t>
-      </w:r>
-      <w:proofErr w:type="spellStart"/>
-      <w:r>
-        <w:t>Genau</w:t>
-      </w:r>
-      <w:proofErr w:type="spellEnd"/>
-      <w:r>
-        <w:t xml:space="preserve"> </w:t>
-      </w:r>
-      <w:proofErr w:type="spellStart"/>
-      <w:r>
-        <w:t>solche</w:t>
-      </w:r>
-      <w:proofErr w:type="spellEnd"/>
-      <w:r>
-        <w:t xml:space="preserve"> </w:t>
-      </w:r>
-      <w:proofErr w:type="spellStart"/>
-      <w:r>
-        <w:t>Stellen</w:t>
-      </w:r>
-      <w:proofErr w:type="spellEnd"/>
-      <w:r>
-        <w:t xml:space="preserve"> </w:t>
-      </w:r>
-      <w:proofErr w:type="spellStart"/>
-      <w:r>
-        <w:t>findet</w:t>
-      </w:r>
-      <w:proofErr w:type="spellEnd"/>
-      <w:r>
-        <w:t xml:space="preserve"> die </w:t>
-      </w:r>
-      <w:proofErr w:type="spellStart"/>
-      <w:r>
-        <w:t>Checkliste</w:t>
-      </w:r>
-      <w:proofErr w:type="spellEnd"/>
-      <w:r>
-        <w:t>.</w:t>
+        <w:t>Ein Beispiel: Als wir die Nacharbeit auf höchstens zwei Durchläufe begrenzt haben, mussten auch die anderen Modelle angepasst werden. Genau solche Stellen findet die Checkliste.</w:t>
       </w:r>
     </w:p>
     <w:p>
@@ -4202,265 +559,17 @@
         <w:t>Folie 20 – Herausforderungen und Lernerfahrungen</w:t>
       </w:r>
       <w:r>
-        <w:rPr/>
         <w:t xml:space="preserve">  (65 s)</w:t>
       </w:r>
-      <w:proofErr w:type="gramStart"/>
-      <w:proofErr w:type="gramEnd"/>
     </w:p>
     <w:p>
       <w:r>
-        <w:t xml:space="preserve">Jakob: Vier Dinge </w:t>
-      </w:r>
-      <w:proofErr w:type="spellStart"/>
-      <w:r>
-        <w:t>haben</w:t>
-      </w:r>
-      <w:proofErr w:type="spellEnd"/>
-      <w:r>
-        <w:t xml:space="preserve"> </w:t>
-      </w:r>
-      <w:proofErr w:type="spellStart"/>
-      <w:r>
-        <w:t>uns</w:t>
-      </w:r>
-      <w:proofErr w:type="spellEnd"/>
-      <w:r>
-        <w:t xml:space="preserve"> </w:t>
-      </w:r>
-      <w:proofErr w:type="spellStart"/>
-      <w:r>
-        <w:t>besonders</w:t>
-      </w:r>
-      <w:proofErr w:type="spellEnd"/>
-      <w:r>
-        <w:t xml:space="preserve"> </w:t>
-      </w:r>
-      <w:proofErr w:type="spellStart"/>
-      <w:r>
-        <w:t>beschäftigt</w:t>
-      </w:r>
-      <w:proofErr w:type="spellEnd"/>
-      <w:r>
-        <w:t>.</w:t>
+        <w:t>Jakob: Vier Dinge haben uns besonders beschäftigt.</w:t>
       </w:r>
     </w:p>
     <w:p>
-      <w:proofErr w:type="spellStart"/>
       <w:r>
-        <w:t>Erstens</w:t>
-      </w:r>
-      <w:proofErr w:type="spellEnd"/>
-      <w:r>
-        <w:t xml:space="preserve"> die Frage, </w:t>
-      </w:r>
-      <w:proofErr w:type="spellStart"/>
-      <w:r>
-        <w:t>wer</w:t>
-      </w:r>
-      <w:proofErr w:type="spellEnd"/>
-      <w:r>
-        <w:t xml:space="preserve"> </w:t>
-      </w:r>
-      <w:proofErr w:type="spellStart"/>
-      <w:r>
-        <w:t>wir</w:t>
-      </w:r>
-      <w:proofErr w:type="spellEnd"/>
-      <w:r>
-        <w:t xml:space="preserve"> </w:t>
-      </w:r>
-      <w:proofErr w:type="spellStart"/>
-      <w:r>
-        <w:t>eigentlich</w:t>
-      </w:r>
-      <w:proofErr w:type="spellEnd"/>
-      <w:r>
-        <w:t xml:space="preserve"> </w:t>
-      </w:r>
-      <w:proofErr w:type="spellStart"/>
-      <w:r>
-        <w:t>sind</w:t>
-      </w:r>
-      <w:proofErr w:type="spellEnd"/>
-      <w:r>
-        <w:t xml:space="preserve">: die </w:t>
-      </w:r>
-      <w:proofErr w:type="spellStart"/>
-      <w:r>
-        <w:t>Werkstatt</w:t>
-      </w:r>
-      <w:proofErr w:type="spellEnd"/>
-      <w:r>
-        <w:t xml:space="preserve"> </w:t>
-      </w:r>
-      <w:proofErr w:type="spellStart"/>
-      <w:r>
-        <w:t>oder</w:t>
-      </w:r>
-      <w:proofErr w:type="spellEnd"/>
-      <w:r>
-        <w:t xml:space="preserve"> der </w:t>
-      </w:r>
-      <w:proofErr w:type="spellStart"/>
-      <w:r>
-        <w:t>Softwareanbieter</w:t>
-      </w:r>
-      <w:proofErr w:type="spellEnd"/>
-      <w:r>
-        <w:t xml:space="preserve">? Nach </w:t>
-      </w:r>
-      <w:proofErr w:type="spellStart"/>
-      <w:r>
-        <w:t>einer</w:t>
-      </w:r>
-      <w:proofErr w:type="spellEnd"/>
-      <w:r>
-        <w:t xml:space="preserve"> </w:t>
-      </w:r>
-      <w:proofErr w:type="spellStart"/>
-      <w:r>
-        <w:t>Rückfrage</w:t>
-      </w:r>
-      <w:proofErr w:type="spellEnd"/>
-      <w:r>
-        <w:t xml:space="preserve"> des </w:t>
-      </w:r>
-      <w:proofErr w:type="spellStart"/>
-      <w:r>
-        <w:t>Dozenten</w:t>
-      </w:r>
-      <w:proofErr w:type="spellEnd"/>
-      <w:r>
-        <w:t xml:space="preserve"> </w:t>
-      </w:r>
-      <w:proofErr w:type="spellStart"/>
-      <w:r>
-        <w:t>haben</w:t>
-      </w:r>
-      <w:proofErr w:type="spellEnd"/>
-      <w:r>
-        <w:t xml:space="preserve"> </w:t>
-      </w:r>
-      <w:proofErr w:type="spellStart"/>
-      <w:r>
-        <w:t>wir</w:t>
-      </w:r>
-      <w:proofErr w:type="spellEnd"/>
-      <w:r>
-        <w:t xml:space="preserve"> </w:t>
-      </w:r>
-      <w:proofErr w:type="spellStart"/>
-      <w:r>
-        <w:t>uns</w:t>
-      </w:r>
-      <w:proofErr w:type="spellEnd"/>
-      <w:r>
-        <w:t xml:space="preserve"> </w:t>
-      </w:r>
-      <w:proofErr w:type="spellStart"/>
-      <w:r>
-        <w:t>klar</w:t>
-      </w:r>
-      <w:proofErr w:type="spellEnd"/>
-      <w:r>
-        <w:t xml:space="preserve"> </w:t>
-      </w:r>
-      <w:proofErr w:type="spellStart"/>
-      <w:r>
-        <w:t>entschieden</w:t>
-      </w:r>
-      <w:proofErr w:type="spellEnd"/>
-      <w:r>
-        <w:t xml:space="preserve">. Wir </w:t>
-      </w:r>
-      <w:proofErr w:type="spellStart"/>
-      <w:r>
-        <w:t>sind</w:t>
-      </w:r>
-      <w:proofErr w:type="spellEnd"/>
-      <w:r>
-        <w:t xml:space="preserve"> der </w:t>
-      </w:r>
-      <w:proofErr w:type="spellStart"/>
-      <w:r>
-        <w:t>Anbieter</w:t>
-      </w:r>
-      <w:proofErr w:type="spellEnd"/>
-      <w:r>
-        <w:t xml:space="preserve">, </w:t>
-      </w:r>
-      <w:proofErr w:type="spellStart"/>
-      <w:r>
-        <w:t>FixWerk</w:t>
-      </w:r>
-      <w:proofErr w:type="spellEnd"/>
-      <w:r>
-        <w:t xml:space="preserve"> </w:t>
-      </w:r>
-      <w:proofErr w:type="spellStart"/>
-      <w:r>
-        <w:t>ist</w:t>
-      </w:r>
-      <w:proofErr w:type="spellEnd"/>
-      <w:r>
-        <w:t xml:space="preserve"> </w:t>
-      </w:r>
-      <w:proofErr w:type="spellStart"/>
-      <w:r>
-        <w:t>unser</w:t>
-      </w:r>
-      <w:proofErr w:type="spellEnd"/>
-      <w:r>
-        <w:t xml:space="preserve"> </w:t>
-      </w:r>
-      <w:proofErr w:type="spellStart"/>
-      <w:r>
-        <w:t>Pilotkunde</w:t>
-      </w:r>
-      <w:proofErr w:type="spellEnd"/>
-      <w:r>
-        <w:t xml:space="preserve">. </w:t>
-      </w:r>
-      <w:proofErr w:type="spellStart"/>
-      <w:r>
-        <w:t>Danach</w:t>
-      </w:r>
-      <w:proofErr w:type="spellEnd"/>
-      <w:r>
-        <w:t xml:space="preserve"> </w:t>
-      </w:r>
-      <w:proofErr w:type="spellStart"/>
-      <w:r>
-        <w:t>mussten</w:t>
-      </w:r>
-      <w:proofErr w:type="spellEnd"/>
-      <w:r>
-        <w:t xml:space="preserve"> </w:t>
-      </w:r>
-      <w:proofErr w:type="spellStart"/>
-      <w:r>
-        <w:t>wir</w:t>
-      </w:r>
-      <w:proofErr w:type="spellEnd"/>
-      <w:r>
-        <w:t xml:space="preserve"> Texte und </w:t>
-      </w:r>
-      <w:proofErr w:type="spellStart"/>
-      <w:r>
-        <w:t>Klassenmodell</w:t>
-      </w:r>
-      <w:proofErr w:type="spellEnd"/>
-      <w:r>
-        <w:t xml:space="preserve"> </w:t>
-      </w:r>
-      <w:proofErr w:type="spellStart"/>
-      <w:r>
-        <w:t>anpassen</w:t>
-      </w:r>
-      <w:proofErr w:type="spellEnd"/>
-      <w:r>
-        <w:t>.</w:t>
+        <w:t>Erstens die Frage, wer wir eigentlich sind: die Werkstatt oder der Softwareanbieter? Nach einer Rückfrage des Dozenten haben wir uns klar entschieden. Wir sind der Anbieter, FixWerk ist unser Pilotkunde. Danach mussten wir Texte und Klassenmodell anpassen.</w:t>
       </w:r>
     </w:p>
     <w:p>
@@ -4480,7 +589,17 @@
           <w:szCs w:val="22"/>
           <w:lang w:val="en-US" w:eastAsia="en-US"/>
         </w:rPr>
-        <w:t>Zweitens Pools und Lanes. In einem frühen Entwurf waren Werkstatt und Disposition getrennte Pools. Nach der Regel „ein Pool je Unternehmen, eine Lane je Rolle“ gibt es jetzt einen Pool mit Lanes. Den Kunden hatten wir zuerst als Black Box gezeichnet. Weil man so nicht gesehen hat, wann er antwortet oder entscheidet, hat er einen eigenen Ablauf bekommen.</w:t>
+        <w:t xml:space="preserve">Zweitens Pools und Lanes. In einem frühen Entwurf waren Werkstatt und Disposition getrennte Pools. Nach der Regel „ein Pool je Unternehmen, eine Lane je Rolle“ gibt es jetzt einen Pool mit Lanes. Den </w:t>
+      </w:r>
+      <w:r>
+        <w:rPr>
+          <w:rFonts w:ascii="Calibri" w:eastAsiaTheme="minorEastAsia" w:hAnsi="Calibri" w:cstheme="minorBidi"/>
+          <w:sz w:val="22"/>
+          <w:szCs w:val="22"/>
+          <w:lang w:val="en-US" w:eastAsia="en-US"/>
+        </w:rPr>
+        <w:lastRenderedPageBreak/>
+        <w:t>Kunden hatten wir zuerst als Black Box gezeichnet. Weil man so nicht gesehen hat, wann er antwortet oder entscheidet, hat er einen eigenen Ablauf bekommen.</w:t>
       </w:r>
     </w:p>
     <w:p>
@@ -4504,260 +623,26 @@
       </w:r>
     </w:p>
     <w:p>
-      <w:proofErr w:type="spellStart"/>
       <w:r>
-        <w:lastRenderedPageBreak/>
-        <w:t>Viertens</w:t>
-      </w:r>
-      <w:proofErr w:type="spellEnd"/>
-      <w:r>
-        <w:t xml:space="preserve"> das Feedback </w:t>
-      </w:r>
-      <w:proofErr w:type="spellStart"/>
-      <w:r>
-        <w:t>aus</w:t>
-      </w:r>
-      <w:proofErr w:type="spellEnd"/>
-      <w:r>
-        <w:t xml:space="preserve"> den </w:t>
-      </w:r>
-      <w:proofErr w:type="spellStart"/>
-      <w:r>
-        <w:t>Coachings</w:t>
-      </w:r>
-      <w:proofErr w:type="spellEnd"/>
-      <w:r>
-        <w:t xml:space="preserve">. </w:t>
-      </w:r>
-      <w:proofErr w:type="spellStart"/>
-      <w:r>
-        <w:t>Seitdem</w:t>
-      </w:r>
-      <w:proofErr w:type="spellEnd"/>
-      <w:r>
-        <w:t xml:space="preserve"> </w:t>
-      </w:r>
-      <w:proofErr w:type="spellStart"/>
-      <w:r>
-        <w:t>gibt</w:t>
-      </w:r>
-      <w:proofErr w:type="spellEnd"/>
-      <w:r>
-        <w:t xml:space="preserve"> es </w:t>
-      </w:r>
-      <w:proofErr w:type="spellStart"/>
-      <w:r>
-        <w:t>eine</w:t>
-      </w:r>
-      <w:proofErr w:type="spellEnd"/>
-      <w:r>
-        <w:t xml:space="preserve"> Rolle je Use Case und </w:t>
-      </w:r>
-      <w:proofErr w:type="spellStart"/>
-      <w:r>
-        <w:t>eigene</w:t>
-      </w:r>
-      <w:proofErr w:type="spellEnd"/>
-      <w:r>
-        <w:t xml:space="preserve"> </w:t>
-      </w:r>
-      <w:proofErr w:type="spellStart"/>
-      <w:r>
-        <w:t>Oberflächenklassen</w:t>
-      </w:r>
-      <w:proofErr w:type="spellEnd"/>
-      <w:r>
-        <w:t>.</w:t>
+        <w:t>Viertens das Feedback aus den Coachings. Seitdem gibt es eine Rolle je Use Case und eigene Oberflächenklassen.</w:t>
       </w:r>
     </w:p>
     <w:p>
-      <w:proofErr w:type="spellStart"/>
       <w:r>
-        <w:t>Gelernt</w:t>
-      </w:r>
-      <w:proofErr w:type="spellEnd"/>
-      <w:r>
-        <w:t xml:space="preserve"> </w:t>
-      </w:r>
-      <w:proofErr w:type="spellStart"/>
-      <w:r>
-        <w:t>haben</w:t>
-      </w:r>
-      <w:proofErr w:type="spellEnd"/>
-      <w:r>
-        <w:t xml:space="preserve"> </w:t>
-      </w:r>
-      <w:proofErr w:type="spellStart"/>
-      <w:r>
-        <w:t>wir</w:t>
-      </w:r>
-      <w:proofErr w:type="spellEnd"/>
-      <w:r>
-        <w:t xml:space="preserve"> </w:t>
-      </w:r>
-      <w:proofErr w:type="spellStart"/>
-      <w:r>
-        <w:t>vor</w:t>
-      </w:r>
-      <w:proofErr w:type="spellEnd"/>
-      <w:r>
-        <w:t xml:space="preserve"> </w:t>
-      </w:r>
-      <w:proofErr w:type="spellStart"/>
-      <w:r>
-        <w:t>allem</w:t>
-      </w:r>
-      <w:proofErr w:type="spellEnd"/>
-      <w:r>
-        <w:t xml:space="preserve">, </w:t>
-      </w:r>
-      <w:proofErr w:type="spellStart"/>
-      <w:r>
-        <w:t>dass</w:t>
-      </w:r>
-      <w:proofErr w:type="spellEnd"/>
-      <w:r>
-        <w:t xml:space="preserve"> man </w:t>
-      </w:r>
-      <w:proofErr w:type="spellStart"/>
-      <w:r>
-        <w:t>bei</w:t>
-      </w:r>
-      <w:proofErr w:type="spellEnd"/>
-      <w:r>
-        <w:t xml:space="preserve"> </w:t>
-      </w:r>
-      <w:proofErr w:type="spellStart"/>
-      <w:r>
-        <w:t>jeder</w:t>
-      </w:r>
-      <w:proofErr w:type="spellEnd"/>
-      <w:r>
-        <w:t xml:space="preserve"> </w:t>
-      </w:r>
-      <w:proofErr w:type="spellStart"/>
-      <w:r>
-        <w:t>einzelnen</w:t>
-      </w:r>
-      <w:proofErr w:type="spellEnd"/>
-      <w:r>
-        <w:t xml:space="preserve"> </w:t>
-      </w:r>
-      <w:proofErr w:type="spellStart"/>
-      <w:r>
-        <w:t>Änderung</w:t>
-      </w:r>
-      <w:proofErr w:type="spellEnd"/>
-      <w:r>
-        <w:t xml:space="preserve"> </w:t>
-      </w:r>
-      <w:proofErr w:type="spellStart"/>
-      <w:r>
-        <w:t>prüfen</w:t>
-      </w:r>
-      <w:proofErr w:type="spellEnd"/>
-      <w:r>
-        <w:t xml:space="preserve"> muss, </w:t>
-      </w:r>
-      <w:proofErr w:type="spellStart"/>
-      <w:r>
-        <w:t>ob</w:t>
-      </w:r>
-      <w:proofErr w:type="spellEnd"/>
-      <w:r>
-        <w:t xml:space="preserve"> </w:t>
-      </w:r>
-      <w:proofErr w:type="spellStart"/>
-      <w:r>
-        <w:t>alles</w:t>
-      </w:r>
-      <w:proofErr w:type="spellEnd"/>
-      <w:r>
-        <w:t xml:space="preserve"> </w:t>
-      </w:r>
-      <w:proofErr w:type="spellStart"/>
-      <w:r>
-        <w:t>noch</w:t>
-      </w:r>
-      <w:proofErr w:type="spellEnd"/>
-      <w:r>
-        <w:t xml:space="preserve"> </w:t>
-      </w:r>
-      <w:proofErr w:type="spellStart"/>
-      <w:r>
-        <w:t>zusammenpasst</w:t>
-      </w:r>
-      <w:proofErr w:type="spellEnd"/>
-      <w:r>
-        <w:t xml:space="preserve">. Wie </w:t>
-      </w:r>
-      <w:proofErr w:type="spellStart"/>
-      <w:r>
-        <w:t>wir</w:t>
-      </w:r>
-      <w:proofErr w:type="spellEnd"/>
-      <w:r>
-        <w:t xml:space="preserve"> </w:t>
-      </w:r>
-      <w:proofErr w:type="spellStart"/>
-      <w:r>
-        <w:t>zusammengearbeitet</w:t>
-      </w:r>
-      <w:proofErr w:type="spellEnd"/>
-      <w:r>
-        <w:t xml:space="preserve"> </w:t>
-      </w:r>
-      <w:proofErr w:type="spellStart"/>
-      <w:r>
-        <w:t>haben</w:t>
-      </w:r>
-      <w:proofErr w:type="spellEnd"/>
-      <w:r>
-        <w:t xml:space="preserve">, </w:t>
-      </w:r>
-      <w:proofErr w:type="spellStart"/>
-      <w:r>
-        <w:t>zeigt</w:t>
-      </w:r>
-      <w:proofErr w:type="spellEnd"/>
-      <w:r>
-        <w:t xml:space="preserve"> Nina.</w:t>
+        <w:t>Gelernt haben wir vor allem, dass man bei jeder einzelnen Änderung prüfen muss, ob alles noch zusammenpasst. Wie wir zusammengearbeitet haben, zeigt Nina.</w:t>
       </w:r>
     </w:p>
     <w:p>
       <w:r>
         <w:rPr>
           <w:rStyle w:val="Fett"/>
-          <w:b/>
         </w:rPr>
-        <w:t>Folie 21 – Vorgehen und Projektmanagement</w:t>
-      </w:r>
-      <w:r>
-        <w:rPr>
-          <w:rStyle w:val="Fett"/>
-        </w:rPr>
-        <w:t xml:space="preserve">  (65 s)</w:t>
+        <w:t>Folie 21 – Vorgehen und Projektmanagement  (65 s)</w:t>
       </w:r>
     </w:p>
     <w:p>
       <w:r>
-        <w:t xml:space="preserve">Nina: Gearbeitet haben wir in Sprints im Takt der vier Gruppentermine, mit Review, Retrospektive und Planning je Termin. Ich habe die Projektleitung, David die Stellvertretung und UML, Adrian ist Product Owner, Kilian Scrum Master und ebenfalls für UML zuständig, Maximilian verantwortet BPMN und Jakob die Qualität. Alles Schriftliche liegt in unserem privaten GitHub-Repository. Änderungen gehen über einen eigenen Branch, einen Pull Request und ein Review durch eine zweite Person. Außerdem führen wir ein Trello-Board mit einer Liste je Termin und eine Karte je Person und Aufgabe. Jedes Diagramm ist denselben Weg gegangen: Zuerst der Entwurf im Zweierteam, dann gegenseitiges Review, anschließend Abstimmung im Gruppentermin und erst dann der Merge über Pull Request. Entscheidungen, die mehrere betreffen, haben wir mit Begründung und Datum in den Entscheidungslog geschrieben. So konnten wir bei jeder Korrektur nachvollziehen, warum </w:t>
-      </w:r>
-      <w:proofErr w:type="spellStart"/>
-      <w:r>
-        <w:t>ein</w:t>
-      </w:r>
-      <w:proofErr w:type="spellEnd"/>
-      <w:r>
-        <w:t xml:space="preserve"> Modell so </w:t>
-      </w:r>
-      <w:proofErr w:type="spellStart"/>
-      <w:r>
-        <w:t>aussieht</w:t>
-      </w:r>
-      <w:proofErr w:type="spellEnd"/>
-      <w:r>
-        <w:t>.</w:t>
+        <w:t>Nina: Gearbeitet haben wir in Sprints im Takt der vier Gruppentermine, mit Review, Retrospektive und Planning je Termin. Ich habe die Projektleitung, David die Stellvertretung und UML, Adrian ist Product Owner, Kilian Scrum Master und ebenfalls für UML zuständig, Maximilian verantwortet BPMN und Jakob die Qualität. Alles Schriftliche liegt in unserem privaten GitHub-Repository. Änderungen gehen über einen eigenen Branch, einen Pull Request und ein Review durch eine zweite Person. Außerdem führen wir ein Trello-Board mit einer Liste je Termin und eine Karte je Person und Aufgabe. Jedes Diagramm ist denselben Weg gegangen: Zuerst der Entwurf im Zweierteam, dann gegenseitiges Review, anschließend Abstimmung im Gruppentermin und erst dann der Merge über Pull Request. Entscheidungen, die mehrere betreffen, haben wir mit Begründung und Datum in den Entscheidungslog geschrieben. So konnten wir bei jeder Korrektur nachvollziehen, warum ein Modell so aussieht.</w:t>
       </w:r>
     </w:p>
     <w:p>
@@ -4774,57 +659,13 @@
         </w:rPr>
         <w:t xml:space="preserve">  (60 s)</w:t>
       </w:r>
-      <w:proofErr w:type="gramStart"/>
-      <w:proofErr w:type="gramEnd"/>
     </w:p>
     <w:p>
       <w:r>
         <w:rPr>
           <w:bCs/>
         </w:rPr>
-        <w:t xml:space="preserve">Nina: Zum Schluss unser Blick nach vorn. Wir bieten RepairFlow als Abo je Filiale in zwei Stufen an: Basis mit Auftragsverwaltung und Kundenkommunikation, Pro zusätzlich mit filialübergreifender Disposition und KI-Sofortdiagnose. Zielkunden sind unabhängige Werkstätten und kleine Ketten mit zwei bis zehn </w:t>
-      </w:r>
-      <w:proofErr w:type="spellStart"/>
-      <w:r>
-        <w:rPr>
-          <w:bCs/>
-        </w:rPr>
-        <w:t>Filialen</w:t>
-      </w:r>
-      <w:proofErr w:type="spellEnd"/>
-      <w:r>
-        <w:rPr>
-          <w:bCs/>
-        </w:rPr>
-        <w:t xml:space="preserve"> </w:t>
-      </w:r>
-      <w:proofErr w:type="spellStart"/>
-      <w:r>
-        <w:rPr>
-          <w:bCs/>
-        </w:rPr>
-        <w:t>im</w:t>
-      </w:r>
-      <w:proofErr w:type="spellEnd"/>
-      <w:r>
-        <w:rPr>
-          <w:bCs/>
-        </w:rPr>
-        <w:t xml:space="preserve"> </w:t>
-      </w:r>
-      <w:proofErr w:type="spellStart"/>
-      <w:r>
-        <w:rPr>
-          <w:bCs/>
-        </w:rPr>
-        <w:t>deutschsprachigen</w:t>
-      </w:r>
-      <w:proofErr w:type="spellEnd"/>
-      <w:r>
-        <w:rPr>
-          <w:bCs/>
-        </w:rPr>
-        <w:t xml:space="preserve"> Raum.</w:t>
+        <w:t>Nina: Zum Schluss unser Blick nach vorn. Wir bieten RepairFlow als Abo je Filiale in zwei Stufen an: Basis mit Auftragsverwaltung und Kundenkommunikation, Pro zusätzlich mit filialübergreifender Disposition und KI-Sofortdiagnose. Zielkunden sind unabhängige Werkstätten und kleine Ketten mit zwei bis zehn Filialen im deutschsprachigen Raum.</w:t>
       </w:r>
     </w:p>
     <w:p>
@@ -4834,60 +675,12 @@
     </w:p>
     <w:p>
       <w:r>
-        <w:t xml:space="preserve">Erstens eine KI-gestützte Disposition: Aus Lagerbeständen, Bestellhistorie und Saisonverläufen sagt RepairFlow den Bedarf vorher, bevor </w:t>
-      </w:r>
-      <w:proofErr w:type="spellStart"/>
-      <w:r>
-        <w:t>Fehlteile</w:t>
-      </w:r>
-      <w:proofErr w:type="spellEnd"/>
-      <w:r>
-        <w:t xml:space="preserve"> </w:t>
-      </w:r>
-      <w:proofErr w:type="spellStart"/>
-      <w:r>
-        <w:t>einen</w:t>
-      </w:r>
-      <w:proofErr w:type="spellEnd"/>
-      <w:r>
-        <w:t xml:space="preserve"> </w:t>
-      </w:r>
-      <w:proofErr w:type="spellStart"/>
-      <w:r>
-        <w:t>Auftrag</w:t>
-      </w:r>
-      <w:proofErr w:type="spellEnd"/>
-      <w:r>
-        <w:t xml:space="preserve"> </w:t>
-      </w:r>
-      <w:proofErr w:type="spellStart"/>
-      <w:r>
-        <w:t>blockieren</w:t>
-      </w:r>
-      <w:proofErr w:type="spellEnd"/>
-      <w:r>
-        <w:t>.</w:t>
+        <w:t>Erstens eine KI-gestützte Disposition: Aus Lagerbeständen, Bestellhistorie und Saisonverläufen sagt RepairFlow den Bedarf vorher, bevor Fehlteile einen Auftrag blockieren.</w:t>
       </w:r>
     </w:p>
     <w:p>
       <w:r>
-        <w:t xml:space="preserve">Zweitens ein Techniker-Copilot, der aus der Auftragshistorie lernt und bei ähnlichen Reparaturen Schritt für Schritt </w:t>
-      </w:r>
-      <w:proofErr w:type="spellStart"/>
-      <w:r>
-        <w:t>Empfehlungen</w:t>
-      </w:r>
-      <w:proofErr w:type="spellEnd"/>
-      <w:r>
-        <w:t xml:space="preserve"> </w:t>
-      </w:r>
-      <w:proofErr w:type="spellStart"/>
-      <w:r>
-        <w:t>gibt</w:t>
-      </w:r>
-      <w:proofErr w:type="spellEnd"/>
-      <w:r>
-        <w:t>.</w:t>
+        <w:t>Zweitens ein Techniker-Copilot, der aus der Auftragshistorie lernt und bei ähnlichen Reparaturen Schritt für Schritt Empfehlungen gibt.</w:t>
       </w:r>
     </w:p>
     <w:p>
@@ -4906,6 +699,7 @@
           <w:b/>
           <w:bCs/>
         </w:rPr>
+        <w:lastRenderedPageBreak/>
         <w:t>Folie 23 – Fazit</w:t>
       </w:r>
       <w:r>
@@ -4914,57 +708,13 @@
         </w:rPr>
         <w:t xml:space="preserve">  (30 s)</w:t>
       </w:r>
-      <w:proofErr w:type="gramStart"/>
-      <w:proofErr w:type="gramEnd"/>
     </w:p>
     <w:p>
       <w:r>
         <w:rPr>
           <w:bCs/>
         </w:rPr>
-        <w:t xml:space="preserve">Nina: Lassen Sie mich RepairFlow kurz zusammenfassen: Wir ersetzen Papier, Excel und Telefon durch einen digitalen Reparaturauftrag als zentralen Zustandsautomaten. Der fachliche Mehrwert liegt in der filialübergreifenden Disposition und in der KI-Sofortdiagnose, die dem Kunden Klarheit gibt, noch bevor er die Werkstatt betritt. Und mit dem Potenzial, das wir gerade gezeigt haben, ist das erst der Anfang. Vielen Dank. Wir freuen </w:t>
-      </w:r>
-      <w:proofErr w:type="spellStart"/>
-      <w:r>
-        <w:rPr>
-          <w:bCs/>
-        </w:rPr>
-        <w:t>uns</w:t>
-      </w:r>
-      <w:proofErr w:type="spellEnd"/>
-      <w:r>
-        <w:rPr>
-          <w:bCs/>
-        </w:rPr>
-        <w:t xml:space="preserve"> auf </w:t>
-      </w:r>
-      <w:proofErr w:type="spellStart"/>
-      <w:r>
-        <w:rPr>
-          <w:bCs/>
-        </w:rPr>
-        <w:t>Ihre</w:t>
-      </w:r>
-      <w:proofErr w:type="spellEnd"/>
-      <w:r>
-        <w:rPr>
-          <w:bCs/>
-        </w:rPr>
-        <w:t xml:space="preserve"> </w:t>
-      </w:r>
-      <w:proofErr w:type="spellStart"/>
-      <w:r>
-        <w:rPr>
-          <w:bCs/>
-        </w:rPr>
-        <w:t>Fragen</w:t>
-      </w:r>
-      <w:proofErr w:type="spellEnd"/>
-      <w:r>
-        <w:rPr>
-          <w:bCs/>
-        </w:rPr>
-        <w:t>.</w:t>
+        <w:t>Nina: Lassen Sie mich RepairFlow kurz zusammenfassen: Wir ersetzen Papier, Excel und Telefon durch einen digitalen Reparaturauftrag als zentralen Zustandsautomaten. Der fachliche Mehrwert liegt in der filialübergreifenden Disposition und in der KI-Sofortdiagnose, die dem Kunden Klarheit gibt, noch bevor er die Werkstatt betritt. Und mit dem Potenzial, das wir gerade gezeigt haben, ist das erst der Anfang. Vielen Dank. Wir freuen uns auf Ihre Fragen.</w:t>
       </w:r>
     </w:p>
     <w:sectPr>

</xml_diff>

<commit_message>
[T05 2026-10-26] docs: update david's slides 1-7 and speech text
Slides 1-7 replaced with the current working version: new agenda (two
columns, morph 3->4), problem slide, solution (slide 6) and system
boundary (slide 7, morph 6->7). Notes keep only the speaker. Speech text
for slides 1-7 replaced (about 3:40 instead of 2:50). Slides 8-24, their
notes and the speech text from slide 8 on are unchanged (checked by
render and XML comparison).

Co-Authored-By: Claude Opus 5.5 <noreply@anthropic.com>
</commit_message>
<xml_diff>
--- a/4_praesentation/Sprechtext_Abschlusspraesentation.docx
+++ b/4_praesentation/Sprechtext_Abschlusspraesentation.docx
@@ -87,7 +87,7 @@
       </w:r>
       <w:proofErr w:type="gramEnd"/>
       <w:r>
-        <w:t>12 s)</w:t>
+        <w:t>17 s)</w:t>
       </w:r>
     </w:p>
     <w:p>
@@ -99,116 +99,35 @@
       </w:r>
       <w:proofErr w:type="spellStart"/>
       <w:r>
-        <w:t>Guten</w:t>
-      </w:r>
-      <w:proofErr w:type="spellEnd"/>
-      <w:r>
-        <w:t xml:space="preserve"> Morgen. Wir </w:t>
-      </w:r>
-      <w:proofErr w:type="spellStart"/>
-      <w:r>
-        <w:t>sind</w:t>
-      </w:r>
-      <w:proofErr w:type="spellEnd"/>
-      <w:r>
-        <w:t xml:space="preserve"> Gruppe 1 und </w:t>
-      </w:r>
-      <w:proofErr w:type="spellStart"/>
-      <w:r>
-        <w:t>stellen</w:t>
-      </w:r>
-      <w:proofErr w:type="spellEnd"/>
-      <w:r>
-        <w:t xml:space="preserve"> Ihnen </w:t>
-      </w:r>
-      <w:proofErr w:type="spellStart"/>
-      <w:r>
-        <w:t>RepairFlow</w:t>
-      </w:r>
-      <w:proofErr w:type="spellEnd"/>
-      <w:r>
-        <w:t xml:space="preserve"> </w:t>
-      </w:r>
-      <w:proofErr w:type="spellStart"/>
-      <w:r>
-        <w:t>vor</w:t>
-      </w:r>
-      <w:proofErr w:type="spellEnd"/>
-      <w:r>
-        <w:t xml:space="preserve">, </w:t>
-      </w:r>
-      <w:proofErr w:type="spellStart"/>
-      <w:r>
-        <w:t>eine</w:t>
-      </w:r>
-      <w:proofErr w:type="spellEnd"/>
-      <w:r>
-        <w:t xml:space="preserve"> </w:t>
-      </w:r>
-      <w:proofErr w:type="spellStart"/>
-      <w:r>
-        <w:t>Plattform</w:t>
-      </w:r>
-      <w:proofErr w:type="spellEnd"/>
-      <w:r>
-        <w:t xml:space="preserve">, </w:t>
-      </w:r>
-      <w:proofErr w:type="spellStart"/>
-      <w:r>
-        <w:t>mit</w:t>
-      </w:r>
-      <w:proofErr w:type="spellEnd"/>
-      <w:r>
-        <w:t xml:space="preserve"> der </w:t>
-      </w:r>
-      <w:proofErr w:type="spellStart"/>
-      <w:r>
-        <w:t>Reparaturwerkstätten</w:t>
-      </w:r>
-      <w:proofErr w:type="spellEnd"/>
-      <w:r>
-        <w:t xml:space="preserve"> </w:t>
-      </w:r>
-      <w:proofErr w:type="spellStart"/>
-      <w:r>
-        <w:t>ihre</w:t>
-      </w:r>
-      <w:proofErr w:type="spellEnd"/>
-      <w:r>
-        <w:t xml:space="preserve"> </w:t>
-      </w:r>
-      <w:proofErr w:type="spellStart"/>
-      <w:r>
-        <w:t>Aufträge</w:t>
-      </w:r>
-      <w:proofErr w:type="spellEnd"/>
-      <w:r>
-        <w:t xml:space="preserve">, </w:t>
-      </w:r>
-      <w:proofErr w:type="spellStart"/>
-      <w:r>
-        <w:t>Ersatzteile</w:t>
-      </w:r>
-      <w:proofErr w:type="spellEnd"/>
-      <w:r>
-        <w:t xml:space="preserve"> und Kunden an </w:t>
-      </w:r>
-      <w:proofErr w:type="spellStart"/>
-      <w:r>
-        <w:t>einer</w:t>
-      </w:r>
-      <w:proofErr w:type="spellEnd"/>
-      <w:r>
-        <w:t xml:space="preserve"> Stelle </w:t>
-      </w:r>
-      <w:proofErr w:type="spellStart"/>
-      <w:r>
-        <w:t>verwalten</w:t>
-      </w:r>
-      <w:proofErr w:type="spellEnd"/>
-      <w:r>
-        <w:t>.</w:t>
-      </w:r>
+        <w:t>Guten Morgen. Mein Name ist David Leismann, und ich mache heute den Anfang. Wir sind Gruppe 1 und stellen Ihnen RepairFlow vor, eine Plattform, mit der Reparaturwerkstätten ihre Aufträge, Ersatzteile und Kunden an einer Stelle verwalten.</w:t>
+      </w:r>
+      <w:proofErr w:type="spellEnd"/>
+      <w:proofErr w:type="spellStart"/>
+      <w:proofErr w:type="spellEnd"/>
+      <w:proofErr w:type="spellStart"/>
+      <w:proofErr w:type="spellEnd"/>
+      <w:proofErr w:type="spellStart"/>
+      <w:proofErr w:type="spellEnd"/>
+      <w:proofErr w:type="spellStart"/>
+      <w:proofErr w:type="spellEnd"/>
+      <w:proofErr w:type="spellStart"/>
+      <w:proofErr w:type="spellEnd"/>
+      <w:proofErr w:type="spellStart"/>
+      <w:proofErr w:type="spellEnd"/>
+      <w:proofErr w:type="spellStart"/>
+      <w:proofErr w:type="spellEnd"/>
+      <w:proofErr w:type="spellStart"/>
+      <w:proofErr w:type="spellEnd"/>
+      <w:proofErr w:type="spellStart"/>
+      <w:proofErr w:type="spellEnd"/>
+      <w:proofErr w:type="spellStart"/>
+      <w:proofErr w:type="spellEnd"/>
+      <w:proofErr w:type="spellStart"/>
+      <w:proofErr w:type="spellEnd"/>
+      <w:proofErr w:type="spellStart"/>
+      <w:proofErr w:type="spellEnd"/>
+      <w:proofErr w:type="spellStart"/>
+      <w:proofErr w:type="spellEnd"/>
     </w:p>
     <w:p>
       <w:pPr>
@@ -218,14 +137,14 @@
         <w:rPr>
           <w:b/>
         </w:rPr>
-        <w:t xml:space="preserve">Folie 2 – Unser </w:t>
+        <w:t xml:space="preserve">Folie 2 – </w:t>
       </w:r>
       <w:proofErr w:type="gramStart"/>
       <w:r>
         <w:rPr>
           <w:b/>
         </w:rPr>
-        <w:t>Team</w:t>
+        <w:t>Unser Team</w:t>
       </w:r>
       <w:r>
         <w:t xml:space="preserve">  (</w:t>
@@ -242,137 +161,37 @@
         </w:rPr>
         <w:t xml:space="preserve">David: </w:t>
       </w:r>
-      <w:r>
-        <w:t xml:space="preserve">Kurz </w:t>
-      </w:r>
-      <w:proofErr w:type="spellStart"/>
-      <w:r>
-        <w:t>zu</w:t>
-      </w:r>
-      <w:proofErr w:type="spellEnd"/>
-      <w:r>
-        <w:t xml:space="preserve"> </w:t>
-      </w:r>
-      <w:proofErr w:type="spellStart"/>
-      <w:r>
-        <w:t>uns</w:t>
-      </w:r>
-      <w:proofErr w:type="spellEnd"/>
-      <w:r>
-        <w:t xml:space="preserve">: Wir </w:t>
-      </w:r>
-      <w:proofErr w:type="spellStart"/>
-      <w:r>
-        <w:t>haben</w:t>
-      </w:r>
-      <w:proofErr w:type="spellEnd"/>
-      <w:r>
-        <w:t xml:space="preserve"> das Projekt </w:t>
-      </w:r>
-      <w:proofErr w:type="spellStart"/>
-      <w:r>
-        <w:t>aufgeteilt</w:t>
-      </w:r>
-      <w:proofErr w:type="spellEnd"/>
-      <w:r>
-        <w:t xml:space="preserve"> </w:t>
-      </w:r>
-      <w:proofErr w:type="spellStart"/>
-      <w:r>
-        <w:t>wie</w:t>
-      </w:r>
-      <w:proofErr w:type="spellEnd"/>
-      <w:r>
-        <w:t xml:space="preserve"> </w:t>
-      </w:r>
-      <w:proofErr w:type="spellStart"/>
-      <w:r>
-        <w:t>ein</w:t>
-      </w:r>
-      <w:proofErr w:type="spellEnd"/>
-      <w:r>
-        <w:t xml:space="preserve"> </w:t>
-      </w:r>
-      <w:proofErr w:type="spellStart"/>
-      <w:r>
-        <w:t>kleines</w:t>
-      </w:r>
-      <w:proofErr w:type="spellEnd"/>
-      <w:r>
-        <w:t xml:space="preserve"> Startup, </w:t>
-      </w:r>
-      <w:proofErr w:type="spellStart"/>
-      <w:r>
-        <w:t>mit</w:t>
-      </w:r>
-      <w:proofErr w:type="spellEnd"/>
-      <w:r>
-        <w:t xml:space="preserve"> </w:t>
-      </w:r>
-      <w:proofErr w:type="spellStart"/>
-      <w:r>
-        <w:t>Projektleitung</w:t>
-      </w:r>
-      <w:proofErr w:type="spellEnd"/>
-      <w:r>
-        <w:t xml:space="preserve">, Product Owner, Scrum Master und je </w:t>
-      </w:r>
-      <w:proofErr w:type="spellStart"/>
-      <w:r>
-        <w:t>einer</w:t>
-      </w:r>
-      <w:proofErr w:type="spellEnd"/>
-      <w:r>
-        <w:t xml:space="preserve"> Person für die </w:t>
-      </w:r>
-      <w:proofErr w:type="spellStart"/>
-      <w:r>
-        <w:t>Prozesse</w:t>
-      </w:r>
-      <w:proofErr w:type="spellEnd"/>
-      <w:r>
-        <w:t xml:space="preserve"> und die </w:t>
-      </w:r>
-      <w:proofErr w:type="spellStart"/>
-      <w:r>
-        <w:t>Qualität</w:t>
-      </w:r>
-      <w:proofErr w:type="spellEnd"/>
-      <w:r>
-        <w:t xml:space="preserve">. Unter </w:t>
-      </w:r>
-      <w:proofErr w:type="spellStart"/>
-      <w:r>
-        <w:t>jedem</w:t>
-      </w:r>
-      <w:proofErr w:type="spellEnd"/>
-      <w:r>
-        <w:t xml:space="preserve"> Namen </w:t>
-      </w:r>
-      <w:proofErr w:type="spellStart"/>
-      <w:r>
-        <w:t>sehen</w:t>
-      </w:r>
-      <w:proofErr w:type="spellEnd"/>
-      <w:r>
-        <w:t xml:space="preserve"> Sie, welches Thema die Person </w:t>
-      </w:r>
-      <w:proofErr w:type="spellStart"/>
-      <w:r>
-        <w:t>heute</w:t>
-      </w:r>
-      <w:proofErr w:type="spellEnd"/>
-      <w:r>
-        <w:t xml:space="preserve"> </w:t>
-      </w:r>
-      <w:proofErr w:type="spellStart"/>
-      <w:r>
-        <w:t>vorstellt</w:t>
-      </w:r>
-      <w:proofErr w:type="spellEnd"/>
-      <w:r>
-        <w:t>.</w:t>
-      </w:r>
+      <w:proofErr w:type="spellStart"/>
+      <w:r>
+        <w:t>Kurz zu uns: Wir haben das Projekt aufgeteilt wie ein kleines Startup, mit Projektleitung, Product Owner, Scrum Master und je einer Person für die Prozesse und die Qualität. Unter jedem Namen sehen Sie, welches Thema die Person heute vorstellt.</w:t>
+      </w:r>
+      <w:proofErr w:type="spellEnd"/>
+      <w:proofErr w:type="spellStart"/>
+      <w:proofErr w:type="spellEnd"/>
+      <w:proofErr w:type="spellStart"/>
+      <w:proofErr w:type="spellEnd"/>
+      <w:proofErr w:type="spellStart"/>
+      <w:proofErr w:type="spellEnd"/>
+      <w:proofErr w:type="spellStart"/>
+      <w:proofErr w:type="spellEnd"/>
+      <w:proofErr w:type="spellStart"/>
+      <w:proofErr w:type="spellEnd"/>
+      <w:proofErr w:type="spellStart"/>
+      <w:proofErr w:type="spellEnd"/>
+      <w:proofErr w:type="spellStart"/>
+      <w:proofErr w:type="spellEnd"/>
+      <w:proofErr w:type="spellStart"/>
+      <w:proofErr w:type="spellEnd"/>
+      <w:proofErr w:type="spellStart"/>
+      <w:proofErr w:type="spellEnd"/>
+      <w:proofErr w:type="spellStart"/>
+      <w:proofErr w:type="spellEnd"/>
+      <w:proofErr w:type="spellStart"/>
+      <w:proofErr w:type="spellEnd"/>
+      <w:proofErr w:type="spellStart"/>
+      <w:proofErr w:type="spellEnd"/>
+      <w:proofErr w:type="spellStart"/>
+      <w:proofErr w:type="spellEnd"/>
     </w:p>
     <w:p>
       <w:pPr>
@@ -382,14 +201,14 @@
         <w:rPr>
           <w:b/>
         </w:rPr>
-        <w:t xml:space="preserve">Folie 3 – Agenda, Teil </w:t>
+        <w:t xml:space="preserve">Folie 3 – </w:t>
       </w:r>
       <w:proofErr w:type="gramStart"/>
       <w:r>
         <w:rPr>
           <w:b/>
         </w:rPr>
-        <w:t>1</w:t>
+        <w:t>Agenda, Teil 1</w:t>
       </w:r>
       <w:r>
         <w:t xml:space="preserve">  (</w:t>
@@ -406,225 +225,37 @@
         </w:rPr>
         <w:t xml:space="preserve">David: </w:t>
       </w:r>
-      <w:r>
-        <w:t xml:space="preserve">Die </w:t>
-      </w:r>
-      <w:proofErr w:type="spellStart"/>
-      <w:r>
-        <w:t>Präsentation</w:t>
-      </w:r>
-      <w:proofErr w:type="spellEnd"/>
-      <w:r>
-        <w:t xml:space="preserve"> hat </w:t>
-      </w:r>
-      <w:proofErr w:type="spellStart"/>
-      <w:r>
-        <w:t>zwei</w:t>
-      </w:r>
-      <w:proofErr w:type="spellEnd"/>
-      <w:r>
-        <w:t xml:space="preserve"> </w:t>
-      </w:r>
-      <w:proofErr w:type="spellStart"/>
-      <w:r>
-        <w:t>Teile</w:t>
-      </w:r>
-      <w:proofErr w:type="spellEnd"/>
-      <w:r>
-        <w:t xml:space="preserve">. </w:t>
-      </w:r>
-      <w:proofErr w:type="spellStart"/>
-      <w:r>
-        <w:t>Im</w:t>
-      </w:r>
-      <w:proofErr w:type="spellEnd"/>
-      <w:r>
-        <w:t xml:space="preserve"> </w:t>
-      </w:r>
-      <w:proofErr w:type="spellStart"/>
-      <w:r>
-        <w:t>ersten</w:t>
-      </w:r>
-      <w:proofErr w:type="spellEnd"/>
-      <w:r>
-        <w:t xml:space="preserve"> </w:t>
-      </w:r>
-      <w:proofErr w:type="spellStart"/>
-      <w:r>
-        <w:t>stellen</w:t>
-      </w:r>
-      <w:proofErr w:type="spellEnd"/>
-      <w:r>
-        <w:t xml:space="preserve"> </w:t>
-      </w:r>
-      <w:proofErr w:type="spellStart"/>
-      <w:r>
-        <w:t>wir</w:t>
-      </w:r>
-      <w:proofErr w:type="spellEnd"/>
-      <w:r>
-        <w:t xml:space="preserve"> </w:t>
-      </w:r>
-      <w:proofErr w:type="spellStart"/>
-      <w:r>
-        <w:t>RepairFlow</w:t>
-      </w:r>
-      <w:proofErr w:type="spellEnd"/>
-      <w:r>
-        <w:t xml:space="preserve"> so </w:t>
-      </w:r>
-      <w:proofErr w:type="spellStart"/>
-      <w:r>
-        <w:t>vor</w:t>
-      </w:r>
-      <w:proofErr w:type="spellEnd"/>
-      <w:r>
-        <w:t xml:space="preserve">, </w:t>
-      </w:r>
-      <w:proofErr w:type="spellStart"/>
-      <w:r>
-        <w:t>wie</w:t>
-      </w:r>
-      <w:proofErr w:type="spellEnd"/>
-      <w:r>
-        <w:t xml:space="preserve"> </w:t>
-      </w:r>
-      <w:proofErr w:type="spellStart"/>
-      <w:r>
-        <w:t>wir</w:t>
-      </w:r>
-      <w:proofErr w:type="spellEnd"/>
-      <w:r>
-        <w:t xml:space="preserve"> es </w:t>
-      </w:r>
-      <w:proofErr w:type="spellStart"/>
-      <w:r>
-        <w:t>einer</w:t>
-      </w:r>
-      <w:proofErr w:type="spellEnd"/>
-      <w:r>
-        <w:t xml:space="preserve"> </w:t>
-      </w:r>
-      <w:proofErr w:type="spellStart"/>
-      <w:r>
-        <w:t>Werkstatt</w:t>
-      </w:r>
-      <w:proofErr w:type="spellEnd"/>
-      <w:r>
-        <w:t xml:space="preserve"> </w:t>
-      </w:r>
-      <w:proofErr w:type="spellStart"/>
-      <w:r>
-        <w:t>zeigen</w:t>
-      </w:r>
-      <w:proofErr w:type="spellEnd"/>
-      <w:r>
-        <w:t xml:space="preserve"> </w:t>
-      </w:r>
-      <w:proofErr w:type="spellStart"/>
-      <w:r>
-        <w:t>würden</w:t>
-      </w:r>
-      <w:proofErr w:type="spellEnd"/>
-      <w:r>
-        <w:t xml:space="preserve">: </w:t>
-      </w:r>
-      <w:proofErr w:type="spellStart"/>
-      <w:r>
-        <w:t>vom</w:t>
-      </w:r>
-      <w:proofErr w:type="spellEnd"/>
-      <w:r>
-        <w:t xml:space="preserve"> Problem </w:t>
-      </w:r>
-      <w:proofErr w:type="spellStart"/>
-      <w:r>
-        <w:t>über</w:t>
-      </w:r>
-      <w:proofErr w:type="spellEnd"/>
-      <w:r>
-        <w:t xml:space="preserve"> </w:t>
-      </w:r>
-      <w:proofErr w:type="spellStart"/>
-      <w:r>
-        <w:t>unsere</w:t>
-      </w:r>
-      <w:proofErr w:type="spellEnd"/>
-      <w:r>
-        <w:t xml:space="preserve"> </w:t>
-      </w:r>
-      <w:proofErr w:type="spellStart"/>
-      <w:r>
-        <w:t>Lösung</w:t>
-      </w:r>
-      <w:proofErr w:type="spellEnd"/>
-      <w:r>
-        <w:t xml:space="preserve"> und </w:t>
-      </w:r>
-      <w:proofErr w:type="spellStart"/>
-      <w:r>
-        <w:t>ihren</w:t>
-      </w:r>
-      <w:proofErr w:type="spellEnd"/>
-      <w:r>
-        <w:t xml:space="preserve"> </w:t>
-      </w:r>
-      <w:proofErr w:type="spellStart"/>
-      <w:r>
-        <w:t>Nutzen</w:t>
-      </w:r>
-      <w:proofErr w:type="spellEnd"/>
-      <w:r>
-        <w:t xml:space="preserve"> </w:t>
-      </w:r>
-      <w:proofErr w:type="spellStart"/>
-      <w:r>
-        <w:t>zur</w:t>
-      </w:r>
-      <w:proofErr w:type="spellEnd"/>
-      <w:r>
-        <w:t xml:space="preserve"> </w:t>
-      </w:r>
-      <w:proofErr w:type="spellStart"/>
-      <w:r>
-        <w:t>Auftragsreise</w:t>
-      </w:r>
-      <w:proofErr w:type="spellEnd"/>
-      <w:r>
-        <w:t xml:space="preserve"> </w:t>
-      </w:r>
-      <w:proofErr w:type="spellStart"/>
-      <w:r>
-        <w:t>mit</w:t>
-      </w:r>
-      <w:proofErr w:type="spellEnd"/>
-      <w:r>
-        <w:t xml:space="preserve"> Live-Demo und </w:t>
-      </w:r>
-      <w:proofErr w:type="spellStart"/>
-      <w:r>
-        <w:t>schließlich</w:t>
-      </w:r>
-      <w:proofErr w:type="spellEnd"/>
-      <w:r>
-        <w:t xml:space="preserve"> </w:t>
-      </w:r>
-      <w:proofErr w:type="spellStart"/>
-      <w:r>
-        <w:t>zur</w:t>
-      </w:r>
-      <w:proofErr w:type="spellEnd"/>
-      <w:r>
-        <w:t xml:space="preserve"> KI-</w:t>
-      </w:r>
-      <w:proofErr w:type="spellStart"/>
-      <w:r>
-        <w:t>Sofortdiagnose</w:t>
-      </w:r>
-      <w:proofErr w:type="spellEnd"/>
-      <w:r>
-        <w:t>.</w:t>
-      </w:r>
+      <w:proofErr w:type="spellStart"/>
+      <w:r>
+        <w:t>Die Präsentation hat zwei Teile. Im ersten stellen wir RepairFlow so vor, wie wir es einer Werkstatt zeigen würden: vom Problem über unsere Lösung und ihren Nutzen zur Auftragsreise mit Live-Demo und schließlich zur KI-Sofortdiagnose.</w:t>
+      </w:r>
+      <w:proofErr w:type="spellEnd"/>
+      <w:proofErr w:type="spellStart"/>
+      <w:proofErr w:type="spellEnd"/>
+      <w:proofErr w:type="spellStart"/>
+      <w:proofErr w:type="spellEnd"/>
+      <w:proofErr w:type="spellStart"/>
+      <w:proofErr w:type="spellEnd"/>
+      <w:proofErr w:type="spellStart"/>
+      <w:proofErr w:type="spellEnd"/>
+      <w:proofErr w:type="spellStart"/>
+      <w:proofErr w:type="spellEnd"/>
+      <w:proofErr w:type="spellStart"/>
+      <w:proofErr w:type="spellEnd"/>
+      <w:proofErr w:type="spellStart"/>
+      <w:proofErr w:type="spellEnd"/>
+      <w:proofErr w:type="spellStart"/>
+      <w:proofErr w:type="spellEnd"/>
+      <w:proofErr w:type="spellStart"/>
+      <w:proofErr w:type="spellEnd"/>
+      <w:proofErr w:type="spellStart"/>
+      <w:proofErr w:type="spellEnd"/>
+      <w:proofErr w:type="spellStart"/>
+      <w:proofErr w:type="spellEnd"/>
+      <w:proofErr w:type="spellStart"/>
+      <w:proofErr w:type="spellEnd"/>
+      <w:proofErr w:type="spellStart"/>
+      <w:proofErr w:type="spellEnd"/>
     </w:p>
     <w:p>
       <w:pPr>
@@ -634,14 +265,14 @@
         <w:rPr>
           <w:b/>
         </w:rPr>
-        <w:t xml:space="preserve">Folie 4 – Agenda, Teil </w:t>
+        <w:t xml:space="preserve">Folie 4 – </w:t>
       </w:r>
       <w:proofErr w:type="gramStart"/>
       <w:r>
         <w:rPr>
           <w:b/>
         </w:rPr>
-        <w:t>2</w:t>
+        <w:t>Agenda, Teil 2</w:t>
       </w:r>
       <w:r>
         <w:t xml:space="preserve">  (</w:t>
@@ -660,188 +291,35 @@
       </w:r>
       <w:proofErr w:type="spellStart"/>
       <w:r>
-        <w:t>Im</w:t>
-      </w:r>
-      <w:proofErr w:type="spellEnd"/>
-      <w:r>
-        <w:t xml:space="preserve"> </w:t>
-      </w:r>
-      <w:proofErr w:type="spellStart"/>
-      <w:r>
-        <w:t>zweiten</w:t>
-      </w:r>
-      <w:proofErr w:type="spellEnd"/>
-      <w:r>
-        <w:t xml:space="preserve"> Teil </w:t>
-      </w:r>
-      <w:proofErr w:type="spellStart"/>
-      <w:r>
-        <w:t>zeigen</w:t>
-      </w:r>
-      <w:proofErr w:type="spellEnd"/>
-      <w:r>
-        <w:t xml:space="preserve"> </w:t>
-      </w:r>
-      <w:proofErr w:type="spellStart"/>
-      <w:r>
-        <w:t>wir</w:t>
-      </w:r>
-      <w:proofErr w:type="spellEnd"/>
-      <w:r>
-        <w:t xml:space="preserve">, was </w:t>
-      </w:r>
-      <w:proofErr w:type="spellStart"/>
-      <w:r>
-        <w:t>dahintersteckt</w:t>
-      </w:r>
-      <w:proofErr w:type="spellEnd"/>
-      <w:r>
-        <w:t xml:space="preserve">: die </w:t>
-      </w:r>
-      <w:proofErr w:type="spellStart"/>
-      <w:r>
-        <w:t>Ergebnisse</w:t>
-      </w:r>
-      <w:proofErr w:type="spellEnd"/>
-      <w:r>
-        <w:t xml:space="preserve"> und </w:t>
-      </w:r>
-      <w:proofErr w:type="spellStart"/>
-      <w:r>
-        <w:t>Prozesse</w:t>
-      </w:r>
-      <w:proofErr w:type="spellEnd"/>
-      <w:r>
-        <w:t xml:space="preserve">, Rollen und </w:t>
-      </w:r>
-      <w:proofErr w:type="spellStart"/>
-      <w:r>
-        <w:t>Datenmodell</w:t>
-      </w:r>
-      <w:proofErr w:type="spellEnd"/>
-      <w:r>
-        <w:t xml:space="preserve">, </w:t>
-      </w:r>
-      <w:proofErr w:type="spellStart"/>
-      <w:r>
-        <w:t>wie</w:t>
-      </w:r>
-      <w:proofErr w:type="spellEnd"/>
-      <w:r>
-        <w:t xml:space="preserve"> </w:t>
-      </w:r>
-      <w:proofErr w:type="spellStart"/>
-      <w:r>
-        <w:t>wir</w:t>
-      </w:r>
-      <w:proofErr w:type="spellEnd"/>
-      <w:r>
-        <w:t xml:space="preserve"> die </w:t>
-      </w:r>
-      <w:proofErr w:type="spellStart"/>
-      <w:r>
-        <w:t>Qualität</w:t>
-      </w:r>
-      <w:proofErr w:type="spellEnd"/>
-      <w:r>
-        <w:t xml:space="preserve"> </w:t>
-      </w:r>
-      <w:proofErr w:type="spellStart"/>
-      <w:r>
-        <w:t>gesichert</w:t>
-      </w:r>
-      <w:proofErr w:type="spellEnd"/>
-      <w:r>
-        <w:t xml:space="preserve"> </w:t>
-      </w:r>
-      <w:proofErr w:type="spellStart"/>
-      <w:r>
-        <w:t>haben</w:t>
-      </w:r>
-      <w:proofErr w:type="spellEnd"/>
-      <w:r>
-        <w:t xml:space="preserve">, und </w:t>
-      </w:r>
-      <w:proofErr w:type="spellStart"/>
-      <w:r>
-        <w:t>zum</w:t>
-      </w:r>
-      <w:proofErr w:type="spellEnd"/>
-      <w:r>
-        <w:t xml:space="preserve"> </w:t>
-      </w:r>
-      <w:proofErr w:type="spellStart"/>
-      <w:r>
-        <w:t>Schluss</w:t>
-      </w:r>
-      <w:proofErr w:type="spellEnd"/>
-      <w:r>
-        <w:t xml:space="preserve"> </w:t>
-      </w:r>
-      <w:proofErr w:type="spellStart"/>
-      <w:r>
-        <w:t>unser</w:t>
-      </w:r>
-      <w:proofErr w:type="spellEnd"/>
-      <w:r>
-        <w:t xml:space="preserve"> </w:t>
-      </w:r>
-      <w:proofErr w:type="spellStart"/>
-      <w:r>
-        <w:t>Vorgehen</w:t>
-      </w:r>
-      <w:proofErr w:type="spellEnd"/>
-      <w:r>
-        <w:t xml:space="preserve"> und das </w:t>
-      </w:r>
-      <w:proofErr w:type="spellStart"/>
-      <w:r>
-        <w:t>Geschäftsmodell</w:t>
-      </w:r>
-      <w:proofErr w:type="spellEnd"/>
-      <w:r>
-        <w:t xml:space="preserve">. Ich </w:t>
-      </w:r>
-      <w:proofErr w:type="spellStart"/>
-      <w:r>
-        <w:t>beginne</w:t>
-      </w:r>
-      <w:proofErr w:type="spellEnd"/>
-      <w:r>
-        <w:t xml:space="preserve"> </w:t>
-      </w:r>
-      <w:proofErr w:type="spellStart"/>
-      <w:r>
-        <w:t>mit</w:t>
-      </w:r>
-      <w:proofErr w:type="spellEnd"/>
-      <w:r>
-        <w:t xml:space="preserve"> der </w:t>
-      </w:r>
-      <w:proofErr w:type="spellStart"/>
-      <w:r>
-        <w:t>Ausgangslage</w:t>
-      </w:r>
-      <w:proofErr w:type="spellEnd"/>
-      <w:r>
-        <w:t xml:space="preserve"> </w:t>
-      </w:r>
-      <w:proofErr w:type="spellStart"/>
-      <w:r>
-        <w:t>bei</w:t>
-      </w:r>
-      <w:proofErr w:type="spellEnd"/>
-      <w:r>
-        <w:t xml:space="preserve"> </w:t>
-      </w:r>
-      <w:proofErr w:type="spellStart"/>
-      <w:r>
-        <w:t>FixWerk</w:t>
-      </w:r>
-      <w:proofErr w:type="spellEnd"/>
-      <w:r>
-        <w:t>.</w:t>
-      </w:r>
+        <w:t>Im zweiten Teil zeigen wir, was dahintersteckt: die Ergebnisse und Prozesse, Rollen und Datenmodell, wie wir die Qualität gesichert haben, und zum Schluss unser Vorgehen und das Geschäftsmodell. Ich beginne mit der Ausgangslage bei FixWerk.</w:t>
+      </w:r>
+      <w:proofErr w:type="spellEnd"/>
+      <w:proofErr w:type="spellStart"/>
+      <w:proofErr w:type="spellEnd"/>
+      <w:proofErr w:type="spellStart"/>
+      <w:proofErr w:type="spellEnd"/>
+      <w:proofErr w:type="spellStart"/>
+      <w:proofErr w:type="spellEnd"/>
+      <w:proofErr w:type="spellStart"/>
+      <w:proofErr w:type="spellEnd"/>
+      <w:proofErr w:type="spellStart"/>
+      <w:proofErr w:type="spellEnd"/>
+      <w:proofErr w:type="spellStart"/>
+      <w:proofErr w:type="spellEnd"/>
+      <w:proofErr w:type="spellStart"/>
+      <w:proofErr w:type="spellEnd"/>
+      <w:proofErr w:type="spellStart"/>
+      <w:proofErr w:type="spellEnd"/>
+      <w:proofErr w:type="spellStart"/>
+      <w:proofErr w:type="spellEnd"/>
+      <w:proofErr w:type="spellStart"/>
+      <w:proofErr w:type="spellEnd"/>
+      <w:proofErr w:type="spellStart"/>
+      <w:proofErr w:type="spellEnd"/>
+      <w:proofErr w:type="spellStart"/>
+      <w:proofErr w:type="spellEnd"/>
+      <w:proofErr w:type="spellStart"/>
+      <w:proofErr w:type="spellEnd"/>
     </w:p>
     <w:p>
       <w:pPr>
@@ -851,21 +329,21 @@
         <w:rPr>
           <w:b/>
         </w:rPr>
-        <w:t xml:space="preserve">Folie 5 – Das </w:t>
+        <w:t xml:space="preserve">Folie 5 – </w:t>
       </w:r>
       <w:proofErr w:type="gramStart"/>
       <w:r>
         <w:rPr>
           <w:b/>
         </w:rPr>
-        <w:t>Problem</w:t>
+        <w:t>Das Problem: Werkstätten heute</w:t>
       </w:r>
       <w:r>
         <w:t xml:space="preserve">  (</w:t>
       </w:r>
       <w:proofErr w:type="gramEnd"/>
       <w:r>
-        <w:t>45 s)</w:t>
+        <w:t>70 s)</w:t>
       </w:r>
     </w:p>
     <w:p>
@@ -875,544 +353,148 @@
         </w:rPr>
         <w:t xml:space="preserve">David: </w:t>
       </w:r>
-      <w:r>
-        <w:t xml:space="preserve">Wie </w:t>
-      </w:r>
-      <w:proofErr w:type="spellStart"/>
-      <w:r>
-        <w:t>weit</w:t>
-      </w:r>
-      <w:proofErr w:type="spellEnd"/>
-      <w:r>
-        <w:t xml:space="preserve"> </w:t>
-      </w:r>
-      <w:proofErr w:type="spellStart"/>
-      <w:r>
-        <w:t>ist</w:t>
-      </w:r>
-      <w:proofErr w:type="spellEnd"/>
-      <w:r>
-        <w:t xml:space="preserve"> </w:t>
-      </w:r>
-      <w:proofErr w:type="spellStart"/>
-      <w:r>
-        <w:t>mein</w:t>
-      </w:r>
-      <w:proofErr w:type="spellEnd"/>
-      <w:r>
-        <w:t xml:space="preserve"> </w:t>
-      </w:r>
-      <w:proofErr w:type="spellStart"/>
-      <w:r>
-        <w:t>Auftrag</w:t>
-      </w:r>
-      <w:proofErr w:type="spellEnd"/>
-      <w:r>
-        <w:t xml:space="preserve">? Um </w:t>
-      </w:r>
-      <w:proofErr w:type="spellStart"/>
-      <w:r>
-        <w:t>diese</w:t>
-      </w:r>
-      <w:proofErr w:type="spellEnd"/>
-      <w:r>
-        <w:t xml:space="preserve"> Frage </w:t>
-      </w:r>
-      <w:proofErr w:type="spellStart"/>
-      <w:r>
-        <w:t>geht</w:t>
-      </w:r>
-      <w:proofErr w:type="spellEnd"/>
-      <w:r>
-        <w:t xml:space="preserve"> es. Unser </w:t>
-      </w:r>
-      <w:proofErr w:type="spellStart"/>
-      <w:r>
-        <w:t>Szenario</w:t>
-      </w:r>
-      <w:proofErr w:type="spellEnd"/>
-      <w:r>
-        <w:t xml:space="preserve"> </w:t>
-      </w:r>
-      <w:proofErr w:type="spellStart"/>
-      <w:r>
-        <w:t>ist</w:t>
-      </w:r>
-      <w:proofErr w:type="spellEnd"/>
-      <w:r>
-        <w:t xml:space="preserve"> </w:t>
-      </w:r>
-      <w:proofErr w:type="spellStart"/>
-      <w:r>
-        <w:t>FixWerk</w:t>
-      </w:r>
-      <w:proofErr w:type="spellEnd"/>
-      <w:r>
-        <w:t xml:space="preserve">, </w:t>
-      </w:r>
-      <w:proofErr w:type="spellStart"/>
-      <w:r>
-        <w:t>eine</w:t>
-      </w:r>
-      <w:proofErr w:type="spellEnd"/>
-      <w:r>
-        <w:t xml:space="preserve"> </w:t>
-      </w:r>
-      <w:proofErr w:type="spellStart"/>
-      <w:r>
-        <w:t>fiktive</w:t>
-      </w:r>
-      <w:proofErr w:type="spellEnd"/>
-      <w:r>
-        <w:t xml:space="preserve"> </w:t>
-      </w:r>
-      <w:proofErr w:type="spellStart"/>
-      <w:r>
-        <w:t>Werkstattkette</w:t>
-      </w:r>
-      <w:proofErr w:type="spellEnd"/>
-      <w:r>
-        <w:t xml:space="preserve"> </w:t>
-      </w:r>
-      <w:proofErr w:type="spellStart"/>
-      <w:r>
-        <w:t>mit</w:t>
-      </w:r>
-      <w:proofErr w:type="spellEnd"/>
-      <w:r>
-        <w:t xml:space="preserve"> vier </w:t>
-      </w:r>
-      <w:proofErr w:type="spellStart"/>
-      <w:r>
-        <w:t>Filialen</w:t>
-      </w:r>
-      <w:proofErr w:type="spellEnd"/>
-      <w:r>
-        <w:t xml:space="preserve"> </w:t>
-      </w:r>
-      <w:proofErr w:type="spellStart"/>
-      <w:r>
-        <w:t>hier</w:t>
-      </w:r>
-      <w:proofErr w:type="spellEnd"/>
-      <w:r>
-        <w:t xml:space="preserve"> in der Region Karlsruhe, für </w:t>
-      </w:r>
-      <w:proofErr w:type="spellStart"/>
-      <w:r>
-        <w:t>Fahrräder</w:t>
-      </w:r>
-      <w:proofErr w:type="spellEnd"/>
-      <w:r>
-        <w:t xml:space="preserve">, E-Bikes und Elektronik. </w:t>
-      </w:r>
-      <w:proofErr w:type="spellStart"/>
-      <w:r>
-        <w:t>Organisiert</w:t>
-      </w:r>
-      <w:proofErr w:type="spellEnd"/>
-      <w:r>
-        <w:t xml:space="preserve"> </w:t>
-      </w:r>
-      <w:proofErr w:type="spellStart"/>
-      <w:r>
-        <w:t>wird</w:t>
-      </w:r>
-      <w:proofErr w:type="spellEnd"/>
-      <w:r>
-        <w:t xml:space="preserve"> </w:t>
-      </w:r>
-      <w:proofErr w:type="spellStart"/>
-      <w:r>
-        <w:t>mit</w:t>
-      </w:r>
-      <w:proofErr w:type="spellEnd"/>
-      <w:r>
-        <w:t xml:space="preserve"> Papier, Excel und </w:t>
-      </w:r>
-      <w:proofErr w:type="spellStart"/>
-      <w:r>
-        <w:t>Telefon</w:t>
-      </w:r>
-      <w:proofErr w:type="spellEnd"/>
-      <w:r>
-        <w:t>.</w:t>
-      </w:r>
+      <w:proofErr w:type="spellStart"/>
+      <w:r>
+        <w:t>Wie weit ist mein Auftrag? Bei FixWerk bekommt man darauf heute meistens nur am Telefon eine Antwort. FixWerk ist unser Szenario, eine fiktive Werkstattkette mit vier Filialen hier in der Region Karlsruhe, für Fahrräder, E-Bikes und Elektronik. Organisiert wird alles mit Papierzetteln, Excel-Listen und dem Telefon.</w:t>
+      </w:r>
+      <w:proofErr w:type="spellEnd"/>
+      <w:proofErr w:type="spellStart"/>
+      <w:proofErr w:type="spellEnd"/>
+      <w:proofErr w:type="spellStart"/>
+      <w:proofErr w:type="spellEnd"/>
+      <w:proofErr w:type="spellStart"/>
+      <w:proofErr w:type="spellEnd"/>
+      <w:proofErr w:type="spellStart"/>
+      <w:proofErr w:type="spellEnd"/>
+      <w:proofErr w:type="spellStart"/>
+      <w:proofErr w:type="spellEnd"/>
+      <w:proofErr w:type="spellStart"/>
+      <w:proofErr w:type="spellEnd"/>
+      <w:proofErr w:type="spellStart"/>
+      <w:proofErr w:type="spellEnd"/>
+      <w:proofErr w:type="spellStart"/>
+      <w:proofErr w:type="spellEnd"/>
+      <w:proofErr w:type="spellStart"/>
+      <w:proofErr w:type="spellEnd"/>
+      <w:proofErr w:type="spellStart"/>
+      <w:proofErr w:type="spellEnd"/>
+      <w:proofErr w:type="spellStart"/>
+      <w:proofErr w:type="spellEnd"/>
+      <w:proofErr w:type="spellStart"/>
+      <w:proofErr w:type="spellEnd"/>
+      <w:proofErr w:type="spellStart"/>
+      <w:proofErr w:type="spellEnd"/>
     </w:p>
     <w:p>
       <w:r>
-        <w:t xml:space="preserve">Für den Kunden </w:t>
-      </w:r>
-      <w:proofErr w:type="spellStart"/>
-      <w:r>
-        <w:t>heißt</w:t>
-      </w:r>
-      <w:proofErr w:type="spellEnd"/>
-      <w:r>
-        <w:t xml:space="preserve"> das: Ob er den </w:t>
-      </w:r>
-      <w:proofErr w:type="spellStart"/>
-      <w:r>
-        <w:t>Kostenvoranschlag</w:t>
-      </w:r>
-      <w:proofErr w:type="spellEnd"/>
-      <w:r>
-        <w:t xml:space="preserve"> </w:t>
-      </w:r>
-      <w:proofErr w:type="spellStart"/>
-      <w:r>
-        <w:t>freigeben</w:t>
-      </w:r>
-      <w:proofErr w:type="spellEnd"/>
-      <w:r>
-        <w:t xml:space="preserve"> </w:t>
-      </w:r>
-      <w:proofErr w:type="spellStart"/>
-      <w:r>
-        <w:t>kann</w:t>
-      </w:r>
-      <w:proofErr w:type="spellEnd"/>
-      <w:r>
-        <w:t xml:space="preserve"> </w:t>
-      </w:r>
-      <w:proofErr w:type="spellStart"/>
-      <w:r>
-        <w:t>oder</w:t>
-      </w:r>
-      <w:proofErr w:type="spellEnd"/>
-      <w:r>
-        <w:t xml:space="preserve"> sein </w:t>
-      </w:r>
-      <w:proofErr w:type="spellStart"/>
-      <w:r>
-        <w:t>Gerät</w:t>
-      </w:r>
-      <w:proofErr w:type="spellEnd"/>
-      <w:r>
-        <w:t xml:space="preserve"> </w:t>
-      </w:r>
-      <w:proofErr w:type="spellStart"/>
-      <w:r>
-        <w:t>abholbereit</w:t>
-      </w:r>
-      <w:proofErr w:type="spellEnd"/>
-      <w:r>
-        <w:t xml:space="preserve"> </w:t>
-      </w:r>
-      <w:proofErr w:type="spellStart"/>
-      <w:r>
-        <w:t>ist</w:t>
-      </w:r>
-      <w:proofErr w:type="spellEnd"/>
-      <w:r>
-        <w:t xml:space="preserve">, </w:t>
-      </w:r>
-      <w:proofErr w:type="spellStart"/>
-      <w:r>
-        <w:t>erfährt</w:t>
-      </w:r>
-      <w:proofErr w:type="spellEnd"/>
-      <w:r>
-        <w:t xml:space="preserve"> er oft erst </w:t>
-      </w:r>
-      <w:proofErr w:type="spellStart"/>
-      <w:r>
-        <w:t>durch</w:t>
-      </w:r>
-      <w:proofErr w:type="spellEnd"/>
-      <w:r>
-        <w:t xml:space="preserve"> </w:t>
-      </w:r>
-      <w:proofErr w:type="spellStart"/>
-      <w:r>
-        <w:t>einen</w:t>
-      </w:r>
-      <w:proofErr w:type="spellEnd"/>
-      <w:r>
-        <w:t xml:space="preserve"> </w:t>
-      </w:r>
-      <w:proofErr w:type="spellStart"/>
-      <w:r>
-        <w:t>Anruf</w:t>
-      </w:r>
-      <w:proofErr w:type="spellEnd"/>
-      <w:r>
-        <w:t xml:space="preserve">. Manche </w:t>
-      </w:r>
-      <w:proofErr w:type="spellStart"/>
-      <w:r>
-        <w:t>Geräte</w:t>
-      </w:r>
-      <w:proofErr w:type="spellEnd"/>
-      <w:r>
-        <w:t xml:space="preserve"> </w:t>
-      </w:r>
-      <w:proofErr w:type="spellStart"/>
-      <w:r>
-        <w:t>liegen</w:t>
-      </w:r>
-      <w:proofErr w:type="spellEnd"/>
-      <w:r>
-        <w:t xml:space="preserve"> </w:t>
-      </w:r>
-      <w:proofErr w:type="spellStart"/>
-      <w:r>
-        <w:t>wochenlang</w:t>
-      </w:r>
-      <w:proofErr w:type="spellEnd"/>
-      <w:r>
-        <w:t xml:space="preserve"> </w:t>
-      </w:r>
-      <w:proofErr w:type="spellStart"/>
-      <w:r>
-        <w:t>im</w:t>
-      </w:r>
-      <w:proofErr w:type="spellEnd"/>
-      <w:r>
-        <w:t xml:space="preserve"> Lager.</w:t>
-      </w:r>
+        <w:t>Für den Kunden heißt das: Ob ein Kostenvoranschlag zur Freigabe bereitliegt oder sein Gerät abholbereit ist, erfährt er oft erst, wenn er selbst anruft. Manche Geräte liegen sogar wochenlang im Lager.</w:t>
+      </w:r>
+      <w:proofErr w:type="spellStart"/>
+      <w:proofErr w:type="spellEnd"/>
+      <w:proofErr w:type="spellStart"/>
+      <w:proofErr w:type="spellEnd"/>
+      <w:proofErr w:type="spellStart"/>
+      <w:proofErr w:type="spellEnd"/>
+      <w:proofErr w:type="spellStart"/>
+      <w:proofErr w:type="spellEnd"/>
+      <w:proofErr w:type="spellStart"/>
+      <w:proofErr w:type="spellEnd"/>
+      <w:proofErr w:type="spellStart"/>
+      <w:proofErr w:type="spellEnd"/>
+      <w:proofErr w:type="spellStart"/>
+      <w:proofErr w:type="spellEnd"/>
+      <w:proofErr w:type="spellStart"/>
+      <w:proofErr w:type="spellEnd"/>
+      <w:proofErr w:type="spellStart"/>
+      <w:proofErr w:type="spellEnd"/>
+      <w:proofErr w:type="spellStart"/>
+      <w:proofErr w:type="spellEnd"/>
+      <w:proofErr w:type="spellStart"/>
+      <w:proofErr w:type="spellEnd"/>
+      <w:proofErr w:type="spellStart"/>
+      <w:proofErr w:type="spellEnd"/>
+      <w:proofErr w:type="spellStart"/>
+      <w:proofErr w:type="spellEnd"/>
+      <w:proofErr w:type="spellStart"/>
+      <w:proofErr w:type="spellEnd"/>
+      <w:proofErr w:type="spellStart"/>
+      <w:proofErr w:type="spellEnd"/>
+      <w:proofErr w:type="spellStart"/>
+      <w:proofErr w:type="spellEnd"/>
     </w:p>
     <w:p>
       <w:r>
-        <w:t xml:space="preserve">Und in der </w:t>
-      </w:r>
-      <w:proofErr w:type="spellStart"/>
-      <w:r>
-        <w:t>Werkstatt</w:t>
-      </w:r>
-      <w:proofErr w:type="spellEnd"/>
-      <w:r>
-        <w:t xml:space="preserve"> </w:t>
-      </w:r>
-      <w:proofErr w:type="spellStart"/>
-      <w:r>
-        <w:t>fehlt</w:t>
-      </w:r>
-      <w:proofErr w:type="spellEnd"/>
-      <w:r>
-        <w:t xml:space="preserve"> der </w:t>
-      </w:r>
-      <w:proofErr w:type="spellStart"/>
-      <w:r>
-        <w:t>Überblick</w:t>
-      </w:r>
-      <w:proofErr w:type="spellEnd"/>
-      <w:r>
-        <w:t xml:space="preserve">. Niemand </w:t>
-      </w:r>
-      <w:proofErr w:type="spellStart"/>
-      <w:r>
-        <w:t>sieht</w:t>
-      </w:r>
-      <w:proofErr w:type="spellEnd"/>
-      <w:r>
-        <w:t xml:space="preserve"> </w:t>
-      </w:r>
-      <w:proofErr w:type="spellStart"/>
-      <w:r>
-        <w:t>sofort</w:t>
-      </w:r>
-      <w:proofErr w:type="spellEnd"/>
-      <w:r>
-        <w:t xml:space="preserve">, </w:t>
-      </w:r>
-      <w:proofErr w:type="spellStart"/>
-      <w:r>
-        <w:t>wie</w:t>
-      </w:r>
-      <w:proofErr w:type="spellEnd"/>
-      <w:r>
-        <w:t xml:space="preserve"> </w:t>
-      </w:r>
-      <w:proofErr w:type="spellStart"/>
-      <w:r>
-        <w:t>weit</w:t>
-      </w:r>
-      <w:proofErr w:type="spellEnd"/>
-      <w:r>
-        <w:t xml:space="preserve"> </w:t>
-      </w:r>
-      <w:proofErr w:type="spellStart"/>
-      <w:r>
-        <w:t>ein</w:t>
-      </w:r>
-      <w:proofErr w:type="spellEnd"/>
-      <w:r>
-        <w:t xml:space="preserve"> </w:t>
-      </w:r>
-      <w:proofErr w:type="spellStart"/>
-      <w:r>
-        <w:t>Auftrag</w:t>
-      </w:r>
-      <w:proofErr w:type="spellEnd"/>
-      <w:r>
-        <w:t xml:space="preserve"> </w:t>
-      </w:r>
-      <w:proofErr w:type="spellStart"/>
-      <w:r>
-        <w:t>ist</w:t>
-      </w:r>
-      <w:proofErr w:type="spellEnd"/>
-      <w:r>
-        <w:t xml:space="preserve">, </w:t>
-      </w:r>
-      <w:proofErr w:type="spellStart"/>
-      <w:r>
-        <w:t>Teile</w:t>
-      </w:r>
-      <w:proofErr w:type="spellEnd"/>
-      <w:r>
-        <w:t xml:space="preserve"> </w:t>
-      </w:r>
-      <w:proofErr w:type="spellStart"/>
-      <w:r>
-        <w:t>werden</w:t>
-      </w:r>
-      <w:proofErr w:type="spellEnd"/>
-      <w:r>
-        <w:t xml:space="preserve"> </w:t>
-      </w:r>
-      <w:proofErr w:type="spellStart"/>
-      <w:r>
-        <w:t>bestellt</w:t>
-      </w:r>
-      <w:proofErr w:type="spellEnd"/>
-      <w:r>
-        <w:t xml:space="preserve">, </w:t>
-      </w:r>
-      <w:proofErr w:type="spellStart"/>
-      <w:r>
-        <w:t>obwohl</w:t>
-      </w:r>
-      <w:proofErr w:type="spellEnd"/>
-      <w:r>
-        <w:t xml:space="preserve"> </w:t>
-      </w:r>
-      <w:proofErr w:type="spellStart"/>
-      <w:r>
-        <w:t>sie</w:t>
-      </w:r>
-      <w:proofErr w:type="spellEnd"/>
-      <w:r>
-        <w:t xml:space="preserve"> </w:t>
-      </w:r>
-      <w:proofErr w:type="spellStart"/>
-      <w:r>
-        <w:t>nebenan</w:t>
-      </w:r>
-      <w:proofErr w:type="spellEnd"/>
-      <w:r>
-        <w:t xml:space="preserve"> </w:t>
-      </w:r>
-      <w:proofErr w:type="spellStart"/>
-      <w:r>
-        <w:t>liegen</w:t>
-      </w:r>
-      <w:proofErr w:type="spellEnd"/>
-      <w:r>
-        <w:t xml:space="preserve">, und Termine </w:t>
-      </w:r>
-      <w:proofErr w:type="spellStart"/>
-      <w:r>
-        <w:t>nach</w:t>
-      </w:r>
-      <w:proofErr w:type="spellEnd"/>
-      <w:r>
-        <w:t xml:space="preserve"> </w:t>
-      </w:r>
-      <w:proofErr w:type="spellStart"/>
-      <w:r>
-        <w:t>Gefühl</w:t>
-      </w:r>
-      <w:proofErr w:type="spellEnd"/>
-      <w:r>
-        <w:t xml:space="preserve"> </w:t>
-      </w:r>
-      <w:proofErr w:type="spellStart"/>
-      <w:r>
-        <w:t>zugesagt</w:t>
-      </w:r>
-      <w:proofErr w:type="spellEnd"/>
-      <w:r>
-        <w:t>.</w:t>
-      </w:r>
+        <w:t>Und in der Werkstatt fehlt der Überblick. Wer wissen will, wo ein Gerät gerade ist, muss nachfragen. Jede Filiale bestellt ihre Ersatzteile für sich, auch wenn das Teil in der Nachbarfiliale im Regal liegt. Weil niemand sieht, wie ausgelastet die Techniker sind, werden Termine nach Gefühl zugesagt.</w:t>
+      </w:r>
+      <w:proofErr w:type="spellStart"/>
+      <w:proofErr w:type="spellEnd"/>
+      <w:proofErr w:type="spellStart"/>
+      <w:proofErr w:type="spellEnd"/>
+      <w:proofErr w:type="spellStart"/>
+      <w:proofErr w:type="spellEnd"/>
+      <w:proofErr w:type="spellStart"/>
+      <w:proofErr w:type="spellEnd"/>
+      <w:proofErr w:type="spellStart"/>
+      <w:proofErr w:type="spellEnd"/>
+      <w:proofErr w:type="spellStart"/>
+      <w:proofErr w:type="spellEnd"/>
+      <w:proofErr w:type="spellStart"/>
+      <w:proofErr w:type="spellEnd"/>
+      <w:proofErr w:type="spellStart"/>
+      <w:proofErr w:type="spellEnd"/>
+      <w:proofErr w:type="spellStart"/>
+      <w:proofErr w:type="spellEnd"/>
+      <w:proofErr w:type="spellStart"/>
+      <w:proofErr w:type="spellEnd"/>
+      <w:proofErr w:type="spellStart"/>
+      <w:proofErr w:type="spellEnd"/>
+      <w:proofErr w:type="spellStart"/>
+      <w:proofErr w:type="spellEnd"/>
+      <w:proofErr w:type="spellStart"/>
+      <w:proofErr w:type="spellEnd"/>
+      <w:proofErr w:type="spellStart"/>
+      <w:proofErr w:type="spellEnd"/>
+      <w:proofErr w:type="spellStart"/>
+      <w:proofErr w:type="spellEnd"/>
+      <w:proofErr w:type="spellStart"/>
+      <w:proofErr w:type="spellEnd"/>
     </w:p>
     <w:p>
       <w:r>
-        <w:t xml:space="preserve">Das </w:t>
-      </w:r>
-      <w:proofErr w:type="spellStart"/>
-      <w:r>
-        <w:t>sind</w:t>
-      </w:r>
-      <w:proofErr w:type="spellEnd"/>
-      <w:r>
-        <w:t xml:space="preserve"> </w:t>
-      </w:r>
-      <w:proofErr w:type="spellStart"/>
-      <w:r>
-        <w:t>Annahmen</w:t>
-      </w:r>
-      <w:proofErr w:type="spellEnd"/>
-      <w:r>
-        <w:t xml:space="preserve"> </w:t>
-      </w:r>
-      <w:proofErr w:type="spellStart"/>
-      <w:r>
-        <w:t>unseres</w:t>
-      </w:r>
-      <w:proofErr w:type="spellEnd"/>
-      <w:r>
-        <w:t xml:space="preserve"> </w:t>
-      </w:r>
-      <w:proofErr w:type="spellStart"/>
-      <w:r>
-        <w:t>Szenarios</w:t>
-      </w:r>
-      <w:proofErr w:type="spellEnd"/>
-      <w:r>
-        <w:t xml:space="preserve">. </w:t>
-      </w:r>
-      <w:proofErr w:type="spellStart"/>
-      <w:r>
-        <w:t>Daraus</w:t>
-      </w:r>
-      <w:proofErr w:type="spellEnd"/>
-      <w:r>
-        <w:t xml:space="preserve"> </w:t>
-      </w:r>
-      <w:proofErr w:type="spellStart"/>
-      <w:r>
-        <w:t>leiten</w:t>
-      </w:r>
-      <w:proofErr w:type="spellEnd"/>
-      <w:r>
-        <w:t xml:space="preserve"> </w:t>
-      </w:r>
-      <w:proofErr w:type="spellStart"/>
-      <w:r>
-        <w:t>wir</w:t>
-      </w:r>
-      <w:proofErr w:type="spellEnd"/>
-      <w:r>
-        <w:t xml:space="preserve"> die </w:t>
-      </w:r>
-      <w:proofErr w:type="spellStart"/>
-      <w:r>
-        <w:t>Anforderungen</w:t>
-      </w:r>
-      <w:proofErr w:type="spellEnd"/>
-      <w:r>
-        <w:t xml:space="preserve"> an </w:t>
-      </w:r>
-      <w:proofErr w:type="spellStart"/>
-      <w:r>
-        <w:t>RepairFlow</w:t>
-      </w:r>
-      <w:proofErr w:type="spellEnd"/>
-      <w:r>
-        <w:t xml:space="preserve"> ab.</w:t>
-      </w:r>
+        <w:t>Von diesen vier Problemen gehen wir in unserem Szenario aus, und daraus leiten wir die Anforderungen an RepairFlow ab.</w:t>
+      </w:r>
+      <w:proofErr w:type="spellStart"/>
+      <w:proofErr w:type="spellEnd"/>
+      <w:proofErr w:type="spellStart"/>
+      <w:proofErr w:type="spellEnd"/>
+      <w:proofErr w:type="spellStart"/>
+      <w:proofErr w:type="spellEnd"/>
+      <w:proofErr w:type="spellStart"/>
+      <w:proofErr w:type="spellEnd"/>
+      <w:proofErr w:type="spellStart"/>
+      <w:proofErr w:type="spellEnd"/>
+      <w:proofErr w:type="spellStart"/>
+      <w:proofErr w:type="spellEnd"/>
+      <w:proofErr w:type="spellStart"/>
+      <w:proofErr w:type="spellEnd"/>
+      <w:proofErr w:type="spellStart"/>
+      <w:proofErr w:type="spellEnd"/>
+      <w:proofErr w:type="spellStart"/>
+      <w:proofErr w:type="spellEnd"/>
+      <w:proofErr w:type="spellStart"/>
+      <w:proofErr w:type="spellEnd"/>
+      <w:proofErr w:type="spellStart"/>
+      <w:proofErr w:type="spellEnd"/>
+      <w:proofErr w:type="spellStart"/>
+      <w:proofErr w:type="spellEnd"/>
+      <w:proofErr w:type="spellStart"/>
+      <w:proofErr w:type="spellEnd"/>
+      <w:proofErr w:type="spellStart"/>
+      <w:proofErr w:type="spellEnd"/>
+      <w:proofErr w:type="spellStart"/>
+      <w:proofErr w:type="spellEnd"/>
+      <w:proofErr w:type="spellStart"/>
+      <w:proofErr w:type="spellEnd"/>
     </w:p>
     <w:p>
       <w:pPr>
@@ -1424,61 +506,19 @@
         </w:rPr>
         <w:t xml:space="preserve">Folie 6 – </w:t>
       </w:r>
-      <w:proofErr w:type="spellStart"/>
+      <w:proofErr w:type="gramStart"/>
       <w:r>
         <w:rPr>
           <w:b/>
         </w:rPr>
-        <w:t>RepairFlow</w:t>
-      </w:r>
-      <w:proofErr w:type="spellEnd"/>
-      <w:r>
-        <w:rPr>
-          <w:b/>
-        </w:rPr>
-        <w:t xml:space="preserve">: die </w:t>
-      </w:r>
-      <w:proofErr w:type="spellStart"/>
-      <w:r>
-        <w:rPr>
-          <w:b/>
-        </w:rPr>
-        <w:t>Lösung</w:t>
-      </w:r>
-      <w:proofErr w:type="spellEnd"/>
-      <w:r>
-        <w:rPr>
-          <w:b/>
-        </w:rPr>
-        <w:t xml:space="preserve">, </w:t>
-      </w:r>
-      <w:proofErr w:type="spellStart"/>
-      <w:r>
-        <w:rPr>
-          <w:b/>
-        </w:rPr>
-        <w:t>Stufe</w:t>
-      </w:r>
-      <w:proofErr w:type="spellEnd"/>
-      <w:r>
-        <w:rPr>
-          <w:b/>
-        </w:rPr>
-        <w:t xml:space="preserve"> </w:t>
-      </w:r>
-      <w:proofErr w:type="gramStart"/>
-      <w:r>
-        <w:rPr>
-          <w:b/>
-        </w:rPr>
-        <w:t>1</w:t>
+        <w:t>RepairFlow: Die Lösung</w:t>
       </w:r>
       <w:r>
         <w:t xml:space="preserve">  (</w:t>
       </w:r>
       <w:proofErr w:type="gramEnd"/>
       <w:r>
-        <w:t>30 s)</w:t>
+        <w:t>40 s)</w:t>
       </w:r>
     </w:p>
     <w:p>
@@ -1490,353 +530,35 @@
       </w:r>
       <w:proofErr w:type="spellStart"/>
       <w:r>
-        <w:t>Genau</w:t>
-      </w:r>
-      <w:proofErr w:type="spellEnd"/>
-      <w:r>
-        <w:t xml:space="preserve"> </w:t>
-      </w:r>
-      <w:proofErr w:type="spellStart"/>
-      <w:r>
-        <w:t>hier</w:t>
-      </w:r>
-      <w:proofErr w:type="spellEnd"/>
-      <w:r>
-        <w:t xml:space="preserve"> </w:t>
-      </w:r>
-      <w:proofErr w:type="spellStart"/>
-      <w:r>
-        <w:t>setzt</w:t>
-      </w:r>
-      <w:proofErr w:type="spellEnd"/>
-      <w:r>
-        <w:t xml:space="preserve"> </w:t>
-      </w:r>
-      <w:proofErr w:type="spellStart"/>
-      <w:r>
-        <w:t>RepairFlow</w:t>
-      </w:r>
-      <w:proofErr w:type="spellEnd"/>
-      <w:r>
-        <w:t xml:space="preserve"> an. Wir </w:t>
-      </w:r>
-      <w:proofErr w:type="spellStart"/>
-      <w:r>
-        <w:t>sind</w:t>
-      </w:r>
-      <w:proofErr w:type="spellEnd"/>
-      <w:r>
-        <w:t xml:space="preserve"> nicht die </w:t>
-      </w:r>
-      <w:proofErr w:type="spellStart"/>
-      <w:r>
-        <w:t>Werkstatt</w:t>
-      </w:r>
-      <w:proofErr w:type="spellEnd"/>
-      <w:r>
-        <w:t xml:space="preserve">, </w:t>
-      </w:r>
-      <w:proofErr w:type="spellStart"/>
-      <w:r>
-        <w:t>sondern</w:t>
-      </w:r>
-      <w:proofErr w:type="spellEnd"/>
-      <w:r>
-        <w:t xml:space="preserve"> der </w:t>
-      </w:r>
-      <w:proofErr w:type="spellStart"/>
-      <w:r>
-        <w:t>Softwareanbieter</w:t>
-      </w:r>
-      <w:proofErr w:type="spellEnd"/>
-      <w:r>
-        <w:t xml:space="preserve"> </w:t>
-      </w:r>
-      <w:proofErr w:type="spellStart"/>
-      <w:r>
-        <w:t>dahinter</w:t>
-      </w:r>
-      <w:proofErr w:type="spellEnd"/>
-      <w:r>
-        <w:t xml:space="preserve">. </w:t>
-      </w:r>
-      <w:proofErr w:type="spellStart"/>
-      <w:r>
-        <w:t>FixWerk</w:t>
-      </w:r>
-      <w:proofErr w:type="spellEnd"/>
-      <w:r>
-        <w:t xml:space="preserve"> </w:t>
-      </w:r>
-      <w:proofErr w:type="spellStart"/>
-      <w:r>
-        <w:t>ist</w:t>
-      </w:r>
-      <w:proofErr w:type="spellEnd"/>
-      <w:r>
-        <w:t xml:space="preserve"> </w:t>
-      </w:r>
-      <w:proofErr w:type="spellStart"/>
-      <w:r>
-        <w:t>unser</w:t>
-      </w:r>
-      <w:proofErr w:type="spellEnd"/>
-      <w:r>
-        <w:t xml:space="preserve"> </w:t>
-      </w:r>
-      <w:proofErr w:type="spellStart"/>
-      <w:r>
-        <w:t>fiktiver</w:t>
-      </w:r>
-      <w:proofErr w:type="spellEnd"/>
-      <w:r>
-        <w:t xml:space="preserve"> </w:t>
-      </w:r>
-      <w:proofErr w:type="spellStart"/>
-      <w:r>
-        <w:t>Pilotkunde</w:t>
-      </w:r>
-      <w:proofErr w:type="spellEnd"/>
-      <w:r>
-        <w:t xml:space="preserve">, </w:t>
-      </w:r>
-      <w:proofErr w:type="gramStart"/>
-      <w:r>
-        <w:t>an</w:t>
-      </w:r>
-      <w:proofErr w:type="gramEnd"/>
-      <w:r>
-        <w:t xml:space="preserve"> seinen </w:t>
-      </w:r>
-      <w:proofErr w:type="spellStart"/>
-      <w:r>
-        <w:t>Abläufen</w:t>
-      </w:r>
-      <w:proofErr w:type="spellEnd"/>
-      <w:r>
-        <w:t xml:space="preserve"> </w:t>
-      </w:r>
-      <w:proofErr w:type="spellStart"/>
-      <w:r>
-        <w:t>haben</w:t>
-      </w:r>
-      <w:proofErr w:type="spellEnd"/>
-      <w:r>
-        <w:t xml:space="preserve"> </w:t>
-      </w:r>
-      <w:proofErr w:type="spellStart"/>
-      <w:r>
-        <w:t>wir</w:t>
-      </w:r>
-      <w:proofErr w:type="spellEnd"/>
-      <w:r>
-        <w:t xml:space="preserve"> die </w:t>
-      </w:r>
-      <w:proofErr w:type="spellStart"/>
-      <w:r>
-        <w:t>Anforderungen</w:t>
-      </w:r>
-      <w:proofErr w:type="spellEnd"/>
-      <w:r>
-        <w:t xml:space="preserve"> </w:t>
-      </w:r>
-      <w:proofErr w:type="spellStart"/>
-      <w:r>
-        <w:t>modelliert</w:t>
-      </w:r>
-      <w:proofErr w:type="spellEnd"/>
-      <w:r>
-        <w:t xml:space="preserve">. </w:t>
-      </w:r>
-      <w:proofErr w:type="spellStart"/>
-      <w:r>
-        <w:t>Gedacht</w:t>
-      </w:r>
-      <w:proofErr w:type="spellEnd"/>
-      <w:r>
-        <w:t xml:space="preserve"> </w:t>
-      </w:r>
-      <w:proofErr w:type="spellStart"/>
-      <w:r>
-        <w:t>ist</w:t>
-      </w:r>
-      <w:proofErr w:type="spellEnd"/>
-      <w:r>
-        <w:t xml:space="preserve"> die </w:t>
-      </w:r>
-      <w:proofErr w:type="spellStart"/>
-      <w:r>
-        <w:t>Plattform</w:t>
-      </w:r>
-      <w:proofErr w:type="spellEnd"/>
-      <w:r>
-        <w:t xml:space="preserve"> für </w:t>
-      </w:r>
-      <w:proofErr w:type="spellStart"/>
-      <w:r>
-        <w:t>Werkstätten</w:t>
-      </w:r>
-      <w:proofErr w:type="spellEnd"/>
-      <w:r>
-        <w:t xml:space="preserve"> und </w:t>
-      </w:r>
-      <w:proofErr w:type="spellStart"/>
-      <w:r>
-        <w:t>kleine</w:t>
-      </w:r>
-      <w:proofErr w:type="spellEnd"/>
-      <w:r>
-        <w:t xml:space="preserve"> Ketten </w:t>
-      </w:r>
-      <w:proofErr w:type="spellStart"/>
-      <w:r>
-        <w:t>mit</w:t>
-      </w:r>
-      <w:proofErr w:type="spellEnd"/>
-      <w:r>
-        <w:t xml:space="preserve"> </w:t>
-      </w:r>
-      <w:proofErr w:type="spellStart"/>
-      <w:r>
-        <w:t>zwei</w:t>
-      </w:r>
-      <w:proofErr w:type="spellEnd"/>
-      <w:r>
-        <w:t xml:space="preserve"> bis </w:t>
-      </w:r>
-      <w:proofErr w:type="spellStart"/>
-      <w:r>
-        <w:t>zehn</w:t>
-      </w:r>
-      <w:proofErr w:type="spellEnd"/>
-      <w:r>
-        <w:t xml:space="preserve"> </w:t>
-      </w:r>
-      <w:proofErr w:type="spellStart"/>
-      <w:r>
-        <w:t>Filialen</w:t>
-      </w:r>
-      <w:proofErr w:type="spellEnd"/>
-      <w:r>
-        <w:t>.</w:t>
-      </w:r>
-    </w:p>
-    <w:p>
-      <w:r>
-        <w:t xml:space="preserve">Der Kunde </w:t>
-      </w:r>
-      <w:proofErr w:type="spellStart"/>
-      <w:r>
-        <w:t>kommt</w:t>
-      </w:r>
-      <w:proofErr w:type="spellEnd"/>
-      <w:r>
-        <w:t xml:space="preserve"> </w:t>
-      </w:r>
-      <w:proofErr w:type="spellStart"/>
-      <w:r>
-        <w:t>über</w:t>
-      </w:r>
-      <w:proofErr w:type="spellEnd"/>
-      <w:r>
-        <w:t xml:space="preserve"> Portal und App, das </w:t>
-      </w:r>
-      <w:proofErr w:type="spellStart"/>
-      <w:r>
-        <w:t>Werkstattteam</w:t>
-      </w:r>
-      <w:proofErr w:type="spellEnd"/>
-      <w:r>
-        <w:t xml:space="preserve"> </w:t>
-      </w:r>
-      <w:proofErr w:type="spellStart"/>
-      <w:r>
-        <w:t>arbeitet</w:t>
-      </w:r>
-      <w:proofErr w:type="spellEnd"/>
-      <w:r>
-        <w:t xml:space="preserve"> </w:t>
-      </w:r>
-      <w:proofErr w:type="spellStart"/>
-      <w:r>
-        <w:t>direkt</w:t>
-      </w:r>
-      <w:proofErr w:type="spellEnd"/>
-      <w:r>
-        <w:t xml:space="preserve"> in der </w:t>
-      </w:r>
-      <w:proofErr w:type="spellStart"/>
-      <w:r>
-        <w:t>Plattform</w:t>
-      </w:r>
-      <w:proofErr w:type="spellEnd"/>
-      <w:r>
-        <w:t xml:space="preserve">. </w:t>
-      </w:r>
-      <w:proofErr w:type="spellStart"/>
-      <w:r>
-        <w:t>Beide</w:t>
-      </w:r>
-      <w:proofErr w:type="spellEnd"/>
-      <w:r>
-        <w:t xml:space="preserve"> </w:t>
-      </w:r>
-      <w:proofErr w:type="spellStart"/>
-      <w:r>
-        <w:t>arbeiten</w:t>
-      </w:r>
-      <w:proofErr w:type="spellEnd"/>
-      <w:r>
-        <w:t xml:space="preserve"> am </w:t>
-      </w:r>
-      <w:proofErr w:type="spellStart"/>
-      <w:r>
-        <w:t>selben</w:t>
-      </w:r>
-      <w:proofErr w:type="spellEnd"/>
-      <w:r>
-        <w:t xml:space="preserve"> </w:t>
-      </w:r>
-      <w:proofErr w:type="spellStart"/>
-      <w:r>
-        <w:t>Auftrag</w:t>
-      </w:r>
-      <w:proofErr w:type="spellEnd"/>
-      <w:r>
-        <w:t xml:space="preserve"> und </w:t>
-      </w:r>
-      <w:proofErr w:type="spellStart"/>
-      <w:r>
-        <w:t>sehen</w:t>
-      </w:r>
-      <w:proofErr w:type="spellEnd"/>
-      <w:r>
-        <w:t xml:space="preserve"> </w:t>
-      </w:r>
-      <w:proofErr w:type="spellStart"/>
-      <w:r>
-        <w:t>denselben</w:t>
-      </w:r>
-      <w:proofErr w:type="spellEnd"/>
-      <w:r>
-        <w:t xml:space="preserve"> Stand, </w:t>
-      </w:r>
-      <w:proofErr w:type="spellStart"/>
-      <w:r>
-        <w:t>ohne</w:t>
-      </w:r>
-      <w:proofErr w:type="spellEnd"/>
-      <w:r>
-        <w:t xml:space="preserve"> Zettel und </w:t>
-      </w:r>
-      <w:proofErr w:type="spellStart"/>
-      <w:r>
-        <w:t>Telefon</w:t>
-      </w:r>
-      <w:proofErr w:type="spellEnd"/>
-      <w:r>
-        <w:t>.</w:t>
-      </w:r>
+        <w:t>Wie kriegt man das in den Griff? Unsere Antwort ist RepairFlow. Wichtig vorweg: Wir sind nicht die Werkstatt, sondern ein Software-Startup, und FixWerk ist unser Pilotkunde. Wir bieten also die Plattform an, mit der eine Werkstatt ihren ganzen Reparaturablauf organisiert, von der ersten Anfrage bis zur Abholung und Rechnung. Unten sehen Sie die vier Module, aus denen sie besteht. Der Kunde kommt über Portal und App, das Werkstattteam arbeitet direkt in der Plattform.</w:t>
+      </w:r>
+      <w:proofErr w:type="spellEnd"/>
+      <w:proofErr w:type="spellStart"/>
+      <w:proofErr w:type="spellEnd"/>
+      <w:proofErr w:type="spellStart"/>
+      <w:proofErr w:type="spellEnd"/>
+      <w:proofErr w:type="spellStart"/>
+      <w:proofErr w:type="spellEnd"/>
+      <w:proofErr w:type="spellStart"/>
+      <w:proofErr w:type="spellEnd"/>
+      <w:proofErr w:type="spellStart"/>
+      <w:proofErr w:type="spellEnd"/>
+      <w:proofErr w:type="spellStart"/>
+      <w:proofErr w:type="spellEnd"/>
+      <w:proofErr w:type="spellStart"/>
+      <w:proofErr w:type="spellEnd"/>
+      <w:proofErr w:type="spellStart"/>
+      <w:proofErr w:type="spellEnd"/>
+      <w:proofErr w:type="spellStart"/>
+      <w:proofErr w:type="spellEnd"/>
+      <w:proofErr w:type="spellStart"/>
+      <w:proofErr w:type="spellEnd"/>
+      <w:proofErr w:type="spellStart"/>
+      <w:proofErr w:type="spellEnd"/>
+      <w:proofErr w:type="spellStart"/>
+      <w:proofErr w:type="spellEnd"/>
+      <w:proofErr w:type="spellStart"/>
+      <w:proofErr w:type="spellEnd"/>
     </w:p>
     <w:p>
       <w:pPr>
@@ -1846,64 +568,21 @@
         <w:rPr>
           <w:b/>
         </w:rPr>
-        <w:lastRenderedPageBreak/>
         <w:t xml:space="preserve">Folie 7 – </w:t>
       </w:r>
-      <w:proofErr w:type="spellStart"/>
+      <w:proofErr w:type="gramStart"/>
       <w:r>
         <w:rPr>
           <w:b/>
         </w:rPr>
-        <w:t>RepairFlow</w:t>
-      </w:r>
-      <w:proofErr w:type="spellEnd"/>
-      <w:r>
-        <w:rPr>
-          <w:b/>
-        </w:rPr>
-        <w:t xml:space="preserve">: die </w:t>
-      </w:r>
-      <w:proofErr w:type="spellStart"/>
-      <w:r>
-        <w:rPr>
-          <w:b/>
-        </w:rPr>
-        <w:t>Lösung</w:t>
-      </w:r>
-      <w:proofErr w:type="spellEnd"/>
-      <w:r>
-        <w:rPr>
-          <w:b/>
-        </w:rPr>
-        <w:t xml:space="preserve">, </w:t>
-      </w:r>
-      <w:proofErr w:type="spellStart"/>
-      <w:r>
-        <w:rPr>
-          <w:b/>
-        </w:rPr>
-        <w:t>Stufe</w:t>
-      </w:r>
-      <w:proofErr w:type="spellEnd"/>
-      <w:r>
-        <w:rPr>
-          <w:b/>
-        </w:rPr>
-        <w:t xml:space="preserve"> </w:t>
-      </w:r>
-      <w:proofErr w:type="gramStart"/>
-      <w:r>
-        <w:rPr>
-          <w:b/>
-        </w:rPr>
-        <w:t>2</w:t>
+        <w:t>RepairFlow: Die Systemgrenze</w:t>
       </w:r>
       <w:r>
         <w:t xml:space="preserve">  (</w:t>
       </w:r>
       <w:proofErr w:type="gramEnd"/>
       <w:r>
-        <w:t>20 s)</w:t>
+        <w:t>40 s)</w:t>
       </w:r>
     </w:p>
     <w:p>
@@ -1915,220 +594,35 @@
       </w:r>
       <w:proofErr w:type="spellStart"/>
       <w:r>
-        <w:t>Wichtig</w:t>
-      </w:r>
-      <w:proofErr w:type="spellEnd"/>
-      <w:r>
-        <w:t xml:space="preserve"> für die </w:t>
-      </w:r>
-      <w:proofErr w:type="spellStart"/>
-      <w:r>
-        <w:t>Analyse</w:t>
-      </w:r>
-      <w:proofErr w:type="spellEnd"/>
-      <w:r>
-        <w:t xml:space="preserve"> </w:t>
-      </w:r>
-      <w:proofErr w:type="spellStart"/>
-      <w:r>
-        <w:t>ist</w:t>
-      </w:r>
-      <w:proofErr w:type="spellEnd"/>
-      <w:r>
-        <w:t xml:space="preserve"> die </w:t>
-      </w:r>
-      <w:proofErr w:type="spellStart"/>
-      <w:r>
-        <w:t>Grenze</w:t>
-      </w:r>
-      <w:proofErr w:type="spellEnd"/>
-      <w:r>
-        <w:t xml:space="preserve">: Drinnen </w:t>
-      </w:r>
-      <w:proofErr w:type="spellStart"/>
-      <w:r>
-        <w:t>liegt</w:t>
-      </w:r>
-      <w:proofErr w:type="spellEnd"/>
-      <w:r>
-        <w:t xml:space="preserve"> </w:t>
-      </w:r>
-      <w:proofErr w:type="spellStart"/>
-      <w:r>
-        <w:t>nur</w:t>
-      </w:r>
-      <w:proofErr w:type="spellEnd"/>
-      <w:r>
-        <w:t xml:space="preserve"> </w:t>
-      </w:r>
-      <w:proofErr w:type="spellStart"/>
-      <w:r>
-        <w:t>unsere</w:t>
-      </w:r>
-      <w:proofErr w:type="spellEnd"/>
-      <w:r>
-        <w:t xml:space="preserve"> Software. Die </w:t>
-      </w:r>
-      <w:proofErr w:type="spellStart"/>
-      <w:r>
-        <w:t>Reparatur</w:t>
-      </w:r>
-      <w:proofErr w:type="spellEnd"/>
-      <w:r>
-        <w:t xml:space="preserve"> </w:t>
-      </w:r>
-      <w:proofErr w:type="spellStart"/>
-      <w:r>
-        <w:t>selbst</w:t>
-      </w:r>
-      <w:proofErr w:type="spellEnd"/>
-      <w:r>
-        <w:t xml:space="preserve"> </w:t>
-      </w:r>
-      <w:proofErr w:type="spellStart"/>
-      <w:r>
-        <w:t>bleibt</w:t>
-      </w:r>
-      <w:proofErr w:type="spellEnd"/>
-      <w:r>
-        <w:t xml:space="preserve"> </w:t>
-      </w:r>
-      <w:proofErr w:type="spellStart"/>
-      <w:r>
-        <w:t>draußen</w:t>
-      </w:r>
-      <w:proofErr w:type="spellEnd"/>
-      <w:r>
-        <w:t xml:space="preserve">, die </w:t>
-      </w:r>
-      <w:proofErr w:type="spellStart"/>
-      <w:r>
-        <w:t>macht</w:t>
-      </w:r>
-      <w:proofErr w:type="spellEnd"/>
-      <w:r>
-        <w:t xml:space="preserve"> </w:t>
-      </w:r>
-      <w:proofErr w:type="spellStart"/>
-      <w:r>
-        <w:t>weiter</w:t>
-      </w:r>
-      <w:proofErr w:type="spellEnd"/>
-      <w:r>
-        <w:t xml:space="preserve"> die </w:t>
-      </w:r>
-      <w:proofErr w:type="spellStart"/>
-      <w:r>
-        <w:t>Werkstatt</w:t>
-      </w:r>
-      <w:proofErr w:type="spellEnd"/>
-      <w:r>
-        <w:t xml:space="preserve">. Den KI-Dienst und die </w:t>
-      </w:r>
-      <w:proofErr w:type="spellStart"/>
-      <w:r>
-        <w:t>Lieferanten</w:t>
-      </w:r>
-      <w:proofErr w:type="spellEnd"/>
-      <w:r>
-        <w:t xml:space="preserve"> </w:t>
-      </w:r>
-      <w:proofErr w:type="spellStart"/>
-      <w:r>
-        <w:t>binden</w:t>
-      </w:r>
-      <w:proofErr w:type="spellEnd"/>
-      <w:r>
-        <w:t xml:space="preserve"> </w:t>
-      </w:r>
-      <w:proofErr w:type="spellStart"/>
-      <w:r>
-        <w:t>wir</w:t>
-      </w:r>
-      <w:proofErr w:type="spellEnd"/>
-      <w:r>
-        <w:t xml:space="preserve"> von </w:t>
-      </w:r>
-      <w:proofErr w:type="spellStart"/>
-      <w:r>
-        <w:t>außen</w:t>
-      </w:r>
-      <w:proofErr w:type="spellEnd"/>
-      <w:r>
-        <w:t xml:space="preserve"> an, die </w:t>
-      </w:r>
-      <w:proofErr w:type="spellStart"/>
-      <w:r>
-        <w:t>Buchhaltung</w:t>
-      </w:r>
-      <w:proofErr w:type="spellEnd"/>
-      <w:r>
-        <w:t xml:space="preserve"> </w:t>
-      </w:r>
-      <w:proofErr w:type="spellStart"/>
-      <w:r>
-        <w:t>bekommt</w:t>
-      </w:r>
-      <w:proofErr w:type="spellEnd"/>
-      <w:r>
-        <w:t xml:space="preserve"> </w:t>
-      </w:r>
-      <w:proofErr w:type="spellStart"/>
-      <w:r>
-        <w:t>nur</w:t>
-      </w:r>
-      <w:proofErr w:type="spellEnd"/>
-      <w:r>
-        <w:t xml:space="preserve"> </w:t>
-      </w:r>
-      <w:proofErr w:type="spellStart"/>
-      <w:r>
-        <w:t>einen</w:t>
-      </w:r>
-      <w:proofErr w:type="spellEnd"/>
-      <w:r>
-        <w:t xml:space="preserve"> Export. Was das </w:t>
-      </w:r>
-      <w:proofErr w:type="spellStart"/>
-      <w:r>
-        <w:t>im</w:t>
-      </w:r>
-      <w:proofErr w:type="spellEnd"/>
-      <w:r>
-        <w:t xml:space="preserve"> </w:t>
-      </w:r>
-      <w:proofErr w:type="spellStart"/>
-      <w:r>
-        <w:t>Alltag</w:t>
-      </w:r>
-      <w:proofErr w:type="spellEnd"/>
-      <w:r>
-        <w:t xml:space="preserve"> </w:t>
-      </w:r>
-      <w:proofErr w:type="spellStart"/>
-      <w:r>
-        <w:t>bringt</w:t>
-      </w:r>
-      <w:proofErr w:type="spellEnd"/>
-      <w:r>
-        <w:t xml:space="preserve">, </w:t>
-      </w:r>
-      <w:proofErr w:type="spellStart"/>
-      <w:r>
-        <w:t>zeigt</w:t>
-      </w:r>
-      <w:proofErr w:type="spellEnd"/>
-      <w:r>
-        <w:t xml:space="preserve"> Ihnen </w:t>
-      </w:r>
-      <w:proofErr w:type="spellStart"/>
-      <w:r>
-        <w:t>jetzt</w:t>
-      </w:r>
-      <w:proofErr w:type="spellEnd"/>
-      <w:r>
-        <w:t xml:space="preserve"> Kilian.</w:t>
-      </w:r>
+        <w:t>Für die Analyse ist wichtig, was zu unserem System gehört. Die orange Linie ist unsere Systemgrenze: Darüber liegt nur die Plattform selbst, alles darunter gehört nicht zum System. Kunde und Werkstattteam benutzen das System, sind aber nicht Teil davon. Der KI-Diagnosedienst und die Systeme der Lieferanten gehören nicht zu uns, mit ihnen tauschen wir nur Daten aus. Die Buchhaltung bekommt von uns sogar nur einen Export. Und ganz außen vor bleibt die eigentliche Arbeit am Gerät: Schrauben muss weiterhin der Techniker. Was das im Alltag bringt, zeigt Ihnen jetzt Kilian.</w:t>
+      </w:r>
+      <w:proofErr w:type="spellEnd"/>
+      <w:proofErr w:type="spellStart"/>
+      <w:proofErr w:type="spellEnd"/>
+      <w:proofErr w:type="spellStart"/>
+      <w:proofErr w:type="spellEnd"/>
+      <w:proofErr w:type="spellStart"/>
+      <w:proofErr w:type="spellEnd"/>
+      <w:proofErr w:type="spellStart"/>
+      <w:proofErr w:type="spellEnd"/>
+      <w:proofErr w:type="spellStart"/>
+      <w:proofErr w:type="spellEnd"/>
+      <w:proofErr w:type="spellStart"/>
+      <w:proofErr w:type="spellEnd"/>
+      <w:proofErr w:type="spellStart"/>
+      <w:proofErr w:type="spellEnd"/>
+      <w:proofErr w:type="spellStart"/>
+      <w:proofErr w:type="spellEnd"/>
+      <w:proofErr w:type="spellStart"/>
+      <w:proofErr w:type="spellEnd"/>
+      <w:proofErr w:type="spellStart"/>
+      <w:proofErr w:type="spellEnd"/>
+      <w:proofErr w:type="spellStart"/>
+      <w:proofErr w:type="spellEnd"/>
+      <w:proofErr w:type="spellStart"/>
+      <w:proofErr w:type="spellEnd"/>
+      <w:proofErr w:type="spellStart"/>
+      <w:proofErr w:type="spellEnd"/>
     </w:p>
     <w:p>
       <w:r>

</xml_diff>